<commit_message>
Integrar MTBF/MTTR (seccion 5.3.4) y Anexo M de deteccion de anomalias
- Nueva subseccion 5.3.4 'Metricas de confiabilidad (MTBF y MTTR)' con Tablas 14a y 14b (operacion estable y periodo completo)
- Nuevo Anexo M 'Deteccion Automatica de Anomalias Termicas' (metodo, resultados, interpretacion y propuesta de implementacion)
- Contenido: bloque del Capitulo 5 regenerado (5.1-5.12 + 5.3.4) y Anexo M agregado
- Indice de Tablas regenerado (incluye 14a/14b); Indice de Figuras actualizado
- Saltos de pagina y margenes (2.54 cm, APA) preservados

Co-authored-by: HenrySali <205542799+HenrySali@users.noreply.github.com>
</commit_message>
<xml_diff>
--- a/tesis-smarttemp-final.docx
+++ b/tesis-smarttemp-final.docx
@@ -3795,13 +3795,8 @@
         <w:ind w:left="396"/>
       </w:pPr>
       <w:r>
-        <w:t xml:space="preserve">5.1 Sistema </w:t>
-      </w:r>
-      <w:proofErr w:type="gramStart"/>
-      <w:r>
-        <w:t>implementado  5</w:t>
-      </w:r>
-      <w:proofErr w:type="gramEnd"/>
+        <w:t xml:space="preserve">5.1 Sistema desplegado  5</w:t>
+      </w:r>
     </w:p>
     <w:p>
       <w:pPr>
@@ -3809,14 +3804,8 @@
         <w:ind w:left="396"/>
       </w:pPr>
       <w:r>
-        <w:lastRenderedPageBreak/>
-        <w:t xml:space="preserve">5.2 Métricas de desempeño </w:t>
-      </w:r>
-      <w:proofErr w:type="gramStart"/>
-      <w:r>
-        <w:t>técnico  5</w:t>
-      </w:r>
-      <w:proofErr w:type="gramEnd"/>
+        <w:t xml:space="preserve">5.2 Evaluación de precisión de medición (CA-1)  5</w:t>
+      </w:r>
     </w:p>
     <w:p>
       <w:pPr>
@@ -3824,13 +3813,8 @@
         <w:ind w:left="793"/>
       </w:pPr>
       <w:r>
-        <w:t xml:space="preserve">5.2.1 Precisión de </w:t>
-      </w:r>
-      <w:proofErr w:type="gramStart"/>
-      <w:r>
-        <w:t>medición  5</w:t>
-      </w:r>
-      <w:proofErr w:type="gramEnd"/>
+        <w:t xml:space="preserve">5.2.1 Calibración puntual con patrón certificado  5</w:t>
+      </w:r>
     </w:p>
     <w:p>
       <w:pPr>
@@ -3838,13 +3822,8 @@
         <w:ind w:left="793"/>
       </w:pPr>
       <w:r>
-        <w:t xml:space="preserve">5.2.2 Disponibilidad del </w:t>
-      </w:r>
-      <w:proofErr w:type="gramStart"/>
-      <w:r>
-        <w:t>sistema  5</w:t>
-      </w:r>
-      <w:proofErr w:type="gramEnd"/>
+        <w:t xml:space="preserve">5.2.2 Validación extendida con dataloggers (Favaloro, 8-jun a 3-jul)  5</w:t>
+      </w:r>
     </w:p>
     <w:p>
       <w:pPr>
@@ -3852,18 +3831,17 @@
         <w:ind w:left="793"/>
       </w:pPr>
       <w:r>
-        <w:t xml:space="preserve">5.2.3 Tiempo de conexión </w:t>
-      </w:r>
-      <w:proofErr w:type="spellStart"/>
-      <w:proofErr w:type="gramStart"/>
-      <w:r>
-        <w:t>WiFi</w:t>
-      </w:r>
-      <w:proofErr w:type="spellEnd"/>
-      <w:r>
-        <w:t xml:space="preserve">  5</w:t>
-      </w:r>
-      <w:proofErr w:type="gramEnd"/>
+        <w:t xml:space="preserve">5.2.3 Interpretación: detección de anomalía térmica en la cámara  5</w:t>
+      </w:r>
+    </w:p>
+    <w:p>
+      <w:pPr>
+        <w:spacing w:after="60" w:line="276" w:lineRule="auto"/>
+        <w:ind w:left="396"/>
+      </w:pPr>
+      <w:r>
+        <w:t xml:space="preserve">5.3 Disponibilidad del sistema (CA-2)  5</w:t>
+      </w:r>
     </w:p>
     <w:p>
       <w:pPr>
@@ -3871,13 +3849,35 @@
         <w:ind w:left="793"/>
       </w:pPr>
       <w:r>
-        <w:t>5.2.4 Gestión *offline</w:t>
-      </w:r>
-      <w:proofErr w:type="gramStart"/>
-      <w:r>
-        <w:t>*  5</w:t>
-      </w:r>
-      <w:proofErr w:type="gramEnd"/>
+        <w:t xml:space="preserve">5.3.1 Disponibilidad global  5</w:t>
+      </w:r>
+    </w:p>
+    <w:p>
+      <w:pPr>
+        <w:spacing w:after="60" w:line="276" w:lineRule="auto"/>
+        <w:ind w:left="793"/>
+      </w:pPr>
+      <w:r>
+        <w:t xml:space="preserve">5.3.2 Análisis de las causas de inactividad  5</w:t>
+      </w:r>
+    </w:p>
+    <w:p>
+      <w:pPr>
+        <w:spacing w:after="60" w:line="276" w:lineRule="auto"/>
+        <w:ind w:left="793"/>
+      </w:pPr>
+      <w:r>
+        <w:t xml:space="preserve">5.3.3 Disponibilidad en modo continuo estable (Favaloro)  5</w:t>
+      </w:r>
+    </w:p>
+    <w:p>
+      <w:pPr>
+        <w:spacing w:after="60" w:line="276" w:lineRule="auto"/>
+        <w:ind w:left="793"/>
+      </w:pPr>
+      <w:r>
+        <w:t xml:space="preserve">5.3.4 Métricas de confiabilidad (MTBF y MTTR)  5</w:t>
+      </w:r>
     </w:p>
     <w:p>
       <w:pPr>
@@ -3885,13 +3885,26 @@
         <w:ind w:left="396"/>
       </w:pPr>
       <w:r>
-        <w:t xml:space="preserve">5.3 Métricas de impacto en la cadena de </w:t>
-      </w:r>
-      <w:proofErr w:type="gramStart"/>
-      <w:r>
-        <w:t>frío  5</w:t>
-      </w:r>
-      <w:proofErr w:type="gramEnd"/>
+        <w:t xml:space="preserve">5.4 Frecuencia de medición (CA-3)  5</w:t>
+      </w:r>
+    </w:p>
+    <w:p>
+      <w:pPr>
+        <w:spacing w:after="60" w:line="276" w:lineRule="auto"/>
+        <w:ind w:left="396"/>
+      </w:pPr>
+      <w:r>
+        <w:t xml:space="preserve">5.5 Detección de excursiones de temperatura (CA-4)  5</w:t>
+      </w:r>
+    </w:p>
+    <w:p>
+      <w:pPr>
+        <w:spacing w:after="60" w:line="276" w:lineRule="auto"/>
+        <w:ind w:left="396"/>
+      </w:pPr>
+      <w:r>
+        <w:t xml:space="preserve">5.6 Gestión offline y recuperación (CA-6, CA-7)  5</w:t>
+      </w:r>
     </w:p>
     <w:p>
       <w:pPr>
@@ -3899,13 +3912,8 @@
         <w:ind w:left="793"/>
       </w:pPr>
       <w:r>
-        <w:t xml:space="preserve">5.3.1 Detección de excursiones de </w:t>
-      </w:r>
-      <w:proofErr w:type="gramStart"/>
-      <w:r>
-        <w:t>temperatura  5</w:t>
-      </w:r>
-      <w:proofErr w:type="gramEnd"/>
+        <w:t xml:space="preserve">5.6.1 Capacidad offline  5</w:t>
+      </w:r>
     </w:p>
     <w:p>
       <w:pPr>
@@ -3913,13 +3921,8 @@
         <w:ind w:left="793"/>
       </w:pPr>
       <w:r>
-        <w:t xml:space="preserve">5.3.2 </w:t>
-      </w:r>
-      <w:proofErr w:type="gramStart"/>
-      <w:r>
-        <w:t>Trazabilidad  5</w:t>
-      </w:r>
-      <w:proofErr w:type="gramEnd"/>
+        <w:t xml:space="preserve">5.6.2 Recuperación offline  5</w:t>
+      </w:r>
     </w:p>
     <w:p>
       <w:pPr>
@@ -3927,13 +3930,8 @@
         <w:ind w:left="793"/>
       </w:pPr>
       <w:r>
-        <w:t xml:space="preserve">5.3.3 Reducción de registro </w:t>
-      </w:r>
-      <w:proofErr w:type="gramStart"/>
-      <w:r>
-        <w:t>manual  5</w:t>
-      </w:r>
-      <w:proofErr w:type="gramEnd"/>
+        <w:t xml:space="preserve">5.6.3 Prueba intencional de recuperación offline (4 días)  5</w:t>
+      </w:r>
     </w:p>
     <w:p>
       <w:pPr>
@@ -3941,13 +3939,8 @@
         <w:ind w:left="396"/>
       </w:pPr>
       <w:r>
-        <w:t xml:space="preserve">5.4 Comparación con soluciones </w:t>
-      </w:r>
-      <w:proofErr w:type="gramStart"/>
-      <w:r>
-        <w:t>comerciales  5</w:t>
-      </w:r>
-      <w:proofErr w:type="gramEnd"/>
+        <w:t xml:space="preserve">5.7 Conexión WiFi (CA-8)  5</w:t>
+      </w:r>
     </w:p>
     <w:p>
       <w:pPr>
@@ -3955,26 +3948,26 @@
         <w:ind w:left="396"/>
       </w:pPr>
       <w:r>
-        <w:t xml:space="preserve">5.6 Validación de criterios de </w:t>
-      </w:r>
-      <w:proofErr w:type="gramStart"/>
-      <w:r>
-        <w:t>aceptación  5</w:t>
-      </w:r>
-      <w:proofErr w:type="gramEnd"/>
+        <w:t xml:space="preserve">5.8 Modos de funcionamiento y configuración remota  5</w:t>
+      </w:r>
     </w:p>
     <w:p>
       <w:pPr>
         <w:spacing w:after="60" w:line="276" w:lineRule="auto"/>
-      </w:pPr>
-      <w:r>
-        <w:t xml:space="preserve">Capítulo 6: </w:t>
-      </w:r>
-      <w:proofErr w:type="gramStart"/>
-      <w:r>
-        <w:t>Discusión  6</w:t>
-      </w:r>
-      <w:proofErr w:type="gramEnd"/>
+        <w:ind w:left="793"/>
+      </w:pPr>
+      <w:r>
+        <w:t xml:space="preserve">5.8.1 Transiciones de modo  5</w:t>
+      </w:r>
+    </w:p>
+    <w:p>
+      <w:pPr>
+        <w:spacing w:after="60" w:line="276" w:lineRule="auto"/>
+        <w:ind w:left="793"/>
+      </w:pPr>
+      <w:r>
+        <w:t xml:space="preserve">5.8.2 Autonomía ante cortes  5</w:t>
+      </w:r>
     </w:p>
     <w:p>
       <w:pPr>
@@ -3982,13 +3975,17 @@
         <w:ind w:left="396"/>
       </w:pPr>
       <w:r>
-        <w:t xml:space="preserve">6.1 Análisis de resultados vs. objetivos </w:t>
-      </w:r>
-      <w:proofErr w:type="gramStart"/>
-      <w:r>
-        <w:t>planteados  6</w:t>
-      </w:r>
-      <w:proofErr w:type="gramEnd"/>
+        <w:t xml:space="preserve">5.9 Sistema de alertas y notificaciones WhatsApp  5</w:t>
+      </w:r>
+    </w:p>
+    <w:p>
+      <w:pPr>
+        <w:spacing w:after="60" w:line="276" w:lineRule="auto"/>
+        <w:ind w:left="793"/>
+      </w:pPr>
+      <w:r>
+        <w:t xml:space="preserve">5.9.1 Correlación con caídas del servidor  5</w:t>
+      </w:r>
     </w:p>
     <w:p>
       <w:pPr>
@@ -3996,13 +3993,8 @@
         <w:ind w:left="396"/>
       </w:pPr>
       <w:r>
-        <w:t xml:space="preserve">6.2 Problemas encontrados durante la </w:t>
-      </w:r>
-      <w:proofErr w:type="gramStart"/>
-      <w:r>
-        <w:t>implementación  6</w:t>
-      </w:r>
-      <w:proofErr w:type="gramEnd"/>
+        <w:t xml:space="preserve">5.10 Trazabilidad y auditoría  5</w:t>
+      </w:r>
     </w:p>
     <w:p>
       <w:pPr>
@@ -4010,26 +4002,8 @@
         <w:ind w:left="396"/>
       </w:pPr>
       <w:r>
-        <w:t xml:space="preserve">6.3 Lecciones </w:t>
-      </w:r>
-      <w:proofErr w:type="gramStart"/>
-      <w:r>
-        <w:t>aprendidas  6</w:t>
-      </w:r>
-      <w:proofErr w:type="gramEnd"/>
-    </w:p>
-    <w:p>
-      <w:pPr>
-        <w:spacing w:after="60" w:line="276" w:lineRule="auto"/>
-      </w:pPr>
-      <w:r>
-        <w:t xml:space="preserve">Capítulo 7: </w:t>
-      </w:r>
-      <w:proofErr w:type="gramStart"/>
-      <w:r>
-        <w:t>Conclusiones  7</w:t>
-      </w:r>
-      <w:proofErr w:type="gramEnd"/>
+        <w:t xml:space="preserve">5.11 Comparación con soluciones comerciales  5</w:t>
+      </w:r>
     </w:p>
     <w:p>
       <w:pPr>
@@ -4037,11 +4011,19 @@
         <w:ind w:left="396"/>
       </w:pPr>
       <w:r>
-        <w:t xml:space="preserve">7.1 </w:t>
+        <w:t xml:space="preserve">5.12 Validación de criterios de aceptación  5</w:t>
+      </w:r>
+    </w:p>
+    <w:p>
+      <w:pPr>
+        <w:spacing w:after="60" w:line="276" w:lineRule="auto"/>
+      </w:pPr>
+      <w:r>
+        <w:t xml:space="preserve">Capítulo 6: </w:t>
       </w:r>
       <w:proofErr w:type="gramStart"/>
       <w:r>
-        <w:t>Conclusiones  7</w:t>
+        <w:t>Discusión  6</w:t>
       </w:r>
       <w:proofErr w:type="gramEnd"/>
     </w:p>
@@ -4051,34 +4033,13 @@
         <w:ind w:left="396"/>
       </w:pPr>
       <w:r>
-        <w:t xml:space="preserve">7.2 Trabajo </w:t>
+        <w:t xml:space="preserve">6.1 Análisis de resultados vs. objetivos </w:t>
       </w:r>
       <w:proofErr w:type="gramStart"/>
       <w:r>
-        <w:t>futuro  7</w:t>
+        <w:t>planteados  6</w:t>
       </w:r>
       <w:proofErr w:type="gramEnd"/>
-    </w:p>
-    <w:p>
-      <w:pPr>
-        <w:spacing w:after="60" w:line="276" w:lineRule="auto"/>
-      </w:pPr>
-      <w:r>
-        <w:t xml:space="preserve">Referencias </w:t>
-      </w:r>
-      <w:proofErr w:type="gramStart"/>
-      <w:r>
-        <w:t>Bibliográficas  8</w:t>
-      </w:r>
-      <w:proofErr w:type="gramEnd"/>
-    </w:p>
-    <w:p>
-      <w:pPr>
-        <w:spacing w:after="60" w:line="276" w:lineRule="auto"/>
-      </w:pPr>
-      <w:r>
-        <w:t>Anexos</w:t>
-      </w:r>
     </w:p>
     <w:p>
       <w:pPr>
@@ -4086,11 +4047,11 @@
         <w:ind w:left="396"/>
       </w:pPr>
       <w:r>
-        <w:t>Anexo A: Código Fuente del Firmware ESP</w:t>
+        <w:t xml:space="preserve">6.2 Problemas encontrados durante la </w:t>
       </w:r>
       <w:proofErr w:type="gramStart"/>
       <w:r>
-        <w:t>8266  9</w:t>
+        <w:t>implementación  6</w:t>
       </w:r>
       <w:proofErr w:type="gramEnd"/>
     </w:p>
@@ -4100,11 +4061,24 @@
         <w:ind w:left="396"/>
       </w:pPr>
       <w:r>
-        <w:t xml:space="preserve">Anexo B: Esquema de Conexión </w:t>
+        <w:t xml:space="preserve">6.3 Lecciones </w:t>
       </w:r>
       <w:proofErr w:type="gramStart"/>
       <w:r>
-        <w:t>Electrónica  10</w:t>
+        <w:t>aprendidas  6</w:t>
+      </w:r>
+      <w:proofErr w:type="gramEnd"/>
+    </w:p>
+    <w:p>
+      <w:pPr>
+        <w:spacing w:after="60" w:line="276" w:lineRule="auto"/>
+      </w:pPr>
+      <w:r>
+        <w:t xml:space="preserve">Capítulo 7: </w:t>
+      </w:r>
+      <w:proofErr w:type="gramStart"/>
+      <w:r>
+        <w:t>Conclusiones  7</w:t>
       </w:r>
       <w:proofErr w:type="gramEnd"/>
     </w:p>
@@ -4114,11 +4088,11 @@
         <w:ind w:left="396"/>
       </w:pPr>
       <w:r>
-        <w:t xml:space="preserve">Anexo C: Esquema de Base de </w:t>
+        <w:t xml:space="preserve">7.1 </w:t>
       </w:r>
       <w:proofErr w:type="gramStart"/>
       <w:r>
-        <w:t>Datos  11</w:t>
+        <w:t>Conclusiones  7</w:t>
       </w:r>
       <w:proofErr w:type="gramEnd"/>
     </w:p>
@@ -4128,7 +4102,33 @@
         <w:ind w:left="396"/>
       </w:pPr>
       <w:r>
-        <w:t>Anexo D: Diagramas UML  12</w:t>
+        <w:t xml:space="preserve">7.2 Trabajo </w:t>
+      </w:r>
+      <w:proofErr w:type="gramStart"/>
+      <w:r>
+        <w:t>futuro  7</w:t>
+      </w:r>
+      <w:proofErr w:type="gramEnd"/>
+    </w:p>
+    <w:p>
+      <w:pPr>
+        <w:spacing w:after="60" w:line="276" w:lineRule="auto"/>
+      </w:pPr>
+      <w:r>
+        <w:t xml:space="preserve">Referencias </w:t>
+      </w:r>
+      <w:proofErr w:type="gramStart"/>
+      <w:r>
+        <w:t>Bibliográficas  8</w:t>
+      </w:r>
+      <w:proofErr w:type="gramEnd"/>
+    </w:p>
+    <w:p>
+      <w:pPr>
+        <w:spacing w:after="60" w:line="276" w:lineRule="auto"/>
+      </w:pPr>
+      <w:r>
+        <w:t>Anexos</w:t>
       </w:r>
     </w:p>
     <w:p>
@@ -4137,11 +4137,11 @@
         <w:ind w:left="396"/>
       </w:pPr>
       <w:r>
-        <w:t xml:space="preserve">Anexo E: Capturas de </w:t>
+        <w:t>Anexo A: Código Fuente del Firmware ESP</w:t>
       </w:r>
       <w:proofErr w:type="gramStart"/>
       <w:r>
-        <w:t>Pantalla  13</w:t>
+        <w:t>8266  9</w:t>
       </w:r>
       <w:proofErr w:type="gramEnd"/>
     </w:p>
@@ -4151,11 +4151,11 @@
         <w:ind w:left="396"/>
       </w:pPr>
       <w:r>
-        <w:t xml:space="preserve">Anexo F: Manual de </w:t>
+        <w:t xml:space="preserve">Anexo B: Esquema de Conexión </w:t>
       </w:r>
       <w:proofErr w:type="gramStart"/>
       <w:r>
-        <w:t>Usuario  14</w:t>
+        <w:t>Electrónica  10</w:t>
       </w:r>
       <w:proofErr w:type="gramEnd"/>
     </w:p>
@@ -4165,11 +4165,11 @@
         <w:ind w:left="396"/>
       </w:pPr>
       <w:r>
-        <w:t xml:space="preserve">Anexo G: Manual de </w:t>
+        <w:t xml:space="preserve">Anexo C: Esquema de Base de </w:t>
       </w:r>
       <w:proofErr w:type="gramStart"/>
       <w:r>
-        <w:t>Instalación  15</w:t>
+        <w:t>Datos  11</w:t>
       </w:r>
       <w:proofErr w:type="gramEnd"/>
     </w:p>
@@ -4179,13 +4179,8 @@
         <w:ind w:left="396"/>
       </w:pPr>
       <w:r>
-        <w:t xml:space="preserve">Anexo H: Resultados de Pruebas de </w:t>
-      </w:r>
-      <w:proofErr w:type="gramStart"/>
-      <w:r>
-        <w:t>Precisión  16</w:t>
-      </w:r>
-      <w:proofErr w:type="gramEnd"/>
+        <w:t>Anexo D: Diagramas UML  12</w:t>
+      </w:r>
     </w:p>
     <w:p>
       <w:pPr>
@@ -4193,11 +4188,11 @@
         <w:ind w:left="396"/>
       </w:pPr>
       <w:r>
-        <w:t xml:space="preserve">Anexo I: Gráficos de Series </w:t>
+        <w:t xml:space="preserve">Anexo E: Capturas de </w:t>
       </w:r>
       <w:proofErr w:type="gramStart"/>
       <w:r>
-        <w:t>Temporales  17</w:t>
+        <w:t>Pantalla  13</w:t>
       </w:r>
       <w:proofErr w:type="gramEnd"/>
     </w:p>
@@ -4207,11 +4202,11 @@
         <w:ind w:left="396"/>
       </w:pPr>
       <w:r>
-        <w:t xml:space="preserve">Anexo K: Presupuesto del </w:t>
+        <w:t xml:space="preserve">Anexo F: Manual de </w:t>
       </w:r>
       <w:proofErr w:type="gramStart"/>
       <w:r>
-        <w:t>Sistema  18</w:t>
+        <w:t>Usuario  14</w:t>
       </w:r>
       <w:proofErr w:type="gramEnd"/>
     </w:p>
@@ -4221,6 +4216,62 @@
         <w:ind w:left="396"/>
       </w:pPr>
       <w:r>
+        <w:t xml:space="preserve">Anexo G: Manual de </w:t>
+      </w:r>
+      <w:proofErr w:type="gramStart"/>
+      <w:r>
+        <w:t>Instalación  15</w:t>
+      </w:r>
+      <w:proofErr w:type="gramEnd"/>
+    </w:p>
+    <w:p>
+      <w:pPr>
+        <w:spacing w:after="60" w:line="276" w:lineRule="auto"/>
+        <w:ind w:left="396"/>
+      </w:pPr>
+      <w:r>
+        <w:t xml:space="preserve">Anexo H: Resultados de Pruebas de </w:t>
+      </w:r>
+      <w:proofErr w:type="gramStart"/>
+      <w:r>
+        <w:t>Precisión  16</w:t>
+      </w:r>
+      <w:proofErr w:type="gramEnd"/>
+    </w:p>
+    <w:p>
+      <w:pPr>
+        <w:spacing w:after="60" w:line="276" w:lineRule="auto"/>
+        <w:ind w:left="396"/>
+      </w:pPr>
+      <w:r>
+        <w:t xml:space="preserve">Anexo I: Gráficos de Series </w:t>
+      </w:r>
+      <w:proofErr w:type="gramStart"/>
+      <w:r>
+        <w:t>Temporales  17</w:t>
+      </w:r>
+      <w:proofErr w:type="gramEnd"/>
+    </w:p>
+    <w:p>
+      <w:pPr>
+        <w:spacing w:after="60" w:line="276" w:lineRule="auto"/>
+        <w:ind w:left="396"/>
+      </w:pPr>
+      <w:r>
+        <w:t xml:space="preserve">Anexo K: Presupuesto del </w:t>
+      </w:r>
+      <w:proofErr w:type="gramStart"/>
+      <w:r>
+        <w:t>Sistema  18</w:t>
+      </w:r>
+      <w:proofErr w:type="gramEnd"/>
+    </w:p>
+    <w:p>
+      <w:pPr>
+        <w:spacing w:after="60" w:line="276" w:lineRule="auto"/>
+        <w:ind w:left="396"/>
+      </w:pPr>
+      <w:r>
         <w:t xml:space="preserve">Anexo L: Normativa </w:t>
       </w:r>
       <w:proofErr w:type="gramStart"/>
@@ -4228,6 +4279,15 @@
         <w:t>Aplicable  19</w:t>
       </w:r>
       <w:proofErr w:type="gramEnd"/>
+    </w:p>
+    <w:p>
+      <w:pPr>
+        <w:spacing w:after="60" w:line="276" w:lineRule="auto"/>
+        <w:ind w:left="396"/>
+      </w:pPr>
+      <w:r>
+        <w:t xml:space="preserve">Anexo M: Detección Automática de Anomalías Térmicas  20</w:t>
+      </w:r>
     </w:p>
     <w:p>
       <w:r>
@@ -4253,29 +4313,8 @@
         <w:ind w:left="396"/>
       </w:pPr>
       <w:r>
-        <w:t xml:space="preserve">Figura 1. Arquitectura general del sistema </w:t>
-      </w:r>
-      <w:proofErr w:type="spellStart"/>
-      <w:r>
-        <w:t>SmartTemp</w:t>
-      </w:r>
-      <w:proofErr w:type="spellEnd"/>
-      <w:r>
-        <w:t xml:space="preserve"> basada en el modelo </w:t>
-      </w:r>
-      <w:proofErr w:type="spellStart"/>
-      <w:r>
-        <w:t>IoT</w:t>
-      </w:r>
-      <w:proofErr w:type="spellEnd"/>
-      <w:r>
-        <w:t xml:space="preserve"> de tres </w:t>
-      </w:r>
-      <w:proofErr w:type="gramStart"/>
-      <w:r>
-        <w:t>capas  1</w:t>
-      </w:r>
-      <w:proofErr w:type="gramEnd"/>
+        <w:t xml:space="preserve">Figura 1. Arquitectura general del sistema SmartTemp basada en el modelo IoT de tres capas.  1</w:t>
+      </w:r>
     </w:p>
     <w:p>
       <w:pPr>
@@ -4283,42 +4322,8 @@
         <w:ind w:left="396"/>
       </w:pPr>
       <w:r>
-        <w:t xml:space="preserve">Figura 3. </w:t>
-      </w:r>
-      <w:proofErr w:type="spellStart"/>
-      <w:r>
-        <w:t>Dashboard</w:t>
-      </w:r>
-      <w:proofErr w:type="spellEnd"/>
-      <w:r>
-        <w:t xml:space="preserve"> principal del sistema </w:t>
-      </w:r>
-      <w:proofErr w:type="spellStart"/>
-      <w:r>
-        <w:t>SmartTemp</w:t>
-      </w:r>
-      <w:proofErr w:type="spellEnd"/>
-      <w:r>
-        <w:t xml:space="preserve"> mostrando el estado de los sensores en tiempo real. [Figura: Captura del </w:t>
-      </w:r>
-      <w:proofErr w:type="spellStart"/>
-      <w:r>
-        <w:t>dashboard</w:t>
-      </w:r>
-      <w:proofErr w:type="spellEnd"/>
-      <w:r>
-        <w:t xml:space="preserve"> de visualización — </w:t>
-      </w:r>
-      <w:proofErr w:type="spellStart"/>
-      <w:proofErr w:type="gramStart"/>
-      <w:r>
-        <w:t>insert</w:t>
-      </w:r>
-      <w:proofErr w:type="spellEnd"/>
-      <w:r>
-        <w:t xml:space="preserve">  2</w:t>
-      </w:r>
-      <w:proofErr w:type="gramEnd"/>
+        <w:t xml:space="preserve">Figura 6. Notificación de alerta recibida por WhatsApp (desconexión y reconexión de sensores con temperatura y tiempo offline).  2</w:t>
+      </w:r>
     </w:p>
     <w:p>
       <w:pPr>
@@ -4326,29 +4331,26 @@
         <w:ind w:left="396"/>
       </w:pPr>
       <w:r>
-        <w:t xml:space="preserve">Figura 4. </w:t>
-      </w:r>
-      <w:proofErr w:type="spellStart"/>
-      <w:r>
-        <w:t>Dashboard</w:t>
-      </w:r>
-      <w:proofErr w:type="spellEnd"/>
-      <w:r>
-        <w:t xml:space="preserve"> gráfico con histórico de temperatura y coloreo por umbrales. [Figura: Captura del </w:t>
-      </w:r>
-      <w:proofErr w:type="spellStart"/>
-      <w:r>
-        <w:t>dashboard</w:t>
-      </w:r>
-      <w:proofErr w:type="spellEnd"/>
-      <w:r>
-        <w:t xml:space="preserve"> gráfico — insertar imagen del autor</w:t>
-      </w:r>
-      <w:proofErr w:type="gramStart"/>
-      <w:r>
-        <w:t>]  3</w:t>
-      </w:r>
-      <w:proofErr w:type="gramEnd"/>
+        <w:t xml:space="preserve">Figura 7. Notificación de alerta recibida por email (fallback) con detalle del evento, sensor, sector y último dato registrado.  3</w:t>
+      </w:r>
+    </w:p>
+    <w:p>
+      <w:r>
+        <w:br w:type="page"/>
+      </w:r>
+    </w:p>
+    <w:p>
+      <w:pPr>
+        <w:pStyle w:val="Ttulo1"/>
+      </w:pPr>
+      <w:r>
+        <w:rPr>
+          <w:sz w:val="24"/>
+          <w:szCs w:val="24"/>
+        </w:rPr>
+        <w:lastRenderedPageBreak/>
+        <w:t>Índice de Tablas</w:t>
+      </w:r>
     </w:p>
     <w:p>
       <w:pPr>
@@ -4356,38 +4358,7 @@
         <w:ind w:left="396"/>
       </w:pPr>
       <w:r>
-        <w:t xml:space="preserve">Figura 5. Registro continuo de temperatura de un freezer durante 7 días. [Figura: Gráfico de temperatura vs. tiempo — se generará como SVG </w:t>
-      </w:r>
-      <w:proofErr w:type="spellStart"/>
-      <w:r>
-        <w:t>inline</w:t>
-      </w:r>
-      <w:proofErr w:type="spellEnd"/>
-      <w:r>
-        <w:t xml:space="preserve"> en HTML v2</w:t>
-      </w:r>
-      <w:proofErr w:type="gramStart"/>
-      <w:r>
-        <w:t>]  4</w:t>
-      </w:r>
-      <w:proofErr w:type="gramEnd"/>
-    </w:p>
-    <w:p>
-      <w:r>
-        <w:br w:type="page"/>
-      </w:r>
-    </w:p>
-    <w:p>
-      <w:pPr>
-        <w:pStyle w:val="Ttulo1"/>
-      </w:pPr>
-      <w:r>
-        <w:rPr>
-          <w:sz w:val="24"/>
-          <w:szCs w:val="24"/>
-        </w:rPr>
-        <w:lastRenderedPageBreak/>
-        <w:t>Índice de Tablas</w:t>
+        <w:t xml:space="preserve">Tabla 1. Comparación de protocolos de comunicación utilizados en SmartTemp.  1</w:t>
       </w:r>
     </w:p>
     <w:p>
@@ -4396,18 +4367,8 @@
         <w:ind w:left="396"/>
       </w:pPr>
       <w:r>
-        <w:t xml:space="preserve">Tabla 1. Comparación de protocolos de comunicación utilizados en </w:t>
-      </w:r>
-      <w:proofErr w:type="spellStart"/>
-      <w:proofErr w:type="gramStart"/>
-      <w:r>
-        <w:t>SmartTemp</w:t>
-      </w:r>
-      <w:proofErr w:type="spellEnd"/>
-      <w:r>
-        <w:t xml:space="preserve">  1</w:t>
-      </w:r>
-      <w:proofErr w:type="gramEnd"/>
+        <w:t xml:space="preserve">Tabla 1b. Comparación de SmartTemp con sistemas de monitoreo IoT publicados.  2</w:t>
+      </w:r>
     </w:p>
     <w:p>
       <w:pPr>
@@ -4415,18 +4376,8 @@
         <w:ind w:left="396"/>
       </w:pPr>
       <w:r>
-        <w:t xml:space="preserve">Tabla 2. Materiales de hardware utilizados en el sistema </w:t>
-      </w:r>
-      <w:proofErr w:type="spellStart"/>
-      <w:proofErr w:type="gramStart"/>
-      <w:r>
-        <w:t>SmartTemp</w:t>
-      </w:r>
-      <w:proofErr w:type="spellEnd"/>
-      <w:r>
-        <w:t xml:space="preserve">  2</w:t>
-      </w:r>
-      <w:proofErr w:type="gramEnd"/>
+        <w:t xml:space="preserve">Tabla 2. Materiales de hardware utilizados en el sistema SmartTemp.  3</w:t>
+      </w:r>
     </w:p>
     <w:p>
       <w:pPr>
@@ -4434,18 +4385,8 @@
         <w:ind w:left="396"/>
       </w:pPr>
       <w:r>
-        <w:t xml:space="preserve">Tabla 3. Infraestructura de red del sistema </w:t>
-      </w:r>
-      <w:proofErr w:type="spellStart"/>
-      <w:proofErr w:type="gramStart"/>
-      <w:r>
-        <w:t>SmartTemp</w:t>
-      </w:r>
-      <w:proofErr w:type="spellEnd"/>
-      <w:r>
-        <w:t xml:space="preserve">  3</w:t>
-      </w:r>
-      <w:proofErr w:type="gramEnd"/>
+        <w:t xml:space="preserve">Tabla 3. Infraestructura de red del sistema SmartTemp.  4</w:t>
+      </w:r>
     </w:p>
     <w:p>
       <w:pPr>
@@ -4453,13 +4394,8 @@
         <w:ind w:left="396"/>
       </w:pPr>
       <w:r>
-        <w:t xml:space="preserve">Tabla 4. Herramientas de software utilizadas en el </w:t>
-      </w:r>
-      <w:proofErr w:type="gramStart"/>
-      <w:r>
-        <w:t>desarrollo  4</w:t>
-      </w:r>
-      <w:proofErr w:type="gramEnd"/>
+        <w:t xml:space="preserve">Tabla 4. Herramientas de software utilizadas en el desarrollo.  5</w:t>
+      </w:r>
     </w:p>
     <w:p>
       <w:pPr>
@@ -4467,18 +4403,8 @@
         <w:ind w:left="396"/>
       </w:pPr>
       <w:r>
-        <w:t xml:space="preserve">Tabla 5. Criterios de aceptación del sistema </w:t>
-      </w:r>
-      <w:proofErr w:type="spellStart"/>
-      <w:proofErr w:type="gramStart"/>
-      <w:r>
-        <w:t>SmartTemp</w:t>
-      </w:r>
-      <w:proofErr w:type="spellEnd"/>
-      <w:r>
-        <w:t xml:space="preserve">  5</w:t>
-      </w:r>
-      <w:proofErr w:type="gramEnd"/>
+        <w:t xml:space="preserve">Tabla 4b. Comparación de metodologías de desarrollo para el sistema SmartTemp.  6</w:t>
+      </w:r>
     </w:p>
     <w:p>
       <w:pPr>
@@ -4486,21 +4412,8 @@
         <w:ind w:left="396"/>
       </w:pPr>
       <w:r>
-        <w:t xml:space="preserve">Tabla 6. </w:t>
-      </w:r>
-      <w:proofErr w:type="spellStart"/>
-      <w:r>
-        <w:t>Topics</w:t>
-      </w:r>
-      <w:proofErr w:type="spellEnd"/>
-      <w:r>
-        <w:t xml:space="preserve"> MQTT utilizados en la comunicación sensor-</w:t>
-      </w:r>
-      <w:proofErr w:type="gramStart"/>
-      <w:r>
-        <w:t>servidor  6</w:t>
-      </w:r>
-      <w:proofErr w:type="gramEnd"/>
+        <w:t xml:space="preserve">Tabla 5. Criterios de aceptación del sistema SmartTemp.  7</w:t>
+      </w:r>
     </w:p>
     <w:p>
       <w:pPr>
@@ -4508,18 +4421,8 @@
         <w:ind w:left="396"/>
       </w:pPr>
       <w:r>
-        <w:t xml:space="preserve">Tabla 7. Organización de las tablas de la base de datos </w:t>
-      </w:r>
-      <w:proofErr w:type="spellStart"/>
-      <w:proofErr w:type="gramStart"/>
-      <w:r>
-        <w:t>SmartTemp</w:t>
-      </w:r>
-      <w:proofErr w:type="spellEnd"/>
-      <w:r>
-        <w:t xml:space="preserve">  7</w:t>
-      </w:r>
-      <w:proofErr w:type="gramEnd"/>
+        <w:t xml:space="preserve">Tabla 6. Topics MQTT utilizados en la comunicación sensor-servidor.  8</w:t>
+      </w:r>
     </w:p>
     <w:p>
       <w:pPr>
@@ -4527,13 +4430,8 @@
         <w:ind w:left="396"/>
       </w:pPr>
       <w:r>
-        <w:t xml:space="preserve">Tabla 8. Resultados de precisión de medición por rango de </w:t>
-      </w:r>
-      <w:proofErr w:type="gramStart"/>
-      <w:r>
-        <w:t>temperatura  8</w:t>
-      </w:r>
-      <w:proofErr w:type="gramEnd"/>
+        <w:t xml:space="preserve">Tabla 7. Organización de las tablas de la base de datos SmartTemp.  9</w:t>
+      </w:r>
     </w:p>
     <w:p>
       <w:pPr>
@@ -4541,13 +4439,8 @@
         <w:ind w:left="396"/>
       </w:pPr>
       <w:r>
-        <w:t xml:space="preserve">Tabla 9. Disponibilidad del sistema durante el período de </w:t>
-      </w:r>
-      <w:proofErr w:type="gramStart"/>
-      <w:r>
-        <w:t>evaluación  9</w:t>
-      </w:r>
-      <w:proofErr w:type="gramEnd"/>
+        <w:t xml:space="preserve">Tabla 8. Configuración de sensores y dataloggers desplegados.  10</w:t>
+      </w:r>
     </w:p>
     <w:p>
       <w:pPr>
@@ -4555,21 +4448,8 @@
         <w:ind w:left="396"/>
       </w:pPr>
       <w:r>
-        <w:t xml:space="preserve">Tabla 10. Tiempo de conexión </w:t>
-      </w:r>
-      <w:proofErr w:type="spellStart"/>
-      <w:r>
-        <w:t>WiFi</w:t>
-      </w:r>
-      <w:proofErr w:type="spellEnd"/>
-      <w:r>
-        <w:t xml:space="preserve"> con y sin </w:t>
-      </w:r>
-      <w:proofErr w:type="gramStart"/>
-      <w:r>
-        <w:t>caché  10</w:t>
-      </w:r>
-      <w:proofErr w:type="gramEnd"/>
+        <w:t xml:space="preserve">Tabla 9. Resumen del período de evaluación.  11</w:t>
+      </w:r>
     </w:p>
     <w:p>
       <w:pPr>
@@ -4577,13 +4457,8 @@
         <w:ind w:left="396"/>
       </w:pPr>
       <w:r>
-        <w:t xml:space="preserve">Tabla 11. Resultados de pruebas de gestión </w:t>
-      </w:r>
-      <w:proofErr w:type="gramStart"/>
-      <w:r>
-        <w:t>offline  11</w:t>
-      </w:r>
-      <w:proofErr w:type="gramEnd"/>
+        <w:t xml:space="preserve">Tabla 10. Resultados de calibración puntual — Sensor Freezer (28cd8646d49c3f83).  12</w:t>
+      </w:r>
     </w:p>
     <w:p>
       <w:pPr>
@@ -4591,13 +4466,8 @@
         <w:ind w:left="396"/>
       </w:pPr>
       <w:r>
-        <w:t xml:space="preserve">Tabla 12. Resumen de excursiones </w:t>
-      </w:r>
-      <w:proofErr w:type="gramStart"/>
-      <w:r>
-        <w:t>detectadas  12</w:t>
-      </w:r>
-      <w:proofErr w:type="gramEnd"/>
+        <w:t xml:space="preserve">Tabla 11. Resultados de calibración puntual — Sensor Heladera 1 (28db3543d4e13c37).  13</w:t>
+      </w:r>
     </w:p>
     <w:p>
       <w:pPr>
@@ -4605,13 +4475,8 @@
         <w:ind w:left="396"/>
       </w:pPr>
       <w:r>
-        <w:t xml:space="preserve">Tabla 13. Comparación del registro de </w:t>
-      </w:r>
-      <w:proofErr w:type="gramStart"/>
-      <w:r>
-        <w:t>temperaturas  13</w:t>
-      </w:r>
-      <w:proofErr w:type="gramEnd"/>
+        <w:t xml:space="preserve">Tabla 12. Resultados del análisis Bland-Altman.  14</w:t>
+      </w:r>
     </w:p>
     <w:p>
       <w:pPr>
@@ -4619,21 +4484,8 @@
         <w:ind w:left="396"/>
       </w:pPr>
       <w:r>
-        <w:t xml:space="preserve">Tabla 14. Comparación de </w:t>
-      </w:r>
-      <w:proofErr w:type="spellStart"/>
-      <w:r>
-        <w:t>SmartTemp</w:t>
-      </w:r>
-      <w:proofErr w:type="spellEnd"/>
-      <w:r>
-        <w:t xml:space="preserve"> con soluciones </w:t>
-      </w:r>
-      <w:proofErr w:type="gramStart"/>
-      <w:r>
-        <w:t>comerciales  14</w:t>
-      </w:r>
-      <w:proofErr w:type="gramEnd"/>
+        <w:t xml:space="preserve">Tabla 13. Caracterización de la anomalía térmica detectada.  15</w:t>
+      </w:r>
     </w:p>
     <w:p>
       <w:pPr>
@@ -4641,13 +4493,152 @@
         <w:ind w:left="396"/>
       </w:pPr>
       <w:r>
-        <w:t xml:space="preserve">Tabla 16. Validación de criterios de aceptación (Tabla 5, Capítulo 3) contra resultados </w:t>
-      </w:r>
-      <w:proofErr w:type="gramStart"/>
-      <w:r>
-        <w:t>reales  15</w:t>
-      </w:r>
-      <w:proofErr w:type="gramEnd"/>
+        <w:t xml:space="preserve">Tabla 14. Disponibilidad del sistema durante el período de evaluación (113 días).  16</w:t>
+      </w:r>
+    </w:p>
+    <w:p>
+      <w:pPr>
+        <w:spacing w:after="60" w:line="276" w:lineRule="auto"/>
+        <w:ind w:left="396"/>
+      </w:pPr>
+      <w:r>
+        <w:t xml:space="preserve">Tabla 14a. Métricas de confiabilidad en operación estable (Favaloro, 28 días, modo continuo).  17</w:t>
+      </w:r>
+    </w:p>
+    <w:p>
+      <w:pPr>
+        <w:spacing w:after="60" w:line="276" w:lineRule="auto"/>
+        <w:ind w:left="396"/>
+      </w:pPr>
+      <w:r>
+        <w:t xml:space="preserve">Tabla 14b. Métricas de confiabilidad del período completo (113 días).  18</w:t>
+      </w:r>
+    </w:p>
+    <w:p>
+      <w:pPr>
+        <w:spacing w:after="60" w:line="276" w:lineRule="auto"/>
+        <w:ind w:left="396"/>
+      </w:pPr>
+      <w:r>
+        <w:t xml:space="preserve">Tabla 15. Frecuencia de medición durante todo el período.  19</w:t>
+      </w:r>
+    </w:p>
+    <w:p>
+      <w:pPr>
+        <w:spacing w:after="60" w:line="276" w:lineRule="auto"/>
+        <w:ind w:left="396"/>
+      </w:pPr>
+      <w:r>
+        <w:t xml:space="preserve">Tabla 16. Excursiones de temperatura detectadas y documentadas.  20</w:t>
+      </w:r>
+    </w:p>
+    <w:p>
+      <w:pPr>
+        <w:spacing w:after="60" w:line="276" w:lineRule="auto"/>
+        <w:ind w:left="396"/>
+      </w:pPr>
+      <w:r>
+        <w:t xml:space="preserve">Tabla 17. Eventos de recuperación offline registrados.  21</w:t>
+      </w:r>
+    </w:p>
+    <w:p>
+      <w:pPr>
+        <w:spacing w:after="60" w:line="276" w:lineRule="auto"/>
+        <w:ind w:left="396"/>
+      </w:pPr>
+      <w:r>
+        <w:t xml:space="preserve">Tabla 18. Resultados de la prueba de recuperación offline (23-27 abril 2026).  22</w:t>
+      </w:r>
+    </w:p>
+    <w:p>
+      <w:pPr>
+        <w:spacing w:after="60" w:line="276" w:lineRule="auto"/>
+        <w:ind w:left="396"/>
+      </w:pPr>
+      <w:r>
+        <w:t xml:space="preserve">Tabla 19. Tiempo de conexión WiFi.  23</w:t>
+      </w:r>
+    </w:p>
+    <w:p>
+      <w:pPr>
+        <w:spacing w:after="60" w:line="276" w:lineRule="auto"/>
+        <w:ind w:left="396"/>
+      </w:pPr>
+      <w:r>
+        <w:t xml:space="preserve">Tabla 20. Transiciones de modo registradas.  24</w:t>
+      </w:r>
+    </w:p>
+    <w:p>
+      <w:pPr>
+        <w:spacing w:after="60" w:line="276" w:lineRule="auto"/>
+        <w:ind w:left="396"/>
+      </w:pPr>
+      <w:r>
+        <w:t xml:space="preserve">Tabla 21. Reinicios del servidor VPS durante el período de evaluación.  25</w:t>
+      </w:r>
+    </w:p>
+    <w:p>
+      <w:pPr>
+        <w:spacing w:after="60" w:line="276" w:lineRule="auto"/>
+        <w:ind w:left="396"/>
+      </w:pPr>
+      <w:r>
+        <w:t xml:space="preserve">Tabla 22. Resumen de autonomía ante cortes.  26</w:t>
+      </w:r>
+    </w:p>
+    <w:p>
+      <w:pPr>
+        <w:spacing w:after="60" w:line="276" w:lineRule="auto"/>
+        <w:ind w:left="396"/>
+      </w:pPr>
+      <w:r>
+        <w:t xml:space="preserve">Tabla 23. Resumen del sistema de notificaciones (6-may a 3-jul 2026).  27</w:t>
+      </w:r>
+    </w:p>
+    <w:p>
+      <w:pPr>
+        <w:spacing w:after="60" w:line="276" w:lineRule="auto"/>
+        <w:ind w:left="396"/>
+      </w:pPr>
+      <w:r>
+        <w:t xml:space="preserve">Tabla 24. Cruce entre reinicios del VPS y notificaciones automáticas.  28</w:t>
+      </w:r>
+    </w:p>
+    <w:p>
+      <w:pPr>
+        <w:spacing w:after="60" w:line="276" w:lineRule="auto"/>
+        <w:ind w:left="396"/>
+      </w:pPr>
+      <w:r>
+        <w:t xml:space="preserve">Tabla 25a. Registros de auditoría — Fase 1: Prueba-producción (casa, 12-mar a 4-jun 2026).  29</w:t>
+      </w:r>
+    </w:p>
+    <w:p>
+      <w:pPr>
+        <w:spacing w:after="60" w:line="276" w:lineRule="auto"/>
+        <w:ind w:left="396"/>
+      </w:pPr>
+      <w:r>
+        <w:t xml:space="preserve">Tabla 25b. Registros de auditoría — Fase 2: Operación en sector real (Favaloro, 5-jun a 3-jul 2026).  30</w:t>
+      </w:r>
+    </w:p>
+    <w:p>
+      <w:pPr>
+        <w:spacing w:after="60" w:line="276" w:lineRule="auto"/>
+        <w:ind w:left="396"/>
+      </w:pPr>
+      <w:r>
+        <w:t xml:space="preserve">Tabla 26. Comparación de SmartTemp con soluciones comerciales.  31</w:t>
+      </w:r>
+    </w:p>
+    <w:p>
+      <w:pPr>
+        <w:spacing w:after="60" w:line="276" w:lineRule="auto"/>
+        <w:ind w:left="396"/>
+      </w:pPr>
+      <w:r>
+        <w:t xml:space="preserve">Tabla 27. Evaluación final de criterios de aceptación.  32</w:t>
+      </w:r>
     </w:p>
     <w:p>
       <w:r>
@@ -21591,6 +21582,748 @@
         <w:t>Cuando el sistema opera en modo continuo con conectividad estable, la disponibilidad supera el 99%.</w:t>
       </w:r>
     </w:p>
+    <w:p>
+      <w:pPr>
+        <w:pStyle w:val="Ttulo3"/>
+      </w:pPr>
+      <w:r>
+        <w:t>5.3.4 Métricas de confiabilidad (MTBF y MTTR)</w:t>
+      </w:r>
+    </w:p>
+    <w:p>
+      <w:r>
+        <w:t>Como complemento a la evaluación de disponibilidad, se calcularon dos métricas estándar de la ingeniería de confiabilidad: el MTBF (Mean Time Between Failures o tiempo medio entre fallas) y el MTTR (Mean Time To Recovery o tiempo medio de recuperación). La disponibilidad se relaciona con ambas mediante A = MTBF / (MTBF + MTTR). Para este cálculo se definió como falla todo intervalo (gap) superior a 15 minutos entre dos mediciones consecutivas de un mismo sensor.</w:t>
+      </w:r>
+    </w:p>
+    <w:p>
+      <w:r>
+        <w:rPr>
+          <w:b/>
+        </w:rPr>
+        <w:t>Tabla 14a.</w:t>
+      </w:r>
+      <w:r>
+        <w:t xml:space="preserve"> Métricas de confiabilidad en operación estable (Favaloro, 28 días, modo continuo).</w:t>
+      </w:r>
+    </w:p>
+    <w:tbl>
+      <w:tblPr>
+        <w:tblLook w:firstColumn="1" w:firstRow="1" w:lastColumn="0" w:lastRow="0" w:noHBand="0" w:noVBand="1" w:val="04A0"/>
+        <w:tblW w:w="5000" w:type="pct"/>
+        <w:tblBorders>
+          <w:top w:val="single" w:sz="4" w:space="0" w:color="auto"/>
+          <w:left w:val="single" w:sz="4" w:space="0" w:color="auto"/>
+          <w:bottom w:val="single" w:sz="4" w:space="0" w:color="auto"/>
+          <w:right w:val="single" w:sz="4" w:space="0" w:color="auto"/>
+          <w:insideH w:val="single" w:sz="4" w:space="0" w:color="auto"/>
+          <w:insideV w:val="single" w:sz="4" w:space="0" w:color="auto"/>
+        </w:tblBorders>
+      </w:tblPr>
+      <w:tblGrid>
+        <w:gridCol w:w="3009"/>
+        <w:gridCol w:w="3009"/>
+        <w:gridCol w:w="3009"/>
+      </w:tblGrid>
+      <w:tr>
+        <w:tc>
+          <w:tcPr>
+            <w:tcW w:type="dxa" w:w="3009"/>
+            <w:shd w:val="solid" w:color="E8E8E8" w:fill="auto"/>
+            <w:vAlign w:val="center"/>
+          </w:tcPr>
+          <w:p>
+            <w:pPr>
+              <w:spacing w:before="40" w:after="40"/>
+            </w:pPr>
+            <w:r/>
+            <w:r>
+              <w:rPr>
+                <w:b/>
+              </w:rPr>
+              <w:t>Métrica</w:t>
+            </w:r>
+          </w:p>
+        </w:tc>
+        <w:tc>
+          <w:tcPr>
+            <w:tcW w:type="dxa" w:w="3009"/>
+            <w:shd w:val="solid" w:color="E8E8E8" w:fill="auto"/>
+            <w:vAlign w:val="center"/>
+          </w:tcPr>
+          <w:p>
+            <w:pPr>
+              <w:spacing w:before="40" w:after="40"/>
+            </w:pPr>
+            <w:r/>
+            <w:r>
+              <w:rPr>
+                <w:b/>
+              </w:rPr>
+              <w:t>Freezer (28cd8646)</w:t>
+            </w:r>
+          </w:p>
+        </w:tc>
+        <w:tc>
+          <w:tcPr>
+            <w:tcW w:type="dxa" w:w="3009"/>
+            <w:shd w:val="solid" w:color="E8E8E8" w:fill="auto"/>
+            <w:vAlign w:val="center"/>
+          </w:tcPr>
+          <w:p>
+            <w:pPr>
+              <w:spacing w:before="40" w:after="40"/>
+            </w:pPr>
+            <w:r/>
+            <w:r>
+              <w:rPr>
+                <w:b/>
+              </w:rPr>
+              <w:t>Heladera 1 (28db3543)</w:t>
+            </w:r>
+          </w:p>
+        </w:tc>
+      </w:tr>
+      <w:tr>
+        <w:tc>
+          <w:tcPr>
+            <w:tcW w:type="dxa" w:w="3009"/>
+          </w:tcPr>
+          <w:p>
+            <w:pPr>
+              <w:spacing w:before="40" w:after="40"/>
+            </w:pPr>
+            <w:r/>
+            <w:r>
+              <w:t>Período evaluado</w:t>
+            </w:r>
+          </w:p>
+        </w:tc>
+        <w:tc>
+          <w:tcPr>
+            <w:tcW w:type="dxa" w:w="3009"/>
+          </w:tcPr>
+          <w:p>
+            <w:pPr>
+              <w:spacing w:before="40" w:after="40"/>
+            </w:pPr>
+            <w:r/>
+            <w:r>
+              <w:t>671 h (28 días)</w:t>
+            </w:r>
+          </w:p>
+        </w:tc>
+        <w:tc>
+          <w:tcPr>
+            <w:tcW w:type="dxa" w:w="3009"/>
+          </w:tcPr>
+          <w:p>
+            <w:pPr>
+              <w:spacing w:before="40" w:after="40"/>
+            </w:pPr>
+            <w:r/>
+            <w:r>
+              <w:t>671 h (28 días)</w:t>
+            </w:r>
+          </w:p>
+        </w:tc>
+      </w:tr>
+      <w:tr>
+        <w:tc>
+          <w:tcPr>
+            <w:tcW w:type="dxa" w:w="3009"/>
+          </w:tcPr>
+          <w:p>
+            <w:pPr>
+              <w:spacing w:before="40" w:after="40"/>
+            </w:pPr>
+            <w:r/>
+            <w:r>
+              <w:t>Total de mediciones</w:t>
+            </w:r>
+          </w:p>
+        </w:tc>
+        <w:tc>
+          <w:tcPr>
+            <w:tcW w:type="dxa" w:w="3009"/>
+          </w:tcPr>
+          <w:p>
+            <w:pPr>
+              <w:spacing w:before="40" w:after="40"/>
+            </w:pPr>
+            <w:r/>
+            <w:r>
+              <w:t>7.843</w:t>
+            </w:r>
+          </w:p>
+        </w:tc>
+        <w:tc>
+          <w:tcPr>
+            <w:tcW w:type="dxa" w:w="3009"/>
+          </w:tcPr>
+          <w:p>
+            <w:pPr>
+              <w:spacing w:before="40" w:after="40"/>
+            </w:pPr>
+            <w:r/>
+            <w:r>
+              <w:t>7.883</w:t>
+            </w:r>
+          </w:p>
+        </w:tc>
+      </w:tr>
+      <w:tr>
+        <w:tc>
+          <w:tcPr>
+            <w:tcW w:type="dxa" w:w="3009"/>
+          </w:tcPr>
+          <w:p>
+            <w:pPr>
+              <w:spacing w:before="40" w:after="40"/>
+            </w:pPr>
+            <w:r/>
+            <w:r>
+              <w:t>Fallas (gaps &gt; 15 min)</w:t>
+            </w:r>
+          </w:p>
+        </w:tc>
+        <w:tc>
+          <w:tcPr>
+            <w:tcW w:type="dxa" w:w="3009"/>
+          </w:tcPr>
+          <w:p>
+            <w:pPr>
+              <w:spacing w:before="40" w:after="40"/>
+            </w:pPr>
+            <w:r/>
+            <w:r>
+              <w:t>28</w:t>
+            </w:r>
+          </w:p>
+        </w:tc>
+        <w:tc>
+          <w:tcPr>
+            <w:tcW w:type="dxa" w:w="3009"/>
+          </w:tcPr>
+          <w:p>
+            <w:pPr>
+              <w:spacing w:before="40" w:after="40"/>
+            </w:pPr>
+            <w:r/>
+            <w:r>
+              <w:t>1</w:t>
+            </w:r>
+          </w:p>
+        </w:tc>
+      </w:tr>
+      <w:tr>
+        <w:tc>
+          <w:tcPr>
+            <w:tcW w:type="dxa" w:w="3009"/>
+          </w:tcPr>
+          <w:p>
+            <w:pPr>
+              <w:spacing w:before="40" w:after="40"/>
+            </w:pPr>
+            <w:r/>
+            <w:r>
+              <w:rPr>
+                <w:b/>
+              </w:rPr>
+              <w:t>MTBF</w:t>
+            </w:r>
+          </w:p>
+        </w:tc>
+        <w:tc>
+          <w:tcPr>
+            <w:tcW w:type="dxa" w:w="3009"/>
+          </w:tcPr>
+          <w:p>
+            <w:pPr>
+              <w:spacing w:before="40" w:after="40"/>
+            </w:pPr>
+            <w:r/>
+            <w:r>
+              <w:t>23,96 h</w:t>
+            </w:r>
+          </w:p>
+        </w:tc>
+        <w:tc>
+          <w:tcPr>
+            <w:tcW w:type="dxa" w:w="3009"/>
+          </w:tcPr>
+          <w:p>
+            <w:pPr>
+              <w:spacing w:before="40" w:after="40"/>
+            </w:pPr>
+            <w:r/>
+            <w:r>
+              <w:t>671 h</w:t>
+            </w:r>
+          </w:p>
+        </w:tc>
+      </w:tr>
+      <w:tr>
+        <w:tc>
+          <w:tcPr>
+            <w:tcW w:type="dxa" w:w="3009"/>
+          </w:tcPr>
+          <w:p>
+            <w:pPr>
+              <w:spacing w:before="40" w:after="40"/>
+            </w:pPr>
+            <w:r/>
+            <w:r>
+              <w:t>MTTR promedio</w:t>
+            </w:r>
+          </w:p>
+        </w:tc>
+        <w:tc>
+          <w:tcPr>
+            <w:tcW w:type="dxa" w:w="3009"/>
+          </w:tcPr>
+          <w:p>
+            <w:pPr>
+              <w:spacing w:before="40" w:after="40"/>
+            </w:pPr>
+            <w:r/>
+            <w:r>
+              <w:t>28,4 min</w:t>
+            </w:r>
+          </w:p>
+        </w:tc>
+        <w:tc>
+          <w:tcPr>
+            <w:tcW w:type="dxa" w:w="3009"/>
+          </w:tcPr>
+          <w:p>
+            <w:pPr>
+              <w:spacing w:before="40" w:after="40"/>
+            </w:pPr>
+            <w:r/>
+            <w:r>
+              <w:t>5,3 h</w:t>
+            </w:r>
+          </w:p>
+        </w:tc>
+      </w:tr>
+      <w:tr>
+        <w:tc>
+          <w:tcPr>
+            <w:tcW w:type="dxa" w:w="3009"/>
+          </w:tcPr>
+          <w:p>
+            <w:pPr>
+              <w:spacing w:before="40" w:after="40"/>
+            </w:pPr>
+            <w:r/>
+            <w:r>
+              <w:rPr>
+                <w:b/>
+              </w:rPr>
+              <w:t>Disponibilidad calculada</w:t>
+            </w:r>
+          </w:p>
+        </w:tc>
+        <w:tc>
+          <w:tcPr>
+            <w:tcW w:type="dxa" w:w="3009"/>
+          </w:tcPr>
+          <w:p>
+            <w:pPr>
+              <w:spacing w:before="40" w:after="40"/>
+            </w:pPr>
+            <w:r/>
+            <w:r>
+              <w:t>98,1 %</w:t>
+            </w:r>
+          </w:p>
+        </w:tc>
+        <w:tc>
+          <w:tcPr>
+            <w:tcW w:type="dxa" w:w="3009"/>
+          </w:tcPr>
+          <w:p>
+            <w:pPr>
+              <w:spacing w:before="40" w:after="40"/>
+            </w:pPr>
+            <w:r/>
+            <w:r>
+              <w:t>99,2 %</w:t>
+            </w:r>
+          </w:p>
+        </w:tc>
+      </w:tr>
+    </w:tbl>
+    <w:p>
+      <w:r>
+        <w:t>En operación estable, el sensor Heladera 1 registró una sola falla en 28 días (MTBF = 671 h), atribuible a la inestabilidad del servidor VPS de los días 27-28 de junio (Tabla 21) y no al sensor. El sensor Freezer presentó un MTBF de 23,96 h con un MTTR promedio de 28,4 min: sus 28 "fallas" fueron gaps de 21 a 37 minutos correspondientes a micro-interrupciones del enlace WiFi que el sistema resolvió de forma automática, sin intervención humana. La disponibilidad resultante (98,1 % y 99,2 %) es coherente con los valores reportados en la sección 5.3.3 para el modo continuo estable (99,3-99,7 %).</w:t>
+      </w:r>
+    </w:p>
+    <w:p>
+      <w:r>
+        <w:rPr>
+          <w:b/>
+        </w:rPr>
+        <w:t>Tabla 14b.</w:t>
+      </w:r>
+      <w:r>
+        <w:t xml:space="preserve"> Métricas de confiabilidad del período completo (113 días).</w:t>
+      </w:r>
+    </w:p>
+    <w:tbl>
+      <w:tblPr>
+        <w:tblLook w:firstColumn="1" w:firstRow="1" w:lastColumn="0" w:lastRow="0" w:noHBand="0" w:noVBand="1" w:val="04A0"/>
+        <w:tblW w:w="5000" w:type="pct"/>
+        <w:tblBorders>
+          <w:top w:val="single" w:sz="4" w:space="0" w:color="auto"/>
+          <w:left w:val="single" w:sz="4" w:space="0" w:color="auto"/>
+          <w:bottom w:val="single" w:sz="4" w:space="0" w:color="auto"/>
+          <w:right w:val="single" w:sz="4" w:space="0" w:color="auto"/>
+          <w:insideH w:val="single" w:sz="4" w:space="0" w:color="auto"/>
+          <w:insideV w:val="single" w:sz="4" w:space="0" w:color="auto"/>
+        </w:tblBorders>
+      </w:tblPr>
+      <w:tblGrid>
+        <w:gridCol w:w="3009"/>
+        <w:gridCol w:w="3009"/>
+        <w:gridCol w:w="3009"/>
+      </w:tblGrid>
+      <w:tr>
+        <w:tc>
+          <w:tcPr>
+            <w:tcW w:type="dxa" w:w="3009"/>
+            <w:shd w:val="solid" w:color="E8E8E8" w:fill="auto"/>
+            <w:vAlign w:val="center"/>
+          </w:tcPr>
+          <w:p>
+            <w:pPr>
+              <w:spacing w:before="40" w:after="40"/>
+            </w:pPr>
+            <w:r/>
+            <w:r>
+              <w:rPr>
+                <w:b/>
+              </w:rPr>
+              <w:t>Métrica</w:t>
+            </w:r>
+          </w:p>
+        </w:tc>
+        <w:tc>
+          <w:tcPr>
+            <w:tcW w:type="dxa" w:w="3009"/>
+            <w:shd w:val="solid" w:color="E8E8E8" w:fill="auto"/>
+            <w:vAlign w:val="center"/>
+          </w:tcPr>
+          <w:p>
+            <w:pPr>
+              <w:spacing w:before="40" w:after="40"/>
+            </w:pPr>
+            <w:r/>
+            <w:r>
+              <w:rPr>
+                <w:b/>
+              </w:rPr>
+              <w:t>Freezer (28cd8646)</w:t>
+            </w:r>
+          </w:p>
+        </w:tc>
+        <w:tc>
+          <w:tcPr>
+            <w:tcW w:type="dxa" w:w="3009"/>
+            <w:shd w:val="solid" w:color="E8E8E8" w:fill="auto"/>
+            <w:vAlign w:val="center"/>
+          </w:tcPr>
+          <w:p>
+            <w:pPr>
+              <w:spacing w:before="40" w:after="40"/>
+            </w:pPr>
+            <w:r/>
+            <w:r>
+              <w:rPr>
+                <w:b/>
+              </w:rPr>
+              <w:t>Heladera 1 (28db3543)</w:t>
+            </w:r>
+          </w:p>
+        </w:tc>
+      </w:tr>
+      <w:tr>
+        <w:tc>
+          <w:tcPr>
+            <w:tcW w:type="dxa" w:w="3009"/>
+          </w:tcPr>
+          <w:p>
+            <w:pPr>
+              <w:spacing w:before="40" w:after="40"/>
+            </w:pPr>
+            <w:r/>
+            <w:r>
+              <w:t>Período evaluado</w:t>
+            </w:r>
+          </w:p>
+        </w:tc>
+        <w:tc>
+          <w:tcPr>
+            <w:tcW w:type="dxa" w:w="3009"/>
+          </w:tcPr>
+          <w:p>
+            <w:pPr>
+              <w:spacing w:before="40" w:after="40"/>
+            </w:pPr>
+            <w:r/>
+            <w:r>
+              <w:t>2.702 h (113 días)</w:t>
+            </w:r>
+          </w:p>
+        </w:tc>
+        <w:tc>
+          <w:tcPr>
+            <w:tcW w:type="dxa" w:w="3009"/>
+          </w:tcPr>
+          <w:p>
+            <w:pPr>
+              <w:spacing w:before="40" w:after="40"/>
+            </w:pPr>
+            <w:r/>
+            <w:r>
+              <w:t>2.702 h (113 días)</w:t>
+            </w:r>
+          </w:p>
+        </w:tc>
+      </w:tr>
+      <w:tr>
+        <w:tc>
+          <w:tcPr>
+            <w:tcW w:type="dxa" w:w="3009"/>
+          </w:tcPr>
+          <w:p>
+            <w:pPr>
+              <w:spacing w:before="40" w:after="40"/>
+            </w:pPr>
+            <w:r/>
+            <w:r>
+              <w:t>Fallas (gaps &gt; 15 min)</w:t>
+            </w:r>
+          </w:p>
+        </w:tc>
+        <w:tc>
+          <w:tcPr>
+            <w:tcW w:type="dxa" w:w="3009"/>
+          </w:tcPr>
+          <w:p>
+            <w:pPr>
+              <w:spacing w:before="40" w:after="40"/>
+            </w:pPr>
+            <w:r/>
+            <w:r>
+              <w:t>1.472</w:t>
+            </w:r>
+          </w:p>
+        </w:tc>
+        <w:tc>
+          <w:tcPr>
+            <w:tcW w:type="dxa" w:w="3009"/>
+          </w:tcPr>
+          <w:p>
+            <w:pPr>
+              <w:spacing w:before="40" w:after="40"/>
+            </w:pPr>
+            <w:r/>
+            <w:r>
+              <w:t>679</w:t>
+            </w:r>
+          </w:p>
+        </w:tc>
+      </w:tr>
+      <w:tr>
+        <w:tc>
+          <w:tcPr>
+            <w:tcW w:type="dxa" w:w="3009"/>
+          </w:tcPr>
+          <w:p>
+            <w:pPr>
+              <w:spacing w:before="40" w:after="40"/>
+            </w:pPr>
+            <w:r/>
+            <w:r>
+              <w:rPr>
+                <w:b/>
+              </w:rPr>
+              <w:t>MTBF</w:t>
+            </w:r>
+          </w:p>
+        </w:tc>
+        <w:tc>
+          <w:tcPr>
+            <w:tcW w:type="dxa" w:w="3009"/>
+          </w:tcPr>
+          <w:p>
+            <w:pPr>
+              <w:spacing w:before="40" w:after="40"/>
+            </w:pPr>
+            <w:r/>
+            <w:r>
+              <w:t>1,84 h</w:t>
+            </w:r>
+          </w:p>
+        </w:tc>
+        <w:tc>
+          <w:tcPr>
+            <w:tcW w:type="dxa" w:w="3009"/>
+          </w:tcPr>
+          <w:p>
+            <w:pPr>
+              <w:spacing w:before="40" w:after="40"/>
+            </w:pPr>
+            <w:r/>
+            <w:r>
+              <w:t>3,98 h</w:t>
+            </w:r>
+          </w:p>
+        </w:tc>
+      </w:tr>
+      <w:tr>
+        <w:tc>
+          <w:tcPr>
+            <w:tcW w:type="dxa" w:w="3009"/>
+          </w:tcPr>
+          <w:p>
+            <w:pPr>
+              <w:spacing w:before="40" w:after="40"/>
+            </w:pPr>
+            <w:r/>
+            <w:r>
+              <w:t>MTTR promedio</w:t>
+            </w:r>
+          </w:p>
+        </w:tc>
+        <w:tc>
+          <w:tcPr>
+            <w:tcW w:type="dxa" w:w="3009"/>
+          </w:tcPr>
+          <w:p>
+            <w:pPr>
+              <w:spacing w:before="40" w:after="40"/>
+            </w:pPr>
+            <w:r/>
+            <w:r>
+              <w:t>44,3 min</w:t>
+            </w:r>
+          </w:p>
+        </w:tc>
+        <w:tc>
+          <w:tcPr>
+            <w:tcW w:type="dxa" w:w="3009"/>
+          </w:tcPr>
+          <w:p>
+            <w:pPr>
+              <w:spacing w:before="40" w:after="40"/>
+            </w:pPr>
+            <w:r/>
+            <w:r>
+              <w:t>75,7 min</w:t>
+            </w:r>
+          </w:p>
+        </w:tc>
+      </w:tr>
+      <w:tr>
+        <w:tc>
+          <w:tcPr>
+            <w:tcW w:type="dxa" w:w="3009"/>
+          </w:tcPr>
+          <w:p>
+            <w:pPr>
+              <w:spacing w:before="40" w:after="40"/>
+            </w:pPr>
+            <w:r/>
+            <w:r>
+              <w:t>MTTR máximo</w:t>
+            </w:r>
+          </w:p>
+        </w:tc>
+        <w:tc>
+          <w:tcPr>
+            <w:tcW w:type="dxa" w:w="3009"/>
+          </w:tcPr>
+          <w:p>
+            <w:pPr>
+              <w:spacing w:before="40" w:after="40"/>
+            </w:pPr>
+            <w:r/>
+            <w:r>
+              <w:t>20,9 h</w:t>
+            </w:r>
+          </w:p>
+        </w:tc>
+        <w:tc>
+          <w:tcPr>
+            <w:tcW w:type="dxa" w:w="3009"/>
+          </w:tcPr>
+          <w:p>
+            <w:pPr>
+              <w:spacing w:before="40" w:after="40"/>
+            </w:pPr>
+            <w:r/>
+            <w:r>
+              <w:t>212,6 h</w:t>
+            </w:r>
+          </w:p>
+        </w:tc>
+      </w:tr>
+      <w:tr>
+        <w:tc>
+          <w:tcPr>
+            <w:tcW w:type="dxa" w:w="3009"/>
+          </w:tcPr>
+          <w:p>
+            <w:pPr>
+              <w:spacing w:before="40" w:after="40"/>
+            </w:pPr>
+            <w:r/>
+            <w:r>
+              <w:rPr>
+                <w:b/>
+              </w:rPr>
+              <w:t>Disponibilidad calculada</w:t>
+            </w:r>
+          </w:p>
+        </w:tc>
+        <w:tc>
+          <w:tcPr>
+            <w:tcW w:type="dxa" w:w="3009"/>
+          </w:tcPr>
+          <w:p>
+            <w:pPr>
+              <w:spacing w:before="40" w:after="40"/>
+            </w:pPr>
+            <w:r/>
+            <w:r>
+              <w:t>71,4 %</w:t>
+            </w:r>
+          </w:p>
+        </w:tc>
+        <w:tc>
+          <w:tcPr>
+            <w:tcW w:type="dxa" w:w="3009"/>
+          </w:tcPr>
+          <w:p>
+            <w:pPr>
+              <w:spacing w:before="40" w:after="40"/>
+            </w:pPr>
+            <w:r/>
+            <w:r>
+              <w:t>76,1 %</w:t>
+            </w:r>
+          </w:p>
+        </w:tc>
+      </w:tr>
+    </w:tbl>
+    <w:p>
+      <w:r>
+        <w:t>Los valores de MTBF del período completo son bajos porque incorporan las condiciones propias de la fase de desarrollo (uso intencional de deep sleep con intervalos de 10 a 60 min, cambios de modo, red WiFi doméstica y el traslado físico de los sensores), y no reflejan la capacidad del sistema en producción. Esta diferencia es consistente con la separación por fases descrita en las secciones 5.3.2 y 5.10. En conjunto, el bajo MTTR observado en operación estable evidencia una capacidad de auto-recuperación eficiente, atribuible al mecanismo de reconexión WiFi con caché de canal y BSSID en EEPROM (sección 5.7).</w:t>
+      </w:r>
+    </w:p>
+    <w:p/>
     <w:p>
       <w:pPr>
         <w:pStyle w:val="Ttulo2"/>
@@ -46684,6 +47417,789 @@
       <w:proofErr w:type="gramEnd"/>
       <w:r>
         <w:t>incluyendo precisión, disponibilidad y capacidad de almacenamiento.</w:t>
+      </w:r>
+    </w:p>
+    <w:p>
+      <w:r>
+        <w:br w:type="page"/>
+      </w:r>
+    </w:p>
+    <w:p>
+      <w:pPr>
+        <w:pStyle w:val="Ttulo2"/>
+      </w:pPr>
+      <w:r>
+        <w:t>Anexo M: Detección Automática de Anomalías Térmicas</w:t>
+      </w:r>
+    </w:p>
+    <w:p>
+      <w:r>
+        <w:t>Como prueba de concepto de detección automática de anomalías, se aplicó un algoritmo basado en reglas sobre los datos del sensor Freezer (28cd8646) durante el período de validación en Favaloro (8 de junio a 3 de julio de 2026; 7.151 mediciones). El objetivo fue demostrar que la anomalía térmica de la cámara de frío descrita en la sección 5.2.3 puede detectarse de forma automática, sin intervención humana y sin necesidad de modelos de aprendizaje automático.</w:t>
+      </w:r>
+    </w:p>
+    <w:p>
+      <w:pPr>
+        <w:pStyle w:val="Ttulo3"/>
+      </w:pPr>
+      <w:r>
+        <w:t>M.1 Método</w:t>
+      </w:r>
+    </w:p>
+    <w:p>
+      <w:r>
+        <w:t>Se combinaron dos criterios de detección complementarios:</w:t>
+      </w:r>
+    </w:p>
+    <w:p>
+      <w:r>
+        <w:t>• Amplitud por ventana horaria: para cada hora se calcula la diferencia entre la temperatura máxima y mínima (ventanas de 12 mediciones) y se clasifica la ventana según su amplitud.</w:t>
+      </w:r>
+    </w:p>
+    <w:p>
+      <w:r>
+        <w:t>• Fuera de rango absoluto: se define el rango aceptable para una heladera (2 °C a 8 °C) y se marca como anomalía toda medición fuera de ese rango.</w:t>
+      </w:r>
+    </w:p>
+    <w:p>
+      <w:pPr>
+        <w:pStyle w:val="Ttulo3"/>
+      </w:pPr>
+      <w:r>
+        <w:t>M.2 Resultados</w:t>
+      </w:r>
+    </w:p>
+    <w:p>
+      <w:r>
+        <w:t>Sobre un total de 600 ventanas horarias evaluadas, la clasificación por amplitud fue la siguiente:</w:t>
+      </w:r>
+    </w:p>
+    <w:p>
+      <w:pPr>
+        <w:pStyle w:val="Ttulo4"/>
+      </w:pPr>
+      <w:r>
+        <w:t>Clasificación de ventanas horarias (600 ventanas evaluadas)</w:t>
+      </w:r>
+    </w:p>
+    <w:tbl>
+      <w:tblPr>
+        <w:tblLook w:firstColumn="1" w:firstRow="1" w:lastColumn="0" w:lastRow="0" w:noHBand="0" w:noVBand="1" w:val="04A0"/>
+        <w:tblW w:w="5000" w:type="pct"/>
+        <w:tblBorders>
+          <w:top w:val="single" w:sz="4" w:space="0" w:color="auto"/>
+          <w:left w:val="single" w:sz="4" w:space="0" w:color="auto"/>
+          <w:bottom w:val="single" w:sz="4" w:space="0" w:color="auto"/>
+          <w:right w:val="single" w:sz="4" w:space="0" w:color="auto"/>
+          <w:insideH w:val="single" w:sz="4" w:space="0" w:color="auto"/>
+          <w:insideV w:val="single" w:sz="4" w:space="0" w:color="auto"/>
+        </w:tblBorders>
+      </w:tblPr>
+      <w:tblGrid>
+        <w:gridCol w:w="2256"/>
+        <w:gridCol w:w="2256"/>
+        <w:gridCol w:w="2256"/>
+        <w:gridCol w:w="2256"/>
+      </w:tblGrid>
+      <w:tr>
+        <w:tc>
+          <w:tcPr>
+            <w:tcW w:type="dxa" w:w="2256"/>
+            <w:shd w:val="solid" w:color="E8E8E8" w:fill="auto"/>
+            <w:vAlign w:val="center"/>
+          </w:tcPr>
+          <w:p>
+            <w:pPr>
+              <w:spacing w:before="40" w:after="40"/>
+            </w:pPr>
+            <w:r/>
+            <w:r>
+              <w:rPr>
+                <w:b/>
+              </w:rPr>
+              <w:t>Clasificación</w:t>
+            </w:r>
+          </w:p>
+        </w:tc>
+        <w:tc>
+          <w:tcPr>
+            <w:tcW w:type="dxa" w:w="2256"/>
+            <w:shd w:val="solid" w:color="E8E8E8" w:fill="auto"/>
+            <w:vAlign w:val="center"/>
+          </w:tcPr>
+          <w:p>
+            <w:pPr>
+              <w:spacing w:before="40" w:after="40"/>
+            </w:pPr>
+            <w:r/>
+            <w:r>
+              <w:rPr>
+                <w:b/>
+              </w:rPr>
+              <w:t>Ventanas</w:t>
+            </w:r>
+          </w:p>
+        </w:tc>
+        <w:tc>
+          <w:tcPr>
+            <w:tcW w:type="dxa" w:w="2256"/>
+            <w:shd w:val="solid" w:color="E8E8E8" w:fill="auto"/>
+            <w:vAlign w:val="center"/>
+          </w:tcPr>
+          <w:p>
+            <w:pPr>
+              <w:spacing w:before="40" w:after="40"/>
+            </w:pPr>
+            <w:r/>
+            <w:r>
+              <w:rPr>
+                <w:b/>
+              </w:rPr>
+              <w:t>%</w:t>
+            </w:r>
+          </w:p>
+        </w:tc>
+        <w:tc>
+          <w:tcPr>
+            <w:tcW w:type="dxa" w:w="2256"/>
+            <w:shd w:val="solid" w:color="E8E8E8" w:fill="auto"/>
+            <w:vAlign w:val="center"/>
+          </w:tcPr>
+          <w:p>
+            <w:pPr>
+              <w:spacing w:before="40" w:after="40"/>
+            </w:pPr>
+            <w:r/>
+            <w:r>
+              <w:rPr>
+                <w:b/>
+              </w:rPr>
+              <w:t>Interpretación</w:t>
+            </w:r>
+          </w:p>
+        </w:tc>
+      </w:tr>
+      <w:tr>
+        <w:tc>
+          <w:tcPr>
+            <w:tcW w:type="dxa" w:w="2256"/>
+          </w:tcPr>
+          <w:p>
+            <w:pPr>
+              <w:spacing w:before="40" w:after="40"/>
+            </w:pPr>
+            <w:r/>
+            <w:r>
+              <w:t>0-2 °C (normal estable)</w:t>
+            </w:r>
+          </w:p>
+        </w:tc>
+        <w:tc>
+          <w:tcPr>
+            <w:tcW w:type="dxa" w:w="2256"/>
+          </w:tcPr>
+          <w:p>
+            <w:pPr>
+              <w:spacing w:before="40" w:after="40"/>
+            </w:pPr>
+            <w:r/>
+            <w:r>
+              <w:t>207</w:t>
+            </w:r>
+          </w:p>
+        </w:tc>
+        <w:tc>
+          <w:tcPr>
+            <w:tcW w:type="dxa" w:w="2256"/>
+          </w:tcPr>
+          <w:p>
+            <w:pPr>
+              <w:spacing w:before="40" w:after="40"/>
+            </w:pPr>
+            <w:r/>
+            <w:r>
+              <w:t>34,5 %</w:t>
+            </w:r>
+          </w:p>
+        </w:tc>
+        <w:tc>
+          <w:tcPr>
+            <w:tcW w:type="dxa" w:w="2256"/>
+          </w:tcPr>
+          <w:p>
+            <w:pPr>
+              <w:spacing w:before="40" w:after="40"/>
+            </w:pPr>
+            <w:r/>
+            <w:r>
+              <w:t>Cámara apagada o en equilibrio</w:t>
+            </w:r>
+          </w:p>
+        </w:tc>
+      </w:tr>
+      <w:tr>
+        <w:tc>
+          <w:tcPr>
+            <w:tcW w:type="dxa" w:w="2256"/>
+          </w:tcPr>
+          <w:p>
+            <w:pPr>
+              <w:spacing w:before="40" w:after="40"/>
+            </w:pPr>
+            <w:r/>
+            <w:r>
+              <w:t>2-5 °C (variación moderada)</w:t>
+            </w:r>
+          </w:p>
+        </w:tc>
+        <w:tc>
+          <w:tcPr>
+            <w:tcW w:type="dxa" w:w="2256"/>
+          </w:tcPr>
+          <w:p>
+            <w:pPr>
+              <w:spacing w:before="40" w:after="40"/>
+            </w:pPr>
+            <w:r/>
+            <w:r>
+              <w:t>239</w:t>
+            </w:r>
+          </w:p>
+        </w:tc>
+        <w:tc>
+          <w:tcPr>
+            <w:tcW w:type="dxa" w:w="2256"/>
+          </w:tcPr>
+          <w:p>
+            <w:pPr>
+              <w:spacing w:before="40" w:after="40"/>
+            </w:pPr>
+            <w:r/>
+            <w:r>
+              <w:t>39,8 %</w:t>
+            </w:r>
+          </w:p>
+        </w:tc>
+        <w:tc>
+          <w:tcPr>
+            <w:tcW w:type="dxa" w:w="2256"/>
+          </w:tcPr>
+          <w:p>
+            <w:pPr>
+              <w:spacing w:before="40" w:after="40"/>
+            </w:pPr>
+            <w:r/>
+            <w:r>
+              <w:t>Comportamiento aceptable</w:t>
+            </w:r>
+          </w:p>
+        </w:tc>
+      </w:tr>
+      <w:tr>
+        <w:tc>
+          <w:tcPr>
+            <w:tcW w:type="dxa" w:w="2256"/>
+          </w:tcPr>
+          <w:p>
+            <w:pPr>
+              <w:spacing w:before="40" w:after="40"/>
+            </w:pPr>
+            <w:r/>
+            <w:r>
+              <w:t>5-10 °C (excesiva)</w:t>
+            </w:r>
+          </w:p>
+        </w:tc>
+        <w:tc>
+          <w:tcPr>
+            <w:tcW w:type="dxa" w:w="2256"/>
+          </w:tcPr>
+          <w:p>
+            <w:pPr>
+              <w:spacing w:before="40" w:after="40"/>
+            </w:pPr>
+            <w:r/>
+            <w:r>
+              <w:t>108</w:t>
+            </w:r>
+          </w:p>
+        </w:tc>
+        <w:tc>
+          <w:tcPr>
+            <w:tcW w:type="dxa" w:w="2256"/>
+          </w:tcPr>
+          <w:p>
+            <w:pPr>
+              <w:spacing w:before="40" w:after="40"/>
+            </w:pPr>
+            <w:r/>
+            <w:r>
+              <w:t>18,0 %</w:t>
+            </w:r>
+          </w:p>
+        </w:tc>
+        <w:tc>
+          <w:tcPr>
+            <w:tcW w:type="dxa" w:w="2256"/>
+          </w:tcPr>
+          <w:p>
+            <w:pPr>
+              <w:spacing w:before="40" w:after="40"/>
+            </w:pPr>
+            <w:r/>
+            <w:r>
+              <w:t>Ciclo de compresión con amplitud elevada</w:t>
+            </w:r>
+          </w:p>
+        </w:tc>
+      </w:tr>
+      <w:tr>
+        <w:tc>
+          <w:tcPr>
+            <w:tcW w:type="dxa" w:w="2256"/>
+          </w:tcPr>
+          <w:p>
+            <w:pPr>
+              <w:spacing w:before="40" w:after="40"/>
+            </w:pPr>
+            <w:r/>
+            <w:r>
+              <w:t>&gt; 10 °C (anomalía severa)</w:t>
+            </w:r>
+          </w:p>
+        </w:tc>
+        <w:tc>
+          <w:tcPr>
+            <w:tcW w:type="dxa" w:w="2256"/>
+          </w:tcPr>
+          <w:p>
+            <w:pPr>
+              <w:spacing w:before="40" w:after="40"/>
+            </w:pPr>
+            <w:r/>
+            <w:r>
+              <w:t>46</w:t>
+            </w:r>
+          </w:p>
+        </w:tc>
+        <w:tc>
+          <w:tcPr>
+            <w:tcW w:type="dxa" w:w="2256"/>
+          </w:tcPr>
+          <w:p>
+            <w:pPr>
+              <w:spacing w:before="40" w:after="40"/>
+            </w:pPr>
+            <w:r/>
+            <w:r>
+              <w:t>7,7 %</w:t>
+            </w:r>
+          </w:p>
+        </w:tc>
+        <w:tc>
+          <w:tcPr>
+            <w:tcW w:type="dxa" w:w="2256"/>
+          </w:tcPr>
+          <w:p>
+            <w:pPr>
+              <w:spacing w:before="40" w:after="40"/>
+            </w:pPr>
+            <w:r/>
+            <w:r>
+              <w:t>Ciclo con amplitud &gt; 10 °C → alerta</w:t>
+            </w:r>
+          </w:p>
+        </w:tc>
+      </w:tr>
+    </w:tbl>
+    <w:p>
+      <w:r>
+        <w:t>La amplitud media de las ventanas clasificadas como anómalas fue de 11,87 °C, con un máximo de 17,25 °C, frente a una amplitud media global de 3,80 °C.</w:t>
+      </w:r>
+    </w:p>
+    <w:p>
+      <w:pPr>
+        <w:pStyle w:val="Ttulo4"/>
+      </w:pPr>
+      <w:r>
+        <w:t>Mediciones fuera del rango aceptable (2-8 °C)</w:t>
+      </w:r>
+    </w:p>
+    <w:tbl>
+      <w:tblPr>
+        <w:tblLook w:firstColumn="1" w:firstRow="1" w:lastColumn="0" w:lastRow="0" w:noHBand="0" w:noVBand="1" w:val="04A0"/>
+        <w:tblW w:w="5000" w:type="pct"/>
+        <w:tblBorders>
+          <w:top w:val="single" w:sz="4" w:space="0" w:color="auto"/>
+          <w:left w:val="single" w:sz="4" w:space="0" w:color="auto"/>
+          <w:bottom w:val="single" w:sz="4" w:space="0" w:color="auto"/>
+          <w:right w:val="single" w:sz="4" w:space="0" w:color="auto"/>
+          <w:insideH w:val="single" w:sz="4" w:space="0" w:color="auto"/>
+          <w:insideV w:val="single" w:sz="4" w:space="0" w:color="auto"/>
+        </w:tblBorders>
+      </w:tblPr>
+      <w:tblGrid>
+        <w:gridCol w:w="3009"/>
+        <w:gridCol w:w="3009"/>
+        <w:gridCol w:w="3009"/>
+      </w:tblGrid>
+      <w:tr>
+        <w:tc>
+          <w:tcPr>
+            <w:tcW w:type="dxa" w:w="3009"/>
+            <w:shd w:val="solid" w:color="E8E8E8" w:fill="auto"/>
+            <w:vAlign w:val="center"/>
+          </w:tcPr>
+          <w:p>
+            <w:pPr>
+              <w:spacing w:before="40" w:after="40"/>
+            </w:pPr>
+            <w:r/>
+            <w:r>
+              <w:rPr>
+                <w:b/>
+              </w:rPr>
+              <w:t>Condición</w:t>
+            </w:r>
+          </w:p>
+        </w:tc>
+        <w:tc>
+          <w:tcPr>
+            <w:tcW w:type="dxa" w:w="3009"/>
+            <w:shd w:val="solid" w:color="E8E8E8" w:fill="auto"/>
+            <w:vAlign w:val="center"/>
+          </w:tcPr>
+          <w:p>
+            <w:pPr>
+              <w:spacing w:before="40" w:after="40"/>
+            </w:pPr>
+            <w:r/>
+            <w:r>
+              <w:rPr>
+                <w:b/>
+              </w:rPr>
+              <w:t>Mediciones</w:t>
+            </w:r>
+          </w:p>
+        </w:tc>
+        <w:tc>
+          <w:tcPr>
+            <w:tcW w:type="dxa" w:w="3009"/>
+            <w:shd w:val="solid" w:color="E8E8E8" w:fill="auto"/>
+            <w:vAlign w:val="center"/>
+          </w:tcPr>
+          <w:p>
+            <w:pPr>
+              <w:spacing w:before="40" w:after="40"/>
+            </w:pPr>
+            <w:r/>
+            <w:r>
+              <w:rPr>
+                <w:b/>
+              </w:rPr>
+              <w:t>%</w:t>
+            </w:r>
+          </w:p>
+        </w:tc>
+      </w:tr>
+      <w:tr>
+        <w:tc>
+          <w:tcPr>
+            <w:tcW w:type="dxa" w:w="3009"/>
+          </w:tcPr>
+          <w:p>
+            <w:pPr>
+              <w:spacing w:before="40" w:after="40"/>
+            </w:pPr>
+            <w:r/>
+            <w:r>
+              <w:t>Bajo rango (&lt; 2 °C)</w:t>
+            </w:r>
+          </w:p>
+        </w:tc>
+        <w:tc>
+          <w:tcPr>
+            <w:tcW w:type="dxa" w:w="3009"/>
+          </w:tcPr>
+          <w:p>
+            <w:pPr>
+              <w:spacing w:before="40" w:after="40"/>
+            </w:pPr>
+            <w:r/>
+            <w:r>
+              <w:t>1.971</w:t>
+            </w:r>
+          </w:p>
+        </w:tc>
+        <w:tc>
+          <w:tcPr>
+            <w:tcW w:type="dxa" w:w="3009"/>
+          </w:tcPr>
+          <w:p>
+            <w:pPr>
+              <w:spacing w:before="40" w:after="40"/>
+            </w:pPr>
+            <w:r/>
+            <w:r>
+              <w:t>27,6 %</w:t>
+            </w:r>
+          </w:p>
+        </w:tc>
+      </w:tr>
+      <w:tr>
+        <w:tc>
+          <w:tcPr>
+            <w:tcW w:type="dxa" w:w="3009"/>
+          </w:tcPr>
+          <w:p>
+            <w:pPr>
+              <w:spacing w:before="40" w:after="40"/>
+            </w:pPr>
+            <w:r/>
+            <w:r>
+              <w:t>Sobre rango (&gt; 8 °C)</w:t>
+            </w:r>
+          </w:p>
+        </w:tc>
+        <w:tc>
+          <w:tcPr>
+            <w:tcW w:type="dxa" w:w="3009"/>
+          </w:tcPr>
+          <w:p>
+            <w:pPr>
+              <w:spacing w:before="40" w:after="40"/>
+            </w:pPr>
+            <w:r/>
+            <w:r>
+              <w:t>3.627</w:t>
+            </w:r>
+          </w:p>
+        </w:tc>
+        <w:tc>
+          <w:tcPr>
+            <w:tcW w:type="dxa" w:w="3009"/>
+          </w:tcPr>
+          <w:p>
+            <w:pPr>
+              <w:spacing w:before="40" w:after="40"/>
+            </w:pPr>
+            <w:r/>
+            <w:r>
+              <w:t>50,7 %</w:t>
+            </w:r>
+          </w:p>
+        </w:tc>
+      </w:tr>
+      <w:tr>
+        <w:tc>
+          <w:tcPr>
+            <w:tcW w:type="dxa" w:w="3009"/>
+          </w:tcPr>
+          <w:p>
+            <w:pPr>
+              <w:spacing w:before="40" w:after="40"/>
+            </w:pPr>
+            <w:r/>
+            <w:r>
+              <w:t>En rango (2-8 °C)</w:t>
+            </w:r>
+          </w:p>
+        </w:tc>
+        <w:tc>
+          <w:tcPr>
+            <w:tcW w:type="dxa" w:w="3009"/>
+          </w:tcPr>
+          <w:p>
+            <w:pPr>
+              <w:spacing w:before="40" w:after="40"/>
+            </w:pPr>
+            <w:r/>
+            <w:r>
+              <w:t>1.553</w:t>
+            </w:r>
+          </w:p>
+        </w:tc>
+        <w:tc>
+          <w:tcPr>
+            <w:tcW w:type="dxa" w:w="3009"/>
+          </w:tcPr>
+          <w:p>
+            <w:pPr>
+              <w:spacing w:before="40" w:after="40"/>
+            </w:pPr>
+            <w:r/>
+            <w:r>
+              <w:t>21,7 %</w:t>
+            </w:r>
+          </w:p>
+        </w:tc>
+      </w:tr>
+    </w:tbl>
+    <w:p>
+      <w:r>
+        <w:t>Solo el 21,7 % de las mediciones de la cámara estuvo dentro del rango aceptable, lo que confirma un problema de regulación térmica severo del equipo.</w:t>
+      </w:r>
+    </w:p>
+    <w:p>
+      <w:pPr>
+        <w:pStyle w:val="Ttulo3"/>
+      </w:pPr>
+      <w:r>
+        <w:t>M.3 Interpretación</w:t>
+      </w:r>
+    </w:p>
+    <w:p>
+      <w:r>
+        <w:t>• El algoritmo de amplitud horaria detecta correctamente las 46 horas con ciclos de compresión anómalos (amplitud &gt; 10 °C).</w:t>
+      </w:r>
+    </w:p>
+    <w:p>
+      <w:r>
+        <w:t>• El 78,3 % de las mediciones estuvo fuera de rango, evidenciando la magnitud de la falla de regulación de la cámara.</w:t>
+      </w:r>
+    </w:p>
+    <w:p>
+      <w:r>
+        <w:t>• Un umbral simple de amplitud (&gt; 10 °C por hora) es suficiente para disparar una alerta automática de "equipo defectuoso".</w:t>
+      </w:r>
+    </w:p>
+    <w:p>
+      <w:r>
+        <w:t>• No se requiere aprendizaje automático: una regla condicional resuelve la detección con costo computacional despreciable.</w:t>
+      </w:r>
+    </w:p>
+    <w:p>
+      <w:pPr>
+        <w:pStyle w:val="Ttulo3"/>
+      </w:pPr>
+      <w:r>
+        <w:t>M.4 Propuesta de implementación en SmartTemp</w:t>
+      </w:r>
+    </w:p>
+    <w:p>
+      <w:r>
+        <w:t>La lógica puede integrarse en el backend (Node.js) como una tarea horaria que evalúa la amplitud de la última hora por sensor y genera una alerta proactiva cuando se supera el umbral:</w:t>
+      </w:r>
+    </w:p>
+    <w:p>
+      <w:r>
+        <w:rPr>
+          <w:rFonts w:ascii="Courier New" w:hAnsi="Courier New" w:cs="Courier New"/>
+          <w:sz w:val="18"/>
+        </w:rPr>
+        <w:t>async function detectarAnomaliaCiclo(sensorId) {</w:t>
+      </w:r>
+    </w:p>
+    <w:p>
+      <w:r>
+        <w:rPr>
+          <w:rFonts w:ascii="Courier New" w:hAnsi="Courier New" w:cs="Courier New"/>
+          <w:sz w:val="18"/>
+        </w:rPr>
+        <w:t xml:space="preserve">  const mediciones = await getUltimaHora(sensorId); // 12 mediciones</w:t>
+      </w:r>
+    </w:p>
+    <w:p>
+      <w:r>
+        <w:rPr>
+          <w:rFonts w:ascii="Courier New" w:hAnsi="Courier New" w:cs="Courier New"/>
+          <w:sz w:val="18"/>
+        </w:rPr>
+        <w:t xml:space="preserve">  const temps = mediciones.map(m =&gt; m.temperatura);</w:t>
+      </w:r>
+    </w:p>
+    <w:p>
+      <w:r>
+        <w:rPr>
+          <w:rFonts w:ascii="Courier New" w:hAnsi="Courier New" w:cs="Courier New"/>
+          <w:sz w:val="18"/>
+        </w:rPr>
+        <w:t xml:space="preserve">  const amplitud = Math.max(...temps) - Math.min(...temps);</w:t>
+      </w:r>
+    </w:p>
+    <w:p>
+      <w:r>
+        <w:rPr>
+          <w:rFonts w:ascii="Courier New" w:hAnsi="Courier New" w:cs="Courier New"/>
+          <w:sz w:val="18"/>
+        </w:rPr>
+        <w:t xml:space="preserve">  if (amplitud &gt; 10) {</w:t>
+      </w:r>
+    </w:p>
+    <w:p>
+      <w:r>
+        <w:rPr>
+          <w:rFonts w:ascii="Courier New" w:hAnsi="Courier New" w:cs="Courier New"/>
+          <w:sz w:val="18"/>
+        </w:rPr>
+        <w:t xml:space="preserve">    await enviarAlerta({</w:t>
+      </w:r>
+    </w:p>
+    <w:p>
+      <w:r>
+        <w:rPr>
+          <w:rFonts w:ascii="Courier New" w:hAnsi="Courier New" w:cs="Courier New"/>
+          <w:sz w:val="18"/>
+        </w:rPr>
+        <w:t xml:space="preserve">      tipo: 'anomalia_ciclo',</w:t>
+      </w:r>
+    </w:p>
+    <w:p>
+      <w:r>
+        <w:rPr>
+          <w:rFonts w:ascii="Courier New" w:hAnsi="Courier New" w:cs="Courier New"/>
+          <w:sz w:val="18"/>
+        </w:rPr>
+        <w:t xml:space="preserve">      sensor: sensorId,</w:t>
+      </w:r>
+    </w:p>
+    <w:p>
+      <w:r>
+        <w:rPr>
+          <w:rFonts w:ascii="Courier New" w:hAnsi="Courier New" w:cs="Courier New"/>
+          <w:sz w:val="18"/>
+        </w:rPr>
+        <w:t xml:space="preserve">      amplitud: amplitud,</w:t>
+      </w:r>
+    </w:p>
+    <w:p>
+      <w:r>
+        <w:rPr>
+          <w:rFonts w:ascii="Courier New" w:hAnsi="Courier New" w:cs="Courier New"/>
+          <w:sz w:val="18"/>
+        </w:rPr>
+        <w:t xml:space="preserve">      mensaje: `Amplitud de ${amplitud.toFixed(1)}C en la ultima hora.`</w:t>
+      </w:r>
+    </w:p>
+    <w:p>
+      <w:r>
+        <w:rPr>
+          <w:rFonts w:ascii="Courier New" w:hAnsi="Courier New" w:cs="Courier New"/>
+          <w:sz w:val="18"/>
+        </w:rPr>
+        <w:t xml:space="preserve">    });</w:t>
+      </w:r>
+    </w:p>
+    <w:p>
+      <w:r>
+        <w:rPr>
+          <w:rFonts w:ascii="Courier New" w:hAnsi="Courier New" w:cs="Courier New"/>
+          <w:sz w:val="18"/>
+        </w:rPr>
+        <w:t xml:space="preserve">  }</w:t>
+      </w:r>
+    </w:p>
+    <w:p>
+      <w:r>
+        <w:rPr>
+          <w:rFonts w:ascii="Courier New" w:hAnsi="Courier New" w:cs="Courier New"/>
+          <w:sz w:val="18"/>
+        </w:rPr>
+        <w:t>}</w:t>
+      </w:r>
+    </w:p>
+    <w:p>
+      <w:r>
+        <w:t>De este modo, la detección proactiva por degradación del equipo complementaría a las alertas reactivas por umbral ya implementadas (sección 5.5), fortaleciendo la capacidad del sistema para anticipar fallas de la cadena de frío.</w:t>
       </w:r>
     </w:p>
     <w:sectPr>

</xml_diff>

<commit_message>
Renumerar figuras (1-3) y convertir indices en campos TOC automaticos
- Figuras renumeradas a 1, 2, 3 (antes 1, 6, 7) en cuerpo e indice, sin dejar huecos
- Contenido, Indice de Figuras e Indice de Tablas convertidos en campos TOC de Word:
  Contenido por niveles de titulo (\o 1-3); indices de tablas/figuras por estilo de epigrafe
- Se conservan las listas actuales como resultado en cache (sin regresion si no se actualizan)
- updateFields activado: Word calcula los numeros de pagina reales al abrir/actualizar (F9)
</commit_message>
<xml_diff>
--- a/tesis-smarttemp-final.docx
+++ b/tesis-smarttemp-final.docx
@@ -2705,6 +2705,15 @@
         <w:spacing w:after="60" w:line="276" w:lineRule="auto"/>
       </w:pPr>
       <w:r>
+        <w:fldChar w:fldCharType="begin"/>
+      </w:r>
+      <w:r>
+        <w:instrText xml:space="preserve"> TOC \o "1-3" \h \z \u </w:instrText>
+      </w:r>
+      <w:r>
+        <w:fldChar w:fldCharType="separate"/>
+      </w:r>
+      <w:r>
         <w:t xml:space="preserve">Capítulo 1: </w:t>
       </w:r>
       <w:proofErr w:type="gramStart"/>
@@ -4288,6 +4297,9 @@
       <w:r>
         <w:t xml:space="preserve">Anexo M: Detección Automática de Anomalías Térmicas  20</w:t>
       </w:r>
+      <w:r>
+        <w:fldChar w:fldCharType="end"/>
+      </w:r>
     </w:p>
     <w:p>
       <w:r>
@@ -4313,6 +4325,15 @@
         <w:ind w:left="396"/>
       </w:pPr>
       <w:r>
+        <w:fldChar w:fldCharType="begin"/>
+      </w:r>
+      <w:r>
+        <w:instrText xml:space="preserve"> TOC \h \z \t "EpigrafeFigura,1" </w:instrText>
+      </w:r>
+      <w:r>
+        <w:fldChar w:fldCharType="separate"/>
+      </w:r>
+      <w:r>
         <w:t xml:space="preserve">Figura 1. Arquitectura general del sistema SmartTemp basada en el modelo IoT de tres capas.  1</w:t>
       </w:r>
     </w:p>
@@ -4322,7 +4343,7 @@
         <w:ind w:left="396"/>
       </w:pPr>
       <w:r>
-        <w:t xml:space="preserve">Figura 6. Notificación de alerta recibida por WhatsApp (desconexión y reconexión de sensores con temperatura y tiempo offline).  2</w:t>
+        <w:t>Figura 2. Notificación de alerta recibida por WhatsApp (desconexión y reconexión de sensores con temperatura y tiempo offline).  2</w:t>
       </w:r>
     </w:p>
     <w:p>
@@ -4331,7 +4352,10 @@
         <w:ind w:left="396"/>
       </w:pPr>
       <w:r>
-        <w:t xml:space="preserve">Figura 7. Notificación de alerta recibida por email (fallback) con detalle del evento, sensor, sector y último dato registrado.  3</w:t>
+        <w:t>Figura 3. Notificación de alerta recibida por email (fallback) con detalle del evento, sensor, sector y último dato registrado.  3</w:t>
+      </w:r>
+      <w:r>
+        <w:fldChar w:fldCharType="end"/>
       </w:r>
     </w:p>
     <w:p>
@@ -4358,6 +4382,15 @@
         <w:ind w:left="396"/>
       </w:pPr>
       <w:r>
+        <w:fldChar w:fldCharType="begin"/>
+      </w:r>
+      <w:r>
+        <w:instrText xml:space="preserve"> TOC \h \z \t "EpigrafeTabla,1" </w:instrText>
+      </w:r>
+      <w:r>
+        <w:fldChar w:fldCharType="separate"/>
+      </w:r>
+      <w:r>
         <w:t xml:space="preserve">Tabla 1. Comparación de protocolos de comunicación utilizados en SmartTemp.  1</w:t>
       </w:r>
     </w:p>
@@ -4638,6 +4671,9 @@
       </w:pPr>
       <w:r>
         <w:t xml:space="preserve">Tabla 27. Evaluación final de criterios de aceptación.  32</w:t>
+      </w:r>
+      <w:r>
+        <w:fldChar w:fldCharType="end"/>
       </w:r>
     </w:p>
     <w:p>
@@ -7127,6 +7163,7 @@
     </w:p>
     <w:p>
       <w:pPr>
+        <w:pStyle w:val="EpigrafeTabla"/>
         <w:spacing w:after="200"/>
         <w:jc w:val="both"/>
       </w:pPr>
@@ -8877,6 +8914,7 @@
     </w:p>
     <w:p>
       <w:pPr>
+        <w:pStyle w:val="EpigrafeTabla"/>
         <w:spacing w:after="200"/>
         <w:jc w:val="both"/>
       </w:pPr>
@@ -10756,6 +10794,7 @@
     </w:p>
     <w:p>
       <w:pPr>
+        <w:pStyle w:val="EpigrafeTabla"/>
         <w:spacing w:after="200"/>
         <w:jc w:val="both"/>
       </w:pPr>
@@ -11276,6 +11315,7 @@
     </w:p>
     <w:p>
       <w:pPr>
+        <w:pStyle w:val="EpigrafeTabla"/>
         <w:spacing w:after="200"/>
         <w:jc w:val="both"/>
       </w:pPr>
@@ -11663,6 +11703,7 @@
     </w:p>
     <w:p>
       <w:pPr>
+        <w:pStyle w:val="EpigrafeTabla"/>
         <w:spacing w:after="200"/>
         <w:jc w:val="both"/>
       </w:pPr>
@@ -12313,6 +12354,7 @@
     </w:p>
     <w:p>
       <w:pPr>
+        <w:pStyle w:val="EpigrafeTabla"/>
         <w:spacing w:after="200"/>
         <w:jc w:val="both"/>
       </w:pPr>
@@ -13514,6 +13556,7 @@
     </w:p>
     <w:p>
       <w:pPr>
+        <w:pStyle w:val="EpigrafeTabla"/>
         <w:spacing w:after="200"/>
         <w:jc w:val="both"/>
       </w:pPr>
@@ -14253,6 +14296,7 @@
     </w:p>
     <w:p>
       <w:pPr>
+        <w:pStyle w:val="EpigrafeFigura"/>
         <w:spacing w:after="200"/>
         <w:jc w:val="both"/>
       </w:pPr>
@@ -15243,6 +15287,7 @@
     </w:p>
     <w:p>
       <w:pPr>
+        <w:pStyle w:val="EpigrafeTabla"/>
         <w:spacing w:after="200"/>
         <w:jc w:val="both"/>
       </w:pPr>
@@ -16819,6 +16864,7 @@
     </w:p>
     <w:p>
       <w:pPr>
+        <w:pStyle w:val="EpigrafeTabla"/>
         <w:spacing w:after="200"/>
         <w:jc w:val="both"/>
       </w:pPr>
@@ -18375,6 +18421,7 @@
     </w:p>
     <w:p>
       <w:pPr>
+        <w:pStyle w:val="EpigrafeTabla"/>
         <w:spacing w:after="200"/>
         <w:jc w:val="both"/>
       </w:pPr>
@@ -18663,6 +18710,7 @@
     </w:p>
     <w:p>
       <w:pPr>
+        <w:pStyle w:val="EpigrafeTabla"/>
         <w:spacing w:after="200"/>
         <w:jc w:val="both"/>
       </w:pPr>
@@ -19046,6 +19094,7 @@
     </w:p>
     <w:p>
       <w:pPr>
+        <w:pStyle w:val="EpigrafeTabla"/>
         <w:spacing w:after="200"/>
         <w:jc w:val="both"/>
       </w:pPr>
@@ -19438,6 +19487,7 @@
     </w:p>
     <w:p>
       <w:pPr>
+        <w:pStyle w:val="EpigrafeTabla"/>
         <w:spacing w:after="200"/>
         <w:jc w:val="both"/>
       </w:pPr>
@@ -19901,6 +19951,7 @@
     </w:p>
     <w:p>
       <w:pPr>
+        <w:pStyle w:val="EpigrafeTabla"/>
         <w:spacing w:after="200"/>
         <w:jc w:val="both"/>
       </w:pPr>
@@ -20383,6 +20434,7 @@
     </w:p>
     <w:p>
       <w:pPr>
+        <w:pStyle w:val="EpigrafeTabla"/>
         <w:spacing w:after="200"/>
         <w:jc w:val="both"/>
       </w:pPr>
@@ -20862,6 +20914,7 @@
     </w:p>
     <w:p>
       <w:pPr>
+        <w:pStyle w:val="EpigrafeTabla"/>
         <w:spacing w:after="200"/>
         <w:jc w:val="both"/>
       </w:pPr>
@@ -21596,6 +21649,9 @@
       </w:r>
     </w:p>
     <w:p>
+      <w:pPr>
+        <w:pStyle w:val="EpigrafeTabla"/>
+      </w:pPr>
       <w:r>
         <w:rPr>
           <w:b/>
@@ -21960,6 +22016,9 @@
       </w:r>
     </w:p>
     <w:p>
+      <w:pPr>
+        <w:pStyle w:val="EpigrafeTabla"/>
+      </w:pPr>
       <w:r>
         <w:rPr>
           <w:b/>
@@ -22338,6 +22397,7 @@
     </w:p>
     <w:p>
       <w:pPr>
+        <w:pStyle w:val="EpigrafeTabla"/>
         <w:spacing w:after="200"/>
         <w:jc w:val="both"/>
       </w:pPr>
@@ -22657,6 +22717,7 @@
     </w:p>
     <w:p>
       <w:pPr>
+        <w:pStyle w:val="EpigrafeTabla"/>
         <w:spacing w:after="200"/>
         <w:jc w:val="both"/>
       </w:pPr>
@@ -23199,6 +23260,7 @@
     </w:p>
     <w:p>
       <w:pPr>
+        <w:pStyle w:val="EpigrafeTabla"/>
         <w:spacing w:after="200"/>
         <w:jc w:val="both"/>
       </w:pPr>
@@ -23499,6 +23561,7 @@
     </w:p>
     <w:p>
       <w:pPr>
+        <w:pStyle w:val="EpigrafeTabla"/>
         <w:spacing w:after="200"/>
         <w:jc w:val="both"/>
       </w:pPr>
@@ -23952,6 +24015,7 @@
     </w:p>
     <w:p>
       <w:pPr>
+        <w:pStyle w:val="EpigrafeTabla"/>
         <w:spacing w:after="200"/>
         <w:jc w:val="both"/>
       </w:pPr>
@@ -24274,6 +24338,7 @@
     </w:p>
     <w:p>
       <w:pPr>
+        <w:pStyle w:val="EpigrafeTabla"/>
         <w:spacing w:after="200"/>
         <w:jc w:val="both"/>
       </w:pPr>
@@ -24620,6 +24685,7 @@
     </w:p>
     <w:p>
       <w:pPr>
+        <w:pStyle w:val="EpigrafeTabla"/>
         <w:spacing w:after="200"/>
         <w:jc w:val="both"/>
       </w:pPr>
@@ -24947,6 +25013,7 @@
     </w:p>
     <w:p>
       <w:pPr>
+        <w:pStyle w:val="EpigrafeTabla"/>
         <w:spacing w:after="200"/>
         <w:jc w:val="both"/>
       </w:pPr>
@@ -25416,6 +25483,7 @@
     </w:p>
     <w:p>
       <w:pPr>
+        <w:pStyle w:val="EpigrafeTabla"/>
         <w:spacing w:after="200"/>
         <w:jc w:val="both"/>
       </w:pPr>
@@ -26024,6 +26092,7 @@
     </w:p>
     <w:p>
       <w:pPr>
+        <w:pStyle w:val="EpigrafeFigura"/>
         <w:spacing w:after="200"/>
         <w:jc w:val="both"/>
       </w:pPr>
@@ -26032,7 +26101,7 @@
           <w:b/>
           <w:bCs/>
         </w:rPr>
-        <w:t>Figura 6.</w:t>
+        <w:t>Figura 2.</w:t>
       </w:r>
       <w:r>
         <w:t xml:space="preserve"> Notificación de alerta recibida por WhatsApp (desconexión y reconexión de sensores con temperatura y tiempo offline).</w:t>
@@ -26089,6 +26158,7 @@
     </w:p>
     <w:p>
       <w:pPr>
+        <w:pStyle w:val="EpigrafeFigura"/>
         <w:spacing w:after="200"/>
         <w:jc w:val="both"/>
       </w:pPr>
@@ -26097,7 +26167,7 @@
           <w:b/>
           <w:bCs/>
         </w:rPr>
-        <w:t>Figura 7.</w:t>
+        <w:t>Figura 3.</w:t>
       </w:r>
       <w:r>
         <w:t xml:space="preserve"> Notificación de alerta recibida por email (</w:t>
@@ -26183,6 +26253,7 @@
     </w:p>
     <w:p>
       <w:pPr>
+        <w:pStyle w:val="EpigrafeTabla"/>
         <w:spacing w:after="200"/>
         <w:jc w:val="both"/>
       </w:pPr>
@@ -26592,6 +26663,7 @@
     </w:p>
     <w:p>
       <w:pPr>
+        <w:pStyle w:val="EpigrafeTabla"/>
         <w:spacing w:after="200"/>
         <w:jc w:val="both"/>
       </w:pPr>
@@ -27041,6 +27113,7 @@
     </w:p>
     <w:p>
       <w:pPr>
+        <w:pStyle w:val="EpigrafeTabla"/>
         <w:spacing w:after="200"/>
         <w:jc w:val="both"/>
       </w:pPr>
@@ -27516,6 +27589,7 @@
     </w:p>
     <w:p>
       <w:pPr>
+        <w:pStyle w:val="EpigrafeTabla"/>
         <w:spacing w:after="200"/>
         <w:jc w:val="both"/>
       </w:pPr>
@@ -28243,6 +28317,7 @@
     </w:p>
     <w:p>
       <w:pPr>
+        <w:pStyle w:val="EpigrafeTabla"/>
         <w:spacing w:after="200"/>
         <w:jc w:val="both"/>
       </w:pPr>
@@ -49092,6 +49167,14 @@
     <w:uiPriority w:val="99"/>
     <w:rsid w:val="00C87EDC"/>
   </w:style>
+  <w:style w:type="paragraph" w:customStyle="1" w:styleId="EpigrafeTabla">
+    <w:name w:val="EpigrafeTabla"/>
+    <w:basedOn w:val="Normal"/>
+  </w:style>
+  <w:style w:type="paragraph" w:customStyle="1" w:styleId="EpigrafeFigura">
+    <w:name w:val="EpigrafeFigura"/>
+    <w:basedOn w:val="Normal"/>
+  </w:style>
 </w:styles>
 </file>
 

</xml_diff>

<commit_message>
Anexo A: quitar volcado de codigo fuente (96 lineas) y dejar referencia a material complementario
- Elimina las 96 lineas de codigo .ino/.cpp del Anexo A (van como material complementario, no ocupando paginas)
- Conserva A.1 (hardware) y A.2 (esquema electronico)
- Nota sin enlace a repositorio (el repo es privado)
- Anexos B y C se conservan (son diagramas, no codigo)
</commit_message>
<xml_diff>
--- a/tesis-smarttemp-final.docx
+++ b/tesis-smarttemp-final.docx
@@ -31843,16 +31843,10 @@
         <w:spacing w:after="200"/>
         <w:jc w:val="both"/>
       </w:pPr>
-      <w:r>
-        <w:t xml:space="preserve">Se presentan los fragmentos más representativos del firmware modular </w:t>
-      </w:r>
-      <w:proofErr w:type="spellStart"/>
-      <w:r>
-        <w:t>SmartTemp</w:t>
-      </w:r>
-      <w:proofErr w:type="spellEnd"/>
-      <w:r>
-        <w:t xml:space="preserve"> y el esquema de conexión electrónica.</w:t>
+      <w:proofErr w:type="spellStart"/>
+      <w:proofErr w:type="spellEnd"/>
+      <w:r>
+        <w:t>Este anexo documenta el hardware implementado y el esquema de conexión electrónica del nodo sensor. El código fuente del firmware se referencia al final como material complementario.</w:t>
       </w:r>
     </w:p>
     <w:p>
@@ -32751,3868 +32745,8 @@
       </w:r>
     </w:p>
     <w:p>
-      <w:pPr>
-        <w:pStyle w:val="Ttulo4"/>
-      </w:pPr>
-      <w:r>
-        <w:rPr>
-          <w:i w:val="0"/>
-          <w:iCs w:val="0"/>
-        </w:rPr>
-        <w:t>funcional_remoto_modular_.</w:t>
-      </w:r>
-      <w:proofErr w:type="spellStart"/>
-      <w:r>
-        <w:rPr>
-          <w:i w:val="0"/>
-          <w:iCs w:val="0"/>
-        </w:rPr>
-        <w:t>ino</w:t>
-      </w:r>
-      <w:proofErr w:type="spellEnd"/>
-    </w:p>
-    <w:p>
-      <w:pPr>
-        <w:spacing w:line="240" w:lineRule="auto"/>
-        <w:ind w:left="431"/>
-      </w:pPr>
-      <w:r>
-        <w:rPr>
-          <w:rFonts w:ascii="Courier New" w:eastAsia="Courier New" w:hAnsi="Courier New" w:cs="Courier New"/>
-          <w:sz w:val="16"/>
-          <w:szCs w:val="16"/>
-        </w:rPr>
-        <w:t>&lt;</w:t>
-      </w:r>
-      <w:proofErr w:type="spellStart"/>
-      <w:r>
-        <w:rPr>
-          <w:rFonts w:ascii="Courier New" w:eastAsia="Courier New" w:hAnsi="Courier New" w:cs="Courier New"/>
-          <w:sz w:val="16"/>
-          <w:szCs w:val="16"/>
-        </w:rPr>
-        <w:t>code</w:t>
-      </w:r>
-      <w:proofErr w:type="spellEnd"/>
-      <w:r>
-        <w:rPr>
-          <w:rFonts w:ascii="Courier New" w:eastAsia="Courier New" w:hAnsi="Courier New" w:cs="Courier New"/>
-          <w:sz w:val="16"/>
-          <w:szCs w:val="16"/>
-        </w:rPr>
-        <w:t>&gt;#include &lt;</w:t>
-      </w:r>
-      <w:proofErr w:type="spellStart"/>
-      <w:r>
-        <w:rPr>
-          <w:rFonts w:ascii="Courier New" w:eastAsia="Courier New" w:hAnsi="Courier New" w:cs="Courier New"/>
-          <w:sz w:val="16"/>
-          <w:szCs w:val="16"/>
-        </w:rPr>
-        <w:t>WiFiClient.h</w:t>
-      </w:r>
-      <w:proofErr w:type="spellEnd"/>
-      <w:r>
-        <w:rPr>
-          <w:rFonts w:ascii="Courier New" w:eastAsia="Courier New" w:hAnsi="Courier New" w:cs="Courier New"/>
-          <w:sz w:val="16"/>
-          <w:szCs w:val="16"/>
-        </w:rPr>
-        <w:t>&gt;</w:t>
-      </w:r>
-    </w:p>
-    <w:p>
-      <w:pPr>
-        <w:spacing w:line="240" w:lineRule="auto"/>
-        <w:ind w:left="431"/>
-      </w:pPr>
-      <w:r>
-        <w:rPr>
-          <w:rFonts w:ascii="Courier New" w:eastAsia="Courier New" w:hAnsi="Courier New" w:cs="Courier New"/>
-          <w:sz w:val="16"/>
-          <w:szCs w:val="16"/>
-        </w:rPr>
-        <w:t>#include &lt;ESP8266HTTPClient.h&gt;</w:t>
-      </w:r>
-    </w:p>
-    <w:p>
-      <w:pPr>
-        <w:spacing w:line="240" w:lineRule="auto"/>
-        <w:ind w:left="431"/>
-      </w:pPr>
-      <w:r>
-        <w:rPr>
-          <w:rFonts w:ascii="Courier New" w:eastAsia="Courier New" w:hAnsi="Courier New" w:cs="Courier New"/>
-          <w:sz w:val="16"/>
-          <w:szCs w:val="16"/>
-        </w:rPr>
-        <w:t>#include &lt;ESP8266WebServer.h&gt;</w:t>
-      </w:r>
-    </w:p>
-    <w:p>
-      <w:pPr>
-        <w:spacing w:line="240" w:lineRule="auto"/>
-        <w:ind w:left="431"/>
-      </w:pPr>
-      <w:r>
-        <w:rPr>
-          <w:rFonts w:ascii="Courier New" w:eastAsia="Courier New" w:hAnsi="Courier New" w:cs="Courier New"/>
-          <w:sz w:val="16"/>
-          <w:szCs w:val="16"/>
-        </w:rPr>
-        <w:t>#include &lt;</w:t>
-      </w:r>
-      <w:proofErr w:type="spellStart"/>
-      <w:r>
-        <w:rPr>
-          <w:rFonts w:ascii="Courier New" w:eastAsia="Courier New" w:hAnsi="Courier New" w:cs="Courier New"/>
-          <w:sz w:val="16"/>
-          <w:szCs w:val="16"/>
-        </w:rPr>
-        <w:t>OneWire.h</w:t>
-      </w:r>
-      <w:proofErr w:type="spellEnd"/>
-      <w:r>
-        <w:rPr>
-          <w:rFonts w:ascii="Courier New" w:eastAsia="Courier New" w:hAnsi="Courier New" w:cs="Courier New"/>
-          <w:sz w:val="16"/>
-          <w:szCs w:val="16"/>
-        </w:rPr>
-        <w:t>&gt;</w:t>
-      </w:r>
-    </w:p>
-    <w:p>
-      <w:pPr>
-        <w:spacing w:line="240" w:lineRule="auto"/>
-        <w:ind w:left="431"/>
-      </w:pPr>
-      <w:r>
-        <w:rPr>
-          <w:rFonts w:ascii="Courier New" w:eastAsia="Courier New" w:hAnsi="Courier New" w:cs="Courier New"/>
-          <w:sz w:val="16"/>
-          <w:szCs w:val="16"/>
-        </w:rPr>
-        <w:t>#include &lt;</w:t>
-      </w:r>
-      <w:proofErr w:type="spellStart"/>
-      <w:r>
-        <w:rPr>
-          <w:rFonts w:ascii="Courier New" w:eastAsia="Courier New" w:hAnsi="Courier New" w:cs="Courier New"/>
-          <w:sz w:val="16"/>
-          <w:szCs w:val="16"/>
-        </w:rPr>
-        <w:t>DallasTemperature.h</w:t>
-      </w:r>
-      <w:proofErr w:type="spellEnd"/>
-      <w:r>
-        <w:rPr>
-          <w:rFonts w:ascii="Courier New" w:eastAsia="Courier New" w:hAnsi="Courier New" w:cs="Courier New"/>
-          <w:sz w:val="16"/>
-          <w:szCs w:val="16"/>
-        </w:rPr>
-        <w:t>&gt;</w:t>
-      </w:r>
-    </w:p>
-    <w:p>
-      <w:pPr>
-        <w:spacing w:line="240" w:lineRule="auto"/>
-        <w:ind w:left="431"/>
-      </w:pPr>
-      <w:r>
-        <w:rPr>
-          <w:rFonts w:ascii="Courier New" w:eastAsia="Courier New" w:hAnsi="Courier New" w:cs="Courier New"/>
-          <w:sz w:val="16"/>
-          <w:szCs w:val="16"/>
-        </w:rPr>
-        <w:t>#include &lt;</w:t>
-      </w:r>
-      <w:proofErr w:type="spellStart"/>
-      <w:r>
-        <w:rPr>
-          <w:rFonts w:ascii="Courier New" w:eastAsia="Courier New" w:hAnsi="Courier New" w:cs="Courier New"/>
-          <w:sz w:val="16"/>
-          <w:szCs w:val="16"/>
-        </w:rPr>
-        <w:t>ArduinoJson.h</w:t>
-      </w:r>
-      <w:proofErr w:type="spellEnd"/>
-      <w:r>
-        <w:rPr>
-          <w:rFonts w:ascii="Courier New" w:eastAsia="Courier New" w:hAnsi="Courier New" w:cs="Courier New"/>
-          <w:sz w:val="16"/>
-          <w:szCs w:val="16"/>
-        </w:rPr>
-        <w:t>&gt;</w:t>
-      </w:r>
-    </w:p>
-    <w:p>
-      <w:pPr>
-        <w:spacing w:line="240" w:lineRule="auto"/>
-        <w:ind w:left="431"/>
-      </w:pPr>
-      <w:r>
-        <w:rPr>
-          <w:rFonts w:ascii="Courier New" w:eastAsia="Courier New" w:hAnsi="Courier New" w:cs="Courier New"/>
-          <w:sz w:val="16"/>
-          <w:szCs w:val="16"/>
-        </w:rPr>
-        <w:t>#include &lt;</w:t>
-      </w:r>
-      <w:proofErr w:type="spellStart"/>
-      <w:r>
-        <w:rPr>
-          <w:rFonts w:ascii="Courier New" w:eastAsia="Courier New" w:hAnsi="Courier New" w:cs="Courier New"/>
-          <w:sz w:val="16"/>
-          <w:szCs w:val="16"/>
-        </w:rPr>
-        <w:t>EEPROM.h</w:t>
-      </w:r>
-      <w:proofErr w:type="spellEnd"/>
-      <w:r>
-        <w:rPr>
-          <w:rFonts w:ascii="Courier New" w:eastAsia="Courier New" w:hAnsi="Courier New" w:cs="Courier New"/>
-          <w:sz w:val="16"/>
-          <w:szCs w:val="16"/>
-        </w:rPr>
-        <w:t>&gt;</w:t>
-      </w:r>
-    </w:p>
-    <w:p>
-      <w:pPr>
-        <w:spacing w:line="240" w:lineRule="auto"/>
-        <w:ind w:left="431"/>
-      </w:pPr>
-      <w:r>
-        <w:rPr>
-          <w:rFonts w:ascii="Courier New" w:eastAsia="Courier New" w:hAnsi="Courier New" w:cs="Courier New"/>
-          <w:sz w:val="16"/>
-          <w:szCs w:val="16"/>
-        </w:rPr>
-        <w:t>#include &lt;</w:t>
-      </w:r>
-      <w:proofErr w:type="spellStart"/>
-      <w:r>
-        <w:rPr>
-          <w:rFonts w:ascii="Courier New" w:eastAsia="Courier New" w:hAnsi="Courier New" w:cs="Courier New"/>
-          <w:sz w:val="16"/>
-          <w:szCs w:val="16"/>
-        </w:rPr>
-        <w:t>PubSubClient.h</w:t>
-      </w:r>
-      <w:proofErr w:type="spellEnd"/>
-      <w:r>
-        <w:rPr>
-          <w:rFonts w:ascii="Courier New" w:eastAsia="Courier New" w:hAnsi="Courier New" w:cs="Courier New"/>
-          <w:sz w:val="16"/>
-          <w:szCs w:val="16"/>
-        </w:rPr>
-        <w:t>&gt;</w:t>
-      </w:r>
-    </w:p>
-    <w:p>
-      <w:pPr>
-        <w:spacing w:line="240" w:lineRule="auto"/>
-        <w:ind w:left="431"/>
-      </w:pPr>
-      <w:r>
-        <w:rPr>
-          <w:rFonts w:ascii="Courier New" w:eastAsia="Courier New" w:hAnsi="Courier New" w:cs="Courier New"/>
-          <w:sz w:val="16"/>
-          <w:szCs w:val="16"/>
-        </w:rPr>
-        <w:t>#include &lt;</w:t>
-      </w:r>
-      <w:proofErr w:type="spellStart"/>
-      <w:r>
-        <w:rPr>
-          <w:rFonts w:ascii="Courier New" w:eastAsia="Courier New" w:hAnsi="Courier New" w:cs="Courier New"/>
-          <w:sz w:val="16"/>
-          <w:szCs w:val="16"/>
-        </w:rPr>
-        <w:t>user_interface.h</w:t>
-      </w:r>
-      <w:proofErr w:type="spellEnd"/>
-      <w:r>
-        <w:rPr>
-          <w:rFonts w:ascii="Courier New" w:eastAsia="Courier New" w:hAnsi="Courier New" w:cs="Courier New"/>
-          <w:sz w:val="16"/>
-          <w:szCs w:val="16"/>
-        </w:rPr>
-        <w:t>&gt;</w:t>
-      </w:r>
-    </w:p>
-    <w:p>
-      <w:pPr>
-        <w:spacing w:line="240" w:lineRule="auto"/>
-        <w:ind w:left="431"/>
-      </w:pPr>
-      <w:r>
-        <w:rPr>
-          <w:rFonts w:ascii="Courier New" w:eastAsia="Courier New" w:hAnsi="Courier New" w:cs="Courier New"/>
-          <w:sz w:val="16"/>
-          <w:szCs w:val="16"/>
-        </w:rPr>
-        <w:t>#include &lt;</w:t>
-      </w:r>
-      <w:proofErr w:type="spellStart"/>
-      <w:r>
-        <w:rPr>
-          <w:rFonts w:ascii="Courier New" w:eastAsia="Courier New" w:hAnsi="Courier New" w:cs="Courier New"/>
-          <w:sz w:val="16"/>
-          <w:szCs w:val="16"/>
-        </w:rPr>
-        <w:t>LittleFS.h</w:t>
-      </w:r>
-      <w:proofErr w:type="spellEnd"/>
-      <w:r>
-        <w:rPr>
-          <w:rFonts w:ascii="Courier New" w:eastAsia="Courier New" w:hAnsi="Courier New" w:cs="Courier New"/>
-          <w:sz w:val="16"/>
-          <w:szCs w:val="16"/>
-        </w:rPr>
-        <w:t>&gt;</w:t>
-      </w:r>
-    </w:p>
-    <w:p>
-      <w:pPr>
-        <w:spacing w:line="240" w:lineRule="auto"/>
-        <w:ind w:left="431"/>
-      </w:pPr>
-      <w:r>
-        <w:rPr>
-          <w:rFonts w:ascii="Courier New" w:eastAsia="Courier New" w:hAnsi="Courier New" w:cs="Courier New"/>
-          <w:sz w:val="16"/>
-          <w:szCs w:val="16"/>
-        </w:rPr>
-        <w:t>#include &lt;</w:t>
-      </w:r>
-      <w:proofErr w:type="spellStart"/>
-      <w:r>
-        <w:rPr>
-          <w:rFonts w:ascii="Courier New" w:eastAsia="Courier New" w:hAnsi="Courier New" w:cs="Courier New"/>
-          <w:sz w:val="16"/>
-          <w:szCs w:val="16"/>
-        </w:rPr>
-        <w:t>WiFiUdp.h</w:t>
-      </w:r>
-      <w:proofErr w:type="spellEnd"/>
-      <w:r>
-        <w:rPr>
-          <w:rFonts w:ascii="Courier New" w:eastAsia="Courier New" w:hAnsi="Courier New" w:cs="Courier New"/>
-          <w:sz w:val="16"/>
-          <w:szCs w:val="16"/>
-        </w:rPr>
-        <w:t>&gt;</w:t>
-      </w:r>
-    </w:p>
-    <w:p>
-      <w:pPr>
-        <w:spacing w:line="240" w:lineRule="auto"/>
-        <w:ind w:left="431"/>
-      </w:pPr>
-      <w:r>
-        <w:rPr>
-          <w:rFonts w:ascii="Courier New" w:eastAsia="Courier New" w:hAnsi="Courier New" w:cs="Courier New"/>
-          <w:sz w:val="16"/>
-          <w:szCs w:val="16"/>
-        </w:rPr>
-        <w:t>#include &lt;</w:t>
-      </w:r>
-      <w:proofErr w:type="spellStart"/>
-      <w:r>
-        <w:rPr>
-          <w:rFonts w:ascii="Courier New" w:eastAsia="Courier New" w:hAnsi="Courier New" w:cs="Courier New"/>
-          <w:sz w:val="16"/>
-          <w:szCs w:val="16"/>
-        </w:rPr>
-        <w:t>time.h</w:t>
-      </w:r>
-      <w:proofErr w:type="spellEnd"/>
-      <w:r>
-        <w:rPr>
-          <w:rFonts w:ascii="Courier New" w:eastAsia="Courier New" w:hAnsi="Courier New" w:cs="Courier New"/>
-          <w:sz w:val="16"/>
-          <w:szCs w:val="16"/>
-        </w:rPr>
-        <w:t>&gt;</w:t>
-      </w:r>
-    </w:p>
-    <w:p>
-      <w:pPr>
-        <w:spacing w:line="240" w:lineRule="auto"/>
-        <w:ind w:left="431"/>
-      </w:pPr>
-    </w:p>
-    <w:p>
-      <w:pPr>
-        <w:spacing w:line="240" w:lineRule="auto"/>
-        <w:ind w:left="431"/>
-      </w:pPr>
-      <w:r>
-        <w:rPr>
-          <w:rFonts w:ascii="Courier New" w:eastAsia="Courier New" w:hAnsi="Courier New" w:cs="Courier New"/>
-          <w:sz w:val="16"/>
-          <w:szCs w:val="16"/>
-        </w:rPr>
-        <w:t>#include "</w:t>
-      </w:r>
-      <w:proofErr w:type="spellStart"/>
-      <w:r>
-        <w:rPr>
-          <w:rFonts w:ascii="Courier New" w:eastAsia="Courier New" w:hAnsi="Courier New" w:cs="Courier New"/>
-          <w:sz w:val="16"/>
-          <w:szCs w:val="16"/>
-        </w:rPr>
-        <w:t>config.h</w:t>
-      </w:r>
-      <w:proofErr w:type="spellEnd"/>
-      <w:r>
-        <w:rPr>
-          <w:rFonts w:ascii="Courier New" w:eastAsia="Courier New" w:hAnsi="Courier New" w:cs="Courier New"/>
-          <w:sz w:val="16"/>
-          <w:szCs w:val="16"/>
-        </w:rPr>
-        <w:t>"</w:t>
-      </w:r>
-    </w:p>
-    <w:p>
-      <w:pPr>
-        <w:spacing w:line="240" w:lineRule="auto"/>
-        <w:ind w:left="431"/>
-      </w:pPr>
-      <w:r>
-        <w:rPr>
-          <w:rFonts w:ascii="Courier New" w:eastAsia="Courier New" w:hAnsi="Courier New" w:cs="Courier New"/>
-          <w:sz w:val="16"/>
-          <w:szCs w:val="16"/>
-        </w:rPr>
-        <w:t>#include "</w:t>
-      </w:r>
-      <w:proofErr w:type="spellStart"/>
-      <w:r>
-        <w:rPr>
-          <w:rFonts w:ascii="Courier New" w:eastAsia="Courier New" w:hAnsi="Courier New" w:cs="Courier New"/>
-          <w:sz w:val="16"/>
-          <w:szCs w:val="16"/>
-        </w:rPr>
-        <w:t>types.h</w:t>
-      </w:r>
-      <w:proofErr w:type="spellEnd"/>
-      <w:r>
-        <w:rPr>
-          <w:rFonts w:ascii="Courier New" w:eastAsia="Courier New" w:hAnsi="Courier New" w:cs="Courier New"/>
-          <w:sz w:val="16"/>
-          <w:szCs w:val="16"/>
-        </w:rPr>
-        <w:t>"</w:t>
-      </w:r>
-    </w:p>
-    <w:p>
-      <w:pPr>
-        <w:spacing w:line="240" w:lineRule="auto"/>
-        <w:ind w:left="431"/>
-      </w:pPr>
-      <w:r>
-        <w:rPr>
-          <w:rFonts w:ascii="Courier New" w:eastAsia="Courier New" w:hAnsi="Courier New" w:cs="Courier New"/>
-          <w:sz w:val="16"/>
-          <w:szCs w:val="16"/>
-        </w:rPr>
-        <w:t>#include "</w:t>
-      </w:r>
-      <w:proofErr w:type="spellStart"/>
-      <w:r>
-        <w:rPr>
-          <w:rFonts w:ascii="Courier New" w:eastAsia="Courier New" w:hAnsi="Courier New" w:cs="Courier New"/>
-          <w:sz w:val="16"/>
-          <w:szCs w:val="16"/>
-        </w:rPr>
-        <w:t>sensor.h</w:t>
-      </w:r>
-      <w:proofErr w:type="spellEnd"/>
-      <w:r>
-        <w:rPr>
-          <w:rFonts w:ascii="Courier New" w:eastAsia="Courier New" w:hAnsi="Courier New" w:cs="Courier New"/>
-          <w:sz w:val="16"/>
-          <w:szCs w:val="16"/>
-        </w:rPr>
-        <w:t>"</w:t>
-      </w:r>
-    </w:p>
-    <w:p>
-      <w:pPr>
-        <w:spacing w:line="240" w:lineRule="auto"/>
-        <w:ind w:left="431"/>
-      </w:pPr>
-      <w:r>
-        <w:rPr>
-          <w:rFonts w:ascii="Courier New" w:eastAsia="Courier New" w:hAnsi="Courier New" w:cs="Courier New"/>
-          <w:sz w:val="16"/>
-          <w:szCs w:val="16"/>
-        </w:rPr>
-        <w:t>#include "</w:t>
-      </w:r>
-      <w:proofErr w:type="spellStart"/>
-      <w:r>
-        <w:rPr>
-          <w:rFonts w:ascii="Courier New" w:eastAsia="Courier New" w:hAnsi="Courier New" w:cs="Courier New"/>
-          <w:sz w:val="16"/>
-          <w:szCs w:val="16"/>
-        </w:rPr>
-        <w:t>storage.h</w:t>
-      </w:r>
-      <w:proofErr w:type="spellEnd"/>
-      <w:r>
-        <w:rPr>
-          <w:rFonts w:ascii="Courier New" w:eastAsia="Courier New" w:hAnsi="Courier New" w:cs="Courier New"/>
-          <w:sz w:val="16"/>
-          <w:szCs w:val="16"/>
-        </w:rPr>
-        <w:t>"</w:t>
-      </w:r>
-    </w:p>
-    <w:p>
-      <w:pPr>
-        <w:spacing w:line="240" w:lineRule="auto"/>
-        <w:ind w:left="431"/>
-      </w:pPr>
-      <w:r>
-        <w:rPr>
-          <w:rFonts w:ascii="Courier New" w:eastAsia="Courier New" w:hAnsi="Courier New" w:cs="Courier New"/>
-          <w:sz w:val="16"/>
-          <w:szCs w:val="16"/>
-        </w:rPr>
-        <w:t>#include "</w:t>
-      </w:r>
-      <w:proofErr w:type="spellStart"/>
-      <w:r>
-        <w:rPr>
-          <w:rFonts w:ascii="Courier New" w:eastAsia="Courier New" w:hAnsi="Courier New" w:cs="Courier New"/>
-          <w:sz w:val="16"/>
-          <w:szCs w:val="16"/>
-        </w:rPr>
-        <w:t>wifi_manager.h</w:t>
-      </w:r>
-      <w:proofErr w:type="spellEnd"/>
-      <w:r>
-        <w:rPr>
-          <w:rFonts w:ascii="Courier New" w:eastAsia="Courier New" w:hAnsi="Courier New" w:cs="Courier New"/>
-          <w:sz w:val="16"/>
-          <w:szCs w:val="16"/>
-        </w:rPr>
-        <w:t>"</w:t>
-      </w:r>
-    </w:p>
-    <w:p>
-      <w:pPr>
-        <w:spacing w:line="240" w:lineRule="auto"/>
-        <w:ind w:left="431"/>
-      </w:pPr>
-      <w:r>
-        <w:rPr>
-          <w:rFonts w:ascii="Courier New" w:eastAsia="Courier New" w:hAnsi="Courier New" w:cs="Courier New"/>
-          <w:sz w:val="16"/>
-          <w:szCs w:val="16"/>
-        </w:rPr>
-        <w:t>#include "</w:t>
-      </w:r>
-      <w:proofErr w:type="spellStart"/>
-      <w:r>
-        <w:rPr>
-          <w:rFonts w:ascii="Courier New" w:eastAsia="Courier New" w:hAnsi="Courier New" w:cs="Courier New"/>
-          <w:sz w:val="16"/>
-          <w:szCs w:val="16"/>
-        </w:rPr>
-        <w:t>mqtt_manager.h</w:t>
-      </w:r>
-      <w:proofErr w:type="spellEnd"/>
-      <w:r>
-        <w:rPr>
-          <w:rFonts w:ascii="Courier New" w:eastAsia="Courier New" w:hAnsi="Courier New" w:cs="Courier New"/>
-          <w:sz w:val="16"/>
-          <w:szCs w:val="16"/>
-        </w:rPr>
-        <w:t>"</w:t>
-      </w:r>
-    </w:p>
-    <w:p>
-      <w:pPr>
-        <w:spacing w:line="240" w:lineRule="auto"/>
-        <w:ind w:left="431"/>
-      </w:pPr>
-      <w:r>
-        <w:rPr>
-          <w:rFonts w:ascii="Courier New" w:eastAsia="Courier New" w:hAnsi="Courier New" w:cs="Courier New"/>
-          <w:sz w:val="16"/>
-          <w:szCs w:val="16"/>
-        </w:rPr>
-        <w:t>#include "</w:t>
-      </w:r>
-      <w:proofErr w:type="spellStart"/>
-      <w:r>
-        <w:rPr>
-          <w:rFonts w:ascii="Courier New" w:eastAsia="Courier New" w:hAnsi="Courier New" w:cs="Courier New"/>
-          <w:sz w:val="16"/>
-          <w:szCs w:val="16"/>
-        </w:rPr>
-        <w:t>web_server.h</w:t>
-      </w:r>
-      <w:proofErr w:type="spellEnd"/>
-      <w:r>
-        <w:rPr>
-          <w:rFonts w:ascii="Courier New" w:eastAsia="Courier New" w:hAnsi="Courier New" w:cs="Courier New"/>
-          <w:sz w:val="16"/>
-          <w:szCs w:val="16"/>
-        </w:rPr>
-        <w:t>"</w:t>
-      </w:r>
-    </w:p>
-    <w:p>
-      <w:pPr>
-        <w:spacing w:line="240" w:lineRule="auto"/>
-        <w:ind w:left="431"/>
-      </w:pPr>
-      <w:r>
-        <w:rPr>
-          <w:rFonts w:ascii="Courier New" w:eastAsia="Courier New" w:hAnsi="Courier New" w:cs="Courier New"/>
-          <w:sz w:val="16"/>
-          <w:szCs w:val="16"/>
-        </w:rPr>
-        <w:t>#include "</w:t>
-      </w:r>
-      <w:proofErr w:type="spellStart"/>
-      <w:r>
-        <w:rPr>
-          <w:rFonts w:ascii="Courier New" w:eastAsia="Courier New" w:hAnsi="Courier New" w:cs="Courier New"/>
-          <w:sz w:val="16"/>
-          <w:szCs w:val="16"/>
-        </w:rPr>
-        <w:t>mode_manager.h</w:t>
-      </w:r>
-      <w:proofErr w:type="spellEnd"/>
-      <w:r>
-        <w:rPr>
-          <w:rFonts w:ascii="Courier New" w:eastAsia="Courier New" w:hAnsi="Courier New" w:cs="Courier New"/>
-          <w:sz w:val="16"/>
-          <w:szCs w:val="16"/>
-        </w:rPr>
-        <w:t>"</w:t>
-      </w:r>
-    </w:p>
-    <w:p>
-      <w:pPr>
-        <w:spacing w:line="240" w:lineRule="auto"/>
-        <w:ind w:left="431"/>
-      </w:pPr>
-      <w:r>
-        <w:rPr>
-          <w:rFonts w:ascii="Courier New" w:eastAsia="Courier New" w:hAnsi="Courier New" w:cs="Courier New"/>
-          <w:sz w:val="16"/>
-          <w:szCs w:val="16"/>
-        </w:rPr>
-        <w:t>#include "</w:t>
-      </w:r>
-      <w:proofErr w:type="spellStart"/>
-      <w:r>
-        <w:rPr>
-          <w:rFonts w:ascii="Courier New" w:eastAsia="Courier New" w:hAnsi="Courier New" w:cs="Courier New"/>
-          <w:sz w:val="16"/>
-          <w:szCs w:val="16"/>
-        </w:rPr>
-        <w:t>sensor_fix.h</w:t>
-      </w:r>
-      <w:proofErr w:type="spellEnd"/>
-      <w:r>
-        <w:rPr>
-          <w:rFonts w:ascii="Courier New" w:eastAsia="Courier New" w:hAnsi="Courier New" w:cs="Courier New"/>
-          <w:sz w:val="16"/>
-          <w:szCs w:val="16"/>
-        </w:rPr>
-        <w:t>"</w:t>
-      </w:r>
-    </w:p>
-    <w:p>
-      <w:pPr>
-        <w:spacing w:line="240" w:lineRule="auto"/>
-        <w:ind w:left="431"/>
-      </w:pPr>
-    </w:p>
-    <w:p>
-      <w:pPr>
-        <w:spacing w:line="240" w:lineRule="auto"/>
-        <w:ind w:left="431"/>
-      </w:pPr>
-      <w:r>
-        <w:rPr>
-          <w:rFonts w:ascii="Courier New" w:eastAsia="Courier New" w:hAnsi="Courier New" w:cs="Courier New"/>
-          <w:sz w:val="16"/>
-          <w:szCs w:val="16"/>
-        </w:rPr>
-        <w:t>// ========== VARIABLES GLOBALES ==========</w:t>
-      </w:r>
-    </w:p>
-    <w:p>
-      <w:pPr>
-        <w:spacing w:line="240" w:lineRule="auto"/>
-        <w:ind w:left="431"/>
-      </w:pPr>
-      <w:proofErr w:type="spellStart"/>
-      <w:r>
-        <w:rPr>
-          <w:rFonts w:ascii="Courier New" w:eastAsia="Courier New" w:hAnsi="Courier New" w:cs="Courier New"/>
-          <w:sz w:val="16"/>
-          <w:szCs w:val="16"/>
-        </w:rPr>
-        <w:t>const</w:t>
-      </w:r>
-      <w:proofErr w:type="spellEnd"/>
-      <w:r>
-        <w:rPr>
-          <w:rFonts w:ascii="Courier New" w:eastAsia="Courier New" w:hAnsi="Courier New" w:cs="Courier New"/>
-          <w:sz w:val="16"/>
-          <w:szCs w:val="16"/>
-        </w:rPr>
-        <w:t xml:space="preserve"> </w:t>
-      </w:r>
-      <w:proofErr w:type="spellStart"/>
-      <w:r>
-        <w:rPr>
-          <w:rFonts w:ascii="Courier New" w:eastAsia="Courier New" w:hAnsi="Courier New" w:cs="Courier New"/>
-          <w:sz w:val="16"/>
-          <w:szCs w:val="16"/>
-        </w:rPr>
-        <w:t>char</w:t>
-      </w:r>
-      <w:proofErr w:type="spellEnd"/>
-      <w:r>
-        <w:rPr>
-          <w:rFonts w:ascii="Courier New" w:eastAsia="Courier New" w:hAnsi="Courier New" w:cs="Courier New"/>
-          <w:sz w:val="16"/>
-          <w:szCs w:val="16"/>
-        </w:rPr>
-        <w:t xml:space="preserve">* </w:t>
-      </w:r>
-      <w:proofErr w:type="spellStart"/>
-      <w:r>
-        <w:rPr>
-          <w:rFonts w:ascii="Courier New" w:eastAsia="Courier New" w:hAnsi="Courier New" w:cs="Courier New"/>
-          <w:sz w:val="16"/>
-          <w:szCs w:val="16"/>
-        </w:rPr>
-        <w:t>my_ssid</w:t>
-      </w:r>
-      <w:proofErr w:type="spellEnd"/>
-      <w:r>
-        <w:rPr>
-          <w:rFonts w:ascii="Courier New" w:eastAsia="Courier New" w:hAnsi="Courier New" w:cs="Courier New"/>
-          <w:sz w:val="16"/>
-          <w:szCs w:val="16"/>
-        </w:rPr>
-        <w:t xml:space="preserve"> = WIFI_SSID;</w:t>
-      </w:r>
-    </w:p>
-    <w:p>
-      <w:pPr>
-        <w:spacing w:line="240" w:lineRule="auto"/>
-        <w:ind w:left="431"/>
-      </w:pPr>
-      <w:proofErr w:type="spellStart"/>
-      <w:r>
-        <w:rPr>
-          <w:rFonts w:ascii="Courier New" w:eastAsia="Courier New" w:hAnsi="Courier New" w:cs="Courier New"/>
-          <w:sz w:val="16"/>
-          <w:szCs w:val="16"/>
-        </w:rPr>
-        <w:t>const</w:t>
-      </w:r>
-      <w:proofErr w:type="spellEnd"/>
-      <w:r>
-        <w:rPr>
-          <w:rFonts w:ascii="Courier New" w:eastAsia="Courier New" w:hAnsi="Courier New" w:cs="Courier New"/>
-          <w:sz w:val="16"/>
-          <w:szCs w:val="16"/>
-        </w:rPr>
-        <w:t xml:space="preserve"> </w:t>
-      </w:r>
-      <w:proofErr w:type="spellStart"/>
-      <w:r>
-        <w:rPr>
-          <w:rFonts w:ascii="Courier New" w:eastAsia="Courier New" w:hAnsi="Courier New" w:cs="Courier New"/>
-          <w:sz w:val="16"/>
-          <w:szCs w:val="16"/>
-        </w:rPr>
-        <w:t>char</w:t>
-      </w:r>
-      <w:proofErr w:type="spellEnd"/>
-      <w:r>
-        <w:rPr>
-          <w:rFonts w:ascii="Courier New" w:eastAsia="Courier New" w:hAnsi="Courier New" w:cs="Courier New"/>
-          <w:sz w:val="16"/>
-          <w:szCs w:val="16"/>
-        </w:rPr>
-        <w:t xml:space="preserve">* </w:t>
-      </w:r>
-      <w:proofErr w:type="spellStart"/>
-      <w:r>
-        <w:rPr>
-          <w:rFonts w:ascii="Courier New" w:eastAsia="Courier New" w:hAnsi="Courier New" w:cs="Courier New"/>
-          <w:sz w:val="16"/>
-          <w:szCs w:val="16"/>
-        </w:rPr>
-        <w:t>my_password</w:t>
-      </w:r>
-      <w:proofErr w:type="spellEnd"/>
-      <w:r>
-        <w:rPr>
-          <w:rFonts w:ascii="Courier New" w:eastAsia="Courier New" w:hAnsi="Courier New" w:cs="Courier New"/>
-          <w:sz w:val="16"/>
-          <w:szCs w:val="16"/>
-        </w:rPr>
-        <w:t xml:space="preserve"> = WIFI_PASSWORD;</w:t>
-      </w:r>
-    </w:p>
-    <w:p>
-      <w:pPr>
-        <w:spacing w:line="240" w:lineRule="auto"/>
-        <w:ind w:left="431"/>
-      </w:pPr>
-      <w:proofErr w:type="spellStart"/>
-      <w:r>
-        <w:rPr>
-          <w:rFonts w:ascii="Courier New" w:eastAsia="Courier New" w:hAnsi="Courier New" w:cs="Courier New"/>
-          <w:sz w:val="16"/>
-          <w:szCs w:val="16"/>
-        </w:rPr>
-        <w:t>const</w:t>
-      </w:r>
-      <w:proofErr w:type="spellEnd"/>
-      <w:r>
-        <w:rPr>
-          <w:rFonts w:ascii="Courier New" w:eastAsia="Courier New" w:hAnsi="Courier New" w:cs="Courier New"/>
-          <w:sz w:val="16"/>
-          <w:szCs w:val="16"/>
-        </w:rPr>
-        <w:t xml:space="preserve"> </w:t>
-      </w:r>
-      <w:proofErr w:type="spellStart"/>
-      <w:r>
-        <w:rPr>
-          <w:rFonts w:ascii="Courier New" w:eastAsia="Courier New" w:hAnsi="Courier New" w:cs="Courier New"/>
-          <w:sz w:val="16"/>
-          <w:szCs w:val="16"/>
-        </w:rPr>
-        <w:t>char</w:t>
-      </w:r>
-      <w:proofErr w:type="spellEnd"/>
-      <w:r>
-        <w:rPr>
-          <w:rFonts w:ascii="Courier New" w:eastAsia="Courier New" w:hAnsi="Courier New" w:cs="Courier New"/>
-          <w:sz w:val="16"/>
-          <w:szCs w:val="16"/>
-        </w:rPr>
-        <w:t xml:space="preserve">* </w:t>
-      </w:r>
-      <w:proofErr w:type="spellStart"/>
-      <w:r>
-        <w:rPr>
-          <w:rFonts w:ascii="Courier New" w:eastAsia="Courier New" w:hAnsi="Courier New" w:cs="Courier New"/>
-          <w:sz w:val="16"/>
-          <w:szCs w:val="16"/>
-        </w:rPr>
-        <w:t>serverIP</w:t>
-      </w:r>
-      <w:proofErr w:type="spellEnd"/>
-      <w:r>
-        <w:rPr>
-          <w:rFonts w:ascii="Courier New" w:eastAsia="Courier New" w:hAnsi="Courier New" w:cs="Courier New"/>
-          <w:sz w:val="16"/>
-          <w:szCs w:val="16"/>
-        </w:rPr>
-        <w:t xml:space="preserve"> = SERVER_IP;</w:t>
-      </w:r>
-    </w:p>
-    <w:p>
-      <w:pPr>
-        <w:spacing w:line="240" w:lineRule="auto"/>
-        <w:ind w:left="431"/>
-      </w:pPr>
-      <w:proofErr w:type="spellStart"/>
-      <w:r>
-        <w:rPr>
-          <w:rFonts w:ascii="Courier New" w:eastAsia="Courier New" w:hAnsi="Courier New" w:cs="Courier New"/>
-          <w:sz w:val="16"/>
-          <w:szCs w:val="16"/>
-        </w:rPr>
-        <w:t>const</w:t>
-      </w:r>
-      <w:proofErr w:type="spellEnd"/>
-      <w:r>
-        <w:rPr>
-          <w:rFonts w:ascii="Courier New" w:eastAsia="Courier New" w:hAnsi="Courier New" w:cs="Courier New"/>
-          <w:sz w:val="16"/>
-          <w:szCs w:val="16"/>
-        </w:rPr>
-        <w:t xml:space="preserve"> uint16_t </w:t>
-      </w:r>
-      <w:proofErr w:type="spellStart"/>
-      <w:r>
-        <w:rPr>
-          <w:rFonts w:ascii="Courier New" w:eastAsia="Courier New" w:hAnsi="Courier New" w:cs="Courier New"/>
-          <w:sz w:val="16"/>
-          <w:szCs w:val="16"/>
-        </w:rPr>
-        <w:t>serverPort</w:t>
-      </w:r>
-      <w:proofErr w:type="spellEnd"/>
-      <w:r>
-        <w:rPr>
-          <w:rFonts w:ascii="Courier New" w:eastAsia="Courier New" w:hAnsi="Courier New" w:cs="Courier New"/>
-          <w:sz w:val="16"/>
-          <w:szCs w:val="16"/>
-        </w:rPr>
-        <w:t xml:space="preserve"> = SERVER_PORT;</w:t>
-      </w:r>
-    </w:p>
-    <w:p>
-      <w:pPr>
-        <w:spacing w:line="240" w:lineRule="auto"/>
-        <w:ind w:left="431"/>
-      </w:pPr>
-      <w:proofErr w:type="spellStart"/>
-      <w:r>
-        <w:rPr>
-          <w:rFonts w:ascii="Courier New" w:eastAsia="Courier New" w:hAnsi="Courier New" w:cs="Courier New"/>
-          <w:sz w:val="16"/>
-          <w:szCs w:val="16"/>
-        </w:rPr>
-        <w:t>const</w:t>
-      </w:r>
-      <w:proofErr w:type="spellEnd"/>
-      <w:r>
-        <w:rPr>
-          <w:rFonts w:ascii="Courier New" w:eastAsia="Courier New" w:hAnsi="Courier New" w:cs="Courier New"/>
-          <w:sz w:val="16"/>
-          <w:szCs w:val="16"/>
-        </w:rPr>
-        <w:t xml:space="preserve"> </w:t>
-      </w:r>
-      <w:proofErr w:type="spellStart"/>
-      <w:r>
-        <w:rPr>
-          <w:rFonts w:ascii="Courier New" w:eastAsia="Courier New" w:hAnsi="Courier New" w:cs="Courier New"/>
-          <w:sz w:val="16"/>
-          <w:szCs w:val="16"/>
-        </w:rPr>
-        <w:t>char</w:t>
-      </w:r>
-      <w:proofErr w:type="spellEnd"/>
-      <w:r>
-        <w:rPr>
-          <w:rFonts w:ascii="Courier New" w:eastAsia="Courier New" w:hAnsi="Courier New" w:cs="Courier New"/>
-          <w:sz w:val="16"/>
-          <w:szCs w:val="16"/>
-        </w:rPr>
-        <w:t>* API_ENDPOINT_PATH = API_ENDPOINT;</w:t>
-      </w:r>
-    </w:p>
-    <w:p>
-      <w:pPr>
-        <w:spacing w:line="240" w:lineRule="auto"/>
-        <w:ind w:left="431"/>
-      </w:pPr>
-    </w:p>
-    <w:p>
-      <w:pPr>
-        <w:spacing w:line="240" w:lineRule="auto"/>
-        <w:ind w:left="431"/>
-      </w:pPr>
-      <w:r>
-        <w:rPr>
-          <w:rFonts w:ascii="Courier New" w:eastAsia="Courier New" w:hAnsi="Courier New" w:cs="Courier New"/>
-          <w:sz w:val="16"/>
-          <w:szCs w:val="16"/>
-        </w:rPr>
-        <w:t xml:space="preserve">// ... (295 líneas </w:t>
-      </w:r>
-      <w:proofErr w:type="gramStart"/>
-      <w:r>
-        <w:rPr>
-          <w:rFonts w:ascii="Courier New" w:eastAsia="Courier New" w:hAnsi="Courier New" w:cs="Courier New"/>
-          <w:sz w:val="16"/>
-          <w:szCs w:val="16"/>
-        </w:rPr>
-        <w:t>omitidas)&lt;</w:t>
-      </w:r>
-      <w:proofErr w:type="gramEnd"/>
-      <w:r>
-        <w:rPr>
-          <w:rFonts w:ascii="Courier New" w:eastAsia="Courier New" w:hAnsi="Courier New" w:cs="Courier New"/>
-          <w:sz w:val="16"/>
-          <w:szCs w:val="16"/>
-        </w:rPr>
-        <w:t>/</w:t>
-      </w:r>
-      <w:proofErr w:type="spellStart"/>
-      <w:r>
-        <w:rPr>
-          <w:rFonts w:ascii="Courier New" w:eastAsia="Courier New" w:hAnsi="Courier New" w:cs="Courier New"/>
-          <w:sz w:val="16"/>
-          <w:szCs w:val="16"/>
-        </w:rPr>
-        <w:t>code</w:t>
-      </w:r>
-      <w:proofErr w:type="spellEnd"/>
-      <w:r>
-        <w:rPr>
-          <w:rFonts w:ascii="Courier New" w:eastAsia="Courier New" w:hAnsi="Courier New" w:cs="Courier New"/>
-          <w:sz w:val="16"/>
-          <w:szCs w:val="16"/>
-        </w:rPr>
-        <w:t>&gt;</w:t>
-      </w:r>
-    </w:p>
-    <w:p>
-      <w:pPr>
-        <w:spacing w:after="200"/>
-      </w:pPr>
-    </w:p>
-    <w:p>
-      <w:pPr>
-        <w:pStyle w:val="Ttulo4"/>
-      </w:pPr>
-      <w:r>
-        <w:rPr>
-          <w:i w:val="0"/>
-          <w:iCs w:val="0"/>
-        </w:rPr>
-        <w:t>mqtt_manager.cpp</w:t>
-      </w:r>
-    </w:p>
-    <w:p>
-      <w:pPr>
-        <w:spacing w:line="240" w:lineRule="auto"/>
-        <w:ind w:left="431"/>
-      </w:pPr>
-      <w:r>
-        <w:rPr>
-          <w:rFonts w:ascii="Courier New" w:eastAsia="Courier New" w:hAnsi="Courier New" w:cs="Courier New"/>
-          <w:sz w:val="16"/>
-          <w:szCs w:val="16"/>
-        </w:rPr>
-        <w:lastRenderedPageBreak/>
-        <w:t>&lt;</w:t>
-      </w:r>
-      <w:proofErr w:type="spellStart"/>
-      <w:r>
-        <w:rPr>
-          <w:rFonts w:ascii="Courier New" w:eastAsia="Courier New" w:hAnsi="Courier New" w:cs="Courier New"/>
-          <w:sz w:val="16"/>
-          <w:szCs w:val="16"/>
-        </w:rPr>
-        <w:t>code</w:t>
-      </w:r>
-      <w:proofErr w:type="spellEnd"/>
-      <w:r>
-        <w:rPr>
-          <w:rFonts w:ascii="Courier New" w:eastAsia="Courier New" w:hAnsi="Courier New" w:cs="Courier New"/>
-          <w:sz w:val="16"/>
-          <w:szCs w:val="16"/>
-        </w:rPr>
-        <w:t>&gt;#include "</w:t>
-      </w:r>
-      <w:proofErr w:type="spellStart"/>
-      <w:r>
-        <w:rPr>
-          <w:rFonts w:ascii="Courier New" w:eastAsia="Courier New" w:hAnsi="Courier New" w:cs="Courier New"/>
-          <w:sz w:val="16"/>
-          <w:szCs w:val="16"/>
-        </w:rPr>
-        <w:t>mqtt_manager.h</w:t>
-      </w:r>
-      <w:proofErr w:type="spellEnd"/>
-      <w:r>
-        <w:rPr>
-          <w:rFonts w:ascii="Courier New" w:eastAsia="Courier New" w:hAnsi="Courier New" w:cs="Courier New"/>
-          <w:sz w:val="16"/>
-          <w:szCs w:val="16"/>
-        </w:rPr>
-        <w:t>"</w:t>
-      </w:r>
-    </w:p>
-    <w:p>
-      <w:pPr>
-        <w:spacing w:line="240" w:lineRule="auto"/>
-        <w:ind w:left="431"/>
-      </w:pPr>
-      <w:r>
-        <w:rPr>
-          <w:rFonts w:ascii="Courier New" w:eastAsia="Courier New" w:hAnsi="Courier New" w:cs="Courier New"/>
-          <w:sz w:val="16"/>
-          <w:szCs w:val="16"/>
-        </w:rPr>
-        <w:t>#include "</w:t>
-      </w:r>
-      <w:proofErr w:type="spellStart"/>
-      <w:r>
-        <w:rPr>
-          <w:rFonts w:ascii="Courier New" w:eastAsia="Courier New" w:hAnsi="Courier New" w:cs="Courier New"/>
-          <w:sz w:val="16"/>
-          <w:szCs w:val="16"/>
-        </w:rPr>
-        <w:t>config.h</w:t>
-      </w:r>
-      <w:proofErr w:type="spellEnd"/>
-      <w:r>
-        <w:rPr>
-          <w:rFonts w:ascii="Courier New" w:eastAsia="Courier New" w:hAnsi="Courier New" w:cs="Courier New"/>
-          <w:sz w:val="16"/>
-          <w:szCs w:val="16"/>
-        </w:rPr>
-        <w:t>"</w:t>
-      </w:r>
-    </w:p>
-    <w:p>
-      <w:pPr>
-        <w:spacing w:line="240" w:lineRule="auto"/>
-        <w:ind w:left="431"/>
-      </w:pPr>
-      <w:r>
-        <w:rPr>
-          <w:rFonts w:ascii="Courier New" w:eastAsia="Courier New" w:hAnsi="Courier New" w:cs="Courier New"/>
-          <w:sz w:val="16"/>
-          <w:szCs w:val="16"/>
-        </w:rPr>
-        <w:t>#include "</w:t>
-      </w:r>
-      <w:proofErr w:type="spellStart"/>
-      <w:r>
-        <w:rPr>
-          <w:rFonts w:ascii="Courier New" w:eastAsia="Courier New" w:hAnsi="Courier New" w:cs="Courier New"/>
-          <w:sz w:val="16"/>
-          <w:szCs w:val="16"/>
-        </w:rPr>
-        <w:t>sensor.h</w:t>
-      </w:r>
-      <w:proofErr w:type="spellEnd"/>
-      <w:r>
-        <w:rPr>
-          <w:rFonts w:ascii="Courier New" w:eastAsia="Courier New" w:hAnsi="Courier New" w:cs="Courier New"/>
-          <w:sz w:val="16"/>
-          <w:szCs w:val="16"/>
-        </w:rPr>
-        <w:t>"</w:t>
-      </w:r>
-    </w:p>
-    <w:p>
-      <w:pPr>
-        <w:spacing w:line="240" w:lineRule="auto"/>
-        <w:ind w:left="431"/>
-      </w:pPr>
-      <w:r>
-        <w:rPr>
-          <w:rFonts w:ascii="Courier New" w:eastAsia="Courier New" w:hAnsi="Courier New" w:cs="Courier New"/>
-          <w:sz w:val="16"/>
-          <w:szCs w:val="16"/>
-        </w:rPr>
-        <w:t>#include "</w:t>
-      </w:r>
-      <w:proofErr w:type="spellStart"/>
-      <w:r>
-        <w:rPr>
-          <w:rFonts w:ascii="Courier New" w:eastAsia="Courier New" w:hAnsi="Courier New" w:cs="Courier New"/>
-          <w:sz w:val="16"/>
-          <w:szCs w:val="16"/>
-        </w:rPr>
-        <w:t>storage.h</w:t>
-      </w:r>
-      <w:proofErr w:type="spellEnd"/>
-      <w:r>
-        <w:rPr>
-          <w:rFonts w:ascii="Courier New" w:eastAsia="Courier New" w:hAnsi="Courier New" w:cs="Courier New"/>
-          <w:sz w:val="16"/>
-          <w:szCs w:val="16"/>
-        </w:rPr>
-        <w:t>"</w:t>
-      </w:r>
-    </w:p>
-    <w:p>
-      <w:pPr>
-        <w:spacing w:line="240" w:lineRule="auto"/>
-        <w:ind w:left="431"/>
-      </w:pPr>
-    </w:p>
-    <w:p>
-      <w:pPr>
-        <w:spacing w:line="240" w:lineRule="auto"/>
-        <w:ind w:left="431"/>
-      </w:pPr>
-      <w:r>
-        <w:rPr>
-          <w:rFonts w:ascii="Courier New" w:eastAsia="Courier New" w:hAnsi="Courier New" w:cs="Courier New"/>
-          <w:sz w:val="16"/>
-          <w:szCs w:val="16"/>
-        </w:rPr>
-        <w:t xml:space="preserve">// ========== MQTT: Helper para suscribir </w:t>
-      </w:r>
-      <w:proofErr w:type="spellStart"/>
-      <w:r>
-        <w:rPr>
-          <w:rFonts w:ascii="Courier New" w:eastAsia="Courier New" w:hAnsi="Courier New" w:cs="Courier New"/>
-          <w:sz w:val="16"/>
-          <w:szCs w:val="16"/>
-        </w:rPr>
-        <w:t>topics</w:t>
-      </w:r>
-      <w:proofErr w:type="spellEnd"/>
-      <w:r>
-        <w:rPr>
-          <w:rFonts w:ascii="Courier New" w:eastAsia="Courier New" w:hAnsi="Courier New" w:cs="Courier New"/>
-          <w:sz w:val="16"/>
-          <w:szCs w:val="16"/>
-        </w:rPr>
-        <w:t xml:space="preserve"> ==========</w:t>
-      </w:r>
-    </w:p>
-    <w:p>
-      <w:pPr>
-        <w:spacing w:line="240" w:lineRule="auto"/>
-        <w:ind w:left="431"/>
-      </w:pPr>
-      <w:proofErr w:type="spellStart"/>
-      <w:r>
-        <w:rPr>
-          <w:rFonts w:ascii="Courier New" w:eastAsia="Courier New" w:hAnsi="Courier New" w:cs="Courier New"/>
-          <w:sz w:val="16"/>
-          <w:szCs w:val="16"/>
-        </w:rPr>
-        <w:t>void</w:t>
-      </w:r>
-      <w:proofErr w:type="spellEnd"/>
-      <w:r>
-        <w:rPr>
-          <w:rFonts w:ascii="Courier New" w:eastAsia="Courier New" w:hAnsi="Courier New" w:cs="Courier New"/>
-          <w:sz w:val="16"/>
-          <w:szCs w:val="16"/>
-        </w:rPr>
-        <w:t xml:space="preserve"> </w:t>
-      </w:r>
-      <w:proofErr w:type="spellStart"/>
-      <w:proofErr w:type="gramStart"/>
-      <w:r>
-        <w:rPr>
-          <w:rFonts w:ascii="Courier New" w:eastAsia="Courier New" w:hAnsi="Courier New" w:cs="Courier New"/>
-          <w:sz w:val="16"/>
-          <w:szCs w:val="16"/>
-        </w:rPr>
-        <w:t>mqttSubscribeAll</w:t>
-      </w:r>
-      <w:proofErr w:type="spellEnd"/>
-      <w:r>
-        <w:rPr>
-          <w:rFonts w:ascii="Courier New" w:eastAsia="Courier New" w:hAnsi="Courier New" w:cs="Courier New"/>
-          <w:sz w:val="16"/>
-          <w:szCs w:val="16"/>
-        </w:rPr>
-        <w:t>(</w:t>
-      </w:r>
-      <w:proofErr w:type="gramEnd"/>
-      <w:r>
-        <w:rPr>
-          <w:rFonts w:ascii="Courier New" w:eastAsia="Courier New" w:hAnsi="Courier New" w:cs="Courier New"/>
-          <w:sz w:val="16"/>
-          <w:szCs w:val="16"/>
-        </w:rPr>
-        <w:t>) {</w:t>
-      </w:r>
-    </w:p>
-    <w:p>
-      <w:pPr>
-        <w:spacing w:line="240" w:lineRule="auto"/>
-        <w:ind w:left="431"/>
-      </w:pPr>
-      <w:r>
-        <w:rPr>
-          <w:rFonts w:ascii="Courier New" w:eastAsia="Courier New" w:hAnsi="Courier New" w:cs="Courier New"/>
-          <w:sz w:val="16"/>
-          <w:szCs w:val="16"/>
-        </w:rPr>
-        <w:t xml:space="preserve">  </w:t>
-      </w:r>
-      <w:proofErr w:type="spellStart"/>
-      <w:r>
-        <w:rPr>
-          <w:rFonts w:ascii="Courier New" w:eastAsia="Courier New" w:hAnsi="Courier New" w:cs="Courier New"/>
-          <w:sz w:val="16"/>
-          <w:szCs w:val="16"/>
-        </w:rPr>
-        <w:t>mqttClient.subscribe</w:t>
-      </w:r>
-      <w:proofErr w:type="spellEnd"/>
-      <w:r>
-        <w:rPr>
-          <w:rFonts w:ascii="Courier New" w:eastAsia="Courier New" w:hAnsi="Courier New" w:cs="Courier New"/>
-          <w:sz w:val="16"/>
-          <w:szCs w:val="16"/>
-        </w:rPr>
-        <w:t>("sensores/ping/</w:t>
-      </w:r>
-      <w:proofErr w:type="spellStart"/>
-      <w:r>
-        <w:rPr>
-          <w:rFonts w:ascii="Courier New" w:eastAsia="Courier New" w:hAnsi="Courier New" w:cs="Courier New"/>
-          <w:sz w:val="16"/>
-          <w:szCs w:val="16"/>
-        </w:rPr>
-        <w:t>request</w:t>
-      </w:r>
-      <w:proofErr w:type="spellEnd"/>
-      <w:r>
-        <w:rPr>
-          <w:rFonts w:ascii="Courier New" w:eastAsia="Courier New" w:hAnsi="Courier New" w:cs="Courier New"/>
-          <w:sz w:val="16"/>
-          <w:szCs w:val="16"/>
-        </w:rPr>
-        <w:t>");</w:t>
-      </w:r>
-    </w:p>
-    <w:p>
-      <w:pPr>
-        <w:spacing w:line="240" w:lineRule="auto"/>
-        <w:ind w:left="431"/>
-      </w:pPr>
-      <w:r>
-        <w:rPr>
-          <w:rFonts w:ascii="Courier New" w:eastAsia="Courier New" w:hAnsi="Courier New" w:cs="Courier New"/>
-          <w:sz w:val="16"/>
-          <w:szCs w:val="16"/>
-        </w:rPr>
-        <w:t xml:space="preserve">  </w:t>
-      </w:r>
-      <w:proofErr w:type="spellStart"/>
-      <w:r>
-        <w:rPr>
-          <w:rFonts w:ascii="Courier New" w:eastAsia="Courier New" w:hAnsi="Courier New" w:cs="Courier New"/>
-          <w:sz w:val="16"/>
-          <w:szCs w:val="16"/>
-        </w:rPr>
-        <w:t>mqttClient.subscribe</w:t>
-      </w:r>
-      <w:proofErr w:type="spellEnd"/>
-      <w:r>
-        <w:rPr>
-          <w:rFonts w:ascii="Courier New" w:eastAsia="Courier New" w:hAnsi="Courier New" w:cs="Courier New"/>
-          <w:sz w:val="16"/>
-          <w:szCs w:val="16"/>
-        </w:rPr>
-        <w:t>(MQTT_ACK_TOPIC);</w:t>
-      </w:r>
-    </w:p>
-    <w:p>
-      <w:pPr>
-        <w:spacing w:line="240" w:lineRule="auto"/>
-        <w:ind w:left="431"/>
-      </w:pPr>
-      <w:r>
-        <w:rPr>
-          <w:rFonts w:ascii="Courier New" w:eastAsia="Courier New" w:hAnsi="Courier New" w:cs="Courier New"/>
-          <w:sz w:val="16"/>
-          <w:szCs w:val="16"/>
-        </w:rPr>
-        <w:t xml:space="preserve">  </w:t>
-      </w:r>
-      <w:proofErr w:type="spellStart"/>
-      <w:r>
-        <w:rPr>
-          <w:rFonts w:ascii="Courier New" w:eastAsia="Courier New" w:hAnsi="Courier New" w:cs="Courier New"/>
-          <w:sz w:val="16"/>
-          <w:szCs w:val="16"/>
-        </w:rPr>
-        <w:t>mqttClient.subscribe</w:t>
-      </w:r>
-      <w:proofErr w:type="spellEnd"/>
-      <w:r>
-        <w:rPr>
-          <w:rFonts w:ascii="Courier New" w:eastAsia="Courier New" w:hAnsi="Courier New" w:cs="Courier New"/>
-          <w:sz w:val="16"/>
-          <w:szCs w:val="16"/>
-        </w:rPr>
-        <w:t>(MQTT_TIME_RESPONSE);</w:t>
-      </w:r>
-    </w:p>
-    <w:p>
-      <w:pPr>
-        <w:spacing w:line="240" w:lineRule="auto"/>
-        <w:ind w:left="431"/>
-      </w:pPr>
-      <w:r>
-        <w:rPr>
-          <w:rFonts w:ascii="Courier New" w:eastAsia="Courier New" w:hAnsi="Courier New" w:cs="Courier New"/>
-          <w:sz w:val="16"/>
-          <w:szCs w:val="16"/>
-        </w:rPr>
-        <w:t xml:space="preserve">  String </w:t>
-      </w:r>
-      <w:proofErr w:type="spellStart"/>
-      <w:r>
-        <w:rPr>
-          <w:rFonts w:ascii="Courier New" w:eastAsia="Courier New" w:hAnsi="Courier New" w:cs="Courier New"/>
-          <w:sz w:val="16"/>
-          <w:szCs w:val="16"/>
-        </w:rPr>
-        <w:t>configTopic</w:t>
-      </w:r>
-      <w:proofErr w:type="spellEnd"/>
-      <w:r>
-        <w:rPr>
-          <w:rFonts w:ascii="Courier New" w:eastAsia="Courier New" w:hAnsi="Courier New" w:cs="Courier New"/>
-          <w:sz w:val="16"/>
-          <w:szCs w:val="16"/>
-        </w:rPr>
-        <w:t xml:space="preserve"> = "sensores/</w:t>
-      </w:r>
-      <w:proofErr w:type="spellStart"/>
-      <w:r>
-        <w:rPr>
-          <w:rFonts w:ascii="Courier New" w:eastAsia="Courier New" w:hAnsi="Courier New" w:cs="Courier New"/>
-          <w:sz w:val="16"/>
-          <w:szCs w:val="16"/>
-        </w:rPr>
-        <w:t>config</w:t>
-      </w:r>
-      <w:proofErr w:type="spellEnd"/>
-      <w:r>
-        <w:rPr>
-          <w:rFonts w:ascii="Courier New" w:eastAsia="Courier New" w:hAnsi="Courier New" w:cs="Courier New"/>
-          <w:sz w:val="16"/>
-          <w:szCs w:val="16"/>
-        </w:rPr>
-        <w:t xml:space="preserve">/" + </w:t>
-      </w:r>
-      <w:proofErr w:type="spellStart"/>
-      <w:r>
-        <w:rPr>
-          <w:rFonts w:ascii="Courier New" w:eastAsia="Courier New" w:hAnsi="Courier New" w:cs="Courier New"/>
-          <w:sz w:val="16"/>
-          <w:szCs w:val="16"/>
-        </w:rPr>
-        <w:t>sensorID</w:t>
-      </w:r>
-      <w:proofErr w:type="spellEnd"/>
-      <w:r>
-        <w:rPr>
-          <w:rFonts w:ascii="Courier New" w:eastAsia="Courier New" w:hAnsi="Courier New" w:cs="Courier New"/>
-          <w:sz w:val="16"/>
-          <w:szCs w:val="16"/>
-        </w:rPr>
-        <w:t>;</w:t>
-      </w:r>
-    </w:p>
-    <w:p>
-      <w:pPr>
-        <w:spacing w:line="240" w:lineRule="auto"/>
-        <w:ind w:left="431"/>
-      </w:pPr>
-      <w:r>
-        <w:rPr>
-          <w:rFonts w:ascii="Courier New" w:eastAsia="Courier New" w:hAnsi="Courier New" w:cs="Courier New"/>
-          <w:sz w:val="16"/>
-          <w:szCs w:val="16"/>
-        </w:rPr>
-        <w:t xml:space="preserve">  </w:t>
-      </w:r>
-      <w:proofErr w:type="spellStart"/>
-      <w:r>
-        <w:rPr>
-          <w:rFonts w:ascii="Courier New" w:eastAsia="Courier New" w:hAnsi="Courier New" w:cs="Courier New"/>
-          <w:sz w:val="16"/>
-          <w:szCs w:val="16"/>
-        </w:rPr>
-        <w:t>mqttClient.subscribe</w:t>
-      </w:r>
-      <w:proofErr w:type="spellEnd"/>
-      <w:r>
-        <w:rPr>
-          <w:rFonts w:ascii="Courier New" w:eastAsia="Courier New" w:hAnsi="Courier New" w:cs="Courier New"/>
-          <w:sz w:val="16"/>
-          <w:szCs w:val="16"/>
-        </w:rPr>
-        <w:t>(</w:t>
-      </w:r>
-      <w:proofErr w:type="spellStart"/>
-      <w:r>
-        <w:rPr>
-          <w:rFonts w:ascii="Courier New" w:eastAsia="Courier New" w:hAnsi="Courier New" w:cs="Courier New"/>
-          <w:sz w:val="16"/>
-          <w:szCs w:val="16"/>
-        </w:rPr>
-        <w:t>configTopic.c_</w:t>
-      </w:r>
-      <w:proofErr w:type="gramStart"/>
-      <w:r>
-        <w:rPr>
-          <w:rFonts w:ascii="Courier New" w:eastAsia="Courier New" w:hAnsi="Courier New" w:cs="Courier New"/>
-          <w:sz w:val="16"/>
-          <w:szCs w:val="16"/>
-        </w:rPr>
-        <w:t>str</w:t>
-      </w:r>
-      <w:proofErr w:type="spellEnd"/>
-      <w:r>
-        <w:rPr>
-          <w:rFonts w:ascii="Courier New" w:eastAsia="Courier New" w:hAnsi="Courier New" w:cs="Courier New"/>
-          <w:sz w:val="16"/>
-          <w:szCs w:val="16"/>
-        </w:rPr>
-        <w:t>(</w:t>
-      </w:r>
-      <w:proofErr w:type="gramEnd"/>
-      <w:r>
-        <w:rPr>
-          <w:rFonts w:ascii="Courier New" w:eastAsia="Courier New" w:hAnsi="Courier New" w:cs="Courier New"/>
-          <w:sz w:val="16"/>
-          <w:szCs w:val="16"/>
-        </w:rPr>
-        <w:t>));</w:t>
-      </w:r>
-    </w:p>
-    <w:p>
-      <w:pPr>
-        <w:spacing w:line="240" w:lineRule="auto"/>
-        <w:ind w:left="431"/>
-      </w:pPr>
-      <w:r>
-        <w:rPr>
-          <w:rFonts w:ascii="Courier New" w:eastAsia="Courier New" w:hAnsi="Courier New" w:cs="Courier New"/>
-          <w:sz w:val="16"/>
-          <w:szCs w:val="16"/>
-        </w:rPr>
-        <w:t xml:space="preserve">  String </w:t>
-      </w:r>
-      <w:proofErr w:type="spellStart"/>
-      <w:r>
-        <w:rPr>
-          <w:rFonts w:ascii="Courier New" w:eastAsia="Courier New" w:hAnsi="Courier New" w:cs="Courier New"/>
-          <w:sz w:val="16"/>
-          <w:szCs w:val="16"/>
-        </w:rPr>
-        <w:t>resetTopic</w:t>
-      </w:r>
-      <w:proofErr w:type="spellEnd"/>
-      <w:r>
-        <w:rPr>
-          <w:rFonts w:ascii="Courier New" w:eastAsia="Courier New" w:hAnsi="Courier New" w:cs="Courier New"/>
-          <w:sz w:val="16"/>
-          <w:szCs w:val="16"/>
-        </w:rPr>
-        <w:t xml:space="preserve"> = "sensores/</w:t>
-      </w:r>
-      <w:proofErr w:type="spellStart"/>
-      <w:r>
-        <w:rPr>
-          <w:rFonts w:ascii="Courier New" w:eastAsia="Courier New" w:hAnsi="Courier New" w:cs="Courier New"/>
-          <w:sz w:val="16"/>
-          <w:szCs w:val="16"/>
-        </w:rPr>
-        <w:t>reset</w:t>
-      </w:r>
-      <w:proofErr w:type="spellEnd"/>
-      <w:r>
-        <w:rPr>
-          <w:rFonts w:ascii="Courier New" w:eastAsia="Courier New" w:hAnsi="Courier New" w:cs="Courier New"/>
-          <w:sz w:val="16"/>
-          <w:szCs w:val="16"/>
-        </w:rPr>
-        <w:t xml:space="preserve">/" + </w:t>
-      </w:r>
-      <w:proofErr w:type="spellStart"/>
-      <w:r>
-        <w:rPr>
-          <w:rFonts w:ascii="Courier New" w:eastAsia="Courier New" w:hAnsi="Courier New" w:cs="Courier New"/>
-          <w:sz w:val="16"/>
-          <w:szCs w:val="16"/>
-        </w:rPr>
-        <w:t>sensorID</w:t>
-      </w:r>
-      <w:proofErr w:type="spellEnd"/>
-      <w:r>
-        <w:rPr>
-          <w:rFonts w:ascii="Courier New" w:eastAsia="Courier New" w:hAnsi="Courier New" w:cs="Courier New"/>
-          <w:sz w:val="16"/>
-          <w:szCs w:val="16"/>
-        </w:rPr>
-        <w:t>;</w:t>
-      </w:r>
-    </w:p>
-    <w:p>
-      <w:pPr>
-        <w:spacing w:line="240" w:lineRule="auto"/>
-        <w:ind w:left="431"/>
-      </w:pPr>
-      <w:r>
-        <w:rPr>
-          <w:rFonts w:ascii="Courier New" w:eastAsia="Courier New" w:hAnsi="Courier New" w:cs="Courier New"/>
-          <w:sz w:val="16"/>
-          <w:szCs w:val="16"/>
-        </w:rPr>
-        <w:t xml:space="preserve">  </w:t>
-      </w:r>
-      <w:proofErr w:type="spellStart"/>
-      <w:r>
-        <w:rPr>
-          <w:rFonts w:ascii="Courier New" w:eastAsia="Courier New" w:hAnsi="Courier New" w:cs="Courier New"/>
-          <w:sz w:val="16"/>
-          <w:szCs w:val="16"/>
-        </w:rPr>
-        <w:t>mqttClient.subscribe</w:t>
-      </w:r>
-      <w:proofErr w:type="spellEnd"/>
-      <w:r>
-        <w:rPr>
-          <w:rFonts w:ascii="Courier New" w:eastAsia="Courier New" w:hAnsi="Courier New" w:cs="Courier New"/>
-          <w:sz w:val="16"/>
-          <w:szCs w:val="16"/>
-        </w:rPr>
-        <w:t>(</w:t>
-      </w:r>
-      <w:proofErr w:type="spellStart"/>
-      <w:r>
-        <w:rPr>
-          <w:rFonts w:ascii="Courier New" w:eastAsia="Courier New" w:hAnsi="Courier New" w:cs="Courier New"/>
-          <w:sz w:val="16"/>
-          <w:szCs w:val="16"/>
-        </w:rPr>
-        <w:t>resetTopic.c_</w:t>
-      </w:r>
-      <w:proofErr w:type="gramStart"/>
-      <w:r>
-        <w:rPr>
-          <w:rFonts w:ascii="Courier New" w:eastAsia="Courier New" w:hAnsi="Courier New" w:cs="Courier New"/>
-          <w:sz w:val="16"/>
-          <w:szCs w:val="16"/>
-        </w:rPr>
-        <w:t>str</w:t>
-      </w:r>
-      <w:proofErr w:type="spellEnd"/>
-      <w:r>
-        <w:rPr>
-          <w:rFonts w:ascii="Courier New" w:eastAsia="Courier New" w:hAnsi="Courier New" w:cs="Courier New"/>
-          <w:sz w:val="16"/>
-          <w:szCs w:val="16"/>
-        </w:rPr>
-        <w:t>(</w:t>
-      </w:r>
-      <w:proofErr w:type="gramEnd"/>
-      <w:r>
-        <w:rPr>
-          <w:rFonts w:ascii="Courier New" w:eastAsia="Courier New" w:hAnsi="Courier New" w:cs="Courier New"/>
-          <w:sz w:val="16"/>
-          <w:szCs w:val="16"/>
-        </w:rPr>
-        <w:t>));</w:t>
-      </w:r>
-    </w:p>
-    <w:p>
-      <w:pPr>
-        <w:spacing w:line="240" w:lineRule="auto"/>
-        <w:ind w:left="431"/>
-      </w:pPr>
-      <w:r>
-        <w:rPr>
-          <w:rFonts w:ascii="Courier New" w:eastAsia="Courier New" w:hAnsi="Courier New" w:cs="Courier New"/>
-          <w:sz w:val="16"/>
-          <w:szCs w:val="16"/>
-        </w:rPr>
-        <w:t>}</w:t>
-      </w:r>
-    </w:p>
-    <w:p>
-      <w:pPr>
-        <w:spacing w:line="240" w:lineRule="auto"/>
-        <w:ind w:left="431"/>
-      </w:pPr>
-    </w:p>
-    <w:p>
-      <w:pPr>
-        <w:spacing w:line="240" w:lineRule="auto"/>
-        <w:ind w:left="431"/>
-      </w:pPr>
-      <w:r>
-        <w:rPr>
-          <w:rFonts w:ascii="Courier New" w:eastAsia="Courier New" w:hAnsi="Courier New" w:cs="Courier New"/>
-          <w:sz w:val="16"/>
-          <w:szCs w:val="16"/>
-        </w:rPr>
-        <w:t>// ========== MQTT: Intentar conectar a un servidor con N reintentos ==========</w:t>
-      </w:r>
-    </w:p>
-    <w:p>
-      <w:pPr>
-        <w:spacing w:line="240" w:lineRule="auto"/>
-        <w:ind w:left="431"/>
-      </w:pPr>
-      <w:proofErr w:type="spellStart"/>
-      <w:r>
-        <w:rPr>
-          <w:rFonts w:ascii="Courier New" w:eastAsia="Courier New" w:hAnsi="Courier New" w:cs="Courier New"/>
-          <w:sz w:val="16"/>
-          <w:szCs w:val="16"/>
-        </w:rPr>
-        <w:t>bool</w:t>
-      </w:r>
-      <w:proofErr w:type="spellEnd"/>
-      <w:r>
-        <w:rPr>
-          <w:rFonts w:ascii="Courier New" w:eastAsia="Courier New" w:hAnsi="Courier New" w:cs="Courier New"/>
-          <w:sz w:val="16"/>
-          <w:szCs w:val="16"/>
-        </w:rPr>
-        <w:t xml:space="preserve"> </w:t>
-      </w:r>
-      <w:proofErr w:type="spellStart"/>
-      <w:proofErr w:type="gramStart"/>
-      <w:r>
-        <w:rPr>
-          <w:rFonts w:ascii="Courier New" w:eastAsia="Courier New" w:hAnsi="Courier New" w:cs="Courier New"/>
-          <w:sz w:val="16"/>
-          <w:szCs w:val="16"/>
-        </w:rPr>
-        <w:t>tryMQTTServer</w:t>
-      </w:r>
-      <w:proofErr w:type="spellEnd"/>
-      <w:r>
-        <w:rPr>
-          <w:rFonts w:ascii="Courier New" w:eastAsia="Courier New" w:hAnsi="Courier New" w:cs="Courier New"/>
-          <w:sz w:val="16"/>
-          <w:szCs w:val="16"/>
-        </w:rPr>
-        <w:t>(</w:t>
-      </w:r>
-      <w:proofErr w:type="spellStart"/>
-      <w:proofErr w:type="gramEnd"/>
-      <w:r>
-        <w:rPr>
-          <w:rFonts w:ascii="Courier New" w:eastAsia="Courier New" w:hAnsi="Courier New" w:cs="Courier New"/>
-          <w:sz w:val="16"/>
-          <w:szCs w:val="16"/>
-        </w:rPr>
-        <w:t>const</w:t>
-      </w:r>
-      <w:proofErr w:type="spellEnd"/>
-      <w:r>
-        <w:rPr>
-          <w:rFonts w:ascii="Courier New" w:eastAsia="Courier New" w:hAnsi="Courier New" w:cs="Courier New"/>
-          <w:sz w:val="16"/>
-          <w:szCs w:val="16"/>
-        </w:rPr>
-        <w:t xml:space="preserve"> </w:t>
-      </w:r>
-      <w:proofErr w:type="spellStart"/>
-      <w:r>
-        <w:rPr>
-          <w:rFonts w:ascii="Courier New" w:eastAsia="Courier New" w:hAnsi="Courier New" w:cs="Courier New"/>
-          <w:sz w:val="16"/>
-          <w:szCs w:val="16"/>
-        </w:rPr>
-        <w:t>char</w:t>
-      </w:r>
-      <w:proofErr w:type="spellEnd"/>
-      <w:r>
-        <w:rPr>
-          <w:rFonts w:ascii="Courier New" w:eastAsia="Courier New" w:hAnsi="Courier New" w:cs="Courier New"/>
-          <w:sz w:val="16"/>
-          <w:szCs w:val="16"/>
-        </w:rPr>
-        <w:t xml:space="preserve">* server, </w:t>
-      </w:r>
-      <w:proofErr w:type="spellStart"/>
-      <w:r>
-        <w:rPr>
-          <w:rFonts w:ascii="Courier New" w:eastAsia="Courier New" w:hAnsi="Courier New" w:cs="Courier New"/>
-          <w:sz w:val="16"/>
-          <w:szCs w:val="16"/>
-        </w:rPr>
-        <w:t>int</w:t>
-      </w:r>
-      <w:proofErr w:type="spellEnd"/>
-      <w:r>
-        <w:rPr>
-          <w:rFonts w:ascii="Courier New" w:eastAsia="Courier New" w:hAnsi="Courier New" w:cs="Courier New"/>
-          <w:sz w:val="16"/>
-          <w:szCs w:val="16"/>
-        </w:rPr>
-        <w:t xml:space="preserve"> </w:t>
-      </w:r>
-      <w:proofErr w:type="spellStart"/>
-      <w:r>
-        <w:rPr>
-          <w:rFonts w:ascii="Courier New" w:eastAsia="Courier New" w:hAnsi="Courier New" w:cs="Courier New"/>
-          <w:sz w:val="16"/>
-          <w:szCs w:val="16"/>
-        </w:rPr>
-        <w:t>port</w:t>
-      </w:r>
-      <w:proofErr w:type="spellEnd"/>
-      <w:r>
-        <w:rPr>
-          <w:rFonts w:ascii="Courier New" w:eastAsia="Courier New" w:hAnsi="Courier New" w:cs="Courier New"/>
-          <w:sz w:val="16"/>
-          <w:szCs w:val="16"/>
-        </w:rPr>
-        <w:t xml:space="preserve">, </w:t>
-      </w:r>
-      <w:proofErr w:type="spellStart"/>
-      <w:r>
-        <w:rPr>
-          <w:rFonts w:ascii="Courier New" w:eastAsia="Courier New" w:hAnsi="Courier New" w:cs="Courier New"/>
-          <w:sz w:val="16"/>
-          <w:szCs w:val="16"/>
-        </w:rPr>
-        <w:t>const</w:t>
-      </w:r>
-      <w:proofErr w:type="spellEnd"/>
-      <w:r>
-        <w:rPr>
-          <w:rFonts w:ascii="Courier New" w:eastAsia="Courier New" w:hAnsi="Courier New" w:cs="Courier New"/>
-          <w:sz w:val="16"/>
-          <w:szCs w:val="16"/>
-        </w:rPr>
-        <w:t xml:space="preserve"> </w:t>
-      </w:r>
-      <w:proofErr w:type="spellStart"/>
-      <w:r>
-        <w:rPr>
-          <w:rFonts w:ascii="Courier New" w:eastAsia="Courier New" w:hAnsi="Courier New" w:cs="Courier New"/>
-          <w:sz w:val="16"/>
-          <w:szCs w:val="16"/>
-        </w:rPr>
-        <w:t>char</w:t>
-      </w:r>
-      <w:proofErr w:type="spellEnd"/>
-      <w:r>
-        <w:rPr>
-          <w:rFonts w:ascii="Courier New" w:eastAsia="Courier New" w:hAnsi="Courier New" w:cs="Courier New"/>
-          <w:sz w:val="16"/>
-          <w:szCs w:val="16"/>
-        </w:rPr>
-        <w:t xml:space="preserve">* </w:t>
-      </w:r>
-      <w:proofErr w:type="spellStart"/>
-      <w:r>
-        <w:rPr>
-          <w:rFonts w:ascii="Courier New" w:eastAsia="Courier New" w:hAnsi="Courier New" w:cs="Courier New"/>
-          <w:sz w:val="16"/>
-          <w:szCs w:val="16"/>
-        </w:rPr>
-        <w:t>label</w:t>
-      </w:r>
-      <w:proofErr w:type="spellEnd"/>
-      <w:r>
-        <w:rPr>
-          <w:rFonts w:ascii="Courier New" w:eastAsia="Courier New" w:hAnsi="Courier New" w:cs="Courier New"/>
-          <w:sz w:val="16"/>
-          <w:szCs w:val="16"/>
-        </w:rPr>
-        <w:t xml:space="preserve">, </w:t>
-      </w:r>
-      <w:proofErr w:type="spellStart"/>
-      <w:r>
-        <w:rPr>
-          <w:rFonts w:ascii="Courier New" w:eastAsia="Courier New" w:hAnsi="Courier New" w:cs="Courier New"/>
-          <w:sz w:val="16"/>
-          <w:szCs w:val="16"/>
-        </w:rPr>
-        <w:t>int</w:t>
-      </w:r>
-      <w:proofErr w:type="spellEnd"/>
-      <w:r>
-        <w:rPr>
-          <w:rFonts w:ascii="Courier New" w:eastAsia="Courier New" w:hAnsi="Courier New" w:cs="Courier New"/>
-          <w:sz w:val="16"/>
-          <w:szCs w:val="16"/>
-        </w:rPr>
-        <w:t xml:space="preserve"> </w:t>
-      </w:r>
-      <w:proofErr w:type="spellStart"/>
-      <w:r>
-        <w:rPr>
-          <w:rFonts w:ascii="Courier New" w:eastAsia="Courier New" w:hAnsi="Courier New" w:cs="Courier New"/>
-          <w:sz w:val="16"/>
-          <w:szCs w:val="16"/>
-        </w:rPr>
-        <w:t>retries</w:t>
-      </w:r>
-      <w:proofErr w:type="spellEnd"/>
-      <w:r>
-        <w:rPr>
-          <w:rFonts w:ascii="Courier New" w:eastAsia="Courier New" w:hAnsi="Courier New" w:cs="Courier New"/>
-          <w:sz w:val="16"/>
-          <w:szCs w:val="16"/>
-        </w:rPr>
-        <w:t>) {</w:t>
-      </w:r>
-    </w:p>
-    <w:p>
-      <w:pPr>
-        <w:spacing w:line="240" w:lineRule="auto"/>
-        <w:ind w:left="431"/>
-      </w:pPr>
-      <w:r>
-        <w:rPr>
-          <w:rFonts w:ascii="Courier New" w:eastAsia="Courier New" w:hAnsi="Courier New" w:cs="Courier New"/>
-          <w:sz w:val="16"/>
-          <w:szCs w:val="16"/>
-        </w:rPr>
-        <w:t xml:space="preserve">  String </w:t>
-      </w:r>
-      <w:proofErr w:type="spellStart"/>
-      <w:r>
-        <w:rPr>
-          <w:rFonts w:ascii="Courier New" w:eastAsia="Courier New" w:hAnsi="Courier New" w:cs="Courier New"/>
-          <w:sz w:val="16"/>
-          <w:szCs w:val="16"/>
-        </w:rPr>
-        <w:t>clientId</w:t>
-      </w:r>
-      <w:proofErr w:type="spellEnd"/>
-      <w:r>
-        <w:rPr>
-          <w:rFonts w:ascii="Courier New" w:eastAsia="Courier New" w:hAnsi="Courier New" w:cs="Courier New"/>
-          <w:sz w:val="16"/>
-          <w:szCs w:val="16"/>
-        </w:rPr>
-        <w:t xml:space="preserve"> = "ESP8266_" + </w:t>
-      </w:r>
-      <w:proofErr w:type="spellStart"/>
-      <w:r>
-        <w:rPr>
-          <w:rFonts w:ascii="Courier New" w:eastAsia="Courier New" w:hAnsi="Courier New" w:cs="Courier New"/>
-          <w:sz w:val="16"/>
-          <w:szCs w:val="16"/>
-        </w:rPr>
-        <w:t>sensorID</w:t>
-      </w:r>
-      <w:proofErr w:type="spellEnd"/>
-      <w:r>
-        <w:rPr>
-          <w:rFonts w:ascii="Courier New" w:eastAsia="Courier New" w:hAnsi="Courier New" w:cs="Courier New"/>
-          <w:sz w:val="16"/>
-          <w:szCs w:val="16"/>
-        </w:rPr>
-        <w:t>;</w:t>
-      </w:r>
-    </w:p>
-    <w:p>
-      <w:pPr>
-        <w:spacing w:line="240" w:lineRule="auto"/>
-        <w:ind w:left="431"/>
-      </w:pPr>
-      <w:r>
-        <w:rPr>
-          <w:rFonts w:ascii="Courier New" w:eastAsia="Courier New" w:hAnsi="Courier New" w:cs="Courier New"/>
-          <w:sz w:val="16"/>
-          <w:szCs w:val="16"/>
-        </w:rPr>
-        <w:t xml:space="preserve">  </w:t>
-      </w:r>
-    </w:p>
-    <w:p>
-      <w:pPr>
-        <w:spacing w:line="240" w:lineRule="auto"/>
-        <w:ind w:left="431"/>
-      </w:pPr>
-      <w:r>
-        <w:rPr>
-          <w:rFonts w:ascii="Courier New" w:eastAsia="Courier New" w:hAnsi="Courier New" w:cs="Courier New"/>
-          <w:sz w:val="16"/>
-          <w:szCs w:val="16"/>
-        </w:rPr>
-        <w:t xml:space="preserve">  </w:t>
-      </w:r>
-      <w:proofErr w:type="spellStart"/>
-      <w:r>
-        <w:rPr>
-          <w:rFonts w:ascii="Courier New" w:eastAsia="Courier New" w:hAnsi="Courier New" w:cs="Courier New"/>
-          <w:sz w:val="16"/>
-          <w:szCs w:val="16"/>
-        </w:rPr>
-        <w:t>for</w:t>
-      </w:r>
-      <w:proofErr w:type="spellEnd"/>
-      <w:r>
-        <w:rPr>
-          <w:rFonts w:ascii="Courier New" w:eastAsia="Courier New" w:hAnsi="Courier New" w:cs="Courier New"/>
-          <w:sz w:val="16"/>
-          <w:szCs w:val="16"/>
-        </w:rPr>
-        <w:t xml:space="preserve"> (</w:t>
-      </w:r>
-      <w:proofErr w:type="spellStart"/>
-      <w:r>
-        <w:rPr>
-          <w:rFonts w:ascii="Courier New" w:eastAsia="Courier New" w:hAnsi="Courier New" w:cs="Courier New"/>
-          <w:sz w:val="16"/>
-          <w:szCs w:val="16"/>
-        </w:rPr>
-        <w:t>int</w:t>
-      </w:r>
-      <w:proofErr w:type="spellEnd"/>
-      <w:r>
-        <w:rPr>
-          <w:rFonts w:ascii="Courier New" w:eastAsia="Courier New" w:hAnsi="Courier New" w:cs="Courier New"/>
-          <w:sz w:val="16"/>
-          <w:szCs w:val="16"/>
-        </w:rPr>
-        <w:t xml:space="preserve"> i = 1; i &lt;= </w:t>
-      </w:r>
-      <w:proofErr w:type="spellStart"/>
-      <w:r>
-        <w:rPr>
-          <w:rFonts w:ascii="Courier New" w:eastAsia="Courier New" w:hAnsi="Courier New" w:cs="Courier New"/>
-          <w:sz w:val="16"/>
-          <w:szCs w:val="16"/>
-        </w:rPr>
-        <w:t>retries</w:t>
-      </w:r>
-      <w:proofErr w:type="spellEnd"/>
-      <w:r>
-        <w:rPr>
-          <w:rFonts w:ascii="Courier New" w:eastAsia="Courier New" w:hAnsi="Courier New" w:cs="Courier New"/>
-          <w:sz w:val="16"/>
-          <w:szCs w:val="16"/>
-        </w:rPr>
-        <w:t>; i++) {</w:t>
-      </w:r>
-    </w:p>
-    <w:p>
-      <w:pPr>
-        <w:spacing w:line="240" w:lineRule="auto"/>
-        <w:ind w:left="431"/>
-      </w:pPr>
-      <w:r>
-        <w:rPr>
-          <w:rFonts w:ascii="Courier New" w:eastAsia="Courier New" w:hAnsi="Courier New" w:cs="Courier New"/>
-          <w:sz w:val="16"/>
-          <w:szCs w:val="16"/>
-        </w:rPr>
-        <w:t xml:space="preserve">    </w:t>
-      </w:r>
-      <w:proofErr w:type="spellStart"/>
-      <w:r>
-        <w:rPr>
-          <w:rFonts w:ascii="Courier New" w:eastAsia="Courier New" w:hAnsi="Courier New" w:cs="Courier New"/>
-          <w:sz w:val="16"/>
-          <w:szCs w:val="16"/>
-        </w:rPr>
-        <w:t>mqttClient.disconnect</w:t>
-      </w:r>
-      <w:proofErr w:type="spellEnd"/>
-      <w:r>
-        <w:rPr>
-          <w:rFonts w:ascii="Courier New" w:eastAsia="Courier New" w:hAnsi="Courier New" w:cs="Courier New"/>
-          <w:sz w:val="16"/>
-          <w:szCs w:val="16"/>
-        </w:rPr>
-        <w:t>();</w:t>
-      </w:r>
-    </w:p>
-    <w:p>
-      <w:pPr>
-        <w:spacing w:line="240" w:lineRule="auto"/>
-        <w:ind w:left="431"/>
-      </w:pPr>
-      <w:r>
-        <w:rPr>
-          <w:rFonts w:ascii="Courier New" w:eastAsia="Courier New" w:hAnsi="Courier New" w:cs="Courier New"/>
-          <w:sz w:val="16"/>
-          <w:szCs w:val="16"/>
-        </w:rPr>
-        <w:t xml:space="preserve">    </w:t>
-      </w:r>
-      <w:proofErr w:type="spellStart"/>
-      <w:r>
-        <w:rPr>
-          <w:rFonts w:ascii="Courier New" w:eastAsia="Courier New" w:hAnsi="Courier New" w:cs="Courier New"/>
-          <w:sz w:val="16"/>
-          <w:szCs w:val="16"/>
-        </w:rPr>
-        <w:t>espClient.stop</w:t>
-      </w:r>
-      <w:proofErr w:type="spellEnd"/>
-      <w:r>
-        <w:rPr>
-          <w:rFonts w:ascii="Courier New" w:eastAsia="Courier New" w:hAnsi="Courier New" w:cs="Courier New"/>
-          <w:sz w:val="16"/>
-          <w:szCs w:val="16"/>
-        </w:rPr>
-        <w:t>();</w:t>
-      </w:r>
-    </w:p>
-    <w:p>
-      <w:pPr>
-        <w:spacing w:line="240" w:lineRule="auto"/>
-        <w:ind w:left="431"/>
-      </w:pPr>
-      <w:r>
-        <w:rPr>
-          <w:rFonts w:ascii="Courier New" w:eastAsia="Courier New" w:hAnsi="Courier New" w:cs="Courier New"/>
-          <w:sz w:val="16"/>
-          <w:szCs w:val="16"/>
-        </w:rPr>
-        <w:t xml:space="preserve">    </w:t>
-      </w:r>
-      <w:proofErr w:type="spellStart"/>
-      <w:r>
-        <w:rPr>
-          <w:rFonts w:ascii="Courier New" w:eastAsia="Courier New" w:hAnsi="Courier New" w:cs="Courier New"/>
-          <w:sz w:val="16"/>
-          <w:szCs w:val="16"/>
-        </w:rPr>
-        <w:t>espClient</w:t>
-      </w:r>
-      <w:proofErr w:type="spellEnd"/>
-      <w:r>
-        <w:rPr>
-          <w:rFonts w:ascii="Courier New" w:eastAsia="Courier New" w:hAnsi="Courier New" w:cs="Courier New"/>
-          <w:sz w:val="16"/>
-          <w:szCs w:val="16"/>
-        </w:rPr>
-        <w:t xml:space="preserve"> = </w:t>
-      </w:r>
-      <w:proofErr w:type="spellStart"/>
-      <w:proofErr w:type="gramStart"/>
-      <w:r>
-        <w:rPr>
-          <w:rFonts w:ascii="Courier New" w:eastAsia="Courier New" w:hAnsi="Courier New" w:cs="Courier New"/>
-          <w:sz w:val="16"/>
-          <w:szCs w:val="16"/>
-        </w:rPr>
-        <w:t>WiFiClient</w:t>
-      </w:r>
-      <w:proofErr w:type="spellEnd"/>
-      <w:r>
-        <w:rPr>
-          <w:rFonts w:ascii="Courier New" w:eastAsia="Courier New" w:hAnsi="Courier New" w:cs="Courier New"/>
-          <w:sz w:val="16"/>
-          <w:szCs w:val="16"/>
-        </w:rPr>
-        <w:t>(</w:t>
-      </w:r>
-      <w:proofErr w:type="gramEnd"/>
-      <w:r>
-        <w:rPr>
-          <w:rFonts w:ascii="Courier New" w:eastAsia="Courier New" w:hAnsi="Courier New" w:cs="Courier New"/>
-          <w:sz w:val="16"/>
-          <w:szCs w:val="16"/>
-        </w:rPr>
-        <w:t>);</w:t>
-      </w:r>
-    </w:p>
-    <w:p>
-      <w:pPr>
-        <w:spacing w:line="240" w:lineRule="auto"/>
-        <w:ind w:left="431"/>
-      </w:pPr>
-      <w:r>
-        <w:rPr>
-          <w:rFonts w:ascii="Courier New" w:eastAsia="Courier New" w:hAnsi="Courier New" w:cs="Courier New"/>
-          <w:sz w:val="16"/>
-          <w:szCs w:val="16"/>
-        </w:rPr>
-        <w:t xml:space="preserve">    </w:t>
-      </w:r>
-      <w:proofErr w:type="spellStart"/>
-      <w:r>
-        <w:rPr>
-          <w:rFonts w:ascii="Courier New" w:eastAsia="Courier New" w:hAnsi="Courier New" w:cs="Courier New"/>
-          <w:sz w:val="16"/>
-          <w:szCs w:val="16"/>
-        </w:rPr>
-        <w:t>mqttClient.setClient</w:t>
-      </w:r>
-      <w:proofErr w:type="spellEnd"/>
-      <w:r>
-        <w:rPr>
-          <w:rFonts w:ascii="Courier New" w:eastAsia="Courier New" w:hAnsi="Courier New" w:cs="Courier New"/>
-          <w:sz w:val="16"/>
-          <w:szCs w:val="16"/>
-        </w:rPr>
-        <w:t>(</w:t>
-      </w:r>
-      <w:proofErr w:type="spellStart"/>
-      <w:r>
-        <w:rPr>
-          <w:rFonts w:ascii="Courier New" w:eastAsia="Courier New" w:hAnsi="Courier New" w:cs="Courier New"/>
-          <w:sz w:val="16"/>
-          <w:szCs w:val="16"/>
-        </w:rPr>
-        <w:t>espClient</w:t>
-      </w:r>
-      <w:proofErr w:type="spellEnd"/>
-      <w:r>
-        <w:rPr>
-          <w:rFonts w:ascii="Courier New" w:eastAsia="Courier New" w:hAnsi="Courier New" w:cs="Courier New"/>
-          <w:sz w:val="16"/>
-          <w:szCs w:val="16"/>
-        </w:rPr>
-        <w:t>);</w:t>
-      </w:r>
-    </w:p>
-    <w:p>
-      <w:pPr>
-        <w:spacing w:line="240" w:lineRule="auto"/>
-        <w:ind w:left="431"/>
-      </w:pPr>
-      <w:r>
-        <w:rPr>
-          <w:rFonts w:ascii="Courier New" w:eastAsia="Courier New" w:hAnsi="Courier New" w:cs="Courier New"/>
-          <w:sz w:val="16"/>
-          <w:szCs w:val="16"/>
-        </w:rPr>
-        <w:t xml:space="preserve">    </w:t>
-      </w:r>
-      <w:proofErr w:type="spellStart"/>
-      <w:r>
-        <w:rPr>
-          <w:rFonts w:ascii="Courier New" w:eastAsia="Courier New" w:hAnsi="Courier New" w:cs="Courier New"/>
-          <w:sz w:val="16"/>
-          <w:szCs w:val="16"/>
-        </w:rPr>
-        <w:t>mqttClient.setServer</w:t>
-      </w:r>
-      <w:proofErr w:type="spellEnd"/>
-      <w:r>
-        <w:rPr>
-          <w:rFonts w:ascii="Courier New" w:eastAsia="Courier New" w:hAnsi="Courier New" w:cs="Courier New"/>
-          <w:sz w:val="16"/>
-          <w:szCs w:val="16"/>
-        </w:rPr>
-        <w:t xml:space="preserve">(server, </w:t>
-      </w:r>
-      <w:proofErr w:type="spellStart"/>
-      <w:r>
-        <w:rPr>
-          <w:rFonts w:ascii="Courier New" w:eastAsia="Courier New" w:hAnsi="Courier New" w:cs="Courier New"/>
-          <w:sz w:val="16"/>
-          <w:szCs w:val="16"/>
-        </w:rPr>
-        <w:t>port</w:t>
-      </w:r>
-      <w:proofErr w:type="spellEnd"/>
-      <w:r>
-        <w:rPr>
-          <w:rFonts w:ascii="Courier New" w:eastAsia="Courier New" w:hAnsi="Courier New" w:cs="Courier New"/>
-          <w:sz w:val="16"/>
-          <w:szCs w:val="16"/>
-        </w:rPr>
-        <w:t>);</w:t>
-      </w:r>
-    </w:p>
-    <w:p>
-      <w:pPr>
-        <w:spacing w:line="240" w:lineRule="auto"/>
-        <w:ind w:left="431"/>
-      </w:pPr>
-      <w:r>
-        <w:rPr>
-          <w:rFonts w:ascii="Courier New" w:eastAsia="Courier New" w:hAnsi="Courier New" w:cs="Courier New"/>
-          <w:sz w:val="16"/>
-          <w:szCs w:val="16"/>
-        </w:rPr>
-        <w:t xml:space="preserve">    </w:t>
-      </w:r>
-    </w:p>
-    <w:p>
-      <w:pPr>
-        <w:spacing w:line="240" w:lineRule="auto"/>
-        <w:ind w:left="431"/>
-      </w:pPr>
-      <w:r>
-        <w:rPr>
-          <w:rFonts w:ascii="Courier New" w:eastAsia="Courier New" w:hAnsi="Courier New" w:cs="Courier New"/>
-          <w:sz w:val="16"/>
-          <w:szCs w:val="16"/>
-        </w:rPr>
-        <w:t xml:space="preserve">    </w:t>
-      </w:r>
-      <w:proofErr w:type="spellStart"/>
-      <w:r>
-        <w:rPr>
-          <w:rFonts w:ascii="Courier New" w:eastAsia="Courier New" w:hAnsi="Courier New" w:cs="Courier New"/>
-          <w:sz w:val="16"/>
-          <w:szCs w:val="16"/>
-        </w:rPr>
-        <w:t>Serial.printf</w:t>
-      </w:r>
-      <w:proofErr w:type="spellEnd"/>
-      <w:r>
-        <w:rPr>
-          <w:rFonts w:ascii="Courier New" w:eastAsia="Courier New" w:hAnsi="Courier New" w:cs="Courier New"/>
-          <w:sz w:val="16"/>
-          <w:szCs w:val="16"/>
-        </w:rPr>
-        <w:t>("MQTT %s %</w:t>
-      </w:r>
-      <w:proofErr w:type="gramStart"/>
-      <w:r>
-        <w:rPr>
-          <w:rFonts w:ascii="Courier New" w:eastAsia="Courier New" w:hAnsi="Courier New" w:cs="Courier New"/>
-          <w:sz w:val="16"/>
-          <w:szCs w:val="16"/>
-        </w:rPr>
-        <w:t>s:%</w:t>
-      </w:r>
-      <w:proofErr w:type="gramEnd"/>
-      <w:r>
-        <w:rPr>
-          <w:rFonts w:ascii="Courier New" w:eastAsia="Courier New" w:hAnsi="Courier New" w:cs="Courier New"/>
-          <w:sz w:val="16"/>
-          <w:szCs w:val="16"/>
-        </w:rPr>
-        <w:t>d (intento %d/%</w:t>
-      </w:r>
-      <w:proofErr w:type="gramStart"/>
-      <w:r>
-        <w:rPr>
-          <w:rFonts w:ascii="Courier New" w:eastAsia="Courier New" w:hAnsi="Courier New" w:cs="Courier New"/>
-          <w:sz w:val="16"/>
-          <w:szCs w:val="16"/>
-        </w:rPr>
-        <w:t>d)\</w:t>
-      </w:r>
-      <w:proofErr w:type="gramEnd"/>
-      <w:r>
-        <w:rPr>
-          <w:rFonts w:ascii="Courier New" w:eastAsia="Courier New" w:hAnsi="Courier New" w:cs="Courier New"/>
-          <w:sz w:val="16"/>
-          <w:szCs w:val="16"/>
-        </w:rPr>
-        <w:t xml:space="preserve">n", </w:t>
-      </w:r>
-      <w:proofErr w:type="spellStart"/>
-      <w:r>
-        <w:rPr>
-          <w:rFonts w:ascii="Courier New" w:eastAsia="Courier New" w:hAnsi="Courier New" w:cs="Courier New"/>
-          <w:sz w:val="16"/>
-          <w:szCs w:val="16"/>
-        </w:rPr>
-        <w:t>label</w:t>
-      </w:r>
-      <w:proofErr w:type="spellEnd"/>
-      <w:r>
-        <w:rPr>
-          <w:rFonts w:ascii="Courier New" w:eastAsia="Courier New" w:hAnsi="Courier New" w:cs="Courier New"/>
-          <w:sz w:val="16"/>
-          <w:szCs w:val="16"/>
-        </w:rPr>
-        <w:t xml:space="preserve">, server, </w:t>
-      </w:r>
-      <w:proofErr w:type="spellStart"/>
-      <w:r>
-        <w:rPr>
-          <w:rFonts w:ascii="Courier New" w:eastAsia="Courier New" w:hAnsi="Courier New" w:cs="Courier New"/>
-          <w:sz w:val="16"/>
-          <w:szCs w:val="16"/>
-        </w:rPr>
-        <w:t>port</w:t>
-      </w:r>
-      <w:proofErr w:type="spellEnd"/>
-      <w:r>
-        <w:rPr>
-          <w:rFonts w:ascii="Courier New" w:eastAsia="Courier New" w:hAnsi="Courier New" w:cs="Courier New"/>
-          <w:sz w:val="16"/>
-          <w:szCs w:val="16"/>
-        </w:rPr>
-        <w:t xml:space="preserve">, i, </w:t>
-      </w:r>
-      <w:proofErr w:type="spellStart"/>
-      <w:r>
-        <w:rPr>
-          <w:rFonts w:ascii="Courier New" w:eastAsia="Courier New" w:hAnsi="Courier New" w:cs="Courier New"/>
-          <w:sz w:val="16"/>
-          <w:szCs w:val="16"/>
-        </w:rPr>
-        <w:t>retries</w:t>
-      </w:r>
-      <w:proofErr w:type="spellEnd"/>
-      <w:r>
-        <w:rPr>
-          <w:rFonts w:ascii="Courier New" w:eastAsia="Courier New" w:hAnsi="Courier New" w:cs="Courier New"/>
-          <w:sz w:val="16"/>
-          <w:szCs w:val="16"/>
-        </w:rPr>
-        <w:t>);</w:t>
-      </w:r>
-    </w:p>
-    <w:p>
-      <w:pPr>
-        <w:spacing w:line="240" w:lineRule="auto"/>
-        <w:ind w:left="431"/>
-      </w:pPr>
-      <w:r>
-        <w:rPr>
-          <w:rFonts w:ascii="Courier New" w:eastAsia="Courier New" w:hAnsi="Courier New" w:cs="Courier New"/>
-          <w:sz w:val="16"/>
-          <w:szCs w:val="16"/>
-        </w:rPr>
-        <w:t xml:space="preserve">    </w:t>
-      </w:r>
-    </w:p>
-    <w:p>
-      <w:pPr>
-        <w:spacing w:line="240" w:lineRule="auto"/>
-        <w:ind w:left="431"/>
-      </w:pPr>
-      <w:r>
-        <w:rPr>
-          <w:rFonts w:ascii="Courier New" w:eastAsia="Courier New" w:hAnsi="Courier New" w:cs="Courier New"/>
-          <w:sz w:val="16"/>
-          <w:szCs w:val="16"/>
-        </w:rPr>
-        <w:t xml:space="preserve">    </w:t>
-      </w:r>
-      <w:proofErr w:type="spellStart"/>
-      <w:r>
-        <w:rPr>
-          <w:rFonts w:ascii="Courier New" w:eastAsia="Courier New" w:hAnsi="Courier New" w:cs="Courier New"/>
-          <w:sz w:val="16"/>
-          <w:szCs w:val="16"/>
-        </w:rPr>
-        <w:t>if</w:t>
-      </w:r>
-      <w:proofErr w:type="spellEnd"/>
-      <w:r>
-        <w:rPr>
-          <w:rFonts w:ascii="Courier New" w:eastAsia="Courier New" w:hAnsi="Courier New" w:cs="Courier New"/>
-          <w:sz w:val="16"/>
-          <w:szCs w:val="16"/>
-        </w:rPr>
-        <w:t xml:space="preserve"> (</w:t>
-      </w:r>
-      <w:proofErr w:type="spellStart"/>
-      <w:r>
-        <w:rPr>
-          <w:rFonts w:ascii="Courier New" w:eastAsia="Courier New" w:hAnsi="Courier New" w:cs="Courier New"/>
-          <w:sz w:val="16"/>
-          <w:szCs w:val="16"/>
-        </w:rPr>
-        <w:t>mqttClient.connect</w:t>
-      </w:r>
-      <w:proofErr w:type="spellEnd"/>
-      <w:r>
-        <w:rPr>
-          <w:rFonts w:ascii="Courier New" w:eastAsia="Courier New" w:hAnsi="Courier New" w:cs="Courier New"/>
-          <w:sz w:val="16"/>
-          <w:szCs w:val="16"/>
-        </w:rPr>
-        <w:t>(</w:t>
-      </w:r>
-      <w:proofErr w:type="spellStart"/>
-      <w:r>
-        <w:rPr>
-          <w:rFonts w:ascii="Courier New" w:eastAsia="Courier New" w:hAnsi="Courier New" w:cs="Courier New"/>
-          <w:sz w:val="16"/>
-          <w:szCs w:val="16"/>
-        </w:rPr>
-        <w:t>clientId.c_</w:t>
-      </w:r>
-      <w:proofErr w:type="gramStart"/>
-      <w:r>
-        <w:rPr>
-          <w:rFonts w:ascii="Courier New" w:eastAsia="Courier New" w:hAnsi="Courier New" w:cs="Courier New"/>
-          <w:sz w:val="16"/>
-          <w:szCs w:val="16"/>
-        </w:rPr>
-        <w:t>str</w:t>
-      </w:r>
-      <w:proofErr w:type="spellEnd"/>
-      <w:r>
-        <w:rPr>
-          <w:rFonts w:ascii="Courier New" w:eastAsia="Courier New" w:hAnsi="Courier New" w:cs="Courier New"/>
-          <w:sz w:val="16"/>
-          <w:szCs w:val="16"/>
-        </w:rPr>
-        <w:t>(</w:t>
-      </w:r>
-      <w:proofErr w:type="gramEnd"/>
-      <w:r>
-        <w:rPr>
-          <w:rFonts w:ascii="Courier New" w:eastAsia="Courier New" w:hAnsi="Courier New" w:cs="Courier New"/>
-          <w:sz w:val="16"/>
-          <w:szCs w:val="16"/>
-        </w:rPr>
-        <w:t>))) {</w:t>
-      </w:r>
-    </w:p>
-    <w:p>
-      <w:pPr>
-        <w:spacing w:line="240" w:lineRule="auto"/>
-        <w:ind w:left="431"/>
-      </w:pPr>
-      <w:r>
-        <w:rPr>
-          <w:rFonts w:ascii="Courier New" w:eastAsia="Courier New" w:hAnsi="Courier New" w:cs="Courier New"/>
-          <w:sz w:val="16"/>
-          <w:szCs w:val="16"/>
-        </w:rPr>
-        <w:t xml:space="preserve">// ... (394 líneas </w:t>
-      </w:r>
-      <w:proofErr w:type="gramStart"/>
-      <w:r>
-        <w:rPr>
-          <w:rFonts w:ascii="Courier New" w:eastAsia="Courier New" w:hAnsi="Courier New" w:cs="Courier New"/>
-          <w:sz w:val="16"/>
-          <w:szCs w:val="16"/>
-        </w:rPr>
-        <w:t>omitidas)&lt;</w:t>
-      </w:r>
-      <w:proofErr w:type="gramEnd"/>
-      <w:r>
-        <w:rPr>
-          <w:rFonts w:ascii="Courier New" w:eastAsia="Courier New" w:hAnsi="Courier New" w:cs="Courier New"/>
-          <w:sz w:val="16"/>
-          <w:szCs w:val="16"/>
-        </w:rPr>
-        <w:t>/</w:t>
-      </w:r>
-      <w:proofErr w:type="spellStart"/>
-      <w:r>
-        <w:rPr>
-          <w:rFonts w:ascii="Courier New" w:eastAsia="Courier New" w:hAnsi="Courier New" w:cs="Courier New"/>
-          <w:sz w:val="16"/>
-          <w:szCs w:val="16"/>
-        </w:rPr>
-        <w:t>code</w:t>
-      </w:r>
-      <w:proofErr w:type="spellEnd"/>
-      <w:r>
-        <w:rPr>
-          <w:rFonts w:ascii="Courier New" w:eastAsia="Courier New" w:hAnsi="Courier New" w:cs="Courier New"/>
-          <w:sz w:val="16"/>
-          <w:szCs w:val="16"/>
-        </w:rPr>
-        <w:t>&gt;</w:t>
-      </w:r>
-    </w:p>
-    <w:p>
-      <w:pPr>
-        <w:spacing w:after="200"/>
-      </w:pPr>
-    </w:p>
-    <w:p>
-      <w:pPr>
-        <w:pStyle w:val="Ttulo4"/>
-      </w:pPr>
-      <w:r>
-        <w:rPr>
-          <w:i w:val="0"/>
-          <w:iCs w:val="0"/>
-        </w:rPr>
-        <w:t>sensor_core.cpp</w:t>
-      </w:r>
-    </w:p>
-    <w:p>
-      <w:pPr>
-        <w:spacing w:line="240" w:lineRule="auto"/>
-        <w:ind w:left="431"/>
-      </w:pPr>
-      <w:r>
-        <w:rPr>
-          <w:rFonts w:ascii="Courier New" w:eastAsia="Courier New" w:hAnsi="Courier New" w:cs="Courier New"/>
-          <w:sz w:val="16"/>
-          <w:szCs w:val="16"/>
-        </w:rPr>
-        <w:t>&lt;</w:t>
-      </w:r>
-      <w:proofErr w:type="spellStart"/>
-      <w:r>
-        <w:rPr>
-          <w:rFonts w:ascii="Courier New" w:eastAsia="Courier New" w:hAnsi="Courier New" w:cs="Courier New"/>
-          <w:sz w:val="16"/>
-          <w:szCs w:val="16"/>
-        </w:rPr>
-        <w:t>code</w:t>
-      </w:r>
-      <w:proofErr w:type="spellEnd"/>
-      <w:r>
-        <w:rPr>
-          <w:rFonts w:ascii="Courier New" w:eastAsia="Courier New" w:hAnsi="Courier New" w:cs="Courier New"/>
-          <w:sz w:val="16"/>
-          <w:szCs w:val="16"/>
-        </w:rPr>
-        <w:t>&gt;#include "</w:t>
-      </w:r>
-      <w:proofErr w:type="spellStart"/>
-      <w:r>
-        <w:rPr>
-          <w:rFonts w:ascii="Courier New" w:eastAsia="Courier New" w:hAnsi="Courier New" w:cs="Courier New"/>
-          <w:sz w:val="16"/>
-          <w:szCs w:val="16"/>
-        </w:rPr>
-        <w:t>sensor.h</w:t>
-      </w:r>
-      <w:proofErr w:type="spellEnd"/>
-      <w:r>
-        <w:rPr>
-          <w:rFonts w:ascii="Courier New" w:eastAsia="Courier New" w:hAnsi="Courier New" w:cs="Courier New"/>
-          <w:sz w:val="16"/>
-          <w:szCs w:val="16"/>
-        </w:rPr>
-        <w:t>"</w:t>
-      </w:r>
-    </w:p>
-    <w:p>
-      <w:pPr>
-        <w:spacing w:line="240" w:lineRule="auto"/>
-        <w:ind w:left="431"/>
-      </w:pPr>
-      <w:r>
-        <w:rPr>
-          <w:rFonts w:ascii="Courier New" w:eastAsia="Courier New" w:hAnsi="Courier New" w:cs="Courier New"/>
-          <w:sz w:val="16"/>
-          <w:szCs w:val="16"/>
-        </w:rPr>
-        <w:t>#include "</w:t>
-      </w:r>
-      <w:proofErr w:type="spellStart"/>
-      <w:r>
-        <w:rPr>
-          <w:rFonts w:ascii="Courier New" w:eastAsia="Courier New" w:hAnsi="Courier New" w:cs="Courier New"/>
-          <w:sz w:val="16"/>
-          <w:szCs w:val="16"/>
-        </w:rPr>
-        <w:t>config.h</w:t>
-      </w:r>
-      <w:proofErr w:type="spellEnd"/>
-      <w:r>
-        <w:rPr>
-          <w:rFonts w:ascii="Courier New" w:eastAsia="Courier New" w:hAnsi="Courier New" w:cs="Courier New"/>
-          <w:sz w:val="16"/>
-          <w:szCs w:val="16"/>
-        </w:rPr>
-        <w:t>"</w:t>
-      </w:r>
-    </w:p>
-    <w:p>
-      <w:pPr>
-        <w:spacing w:line="240" w:lineRule="auto"/>
-        <w:ind w:left="431"/>
-      </w:pPr>
-      <w:r>
-        <w:rPr>
-          <w:rFonts w:ascii="Courier New" w:eastAsia="Courier New" w:hAnsi="Courier New" w:cs="Courier New"/>
-          <w:sz w:val="16"/>
-          <w:szCs w:val="16"/>
-        </w:rPr>
-        <w:t>#include "</w:t>
-      </w:r>
-      <w:proofErr w:type="spellStart"/>
-      <w:r>
-        <w:rPr>
-          <w:rFonts w:ascii="Courier New" w:eastAsia="Courier New" w:hAnsi="Courier New" w:cs="Courier New"/>
-          <w:sz w:val="16"/>
-          <w:szCs w:val="16"/>
-        </w:rPr>
-        <w:t>storage.h</w:t>
-      </w:r>
-      <w:proofErr w:type="spellEnd"/>
-      <w:r>
-        <w:rPr>
-          <w:rFonts w:ascii="Courier New" w:eastAsia="Courier New" w:hAnsi="Courier New" w:cs="Courier New"/>
-          <w:sz w:val="16"/>
-          <w:szCs w:val="16"/>
-        </w:rPr>
-        <w:t>"</w:t>
-      </w:r>
-    </w:p>
-    <w:p>
-      <w:pPr>
-        <w:spacing w:line="240" w:lineRule="auto"/>
-        <w:ind w:left="431"/>
-      </w:pPr>
-      <w:r>
-        <w:rPr>
-          <w:rFonts w:ascii="Courier New" w:eastAsia="Courier New" w:hAnsi="Courier New" w:cs="Courier New"/>
-          <w:sz w:val="16"/>
-          <w:szCs w:val="16"/>
-        </w:rPr>
-        <w:t>#include &lt;</w:t>
-      </w:r>
-      <w:proofErr w:type="spellStart"/>
-      <w:r>
-        <w:rPr>
-          <w:rFonts w:ascii="Courier New" w:eastAsia="Courier New" w:hAnsi="Courier New" w:cs="Courier New"/>
-          <w:sz w:val="16"/>
-          <w:szCs w:val="16"/>
-        </w:rPr>
-        <w:t>EEPROM.h</w:t>
-      </w:r>
-      <w:proofErr w:type="spellEnd"/>
-      <w:r>
-        <w:rPr>
-          <w:rFonts w:ascii="Courier New" w:eastAsia="Courier New" w:hAnsi="Courier New" w:cs="Courier New"/>
-          <w:sz w:val="16"/>
-          <w:szCs w:val="16"/>
-        </w:rPr>
-        <w:t>&gt;</w:t>
-      </w:r>
-    </w:p>
-    <w:p>
-      <w:pPr>
-        <w:spacing w:line="240" w:lineRule="auto"/>
-        <w:ind w:left="431"/>
-      </w:pPr>
-    </w:p>
-    <w:p>
-      <w:pPr>
-        <w:spacing w:line="240" w:lineRule="auto"/>
-        <w:ind w:left="431"/>
-      </w:pPr>
-      <w:proofErr w:type="spellStart"/>
-      <w:r>
-        <w:rPr>
-          <w:rFonts w:ascii="Courier New" w:eastAsia="Courier New" w:hAnsi="Courier New" w:cs="Courier New"/>
-          <w:sz w:val="16"/>
-          <w:szCs w:val="16"/>
-        </w:rPr>
-        <w:t>const</w:t>
-      </w:r>
-      <w:proofErr w:type="spellEnd"/>
-      <w:r>
-        <w:rPr>
-          <w:rFonts w:ascii="Courier New" w:eastAsia="Courier New" w:hAnsi="Courier New" w:cs="Courier New"/>
-          <w:sz w:val="16"/>
-          <w:szCs w:val="16"/>
-        </w:rPr>
-        <w:t xml:space="preserve"> </w:t>
-      </w:r>
-      <w:proofErr w:type="spellStart"/>
-      <w:r>
-        <w:rPr>
-          <w:rFonts w:ascii="Courier New" w:eastAsia="Courier New" w:hAnsi="Courier New" w:cs="Courier New"/>
-          <w:sz w:val="16"/>
-          <w:szCs w:val="16"/>
-        </w:rPr>
-        <w:t>float</w:t>
-      </w:r>
-      <w:proofErr w:type="spellEnd"/>
-      <w:r>
-        <w:rPr>
-          <w:rFonts w:ascii="Courier New" w:eastAsia="Courier New" w:hAnsi="Courier New" w:cs="Courier New"/>
-          <w:sz w:val="16"/>
-          <w:szCs w:val="16"/>
-        </w:rPr>
-        <w:t xml:space="preserve"> VOLTAGE_EMA_ALPHA = 0.3;</w:t>
-      </w:r>
-    </w:p>
-    <w:p>
-      <w:pPr>
-        <w:spacing w:line="240" w:lineRule="auto"/>
-        <w:ind w:left="431"/>
-      </w:pPr>
-      <w:proofErr w:type="spellStart"/>
-      <w:r>
-        <w:rPr>
-          <w:rFonts w:ascii="Courier New" w:eastAsia="Courier New" w:hAnsi="Courier New" w:cs="Courier New"/>
-          <w:sz w:val="16"/>
-          <w:szCs w:val="16"/>
-        </w:rPr>
-        <w:t>bool</w:t>
-      </w:r>
-      <w:proofErr w:type="spellEnd"/>
-      <w:r>
-        <w:rPr>
-          <w:rFonts w:ascii="Courier New" w:eastAsia="Courier New" w:hAnsi="Courier New" w:cs="Courier New"/>
-          <w:sz w:val="16"/>
-          <w:szCs w:val="16"/>
-        </w:rPr>
-        <w:t xml:space="preserve"> </w:t>
-      </w:r>
-      <w:proofErr w:type="spellStart"/>
-      <w:r>
-        <w:rPr>
-          <w:rFonts w:ascii="Courier New" w:eastAsia="Courier New" w:hAnsi="Courier New" w:cs="Courier New"/>
-          <w:sz w:val="16"/>
-          <w:szCs w:val="16"/>
-        </w:rPr>
-        <w:t>sensorChanged</w:t>
-      </w:r>
-      <w:proofErr w:type="spellEnd"/>
-      <w:r>
-        <w:rPr>
-          <w:rFonts w:ascii="Courier New" w:eastAsia="Courier New" w:hAnsi="Courier New" w:cs="Courier New"/>
-          <w:sz w:val="16"/>
-          <w:szCs w:val="16"/>
-        </w:rPr>
-        <w:t xml:space="preserve"> = false;</w:t>
-      </w:r>
-    </w:p>
-    <w:p>
-      <w:pPr>
-        <w:spacing w:line="240" w:lineRule="auto"/>
-        <w:ind w:left="431"/>
-      </w:pPr>
-      <w:r>
-        <w:rPr>
-          <w:rFonts w:ascii="Courier New" w:eastAsia="Courier New" w:hAnsi="Courier New" w:cs="Courier New"/>
-          <w:sz w:val="16"/>
-          <w:szCs w:val="16"/>
-        </w:rPr>
-        <w:t xml:space="preserve">String </w:t>
-      </w:r>
-      <w:proofErr w:type="spellStart"/>
-      <w:r>
-        <w:rPr>
-          <w:rFonts w:ascii="Courier New" w:eastAsia="Courier New" w:hAnsi="Courier New" w:cs="Courier New"/>
-          <w:sz w:val="16"/>
-          <w:szCs w:val="16"/>
-        </w:rPr>
-        <w:t>previousSensorID</w:t>
-      </w:r>
-      <w:proofErr w:type="spellEnd"/>
-      <w:r>
-        <w:rPr>
-          <w:rFonts w:ascii="Courier New" w:eastAsia="Courier New" w:hAnsi="Courier New" w:cs="Courier New"/>
-          <w:sz w:val="16"/>
-          <w:szCs w:val="16"/>
-        </w:rPr>
-        <w:t xml:space="preserve"> = "";</w:t>
-      </w:r>
-    </w:p>
-    <w:p>
-      <w:pPr>
-        <w:spacing w:line="240" w:lineRule="auto"/>
-        <w:ind w:left="431"/>
-      </w:pPr>
-    </w:p>
-    <w:p>
-      <w:pPr>
-        <w:spacing w:line="240" w:lineRule="auto"/>
-        <w:ind w:left="431"/>
-      </w:pPr>
-      <w:r>
-        <w:rPr>
-          <w:rFonts w:ascii="Courier New" w:eastAsia="Courier New" w:hAnsi="Courier New" w:cs="Courier New"/>
-          <w:sz w:val="16"/>
-          <w:szCs w:val="16"/>
-        </w:rPr>
-        <w:t xml:space="preserve">// </w:t>
-      </w:r>
-      <w:proofErr w:type="spellStart"/>
-      <w:r>
-        <w:rPr>
-          <w:rFonts w:ascii="Courier New" w:eastAsia="Courier New" w:hAnsi="Courier New" w:cs="Courier New"/>
-          <w:sz w:val="16"/>
-          <w:szCs w:val="16"/>
-        </w:rPr>
-        <w:t>initSensor</w:t>
-      </w:r>
-      <w:proofErr w:type="spellEnd"/>
-      <w:r>
-        <w:rPr>
-          <w:rFonts w:ascii="Courier New" w:eastAsia="Courier New" w:hAnsi="Courier New" w:cs="Courier New"/>
-          <w:sz w:val="16"/>
-          <w:szCs w:val="16"/>
-        </w:rPr>
-        <w:t>: Inicializa sensor Dallas DS18B20.</w:t>
-      </w:r>
-    </w:p>
-    <w:p>
-      <w:pPr>
-        <w:spacing w:line="240" w:lineRule="auto"/>
-        <w:ind w:left="431"/>
-      </w:pPr>
-      <w:r>
-        <w:rPr>
-          <w:rFonts w:ascii="Courier New" w:eastAsia="Courier New" w:hAnsi="Courier New" w:cs="Courier New"/>
-          <w:sz w:val="16"/>
-          <w:szCs w:val="16"/>
-        </w:rPr>
-        <w:t xml:space="preserve">// En </w:t>
-      </w:r>
-      <w:proofErr w:type="spellStart"/>
-      <w:r>
-        <w:rPr>
-          <w:rFonts w:ascii="Courier New" w:eastAsia="Courier New" w:hAnsi="Courier New" w:cs="Courier New"/>
-          <w:sz w:val="16"/>
-          <w:szCs w:val="16"/>
-        </w:rPr>
-        <w:t>deep</w:t>
-      </w:r>
-      <w:proofErr w:type="spellEnd"/>
-      <w:r>
-        <w:rPr>
-          <w:rFonts w:ascii="Courier New" w:eastAsia="Courier New" w:hAnsi="Courier New" w:cs="Courier New"/>
-          <w:sz w:val="16"/>
-          <w:szCs w:val="16"/>
-        </w:rPr>
-        <w:t xml:space="preserve"> </w:t>
-      </w:r>
-      <w:proofErr w:type="spellStart"/>
-      <w:r>
-        <w:rPr>
-          <w:rFonts w:ascii="Courier New" w:eastAsia="Courier New" w:hAnsi="Courier New" w:cs="Courier New"/>
-          <w:sz w:val="16"/>
-          <w:szCs w:val="16"/>
-        </w:rPr>
-        <w:t>sleep</w:t>
-      </w:r>
-      <w:proofErr w:type="spellEnd"/>
-      <w:r>
-        <w:rPr>
-          <w:rFonts w:ascii="Courier New" w:eastAsia="Courier New" w:hAnsi="Courier New" w:cs="Courier New"/>
-          <w:sz w:val="16"/>
-          <w:szCs w:val="16"/>
-        </w:rPr>
-        <w:t xml:space="preserve">: solo carga </w:t>
-      </w:r>
-      <w:proofErr w:type="spellStart"/>
-      <w:r>
-        <w:rPr>
-          <w:rFonts w:ascii="Courier New" w:eastAsia="Courier New" w:hAnsi="Courier New" w:cs="Courier New"/>
-          <w:sz w:val="16"/>
-          <w:szCs w:val="16"/>
-        </w:rPr>
-        <w:t>IDs</w:t>
-      </w:r>
-      <w:proofErr w:type="spellEnd"/>
-      <w:r>
-        <w:rPr>
-          <w:rFonts w:ascii="Courier New" w:eastAsia="Courier New" w:hAnsi="Courier New" w:cs="Courier New"/>
-          <w:sz w:val="16"/>
-          <w:szCs w:val="16"/>
-        </w:rPr>
-        <w:t xml:space="preserve"> de EEPROM sin encender hardware (ahorro </w:t>
-      </w:r>
-      <w:proofErr w:type="spellStart"/>
-      <w:r>
-        <w:rPr>
-          <w:rFonts w:ascii="Courier New" w:eastAsia="Courier New" w:hAnsi="Courier New" w:cs="Courier New"/>
-          <w:sz w:val="16"/>
-          <w:szCs w:val="16"/>
-        </w:rPr>
-        <w:t>bateria</w:t>
-      </w:r>
-      <w:proofErr w:type="spellEnd"/>
-      <w:r>
-        <w:rPr>
-          <w:rFonts w:ascii="Courier New" w:eastAsia="Courier New" w:hAnsi="Courier New" w:cs="Courier New"/>
-          <w:sz w:val="16"/>
-          <w:szCs w:val="16"/>
-        </w:rPr>
-        <w:t>).</w:t>
-      </w:r>
-    </w:p>
-    <w:p>
-      <w:pPr>
-        <w:spacing w:line="240" w:lineRule="auto"/>
-        <w:ind w:left="431"/>
-      </w:pPr>
-      <w:r>
-        <w:rPr>
-          <w:rFonts w:ascii="Courier New" w:eastAsia="Courier New" w:hAnsi="Courier New" w:cs="Courier New"/>
-          <w:sz w:val="16"/>
-          <w:szCs w:val="16"/>
-        </w:rPr>
-        <w:t xml:space="preserve">// En continuo: escanea bus </w:t>
-      </w:r>
-      <w:proofErr w:type="spellStart"/>
-      <w:r>
-        <w:rPr>
-          <w:rFonts w:ascii="Courier New" w:eastAsia="Courier New" w:hAnsi="Courier New" w:cs="Courier New"/>
-          <w:sz w:val="16"/>
-          <w:szCs w:val="16"/>
-        </w:rPr>
-        <w:t>OneWire</w:t>
-      </w:r>
-      <w:proofErr w:type="spellEnd"/>
-      <w:r>
-        <w:rPr>
-          <w:rFonts w:ascii="Courier New" w:eastAsia="Courier New" w:hAnsi="Courier New" w:cs="Courier New"/>
-          <w:sz w:val="16"/>
-          <w:szCs w:val="16"/>
-        </w:rPr>
-        <w:t xml:space="preserve"> completo y registra sensores </w:t>
-      </w:r>
-      <w:proofErr w:type="spellStart"/>
-      <w:r>
-        <w:rPr>
-          <w:rFonts w:ascii="Courier New" w:eastAsia="Courier New" w:hAnsi="Courier New" w:cs="Courier New"/>
-          <w:sz w:val="16"/>
-          <w:szCs w:val="16"/>
-        </w:rPr>
-        <w:t>fisicos</w:t>
-      </w:r>
-      <w:proofErr w:type="spellEnd"/>
-      <w:r>
-        <w:rPr>
-          <w:rFonts w:ascii="Courier New" w:eastAsia="Courier New" w:hAnsi="Courier New" w:cs="Courier New"/>
-          <w:sz w:val="16"/>
-          <w:szCs w:val="16"/>
-        </w:rPr>
-        <w:t>.</w:t>
-      </w:r>
-    </w:p>
-    <w:p>
-      <w:pPr>
-        <w:spacing w:line="240" w:lineRule="auto"/>
-        <w:ind w:left="431"/>
-      </w:pPr>
-      <w:r>
-        <w:rPr>
-          <w:rFonts w:ascii="Courier New" w:eastAsia="Courier New" w:hAnsi="Courier New" w:cs="Courier New"/>
-          <w:sz w:val="16"/>
-          <w:szCs w:val="16"/>
-        </w:rPr>
-        <w:t xml:space="preserve">// </w:t>
-      </w:r>
-      <w:proofErr w:type="spellStart"/>
-      <w:proofErr w:type="gramStart"/>
-      <w:r>
-        <w:rPr>
-          <w:rFonts w:ascii="Courier New" w:eastAsia="Courier New" w:hAnsi="Courier New" w:cs="Courier New"/>
-          <w:sz w:val="16"/>
-          <w:szCs w:val="16"/>
-        </w:rPr>
-        <w:t>readSensorOptimized</w:t>
-      </w:r>
-      <w:proofErr w:type="spellEnd"/>
-      <w:r>
-        <w:rPr>
-          <w:rFonts w:ascii="Courier New" w:eastAsia="Courier New" w:hAnsi="Courier New" w:cs="Courier New"/>
-          <w:sz w:val="16"/>
-          <w:szCs w:val="16"/>
-        </w:rPr>
-        <w:t>(</w:t>
-      </w:r>
-      <w:proofErr w:type="gramEnd"/>
-      <w:r>
-        <w:rPr>
-          <w:rFonts w:ascii="Courier New" w:eastAsia="Courier New" w:hAnsi="Courier New" w:cs="Courier New"/>
-          <w:sz w:val="16"/>
-          <w:szCs w:val="16"/>
-        </w:rPr>
-        <w:t xml:space="preserve">) es el </w:t>
-      </w:r>
-      <w:proofErr w:type="spellStart"/>
-      <w:r>
-        <w:rPr>
-          <w:rFonts w:ascii="Courier New" w:eastAsia="Courier New" w:hAnsi="Courier New" w:cs="Courier New"/>
-          <w:sz w:val="16"/>
-          <w:szCs w:val="16"/>
-        </w:rPr>
-        <w:t>unico</w:t>
-      </w:r>
-      <w:proofErr w:type="spellEnd"/>
-      <w:r>
-        <w:rPr>
-          <w:rFonts w:ascii="Courier New" w:eastAsia="Courier New" w:hAnsi="Courier New" w:cs="Courier New"/>
-          <w:sz w:val="16"/>
-          <w:szCs w:val="16"/>
-        </w:rPr>
-        <w:t xml:space="preserve"> que enciende/apaga el sensor en </w:t>
-      </w:r>
-      <w:proofErr w:type="spellStart"/>
-      <w:r>
-        <w:rPr>
-          <w:rFonts w:ascii="Courier New" w:eastAsia="Courier New" w:hAnsi="Courier New" w:cs="Courier New"/>
-          <w:sz w:val="16"/>
-          <w:szCs w:val="16"/>
-        </w:rPr>
-        <w:t>deep</w:t>
-      </w:r>
-      <w:proofErr w:type="spellEnd"/>
-      <w:r>
-        <w:rPr>
-          <w:rFonts w:ascii="Courier New" w:eastAsia="Courier New" w:hAnsi="Courier New" w:cs="Courier New"/>
-          <w:sz w:val="16"/>
-          <w:szCs w:val="16"/>
-        </w:rPr>
-        <w:t xml:space="preserve"> </w:t>
-      </w:r>
-      <w:proofErr w:type="spellStart"/>
-      <w:r>
-        <w:rPr>
-          <w:rFonts w:ascii="Courier New" w:eastAsia="Courier New" w:hAnsi="Courier New" w:cs="Courier New"/>
-          <w:sz w:val="16"/>
-          <w:szCs w:val="16"/>
-        </w:rPr>
-        <w:t>sleep</w:t>
-      </w:r>
-      <w:proofErr w:type="spellEnd"/>
-      <w:r>
-        <w:rPr>
-          <w:rFonts w:ascii="Courier New" w:eastAsia="Courier New" w:hAnsi="Courier New" w:cs="Courier New"/>
-          <w:sz w:val="16"/>
-          <w:szCs w:val="16"/>
-        </w:rPr>
-        <w:t>.</w:t>
-      </w:r>
-    </w:p>
-    <w:p>
-      <w:pPr>
-        <w:spacing w:line="240" w:lineRule="auto"/>
-        <w:ind w:left="431"/>
-      </w:pPr>
-      <w:proofErr w:type="spellStart"/>
-      <w:r>
-        <w:rPr>
-          <w:rFonts w:ascii="Courier New" w:eastAsia="Courier New" w:hAnsi="Courier New" w:cs="Courier New"/>
-          <w:sz w:val="16"/>
-          <w:szCs w:val="16"/>
-        </w:rPr>
-        <w:t>void</w:t>
-      </w:r>
-      <w:proofErr w:type="spellEnd"/>
-      <w:r>
-        <w:rPr>
-          <w:rFonts w:ascii="Courier New" w:eastAsia="Courier New" w:hAnsi="Courier New" w:cs="Courier New"/>
-          <w:sz w:val="16"/>
-          <w:szCs w:val="16"/>
-        </w:rPr>
-        <w:t xml:space="preserve"> </w:t>
-      </w:r>
-      <w:proofErr w:type="spellStart"/>
-      <w:proofErr w:type="gramStart"/>
-      <w:r>
-        <w:rPr>
-          <w:rFonts w:ascii="Courier New" w:eastAsia="Courier New" w:hAnsi="Courier New" w:cs="Courier New"/>
-          <w:sz w:val="16"/>
-          <w:szCs w:val="16"/>
-        </w:rPr>
-        <w:t>initSensor</w:t>
-      </w:r>
-      <w:proofErr w:type="spellEnd"/>
-      <w:r>
-        <w:rPr>
-          <w:rFonts w:ascii="Courier New" w:eastAsia="Courier New" w:hAnsi="Courier New" w:cs="Courier New"/>
-          <w:sz w:val="16"/>
-          <w:szCs w:val="16"/>
-        </w:rPr>
-        <w:t>(</w:t>
-      </w:r>
-      <w:proofErr w:type="gramEnd"/>
-      <w:r>
-        <w:rPr>
-          <w:rFonts w:ascii="Courier New" w:eastAsia="Courier New" w:hAnsi="Courier New" w:cs="Courier New"/>
-          <w:sz w:val="16"/>
-          <w:szCs w:val="16"/>
-        </w:rPr>
-        <w:t>) {</w:t>
-      </w:r>
-    </w:p>
-    <w:p>
-      <w:pPr>
-        <w:spacing w:line="240" w:lineRule="auto"/>
-        <w:ind w:left="431"/>
-      </w:pPr>
-      <w:r>
-        <w:rPr>
-          <w:rFonts w:ascii="Courier New" w:eastAsia="Courier New" w:hAnsi="Courier New" w:cs="Courier New"/>
-          <w:sz w:val="16"/>
-          <w:szCs w:val="16"/>
-        </w:rPr>
-        <w:t xml:space="preserve">  </w:t>
-      </w:r>
-      <w:proofErr w:type="spellStart"/>
-      <w:r>
-        <w:rPr>
-          <w:rFonts w:ascii="Courier New" w:eastAsia="Courier New" w:hAnsi="Courier New" w:cs="Courier New"/>
-          <w:sz w:val="16"/>
-          <w:szCs w:val="16"/>
-        </w:rPr>
-        <w:t>bool</w:t>
-      </w:r>
-      <w:proofErr w:type="spellEnd"/>
-      <w:r>
-        <w:rPr>
-          <w:rFonts w:ascii="Courier New" w:eastAsia="Courier New" w:hAnsi="Courier New" w:cs="Courier New"/>
-          <w:sz w:val="16"/>
-          <w:szCs w:val="16"/>
-        </w:rPr>
-        <w:t xml:space="preserve"> </w:t>
-      </w:r>
-      <w:proofErr w:type="spellStart"/>
-      <w:r>
-        <w:rPr>
-          <w:rFonts w:ascii="Courier New" w:eastAsia="Courier New" w:hAnsi="Courier New" w:cs="Courier New"/>
-          <w:sz w:val="16"/>
-          <w:szCs w:val="16"/>
-        </w:rPr>
-        <w:t>skipHardwareScan</w:t>
-      </w:r>
-      <w:proofErr w:type="spellEnd"/>
-      <w:r>
-        <w:rPr>
-          <w:rFonts w:ascii="Courier New" w:eastAsia="Courier New" w:hAnsi="Courier New" w:cs="Courier New"/>
-          <w:sz w:val="16"/>
-          <w:szCs w:val="16"/>
-        </w:rPr>
-        <w:t xml:space="preserve"> = (</w:t>
-      </w:r>
-      <w:proofErr w:type="spellStart"/>
-      <w:r>
-        <w:rPr>
-          <w:rFonts w:ascii="Courier New" w:eastAsia="Courier New" w:hAnsi="Courier New" w:cs="Courier New"/>
-          <w:sz w:val="16"/>
-          <w:szCs w:val="16"/>
-        </w:rPr>
-        <w:t>currentMode</w:t>
-      </w:r>
-      <w:proofErr w:type="spellEnd"/>
-      <w:r>
-        <w:rPr>
-          <w:rFonts w:ascii="Courier New" w:eastAsia="Courier New" w:hAnsi="Courier New" w:cs="Courier New"/>
-          <w:sz w:val="16"/>
-          <w:szCs w:val="16"/>
-        </w:rPr>
-        <w:t xml:space="preserve"> == MODE_DEEP_SLEEP);</w:t>
-      </w:r>
-    </w:p>
-    <w:p>
-      <w:pPr>
-        <w:spacing w:line="240" w:lineRule="auto"/>
-        <w:ind w:left="431"/>
-      </w:pPr>
-    </w:p>
-    <w:p>
-      <w:pPr>
-        <w:spacing w:line="240" w:lineRule="auto"/>
-        <w:ind w:left="431"/>
-      </w:pPr>
-      <w:r>
-        <w:rPr>
-          <w:rFonts w:ascii="Courier New" w:eastAsia="Courier New" w:hAnsi="Courier New" w:cs="Courier New"/>
-          <w:sz w:val="16"/>
-          <w:szCs w:val="16"/>
-        </w:rPr>
-        <w:t xml:space="preserve">  </w:t>
-      </w:r>
-      <w:proofErr w:type="spellStart"/>
-      <w:r>
-        <w:rPr>
-          <w:rFonts w:ascii="Courier New" w:eastAsia="Courier New" w:hAnsi="Courier New" w:cs="Courier New"/>
-          <w:sz w:val="16"/>
-          <w:szCs w:val="16"/>
-        </w:rPr>
-        <w:t>if</w:t>
-      </w:r>
-      <w:proofErr w:type="spellEnd"/>
-      <w:r>
-        <w:rPr>
-          <w:rFonts w:ascii="Courier New" w:eastAsia="Courier New" w:hAnsi="Courier New" w:cs="Courier New"/>
-          <w:sz w:val="16"/>
-          <w:szCs w:val="16"/>
-        </w:rPr>
-        <w:t xml:space="preserve"> </w:t>
-      </w:r>
-      <w:proofErr w:type="gramStart"/>
-      <w:r>
-        <w:rPr>
-          <w:rFonts w:ascii="Courier New" w:eastAsia="Courier New" w:hAnsi="Courier New" w:cs="Courier New"/>
-          <w:sz w:val="16"/>
-          <w:szCs w:val="16"/>
-        </w:rPr>
-        <w:t>(!</w:t>
-      </w:r>
-      <w:proofErr w:type="spellStart"/>
-      <w:r>
-        <w:rPr>
-          <w:rFonts w:ascii="Courier New" w:eastAsia="Courier New" w:hAnsi="Courier New" w:cs="Courier New"/>
-          <w:sz w:val="16"/>
-          <w:szCs w:val="16"/>
-        </w:rPr>
-        <w:t>skipHardwareScan</w:t>
-      </w:r>
-      <w:proofErr w:type="spellEnd"/>
-      <w:proofErr w:type="gramEnd"/>
-      <w:r>
-        <w:rPr>
-          <w:rFonts w:ascii="Courier New" w:eastAsia="Courier New" w:hAnsi="Courier New" w:cs="Courier New"/>
-          <w:sz w:val="16"/>
-          <w:szCs w:val="16"/>
-        </w:rPr>
-        <w:t>) {</w:t>
-      </w:r>
-    </w:p>
-    <w:p>
-      <w:pPr>
-        <w:spacing w:line="240" w:lineRule="auto"/>
-        <w:ind w:left="431"/>
-      </w:pPr>
-      <w:r>
-        <w:rPr>
-          <w:rFonts w:ascii="Courier New" w:eastAsia="Courier New" w:hAnsi="Courier New" w:cs="Courier New"/>
-          <w:sz w:val="16"/>
-          <w:szCs w:val="16"/>
-        </w:rPr>
-        <w:t xml:space="preserve">    // Modo continuo: escaneo completo del bus </w:t>
-      </w:r>
-      <w:proofErr w:type="spellStart"/>
-      <w:r>
-        <w:rPr>
-          <w:rFonts w:ascii="Courier New" w:eastAsia="Courier New" w:hAnsi="Courier New" w:cs="Courier New"/>
-          <w:sz w:val="16"/>
-          <w:szCs w:val="16"/>
-        </w:rPr>
-        <w:t>OneWire</w:t>
-      </w:r>
-      <w:proofErr w:type="spellEnd"/>
-    </w:p>
-    <w:p>
-      <w:pPr>
-        <w:spacing w:line="240" w:lineRule="auto"/>
-        <w:ind w:left="431"/>
-      </w:pPr>
-      <w:r>
-        <w:rPr>
-          <w:rFonts w:ascii="Courier New" w:eastAsia="Courier New" w:hAnsi="Courier New" w:cs="Courier New"/>
-          <w:sz w:val="16"/>
-          <w:szCs w:val="16"/>
-        </w:rPr>
-        <w:t xml:space="preserve">    </w:t>
-      </w:r>
-      <w:proofErr w:type="spellStart"/>
-      <w:proofErr w:type="gramStart"/>
-      <w:r>
-        <w:rPr>
-          <w:rFonts w:ascii="Courier New" w:eastAsia="Courier New" w:hAnsi="Courier New" w:cs="Courier New"/>
-          <w:sz w:val="16"/>
-          <w:szCs w:val="16"/>
-        </w:rPr>
-        <w:t>digitalWrite</w:t>
-      </w:r>
-      <w:proofErr w:type="spellEnd"/>
-      <w:r>
-        <w:rPr>
-          <w:rFonts w:ascii="Courier New" w:eastAsia="Courier New" w:hAnsi="Courier New" w:cs="Courier New"/>
-          <w:sz w:val="16"/>
-          <w:szCs w:val="16"/>
-        </w:rPr>
-        <w:t>(</w:t>
-      </w:r>
-      <w:proofErr w:type="gramEnd"/>
-      <w:r>
-        <w:rPr>
-          <w:rFonts w:ascii="Courier New" w:eastAsia="Courier New" w:hAnsi="Courier New" w:cs="Courier New"/>
-          <w:sz w:val="16"/>
-          <w:szCs w:val="16"/>
-        </w:rPr>
-        <w:t>POWER_PIN, HIGH);</w:t>
-      </w:r>
-    </w:p>
-    <w:p>
-      <w:pPr>
-        <w:spacing w:line="240" w:lineRule="auto"/>
-        <w:ind w:left="431"/>
-      </w:pPr>
-      <w:r>
-        <w:rPr>
-          <w:rFonts w:ascii="Courier New" w:eastAsia="Courier New" w:hAnsi="Courier New" w:cs="Courier New"/>
-          <w:sz w:val="16"/>
-          <w:szCs w:val="16"/>
-        </w:rPr>
-        <w:t xml:space="preserve">    </w:t>
-      </w:r>
-      <w:proofErr w:type="spellStart"/>
-      <w:proofErr w:type="gramStart"/>
-      <w:r>
-        <w:rPr>
-          <w:rFonts w:ascii="Courier New" w:eastAsia="Courier New" w:hAnsi="Courier New" w:cs="Courier New"/>
-          <w:sz w:val="16"/>
-          <w:szCs w:val="16"/>
-        </w:rPr>
-        <w:t>delay</w:t>
-      </w:r>
-      <w:proofErr w:type="spellEnd"/>
-      <w:r>
-        <w:rPr>
-          <w:rFonts w:ascii="Courier New" w:eastAsia="Courier New" w:hAnsi="Courier New" w:cs="Courier New"/>
-          <w:sz w:val="16"/>
-          <w:szCs w:val="16"/>
-        </w:rPr>
-        <w:t>(</w:t>
-      </w:r>
-      <w:proofErr w:type="gramEnd"/>
-      <w:r>
-        <w:rPr>
-          <w:rFonts w:ascii="Courier New" w:eastAsia="Courier New" w:hAnsi="Courier New" w:cs="Courier New"/>
-          <w:sz w:val="16"/>
-          <w:szCs w:val="16"/>
-        </w:rPr>
-        <w:t>SENSOR_POWER_UP_DELAY);</w:t>
-      </w:r>
-    </w:p>
-    <w:p>
-      <w:pPr>
-        <w:spacing w:line="240" w:lineRule="auto"/>
-        <w:ind w:left="431"/>
-      </w:pPr>
-    </w:p>
-    <w:p>
-      <w:pPr>
-        <w:spacing w:line="240" w:lineRule="auto"/>
-        <w:ind w:left="431"/>
-      </w:pPr>
-      <w:r>
-        <w:rPr>
-          <w:rFonts w:ascii="Courier New" w:eastAsia="Courier New" w:hAnsi="Courier New" w:cs="Courier New"/>
-          <w:sz w:val="16"/>
-          <w:szCs w:val="16"/>
-        </w:rPr>
-        <w:t xml:space="preserve">    </w:t>
-      </w:r>
-      <w:proofErr w:type="spellStart"/>
-      <w:proofErr w:type="gramStart"/>
-      <w:r>
-        <w:rPr>
-          <w:rFonts w:ascii="Courier New" w:eastAsia="Courier New" w:hAnsi="Courier New" w:cs="Courier New"/>
-          <w:sz w:val="16"/>
-          <w:szCs w:val="16"/>
-        </w:rPr>
-        <w:t>sensors.begin</w:t>
-      </w:r>
-      <w:proofErr w:type="spellEnd"/>
-      <w:proofErr w:type="gramEnd"/>
-      <w:r>
-        <w:rPr>
-          <w:rFonts w:ascii="Courier New" w:eastAsia="Courier New" w:hAnsi="Courier New" w:cs="Courier New"/>
-          <w:sz w:val="16"/>
-          <w:szCs w:val="16"/>
-        </w:rPr>
-        <w:t>();</w:t>
-      </w:r>
-    </w:p>
-    <w:p>
-      <w:pPr>
-        <w:spacing w:line="240" w:lineRule="auto"/>
-        <w:ind w:left="431"/>
-      </w:pPr>
-      <w:r>
-        <w:rPr>
-          <w:rFonts w:ascii="Courier New" w:eastAsia="Courier New" w:hAnsi="Courier New" w:cs="Courier New"/>
-          <w:sz w:val="16"/>
-          <w:szCs w:val="16"/>
-        </w:rPr>
-        <w:t xml:space="preserve">    </w:t>
-      </w:r>
-      <w:proofErr w:type="spellStart"/>
-      <w:r>
-        <w:rPr>
-          <w:rFonts w:ascii="Courier New" w:eastAsia="Courier New" w:hAnsi="Courier New" w:cs="Courier New"/>
-          <w:sz w:val="16"/>
-          <w:szCs w:val="16"/>
-        </w:rPr>
-        <w:t>sensorCount</w:t>
-      </w:r>
-      <w:proofErr w:type="spellEnd"/>
-      <w:r>
-        <w:rPr>
-          <w:rFonts w:ascii="Courier New" w:eastAsia="Courier New" w:hAnsi="Courier New" w:cs="Courier New"/>
-          <w:sz w:val="16"/>
-          <w:szCs w:val="16"/>
-        </w:rPr>
-        <w:t xml:space="preserve"> = </w:t>
-      </w:r>
-      <w:proofErr w:type="spellStart"/>
-      <w:proofErr w:type="gramStart"/>
-      <w:r>
-        <w:rPr>
-          <w:rFonts w:ascii="Courier New" w:eastAsia="Courier New" w:hAnsi="Courier New" w:cs="Courier New"/>
-          <w:sz w:val="16"/>
-          <w:szCs w:val="16"/>
-        </w:rPr>
-        <w:t>sensors.getDeviceCount</w:t>
-      </w:r>
-      <w:proofErr w:type="spellEnd"/>
-      <w:proofErr w:type="gramEnd"/>
-      <w:r>
-        <w:rPr>
-          <w:rFonts w:ascii="Courier New" w:eastAsia="Courier New" w:hAnsi="Courier New" w:cs="Courier New"/>
-          <w:sz w:val="16"/>
-          <w:szCs w:val="16"/>
-        </w:rPr>
-        <w:t>();</w:t>
-      </w:r>
-    </w:p>
-    <w:p>
-      <w:pPr>
-        <w:spacing w:line="240" w:lineRule="auto"/>
-        <w:ind w:left="431"/>
-      </w:pPr>
-      <w:r>
-        <w:rPr>
-          <w:rFonts w:ascii="Courier New" w:eastAsia="Courier New" w:hAnsi="Courier New" w:cs="Courier New"/>
-          <w:sz w:val="16"/>
-          <w:szCs w:val="16"/>
-        </w:rPr>
-        <w:t xml:space="preserve">    </w:t>
-      </w:r>
-      <w:proofErr w:type="spellStart"/>
-      <w:r>
-        <w:rPr>
-          <w:rFonts w:ascii="Courier New" w:eastAsia="Courier New" w:hAnsi="Courier New" w:cs="Courier New"/>
-          <w:sz w:val="16"/>
-          <w:szCs w:val="16"/>
-        </w:rPr>
-        <w:t>Serial.printf</w:t>
-      </w:r>
-      <w:proofErr w:type="spellEnd"/>
-      <w:r>
-        <w:rPr>
-          <w:rFonts w:ascii="Courier New" w:eastAsia="Courier New" w:hAnsi="Courier New" w:cs="Courier New"/>
-          <w:sz w:val="16"/>
-          <w:szCs w:val="16"/>
-        </w:rPr>
-        <w:t xml:space="preserve">("Sensores encontrados: %d\n", </w:t>
-      </w:r>
-      <w:proofErr w:type="spellStart"/>
-      <w:r>
-        <w:rPr>
-          <w:rFonts w:ascii="Courier New" w:eastAsia="Courier New" w:hAnsi="Courier New" w:cs="Courier New"/>
-          <w:sz w:val="16"/>
-          <w:szCs w:val="16"/>
-        </w:rPr>
-        <w:t>sensorCount</w:t>
-      </w:r>
-      <w:proofErr w:type="spellEnd"/>
-      <w:r>
-        <w:rPr>
-          <w:rFonts w:ascii="Courier New" w:eastAsia="Courier New" w:hAnsi="Courier New" w:cs="Courier New"/>
-          <w:sz w:val="16"/>
-          <w:szCs w:val="16"/>
-        </w:rPr>
-        <w:t>);</w:t>
-      </w:r>
-    </w:p>
-    <w:p>
-      <w:pPr>
-        <w:spacing w:line="240" w:lineRule="auto"/>
-        <w:ind w:left="431"/>
-      </w:pPr>
-    </w:p>
-    <w:p>
-      <w:pPr>
-        <w:spacing w:line="240" w:lineRule="auto"/>
-        <w:ind w:left="431"/>
-      </w:pPr>
-      <w:r>
-        <w:rPr>
-          <w:rFonts w:ascii="Courier New" w:eastAsia="Courier New" w:hAnsi="Courier New" w:cs="Courier New"/>
-          <w:sz w:val="16"/>
-          <w:szCs w:val="16"/>
-        </w:rPr>
-        <w:t xml:space="preserve">    </w:t>
-      </w:r>
-      <w:proofErr w:type="spellStart"/>
-      <w:r>
-        <w:rPr>
-          <w:rFonts w:ascii="Courier New" w:eastAsia="Courier New" w:hAnsi="Courier New" w:cs="Courier New"/>
-          <w:sz w:val="16"/>
-          <w:szCs w:val="16"/>
-        </w:rPr>
-        <w:t>if</w:t>
-      </w:r>
-      <w:proofErr w:type="spellEnd"/>
-      <w:r>
-        <w:rPr>
-          <w:rFonts w:ascii="Courier New" w:eastAsia="Courier New" w:hAnsi="Courier New" w:cs="Courier New"/>
-          <w:sz w:val="16"/>
-          <w:szCs w:val="16"/>
-        </w:rPr>
-        <w:t xml:space="preserve"> (</w:t>
-      </w:r>
-      <w:proofErr w:type="spellStart"/>
-      <w:r>
-        <w:rPr>
-          <w:rFonts w:ascii="Courier New" w:eastAsia="Courier New" w:hAnsi="Courier New" w:cs="Courier New"/>
-          <w:sz w:val="16"/>
-          <w:szCs w:val="16"/>
-        </w:rPr>
-        <w:t>sensorCount</w:t>
-      </w:r>
-      <w:proofErr w:type="spellEnd"/>
-      <w:r>
-        <w:rPr>
-          <w:rFonts w:ascii="Courier New" w:eastAsia="Courier New" w:hAnsi="Courier New" w:cs="Courier New"/>
-          <w:sz w:val="16"/>
-          <w:szCs w:val="16"/>
-        </w:rPr>
-        <w:t xml:space="preserve"> &gt; MAX_CHANNELS) </w:t>
-      </w:r>
-      <w:proofErr w:type="spellStart"/>
-      <w:r>
-        <w:rPr>
-          <w:rFonts w:ascii="Courier New" w:eastAsia="Courier New" w:hAnsi="Courier New" w:cs="Courier New"/>
-          <w:sz w:val="16"/>
-          <w:szCs w:val="16"/>
-        </w:rPr>
-        <w:t>sensorCount</w:t>
-      </w:r>
-      <w:proofErr w:type="spellEnd"/>
-      <w:r>
-        <w:rPr>
-          <w:rFonts w:ascii="Courier New" w:eastAsia="Courier New" w:hAnsi="Courier New" w:cs="Courier New"/>
-          <w:sz w:val="16"/>
-          <w:szCs w:val="16"/>
-        </w:rPr>
-        <w:t xml:space="preserve"> = MAX_CHANNELS;</w:t>
-      </w:r>
-    </w:p>
-    <w:p>
-      <w:pPr>
-        <w:spacing w:line="240" w:lineRule="auto"/>
-        <w:ind w:left="431"/>
-      </w:pPr>
-    </w:p>
-    <w:p>
-      <w:pPr>
-        <w:spacing w:line="240" w:lineRule="auto"/>
-        <w:ind w:left="431"/>
-      </w:pPr>
-      <w:r>
-        <w:rPr>
-          <w:rFonts w:ascii="Courier New" w:eastAsia="Courier New" w:hAnsi="Courier New" w:cs="Courier New"/>
-          <w:sz w:val="16"/>
-          <w:szCs w:val="16"/>
-        </w:rPr>
-        <w:t xml:space="preserve">    </w:t>
-      </w:r>
-      <w:proofErr w:type="spellStart"/>
-      <w:r>
-        <w:rPr>
-          <w:rFonts w:ascii="Courier New" w:eastAsia="Courier New" w:hAnsi="Courier New" w:cs="Courier New"/>
-          <w:sz w:val="16"/>
-          <w:szCs w:val="16"/>
-        </w:rPr>
-        <w:t>for</w:t>
-      </w:r>
-      <w:proofErr w:type="spellEnd"/>
-      <w:r>
-        <w:rPr>
-          <w:rFonts w:ascii="Courier New" w:eastAsia="Courier New" w:hAnsi="Courier New" w:cs="Courier New"/>
-          <w:sz w:val="16"/>
-          <w:szCs w:val="16"/>
-        </w:rPr>
-        <w:t xml:space="preserve"> (</w:t>
-      </w:r>
-      <w:proofErr w:type="spellStart"/>
-      <w:r>
-        <w:rPr>
-          <w:rFonts w:ascii="Courier New" w:eastAsia="Courier New" w:hAnsi="Courier New" w:cs="Courier New"/>
-          <w:sz w:val="16"/>
-          <w:szCs w:val="16"/>
-        </w:rPr>
-        <w:t>int</w:t>
-      </w:r>
-      <w:proofErr w:type="spellEnd"/>
-      <w:r>
-        <w:rPr>
-          <w:rFonts w:ascii="Courier New" w:eastAsia="Courier New" w:hAnsi="Courier New" w:cs="Courier New"/>
-          <w:sz w:val="16"/>
-          <w:szCs w:val="16"/>
-        </w:rPr>
-        <w:t xml:space="preserve"> i = 0; i &lt; </w:t>
-      </w:r>
-      <w:proofErr w:type="spellStart"/>
-      <w:r>
-        <w:rPr>
-          <w:rFonts w:ascii="Courier New" w:eastAsia="Courier New" w:hAnsi="Courier New" w:cs="Courier New"/>
-          <w:sz w:val="16"/>
-          <w:szCs w:val="16"/>
-        </w:rPr>
-        <w:t>sensorCount</w:t>
-      </w:r>
-      <w:proofErr w:type="spellEnd"/>
-      <w:r>
-        <w:rPr>
-          <w:rFonts w:ascii="Courier New" w:eastAsia="Courier New" w:hAnsi="Courier New" w:cs="Courier New"/>
-          <w:sz w:val="16"/>
-          <w:szCs w:val="16"/>
-        </w:rPr>
-        <w:t>; i++) {</w:t>
-      </w:r>
-    </w:p>
-    <w:p>
-      <w:pPr>
-        <w:spacing w:line="240" w:lineRule="auto"/>
-        <w:ind w:left="431"/>
-      </w:pPr>
-      <w:r>
-        <w:rPr>
-          <w:rFonts w:ascii="Courier New" w:eastAsia="Courier New" w:hAnsi="Courier New" w:cs="Courier New"/>
-          <w:sz w:val="16"/>
-          <w:szCs w:val="16"/>
-        </w:rPr>
-        <w:t xml:space="preserve">      </w:t>
-      </w:r>
-      <w:proofErr w:type="spellStart"/>
-      <w:r>
-        <w:rPr>
-          <w:rFonts w:ascii="Courier New" w:eastAsia="Courier New" w:hAnsi="Courier New" w:cs="Courier New"/>
-          <w:sz w:val="16"/>
-          <w:szCs w:val="16"/>
-        </w:rPr>
-        <w:t>if</w:t>
-      </w:r>
-      <w:proofErr w:type="spellEnd"/>
-      <w:r>
-        <w:rPr>
-          <w:rFonts w:ascii="Courier New" w:eastAsia="Courier New" w:hAnsi="Courier New" w:cs="Courier New"/>
-          <w:sz w:val="16"/>
-          <w:szCs w:val="16"/>
-        </w:rPr>
-        <w:t xml:space="preserve"> (</w:t>
-      </w:r>
-      <w:proofErr w:type="spellStart"/>
-      <w:proofErr w:type="gramStart"/>
-      <w:r>
-        <w:rPr>
-          <w:rFonts w:ascii="Courier New" w:eastAsia="Courier New" w:hAnsi="Courier New" w:cs="Courier New"/>
-          <w:sz w:val="16"/>
-          <w:szCs w:val="16"/>
-        </w:rPr>
-        <w:t>sensors.getAddress</w:t>
-      </w:r>
-      <w:proofErr w:type="spellEnd"/>
-      <w:proofErr w:type="gramEnd"/>
-      <w:r>
-        <w:rPr>
-          <w:rFonts w:ascii="Courier New" w:eastAsia="Courier New" w:hAnsi="Courier New" w:cs="Courier New"/>
-          <w:sz w:val="16"/>
-          <w:szCs w:val="16"/>
-        </w:rPr>
-        <w:t>(</w:t>
-      </w:r>
-      <w:proofErr w:type="spellStart"/>
-      <w:r>
-        <w:rPr>
-          <w:rFonts w:ascii="Courier New" w:eastAsia="Courier New" w:hAnsi="Courier New" w:cs="Courier New"/>
-          <w:sz w:val="16"/>
-          <w:szCs w:val="16"/>
-        </w:rPr>
-        <w:t>sensorAddresses</w:t>
-      </w:r>
-      <w:proofErr w:type="spellEnd"/>
-      <w:r>
-        <w:rPr>
-          <w:rFonts w:ascii="Courier New" w:eastAsia="Courier New" w:hAnsi="Courier New" w:cs="Courier New"/>
-          <w:sz w:val="16"/>
-          <w:szCs w:val="16"/>
-        </w:rPr>
-        <w:t>[i], i)) {</w:t>
-      </w:r>
-    </w:p>
-    <w:p>
-      <w:pPr>
-        <w:spacing w:line="240" w:lineRule="auto"/>
-        <w:ind w:left="431"/>
-      </w:pPr>
-      <w:r>
-        <w:rPr>
-          <w:rFonts w:ascii="Courier New" w:eastAsia="Courier New" w:hAnsi="Courier New" w:cs="Courier New"/>
-          <w:sz w:val="16"/>
-          <w:szCs w:val="16"/>
-        </w:rPr>
-        <w:t xml:space="preserve">        </w:t>
-      </w:r>
-      <w:proofErr w:type="spellStart"/>
-      <w:proofErr w:type="gramStart"/>
-      <w:r>
-        <w:rPr>
-          <w:rFonts w:ascii="Courier New" w:eastAsia="Courier New" w:hAnsi="Courier New" w:cs="Courier New"/>
-          <w:sz w:val="16"/>
-          <w:szCs w:val="16"/>
-        </w:rPr>
-        <w:t>sensors.setResolution</w:t>
-      </w:r>
-      <w:proofErr w:type="spellEnd"/>
-      <w:proofErr w:type="gramEnd"/>
-      <w:r>
-        <w:rPr>
-          <w:rFonts w:ascii="Courier New" w:eastAsia="Courier New" w:hAnsi="Courier New" w:cs="Courier New"/>
-          <w:sz w:val="16"/>
-          <w:szCs w:val="16"/>
-        </w:rPr>
-        <w:t>(</w:t>
-      </w:r>
-      <w:proofErr w:type="spellStart"/>
-      <w:r>
-        <w:rPr>
-          <w:rFonts w:ascii="Courier New" w:eastAsia="Courier New" w:hAnsi="Courier New" w:cs="Courier New"/>
-          <w:sz w:val="16"/>
-          <w:szCs w:val="16"/>
-        </w:rPr>
-        <w:t>sensorAddresses</w:t>
-      </w:r>
-      <w:proofErr w:type="spellEnd"/>
-      <w:r>
-        <w:rPr>
-          <w:rFonts w:ascii="Courier New" w:eastAsia="Courier New" w:hAnsi="Courier New" w:cs="Courier New"/>
-          <w:sz w:val="16"/>
-          <w:szCs w:val="16"/>
-        </w:rPr>
-        <w:t>[i], SENSOR_RESOLUTION);</w:t>
-      </w:r>
-    </w:p>
-    <w:p>
-      <w:pPr>
-        <w:spacing w:line="240" w:lineRule="auto"/>
-        <w:ind w:left="431"/>
-      </w:pPr>
-      <w:r>
-        <w:rPr>
-          <w:rFonts w:ascii="Courier New" w:eastAsia="Courier New" w:hAnsi="Courier New" w:cs="Courier New"/>
-          <w:sz w:val="16"/>
-          <w:szCs w:val="16"/>
-        </w:rPr>
-        <w:t xml:space="preserve">// ... (200 líneas </w:t>
-      </w:r>
-      <w:proofErr w:type="gramStart"/>
-      <w:r>
-        <w:rPr>
-          <w:rFonts w:ascii="Courier New" w:eastAsia="Courier New" w:hAnsi="Courier New" w:cs="Courier New"/>
-          <w:sz w:val="16"/>
-          <w:szCs w:val="16"/>
-        </w:rPr>
-        <w:t>omitidas)&lt;</w:t>
-      </w:r>
-      <w:proofErr w:type="gramEnd"/>
-      <w:r>
-        <w:rPr>
-          <w:rFonts w:ascii="Courier New" w:eastAsia="Courier New" w:hAnsi="Courier New" w:cs="Courier New"/>
-          <w:sz w:val="16"/>
-          <w:szCs w:val="16"/>
-        </w:rPr>
-        <w:t>/</w:t>
-      </w:r>
-      <w:proofErr w:type="spellStart"/>
-      <w:r>
-        <w:rPr>
-          <w:rFonts w:ascii="Courier New" w:eastAsia="Courier New" w:hAnsi="Courier New" w:cs="Courier New"/>
-          <w:sz w:val="16"/>
-          <w:szCs w:val="16"/>
-        </w:rPr>
-        <w:t>code</w:t>
-      </w:r>
-      <w:proofErr w:type="spellEnd"/>
-      <w:r>
-        <w:rPr>
-          <w:rFonts w:ascii="Courier New" w:eastAsia="Courier New" w:hAnsi="Courier New" w:cs="Courier New"/>
-          <w:sz w:val="16"/>
-          <w:szCs w:val="16"/>
-        </w:rPr>
-        <w:t>&gt;</w:t>
-      </w:r>
-    </w:p>
-    <w:p>
-      <w:pPr>
-        <w:spacing w:after="200"/>
-      </w:pPr>
-    </w:p>
-    <w:p>
-      <w:r>
-        <w:lastRenderedPageBreak/>
-        <w:br w:type="page"/>
+      <w:r>
+        <w:t>El código fuente completo del firmware (funcional_remoto_modular_.ino, mqtt_manager.cpp y sensor_core.cpp), junto con el resto del sistema, se conserva como material complementario y queda a disposición del tribunal para su consulta.</w:t>
       </w:r>
     </w:p>
     <w:p>

</xml_diff>

<commit_message>
APA: agregar referencia faltante (Ramirez-Faz et al., 2020) citada en el texto
- La cita '(Ramirez-Faz et al., 2020)' aparecia 2 veces en el cuerpo pero faltaba en Referencias
- Agregada en orden alfabetico (Sensors, 20(3), 846)
- Indices re-actualizados; documento verificado en 77 paginas
</commit_message>
<xml_diff>
--- a/tesis-smarttemp-final.docx
+++ b/tesis-smarttemp-final.docx
@@ -176,9 +176,9 @@
                           <a:avLst/>
                           <a:gdLst>
                             <a:gd name="textAreaLeft" fmla="*/ 0 w 3083400"/>
-                            <a:gd name="textAreaRight" fmla="*/ 3083760 w 3083400"/>
+                            <a:gd name="textAreaRight" fmla="*/ 3084120 w 3083400"/>
                             <a:gd name="textAreaTop" fmla="*/ 0 h 720"/>
-                            <a:gd name="textAreaBottom" fmla="*/ 1080 h 720"/>
+                            <a:gd name="textAreaBottom" fmla="*/ 1440 h 720"/>
                           </a:gdLst>
                           <a:ahLst/>
                           <a:cxnLst/>
@@ -1218,7 +1218,7 @@
               </w:rPr>
               <w:t>1. Introducción</w:t>
               <w:tab/>
-              <w:t>10</w:t>
+              <w:t>9</w:t>
             </w:r>
           </w:hyperlink>
         </w:p>
@@ -1239,7 +1239,7 @@
               </w:rPr>
               <w:t>1.1 Planteamiento del problema</w:t>
               <w:tab/>
-              <w:t>11</w:t>
+              <w:t>10</w:t>
             </w:r>
           </w:hyperlink>
         </w:p>
@@ -1260,7 +1260,7 @@
               </w:rPr>
               <w:t>1.2 Justificación</w:t>
               <w:tab/>
-              <w:t>11</w:t>
+              <w:t>10</w:t>
             </w:r>
           </w:hyperlink>
         </w:p>
@@ -1281,7 +1281,7 @@
               </w:rPr>
               <w:t>1.3 Objetivos</w:t>
               <w:tab/>
-              <w:t>12</w:t>
+              <w:t>11</w:t>
             </w:r>
           </w:hyperlink>
         </w:p>
@@ -1302,7 +1302,7 @@
               </w:rPr>
               <w:t>1.4 Alcance y limitaciones</w:t>
               <w:tab/>
-              <w:t>13</w:t>
+              <w:t>12</w:t>
             </w:r>
           </w:hyperlink>
         </w:p>
@@ -1323,7 +1323,7 @@
               </w:rPr>
               <w:t>1.5 Organización del documento</w:t>
               <w:tab/>
-              <w:t>13</w:t>
+              <w:t>12</w:t>
             </w:r>
           </w:hyperlink>
         </w:p>
@@ -1344,7 +1344,7 @@
               </w:rPr>
               <w:t>2. Marco Teórico</w:t>
               <w:tab/>
-              <w:t>15</w:t>
+              <w:t>14</w:t>
             </w:r>
           </w:hyperlink>
         </w:p>
@@ -1365,7 +1365,7 @@
               </w:rPr>
               <w:t>2.1 Cadena de frío en laboratorios de biología molecular</w:t>
               <w:tab/>
-              <w:t>15</w:t>
+              <w:t>14</w:t>
             </w:r>
           </w:hyperlink>
         </w:p>
@@ -1386,7 +1386,7 @@
               </w:rPr>
               <w:t>2.2 Internet de las Cosas (IoT) aplicado a salud</w:t>
               <w:tab/>
-              <w:t>17</w:t>
+              <w:t>16</w:t>
             </w:r>
           </w:hyperlink>
         </w:p>
@@ -1407,7 +1407,7 @@
               </w:rPr>
               <w:t>2.3 Protocolos de comunicación</w:t>
               <w:tab/>
-              <w:t>18</w:t>
+              <w:t>17</w:t>
             </w:r>
           </w:hyperlink>
         </w:p>
@@ -1441,7 +1441,7 @@
                 <w:rStyle w:val="IndexLink"/>
               </w:rPr>
               <w:tab/>
-              <w:t>20</w:t>
+              <w:t>19</w:t>
             </w:r>
           </w:hyperlink>
         </w:p>
@@ -1475,7 +1475,7 @@
                 <w:rStyle w:val="IndexLink"/>
               </w:rPr>
               <w:tab/>
-              <w:t>21</w:t>
+              <w:t>20</w:t>
             </w:r>
           </w:hyperlink>
         </w:p>
@@ -1496,7 +1496,7 @@
               </w:rPr>
               <w:t>2.6 Estado del arte</w:t>
               <w:tab/>
-              <w:t>22</w:t>
+              <w:t>21</w:t>
             </w:r>
           </w:hyperlink>
         </w:p>
@@ -1517,7 +1517,7 @@
               </w:rPr>
               <w:t>2.7 Metodologías de desarrollo de sistemas IoT</w:t>
               <w:tab/>
-              <w:t>25</w:t>
+              <w:t>24</w:t>
             </w:r>
           </w:hyperlink>
         </w:p>
@@ -1538,7 +1538,7 @@
               </w:rPr>
               <w:t>3. Marco Metodológico</w:t>
               <w:tab/>
-              <w:t>27</w:t>
+              <w:t>26</w:t>
             </w:r>
           </w:hyperlink>
         </w:p>
@@ -1559,7 +1559,7 @@
               </w:rPr>
               <w:t>3.1 Tipo de estudio</w:t>
               <w:tab/>
-              <w:t>27</w:t>
+              <w:t>26</w:t>
             </w:r>
           </w:hyperlink>
         </w:p>
@@ -1580,7 +1580,7 @@
               </w:rPr>
               <w:t>3.2 Población y muestra</w:t>
               <w:tab/>
-              <w:t>27</w:t>
+              <w:t>26</w:t>
             </w:r>
           </w:hyperlink>
         </w:p>
@@ -1601,7 +1601,7 @@
               </w:rPr>
               <w:t>3.3 Materiales</w:t>
               <w:tab/>
-              <w:t>28</w:t>
+              <w:t>27</w:t>
             </w:r>
           </w:hyperlink>
         </w:p>
@@ -1622,7 +1622,7 @@
               </w:rPr>
               <w:t>3.4 Metodología de desarrollo</w:t>
               <w:tab/>
-              <w:t>29</w:t>
+              <w:t>28</w:t>
             </w:r>
           </w:hyperlink>
         </w:p>
@@ -1643,7 +1643,7 @@
               </w:rPr>
               <w:t>3.5 Instrumentos de recolección de datos</w:t>
               <w:tab/>
-              <w:t>31</w:t>
+              <w:t>30</w:t>
             </w:r>
           </w:hyperlink>
         </w:p>
@@ -1664,7 +1664,7 @@
               </w:rPr>
               <w:t>3.6 Criterios de aceptación</w:t>
               <w:tab/>
-              <w:t>32</w:t>
+              <w:t>31</w:t>
             </w:r>
           </w:hyperlink>
         </w:p>
@@ -1685,7 +1685,7 @@
               </w:rPr>
               <w:t>4. Diseño e Implementación del Sistema</w:t>
               <w:tab/>
-              <w:t>34</w:t>
+              <w:t>33</w:t>
             </w:r>
           </w:hyperlink>
         </w:p>
@@ -1706,7 +1706,7 @@
               </w:rPr>
               <w:t>4.1 Arquitectura general del sistema</w:t>
               <w:tab/>
-              <w:t>34</w:t>
+              <w:t>33</w:t>
             </w:r>
           </w:hyperlink>
         </w:p>
@@ -1727,7 +1727,7 @@
               </w:rPr>
               <w:t>4.2 Capa de percepción: Firmware ESP8266</w:t>
               <w:tab/>
-              <w:t>34</w:t>
+              <w:t>33</w:t>
             </w:r>
           </w:hyperlink>
         </w:p>
@@ -1761,7 +1761,7 @@
                 <w:rStyle w:val="IndexLink"/>
               </w:rPr>
               <w:tab/>
-              <w:t>37</w:t>
+              <w:t>36</w:t>
             </w:r>
           </w:hyperlink>
         </w:p>
@@ -1782,7 +1782,7 @@
               </w:rPr>
               <w:t>4.4 Capa de aplicación: Frontend Web</w:t>
               <w:tab/>
-              <w:t>40</w:t>
+              <w:t>39</w:t>
             </w:r>
           </w:hyperlink>
         </w:p>
@@ -1803,7 +1803,7 @@
               </w:rPr>
               <w:t>5. Resultados y Evaluación</w:t>
               <w:tab/>
-              <w:t>42</w:t>
+              <w:t>41</w:t>
             </w:r>
           </w:hyperlink>
         </w:p>
@@ -1824,7 +1824,7 @@
               </w:rPr>
               <w:t>5.1 Sistema desplegado</w:t>
               <w:tab/>
-              <w:t>42</w:t>
+              <w:t>41</w:t>
             </w:r>
           </w:hyperlink>
         </w:p>
@@ -1845,7 +1845,7 @@
               </w:rPr>
               <w:t>5.2 Evaluación de precisión de medición (CA-1)</w:t>
               <w:tab/>
-              <w:t>43</w:t>
+              <w:t>42</w:t>
             </w:r>
           </w:hyperlink>
         </w:p>
@@ -1866,7 +1866,7 @@
               </w:rPr>
               <w:t>5.3 Disponibilidad del sistema (CA-2)</w:t>
               <w:tab/>
-              <w:t>45</w:t>
+              <w:t>44</w:t>
             </w:r>
           </w:hyperlink>
         </w:p>
@@ -1887,7 +1887,7 @@
               </w:rPr>
               <w:t>5.4 Frecuencia de medición (CA-3)</w:t>
               <w:tab/>
-              <w:t>48</w:t>
+              <w:t>47</w:t>
             </w:r>
           </w:hyperlink>
         </w:p>
@@ -1908,7 +1908,7 @@
               </w:rPr>
               <w:t>5.5 Detección de excursiones de temperatura (CA-4)</w:t>
               <w:tab/>
-              <w:t>48</w:t>
+              <w:t>47</w:t>
             </w:r>
           </w:hyperlink>
         </w:p>
@@ -1929,7 +1929,7 @@
               </w:rPr>
               <w:t>5.6 Gestión offline y recuperación (CA-6, CA-7)</w:t>
               <w:tab/>
-              <w:t>49</w:t>
+              <w:t>48</w:t>
             </w:r>
           </w:hyperlink>
         </w:p>
@@ -1950,7 +1950,7 @@
               </w:rPr>
               <w:t>5.7 Conexión WiFi (CA-8)</w:t>
               <w:tab/>
-              <w:t>50</w:t>
+              <w:t>49</w:t>
             </w:r>
           </w:hyperlink>
         </w:p>
@@ -1971,7 +1971,7 @@
               </w:rPr>
               <w:t>5.8 Modos de funcionamiento y configuración remota</w:t>
               <w:tab/>
-              <w:t>50</w:t>
+              <w:t>49</w:t>
             </w:r>
           </w:hyperlink>
         </w:p>
@@ -1992,7 +1992,7 @@
               </w:rPr>
               <w:t>5.9 Sistema de alertas y notificaciones WhatsApp</w:t>
               <w:tab/>
-              <w:t>51</w:t>
+              <w:t>50</w:t>
             </w:r>
           </w:hyperlink>
         </w:p>
@@ -2013,7 +2013,7 @@
               </w:rPr>
               <w:t>5.10 Trazabilidad y auditoría</w:t>
               <w:tab/>
-              <w:t>53</w:t>
+              <w:t>52</w:t>
             </w:r>
           </w:hyperlink>
         </w:p>
@@ -2034,7 +2034,7 @@
               </w:rPr>
               <w:t>5.11 Comparación con soluciones comerciales</w:t>
               <w:tab/>
-              <w:t>54</w:t>
+              <w:t>53</w:t>
             </w:r>
           </w:hyperlink>
         </w:p>
@@ -2055,7 +2055,7 @@
               </w:rPr>
               <w:t>5.12 Validación de criterios de aceptación</w:t>
               <w:tab/>
-              <w:t>54</w:t>
+              <w:t>53</w:t>
             </w:r>
           </w:hyperlink>
         </w:p>
@@ -2076,7 +2076,7 @@
               </w:rPr>
               <w:t>6. Discusión</w:t>
               <w:tab/>
-              <w:t>56</w:t>
+              <w:t>55</w:t>
             </w:r>
           </w:hyperlink>
         </w:p>
@@ -2097,7 +2097,7 @@
               </w:rPr>
               <w:t>6.1 Análisis de resultados vs. objetivos planteados</w:t>
               <w:tab/>
-              <w:t>56</w:t>
+              <w:t>55</w:t>
             </w:r>
           </w:hyperlink>
         </w:p>
@@ -2118,7 +2118,7 @@
               </w:rPr>
               <w:t>6.2 Hallazgo principal: detección de anomalía térmica</w:t>
               <w:tab/>
-              <w:t>57</w:t>
+              <w:t>56</w:t>
             </w:r>
           </w:hyperlink>
         </w:p>
@@ -2139,7 +2139,7 @@
               </w:rPr>
               <w:t>6.3 Análisis del Bland-Altman en el contexto de la cámara</w:t>
               <w:tab/>
-              <w:t>57</w:t>
+              <w:t>56</w:t>
             </w:r>
           </w:hyperlink>
         </w:p>
@@ -2160,7 +2160,7 @@
               </w:rPr>
               <w:t>6.4 Disponibilidad: contexto de la evaluación</w:t>
               <w:tab/>
-              <w:t>57</w:t>
+              <w:t>56</w:t>
             </w:r>
           </w:hyperlink>
         </w:p>
@@ -2181,7 +2181,7 @@
               </w:rPr>
               <w:t>6.5 Gestión offline: diferenciador principal</w:t>
               <w:tab/>
-              <w:t>58</w:t>
+              <w:t>57</w:t>
             </w:r>
           </w:hyperlink>
         </w:p>
@@ -2202,7 +2202,7 @@
               </w:rPr>
               <w:t>6.6 Problemas encontrados durante la implementación</w:t>
               <w:tab/>
-              <w:t>58</w:t>
+              <w:t>57</w:t>
             </w:r>
           </w:hyperlink>
         </w:p>
@@ -2223,7 +2223,7 @@
               </w:rPr>
               <w:t>6.7 Lecciones aprendidas</w:t>
               <w:tab/>
-              <w:t>58</w:t>
+              <w:t>57</w:t>
             </w:r>
           </w:hyperlink>
         </w:p>
@@ -2244,7 +2244,7 @@
               </w:rPr>
               <w:t>6.8 Limitaciones del estudio</w:t>
               <w:tab/>
-              <w:t>59</w:t>
+              <w:t>58</w:t>
             </w:r>
           </w:hyperlink>
         </w:p>
@@ -2265,7 +2265,7 @@
               </w:rPr>
               <w:t>7. Conclusiones y Trabajo Futuro</w:t>
               <w:tab/>
-              <w:t>60</w:t>
+              <w:t>59</w:t>
             </w:r>
           </w:hyperlink>
         </w:p>
@@ -2286,7 +2286,7 @@
               </w:rPr>
               <w:t>7.1 Conclusiones</w:t>
               <w:tab/>
-              <w:t>60</w:t>
+              <w:t>59</w:t>
             </w:r>
           </w:hyperlink>
         </w:p>
@@ -2307,7 +2307,7 @@
               </w:rPr>
               <w:t>7.2 Trabajo futuro</w:t>
               <w:tab/>
-              <w:t>61</w:t>
+              <w:t>60</w:t>
             </w:r>
           </w:hyperlink>
         </w:p>
@@ -2328,7 +2328,7 @@
               </w:rPr>
               <w:t>Referencias Bibliográficas</w:t>
               <w:tab/>
-              <w:t>62</w:t>
+              <w:t>61</w:t>
             </w:r>
           </w:hyperlink>
         </w:p>
@@ -2349,7 +2349,7 @@
               </w:rPr>
               <w:t>Anexo A: Código Fuente del Firmware ESP8266 y Esquema Electrónico</w:t>
               <w:tab/>
-              <w:t>65</w:t>
+              <w:t>64</w:t>
             </w:r>
           </w:hyperlink>
         </w:p>
@@ -2370,7 +2370,7 @@
               </w:rPr>
               <w:t>Anexo B: Diagramas de Flujo del Proceso y Arquitectura del Sistema</w:t>
               <w:tab/>
-              <w:t>67</w:t>
+              <w:t>66</w:t>
             </w:r>
           </w:hyperlink>
         </w:p>
@@ -2391,7 +2391,7 @@
               </w:rPr>
               <w:t>Anexo C: Esquema de Base de Datos y Diagramas UML</w:t>
               <w:tab/>
-              <w:t>69</w:t>
+              <w:t>68</w:t>
             </w:r>
           </w:hyperlink>
         </w:p>
@@ -2412,7 +2412,7 @@
               </w:rPr>
               <w:t>Anexo D: Capturas de Pantalla del Sistema</w:t>
               <w:tab/>
-              <w:t>71</w:t>
+              <w:t>70</w:t>
             </w:r>
           </w:hyperlink>
         </w:p>
@@ -2433,7 +2433,7 @@
               </w:rPr>
               <w:t>Anexo E: Presupuesto del Sistema</w:t>
               <w:tab/>
-              <w:t>72</w:t>
+              <w:t>71</w:t>
             </w:r>
           </w:hyperlink>
         </w:p>
@@ -2454,7 +2454,7 @@
               </w:rPr>
               <w:t>Anexo F: Normativa Aplicable</w:t>
               <w:tab/>
-              <w:t>73</w:t>
+              <w:t>72</w:t>
             </w:r>
           </w:hyperlink>
         </w:p>
@@ -2475,7 +2475,7 @@
               </w:rPr>
               <w:t>Anexo G: Detección Automática de Anomalías Térmicas</w:t>
               <w:tab/>
-              <w:t>76</w:t>
+              <w:t>75</w:t>
             </w:r>
           </w:hyperlink>
           <w:r>
@@ -2557,7 +2557,7 @@
               </w:rPr>
               <w:t>Figura 1. Arquitectura general del sistema SmartTemp basada en el modelo IoT de tres capas.</w:t>
               <w:tab/>
-              <w:t>34</w:t>
+              <w:t>33</w:t>
             </w:r>
           </w:hyperlink>
         </w:p>
@@ -2578,7 +2578,7 @@
               </w:rPr>
               <w:t>Figura 2. Notificación de alerta recibida por WhatsApp (desconexión y reconexión de sensores con temperatura y tiempo offline).</w:t>
               <w:tab/>
-              <w:t>52</w:t>
+              <w:t>51</w:t>
             </w:r>
           </w:hyperlink>
         </w:p>
@@ -2599,7 +2599,7 @@
               </w:rPr>
               <w:t>Figura 3. Notificación de alerta recibida por email (fallback) con detalle del evento, sensor, sector y último dato registrado.</w:t>
               <w:tab/>
-              <w:t>52</w:t>
+              <w:t>51</w:t>
             </w:r>
           </w:hyperlink>
           <w:r>
@@ -2996,7 +2996,7 @@
               </w:rPr>
               <w:t>Tabla 16. Métricas de confiabilidad (MTBF/MTTR): operación estable y período completo.</w:t>
               <w:tab/>
-              <w:t>45</w:t>
+              <w:t>46</w:t>
             </w:r>
           </w:hyperlink>
         </w:p>
@@ -3017,7 +3017,7 @@
               </w:rPr>
               <w:t>Tabla 17. Frecuencia de medición durante todo el período.</w:t>
               <w:tab/>
-              <w:t>46</w:t>
+              <w:t>47</w:t>
             </w:r>
           </w:hyperlink>
         </w:p>
@@ -3122,7 +3122,7 @@
               </w:rPr>
               <w:t>Tabla 22. Reinicios del servidor VPS durante el período de evaluación.</w:t>
               <w:tab/>
-              <w:t>49</w:t>
+              <w:t>50</w:t>
             </w:r>
           </w:hyperlink>
         </w:p>
@@ -3206,7 +3206,7 @@
               </w:rPr>
               <w:t>Tabla 26. Comparación de SmartTemp con soluciones comerciales.</w:t>
               <w:tab/>
-              <w:t>52</w:t>
+              <w:t>53</w:t>
             </w:r>
           </w:hyperlink>
         </w:p>
@@ -3227,7 +3227,7 @@
               </w:rPr>
               <w:t>Tabla 27. Evaluación final de criterios de aceptación.</w:t>
               <w:tab/>
-              <w:t>53</w:t>
+              <w:t>54</w:t>
             </w:r>
           </w:hyperlink>
           <w:r>
@@ -5275,16 +5275,16 @@
         <w:tblLook w:val="0000" w:noHBand="0" w:noVBand="0" w:firstColumn="0" w:lastRow="0" w:lastColumn="0" w:firstRow="0"/>
       </w:tblPr>
       <w:tblGrid>
-        <w:gridCol w:w="1671"/>
+        <w:gridCol w:w="1670"/>
         <w:gridCol w:w="2472"/>
         <w:gridCol w:w="2755"/>
-        <w:gridCol w:w="2128"/>
+        <w:gridCol w:w="2129"/>
       </w:tblGrid>
       <w:tr>
         <w:trPr/>
         <w:tc>
           <w:tcPr>
-            <w:tcW w:w="1671" w:type="dxa"/>
+            <w:tcW w:w="1670" w:type="dxa"/>
             <w:tcBorders>
               <w:top w:val="single" w:sz="4" w:space="0" w:color="000000"/>
               <w:start w:val="single" w:sz="4" w:space="0" w:color="000000"/>
@@ -5365,7 +5365,7 @@
         </w:tc>
         <w:tc>
           <w:tcPr>
-            <w:tcW w:w="2128" w:type="dxa"/>
+            <w:tcW w:w="2129" w:type="dxa"/>
             <w:tcBorders>
               <w:top w:val="single" w:sz="4" w:space="0" w:color="000000"/>
               <w:start w:val="single" w:sz="4" w:space="0" w:color="000000"/>
@@ -5395,7 +5395,7 @@
         <w:trPr/>
         <w:tc>
           <w:tcPr>
-            <w:tcW w:w="1671" w:type="dxa"/>
+            <w:tcW w:w="1670" w:type="dxa"/>
             <w:tcBorders>
               <w:top w:val="single" w:sz="4" w:space="0" w:color="000000"/>
               <w:start w:val="single" w:sz="4" w:space="0" w:color="000000"/>
@@ -5464,7 +5464,7 @@
         </w:tc>
         <w:tc>
           <w:tcPr>
-            <w:tcW w:w="2128" w:type="dxa"/>
+            <w:tcW w:w="2129" w:type="dxa"/>
             <w:tcBorders>
               <w:top w:val="single" w:sz="4" w:space="0" w:color="000000"/>
               <w:start w:val="single" w:sz="4" w:space="0" w:color="000000"/>
@@ -5493,7 +5493,7 @@
         <w:trPr/>
         <w:tc>
           <w:tcPr>
-            <w:tcW w:w="1671" w:type="dxa"/>
+            <w:tcW w:w="1670" w:type="dxa"/>
             <w:tcBorders>
               <w:top w:val="single" w:sz="4" w:space="0" w:color="000000"/>
               <w:start w:val="single" w:sz="4" w:space="0" w:color="000000"/>
@@ -5573,7 +5573,7 @@
         </w:tc>
         <w:tc>
           <w:tcPr>
-            <w:tcW w:w="2128" w:type="dxa"/>
+            <w:tcW w:w="2129" w:type="dxa"/>
             <w:tcBorders>
               <w:top w:val="single" w:sz="4" w:space="0" w:color="000000"/>
               <w:start w:val="single" w:sz="4" w:space="0" w:color="000000"/>
@@ -5599,7 +5599,7 @@
         <w:trPr/>
         <w:tc>
           <w:tcPr>
-            <w:tcW w:w="1671" w:type="dxa"/>
+            <w:tcW w:w="1670" w:type="dxa"/>
             <w:tcBorders>
               <w:top w:val="single" w:sz="4" w:space="0" w:color="000000"/>
               <w:start w:val="single" w:sz="4" w:space="0" w:color="000000"/>
@@ -5675,7 +5675,7 @@
         </w:tc>
         <w:tc>
           <w:tcPr>
-            <w:tcW w:w="2128" w:type="dxa"/>
+            <w:tcW w:w="2129" w:type="dxa"/>
             <w:tcBorders>
               <w:top w:val="single" w:sz="4" w:space="0" w:color="000000"/>
               <w:start w:val="single" w:sz="4" w:space="0" w:color="000000"/>
@@ -5701,7 +5701,7 @@
         <w:trPr/>
         <w:tc>
           <w:tcPr>
-            <w:tcW w:w="1671" w:type="dxa"/>
+            <w:tcW w:w="1670" w:type="dxa"/>
             <w:tcBorders>
               <w:top w:val="single" w:sz="4" w:space="0" w:color="000000"/>
               <w:start w:val="single" w:sz="4" w:space="0" w:color="000000"/>
@@ -5770,7 +5770,7 @@
         </w:tc>
         <w:tc>
           <w:tcPr>
-            <w:tcW w:w="2128" w:type="dxa"/>
+            <w:tcW w:w="2129" w:type="dxa"/>
             <w:tcBorders>
               <w:top w:val="single" w:sz="4" w:space="0" w:color="000000"/>
               <w:start w:val="single" w:sz="4" w:space="0" w:color="000000"/>
@@ -5796,7 +5796,7 @@
         <w:trPr/>
         <w:tc>
           <w:tcPr>
-            <w:tcW w:w="1671" w:type="dxa"/>
+            <w:tcW w:w="1670" w:type="dxa"/>
             <w:tcBorders>
               <w:top w:val="single" w:sz="4" w:space="0" w:color="000000"/>
               <w:start w:val="single" w:sz="4" w:space="0" w:color="000000"/>
@@ -5872,7 +5872,7 @@
         </w:tc>
         <w:tc>
           <w:tcPr>
-            <w:tcW w:w="2128" w:type="dxa"/>
+            <w:tcW w:w="2129" w:type="dxa"/>
             <w:tcBorders>
               <w:top w:val="single" w:sz="4" w:space="0" w:color="000000"/>
               <w:start w:val="single" w:sz="4" w:space="0" w:color="000000"/>
@@ -6817,9 +6817,9 @@
         <w:gridCol w:w="1664"/>
         <w:gridCol w:w="1510"/>
         <w:gridCol w:w="1236"/>
-        <w:gridCol w:w="1478"/>
+        <w:gridCol w:w="1477"/>
         <w:gridCol w:w="1248"/>
-        <w:gridCol w:w="1890"/>
+        <w:gridCol w:w="1891"/>
       </w:tblGrid>
       <w:tr>
         <w:trPr/>
@@ -6906,7 +6906,7 @@
         </w:tc>
         <w:tc>
           <w:tcPr>
-            <w:tcW w:w="1478" w:type="dxa"/>
+            <w:tcW w:w="1477" w:type="dxa"/>
             <w:tcBorders>
               <w:top w:val="single" w:sz="4" w:space="0" w:color="000000"/>
               <w:start w:val="single" w:sz="4" w:space="0" w:color="000000"/>
@@ -6960,7 +6960,7 @@
         </w:tc>
         <w:tc>
           <w:tcPr>
-            <w:tcW w:w="1890" w:type="dxa"/>
+            <w:tcW w:w="1891" w:type="dxa"/>
             <w:tcBorders>
               <w:top w:val="single" w:sz="4" w:space="0" w:color="000000"/>
               <w:start w:val="single" w:sz="4" w:space="0" w:color="000000"/>
@@ -7059,7 +7059,7 @@
         </w:tc>
         <w:tc>
           <w:tcPr>
-            <w:tcW w:w="1478" w:type="dxa"/>
+            <w:tcW w:w="1477" w:type="dxa"/>
             <w:tcBorders>
               <w:top w:val="single" w:sz="4" w:space="0" w:color="000000"/>
               <w:start w:val="single" w:sz="4" w:space="0" w:color="000000"/>
@@ -7105,7 +7105,7 @@
         </w:tc>
         <w:tc>
           <w:tcPr>
-            <w:tcW w:w="1890" w:type="dxa"/>
+            <w:tcW w:w="1891" w:type="dxa"/>
             <w:tcBorders>
               <w:top w:val="single" w:sz="4" w:space="0" w:color="000000"/>
               <w:start w:val="single" w:sz="4" w:space="0" w:color="000000"/>
@@ -7203,7 +7203,7 @@
         </w:tc>
         <w:tc>
           <w:tcPr>
-            <w:tcW w:w="1478" w:type="dxa"/>
+            <w:tcW w:w="1477" w:type="dxa"/>
             <w:tcBorders>
               <w:top w:val="single" w:sz="4" w:space="0" w:color="000000"/>
               <w:start w:val="single" w:sz="4" w:space="0" w:color="000000"/>
@@ -7249,7 +7249,7 @@
         </w:tc>
         <w:tc>
           <w:tcPr>
-            <w:tcW w:w="1890" w:type="dxa"/>
+            <w:tcW w:w="1891" w:type="dxa"/>
             <w:tcBorders>
               <w:top w:val="single" w:sz="4" w:space="0" w:color="000000"/>
               <w:start w:val="single" w:sz="4" w:space="0" w:color="000000"/>
@@ -7347,7 +7347,7 @@
         </w:tc>
         <w:tc>
           <w:tcPr>
-            <w:tcW w:w="1478" w:type="dxa"/>
+            <w:tcW w:w="1477" w:type="dxa"/>
             <w:tcBorders>
               <w:top w:val="single" w:sz="4" w:space="0" w:color="000000"/>
               <w:start w:val="single" w:sz="4" w:space="0" w:color="000000"/>
@@ -7393,7 +7393,7 @@
         </w:tc>
         <w:tc>
           <w:tcPr>
-            <w:tcW w:w="1890" w:type="dxa"/>
+            <w:tcW w:w="1891" w:type="dxa"/>
             <w:tcBorders>
               <w:top w:val="single" w:sz="4" w:space="0" w:color="000000"/>
               <w:start w:val="single" w:sz="4" w:space="0" w:color="000000"/>
@@ -7491,7 +7491,7 @@
         </w:tc>
         <w:tc>
           <w:tcPr>
-            <w:tcW w:w="1478" w:type="dxa"/>
+            <w:tcW w:w="1477" w:type="dxa"/>
             <w:tcBorders>
               <w:top w:val="single" w:sz="4" w:space="0" w:color="000000"/>
               <w:start w:val="single" w:sz="4" w:space="0" w:color="000000"/>
@@ -7537,7 +7537,7 @@
         </w:tc>
         <w:tc>
           <w:tcPr>
-            <w:tcW w:w="1890" w:type="dxa"/>
+            <w:tcW w:w="1891" w:type="dxa"/>
             <w:tcBorders>
               <w:top w:val="single" w:sz="4" w:space="0" w:color="000000"/>
               <w:start w:val="single" w:sz="4" w:space="0" w:color="000000"/>
@@ -7635,7 +7635,7 @@
         </w:tc>
         <w:tc>
           <w:tcPr>
-            <w:tcW w:w="1478" w:type="dxa"/>
+            <w:tcW w:w="1477" w:type="dxa"/>
             <w:tcBorders>
               <w:top w:val="single" w:sz="4" w:space="0" w:color="000000"/>
               <w:start w:val="single" w:sz="4" w:space="0" w:color="000000"/>
@@ -7681,7 +7681,7 @@
         </w:tc>
         <w:tc>
           <w:tcPr>
-            <w:tcW w:w="1890" w:type="dxa"/>
+            <w:tcW w:w="1891" w:type="dxa"/>
             <w:tcBorders>
               <w:top w:val="single" w:sz="4" w:space="0" w:color="000000"/>
               <w:start w:val="single" w:sz="4" w:space="0" w:color="000000"/>
@@ -7779,7 +7779,7 @@
         </w:tc>
         <w:tc>
           <w:tcPr>
-            <w:tcW w:w="1478" w:type="dxa"/>
+            <w:tcW w:w="1477" w:type="dxa"/>
             <w:tcBorders>
               <w:top w:val="single" w:sz="4" w:space="0" w:color="000000"/>
               <w:start w:val="single" w:sz="4" w:space="0" w:color="000000"/>
@@ -7825,7 +7825,7 @@
         </w:tc>
         <w:tc>
           <w:tcPr>
-            <w:tcW w:w="1890" w:type="dxa"/>
+            <w:tcW w:w="1891" w:type="dxa"/>
             <w:tcBorders>
               <w:top w:val="single" w:sz="4" w:space="0" w:color="000000"/>
               <w:start w:val="single" w:sz="4" w:space="0" w:color="000000"/>
@@ -7923,7 +7923,7 @@
         </w:tc>
         <w:tc>
           <w:tcPr>
-            <w:tcW w:w="1478" w:type="dxa"/>
+            <w:tcW w:w="1477" w:type="dxa"/>
             <w:tcBorders>
               <w:top w:val="single" w:sz="4" w:space="0" w:color="000000"/>
               <w:start w:val="single" w:sz="4" w:space="0" w:color="000000"/>
@@ -7969,7 +7969,7 @@
         </w:tc>
         <w:tc>
           <w:tcPr>
-            <w:tcW w:w="1890" w:type="dxa"/>
+            <w:tcW w:w="1891" w:type="dxa"/>
             <w:tcBorders>
               <w:top w:val="single" w:sz="4" w:space="0" w:color="000000"/>
               <w:start w:val="single" w:sz="4" w:space="0" w:color="000000"/>
@@ -8067,7 +8067,7 @@
         </w:tc>
         <w:tc>
           <w:tcPr>
-            <w:tcW w:w="1478" w:type="dxa"/>
+            <w:tcW w:w="1477" w:type="dxa"/>
             <w:tcBorders>
               <w:top w:val="single" w:sz="4" w:space="0" w:color="000000"/>
               <w:start w:val="single" w:sz="4" w:space="0" w:color="000000"/>
@@ -8113,7 +8113,7 @@
         </w:tc>
         <w:tc>
           <w:tcPr>
-            <w:tcW w:w="1890" w:type="dxa"/>
+            <w:tcW w:w="1891" w:type="dxa"/>
             <w:tcBorders>
               <w:top w:val="single" w:sz="4" w:space="0" w:color="000000"/>
               <w:start w:val="single" w:sz="4" w:space="0" w:color="000000"/>
@@ -8211,7 +8211,7 @@
         </w:tc>
         <w:tc>
           <w:tcPr>
-            <w:tcW w:w="1478" w:type="dxa"/>
+            <w:tcW w:w="1477" w:type="dxa"/>
             <w:tcBorders>
               <w:top w:val="single" w:sz="4" w:space="0" w:color="000000"/>
               <w:start w:val="single" w:sz="4" w:space="0" w:color="000000"/>
@@ -8257,7 +8257,7 @@
         </w:tc>
         <w:tc>
           <w:tcPr>
-            <w:tcW w:w="1890" w:type="dxa"/>
+            <w:tcW w:w="1891" w:type="dxa"/>
             <w:tcBorders>
               <w:top w:val="single" w:sz="4" w:space="0" w:color="000000"/>
               <w:start w:val="single" w:sz="4" w:space="0" w:color="000000"/>
@@ -8355,7 +8355,7 @@
         </w:tc>
         <w:tc>
           <w:tcPr>
-            <w:tcW w:w="1478" w:type="dxa"/>
+            <w:tcW w:w="1477" w:type="dxa"/>
             <w:tcBorders>
               <w:top w:val="single" w:sz="4" w:space="0" w:color="000000"/>
               <w:start w:val="single" w:sz="4" w:space="0" w:color="000000"/>
@@ -8401,7 +8401,7 @@
         </w:tc>
         <w:tc>
           <w:tcPr>
-            <w:tcW w:w="1890" w:type="dxa"/>
+            <w:tcW w:w="1891" w:type="dxa"/>
             <w:tcBorders>
               <w:top w:val="single" w:sz="4" w:space="0" w:color="000000"/>
               <w:start w:val="single" w:sz="4" w:space="0" w:color="000000"/>
@@ -9077,16 +9077,16 @@
         <w:tblLook w:val="0000" w:noHBand="0" w:noVBand="0" w:firstColumn="0" w:lastRow="0" w:lastColumn="0" w:firstRow="0"/>
       </w:tblPr>
       <w:tblGrid>
-        <w:gridCol w:w="1755"/>
-        <w:gridCol w:w="2987"/>
-        <w:gridCol w:w="1135"/>
-        <w:gridCol w:w="3149"/>
+        <w:gridCol w:w="1754"/>
+        <w:gridCol w:w="2988"/>
+        <w:gridCol w:w="1134"/>
+        <w:gridCol w:w="3150"/>
       </w:tblGrid>
       <w:tr>
         <w:trPr/>
         <w:tc>
           <w:tcPr>
-            <w:tcW w:w="1755" w:type="dxa"/>
+            <w:tcW w:w="1754" w:type="dxa"/>
             <w:tcBorders>
               <w:top w:val="single" w:sz="4" w:space="0" w:color="000000"/>
               <w:start w:val="single" w:sz="4" w:space="0" w:color="000000"/>
@@ -9113,7 +9113,7 @@
         </w:tc>
         <w:tc>
           <w:tcPr>
-            <w:tcW w:w="2987" w:type="dxa"/>
+            <w:tcW w:w="2988" w:type="dxa"/>
             <w:tcBorders>
               <w:top w:val="single" w:sz="4" w:space="0" w:color="000000"/>
               <w:start w:val="single" w:sz="4" w:space="0" w:color="000000"/>
@@ -9140,7 +9140,7 @@
         </w:tc>
         <w:tc>
           <w:tcPr>
-            <w:tcW w:w="1135" w:type="dxa"/>
+            <w:tcW w:w="1134" w:type="dxa"/>
             <w:tcBorders>
               <w:top w:val="single" w:sz="4" w:space="0" w:color="000000"/>
               <w:start w:val="single" w:sz="4" w:space="0" w:color="000000"/>
@@ -9167,7 +9167,7 @@
         </w:tc>
         <w:tc>
           <w:tcPr>
-            <w:tcW w:w="3149" w:type="dxa"/>
+            <w:tcW w:w="3150" w:type="dxa"/>
             <w:tcBorders>
               <w:top w:val="single" w:sz="4" w:space="0" w:color="000000"/>
               <w:start w:val="single" w:sz="4" w:space="0" w:color="000000"/>
@@ -9197,7 +9197,7 @@
         <w:trPr/>
         <w:tc>
           <w:tcPr>
-            <w:tcW w:w="1755" w:type="dxa"/>
+            <w:tcW w:w="1754" w:type="dxa"/>
             <w:tcBorders>
               <w:top w:val="single" w:sz="4" w:space="0" w:color="000000"/>
               <w:start w:val="single" w:sz="4" w:space="0" w:color="000000"/>
@@ -9220,7 +9220,7 @@
         </w:tc>
         <w:tc>
           <w:tcPr>
-            <w:tcW w:w="2987" w:type="dxa"/>
+            <w:tcW w:w="2988" w:type="dxa"/>
             <w:tcBorders>
               <w:top w:val="single" w:sz="4" w:space="0" w:color="000000"/>
               <w:start w:val="single" w:sz="4" w:space="0" w:color="000000"/>
@@ -9243,7 +9243,7 @@
         </w:tc>
         <w:tc>
           <w:tcPr>
-            <w:tcW w:w="1135" w:type="dxa"/>
+            <w:tcW w:w="1134" w:type="dxa"/>
             <w:tcBorders>
               <w:top w:val="single" w:sz="4" w:space="0" w:color="000000"/>
               <w:start w:val="single" w:sz="4" w:space="0" w:color="000000"/>
@@ -9266,7 +9266,7 @@
         </w:tc>
         <w:tc>
           <w:tcPr>
-            <w:tcW w:w="3149" w:type="dxa"/>
+            <w:tcW w:w="3150" w:type="dxa"/>
             <w:tcBorders>
               <w:top w:val="single" w:sz="4" w:space="0" w:color="000000"/>
               <w:start w:val="single" w:sz="4" w:space="0" w:color="000000"/>
@@ -9292,7 +9292,7 @@
         <w:trPr/>
         <w:tc>
           <w:tcPr>
-            <w:tcW w:w="1755" w:type="dxa"/>
+            <w:tcW w:w="1754" w:type="dxa"/>
             <w:tcBorders>
               <w:top w:val="single" w:sz="4" w:space="0" w:color="000000"/>
               <w:start w:val="single" w:sz="4" w:space="0" w:color="000000"/>
@@ -9315,7 +9315,7 @@
         </w:tc>
         <w:tc>
           <w:tcPr>
-            <w:tcW w:w="2987" w:type="dxa"/>
+            <w:tcW w:w="2988" w:type="dxa"/>
             <w:tcBorders>
               <w:top w:val="single" w:sz="4" w:space="0" w:color="000000"/>
               <w:start w:val="single" w:sz="4" w:space="0" w:color="000000"/>
@@ -9338,7 +9338,7 @@
         </w:tc>
         <w:tc>
           <w:tcPr>
-            <w:tcW w:w="1135" w:type="dxa"/>
+            <w:tcW w:w="1134" w:type="dxa"/>
             <w:tcBorders>
               <w:top w:val="single" w:sz="4" w:space="0" w:color="000000"/>
               <w:start w:val="single" w:sz="4" w:space="0" w:color="000000"/>
@@ -9361,7 +9361,7 @@
         </w:tc>
         <w:tc>
           <w:tcPr>
-            <w:tcW w:w="3149" w:type="dxa"/>
+            <w:tcW w:w="3150" w:type="dxa"/>
             <w:tcBorders>
               <w:top w:val="single" w:sz="4" w:space="0" w:color="000000"/>
               <w:start w:val="single" w:sz="4" w:space="0" w:color="000000"/>
@@ -9387,7 +9387,7 @@
         <w:trPr/>
         <w:tc>
           <w:tcPr>
-            <w:tcW w:w="1755" w:type="dxa"/>
+            <w:tcW w:w="1754" w:type="dxa"/>
             <w:tcBorders>
               <w:top w:val="single" w:sz="4" w:space="0" w:color="000000"/>
               <w:start w:val="single" w:sz="4" w:space="0" w:color="000000"/>
@@ -9410,7 +9410,7 @@
         </w:tc>
         <w:tc>
           <w:tcPr>
-            <w:tcW w:w="2987" w:type="dxa"/>
+            <w:tcW w:w="2988" w:type="dxa"/>
             <w:tcBorders>
               <w:top w:val="single" w:sz="4" w:space="0" w:color="000000"/>
               <w:start w:val="single" w:sz="4" w:space="0" w:color="000000"/>
@@ -9433,7 +9433,7 @@
         </w:tc>
         <w:tc>
           <w:tcPr>
-            <w:tcW w:w="1135" w:type="dxa"/>
+            <w:tcW w:w="1134" w:type="dxa"/>
             <w:tcBorders>
               <w:top w:val="single" w:sz="4" w:space="0" w:color="000000"/>
               <w:start w:val="single" w:sz="4" w:space="0" w:color="000000"/>
@@ -9456,7 +9456,7 @@
         </w:tc>
         <w:tc>
           <w:tcPr>
-            <w:tcW w:w="3149" w:type="dxa"/>
+            <w:tcW w:w="3150" w:type="dxa"/>
             <w:tcBorders>
               <w:top w:val="single" w:sz="4" w:space="0" w:color="000000"/>
               <w:start w:val="single" w:sz="4" w:space="0" w:color="000000"/>
@@ -9482,7 +9482,7 @@
         <w:trPr/>
         <w:tc>
           <w:tcPr>
-            <w:tcW w:w="1755" w:type="dxa"/>
+            <w:tcW w:w="1754" w:type="dxa"/>
             <w:tcBorders>
               <w:top w:val="single" w:sz="4" w:space="0" w:color="000000"/>
               <w:start w:val="single" w:sz="4" w:space="0" w:color="000000"/>
@@ -9505,7 +9505,7 @@
         </w:tc>
         <w:tc>
           <w:tcPr>
-            <w:tcW w:w="2987" w:type="dxa"/>
+            <w:tcW w:w="2988" w:type="dxa"/>
             <w:tcBorders>
               <w:top w:val="single" w:sz="4" w:space="0" w:color="000000"/>
               <w:start w:val="single" w:sz="4" w:space="0" w:color="000000"/>
@@ -9528,7 +9528,7 @@
         </w:tc>
         <w:tc>
           <w:tcPr>
-            <w:tcW w:w="1135" w:type="dxa"/>
+            <w:tcW w:w="1134" w:type="dxa"/>
             <w:tcBorders>
               <w:top w:val="single" w:sz="4" w:space="0" w:color="000000"/>
               <w:start w:val="single" w:sz="4" w:space="0" w:color="000000"/>
@@ -9551,7 +9551,7 @@
         </w:tc>
         <w:tc>
           <w:tcPr>
-            <w:tcW w:w="3149" w:type="dxa"/>
+            <w:tcW w:w="3150" w:type="dxa"/>
             <w:tcBorders>
               <w:top w:val="single" w:sz="4" w:space="0" w:color="000000"/>
               <w:start w:val="single" w:sz="4" w:space="0" w:color="000000"/>
@@ -9577,7 +9577,7 @@
         <w:trPr/>
         <w:tc>
           <w:tcPr>
-            <w:tcW w:w="1755" w:type="dxa"/>
+            <w:tcW w:w="1754" w:type="dxa"/>
             <w:tcBorders>
               <w:top w:val="single" w:sz="4" w:space="0" w:color="000000"/>
               <w:start w:val="single" w:sz="4" w:space="0" w:color="000000"/>
@@ -9600,7 +9600,7 @@
         </w:tc>
         <w:tc>
           <w:tcPr>
-            <w:tcW w:w="2987" w:type="dxa"/>
+            <w:tcW w:w="2988" w:type="dxa"/>
             <w:tcBorders>
               <w:top w:val="single" w:sz="4" w:space="0" w:color="000000"/>
               <w:start w:val="single" w:sz="4" w:space="0" w:color="000000"/>
@@ -9623,7 +9623,7 @@
         </w:tc>
         <w:tc>
           <w:tcPr>
-            <w:tcW w:w="1135" w:type="dxa"/>
+            <w:tcW w:w="1134" w:type="dxa"/>
             <w:tcBorders>
               <w:top w:val="single" w:sz="4" w:space="0" w:color="000000"/>
               <w:start w:val="single" w:sz="4" w:space="0" w:color="000000"/>
@@ -9646,7 +9646,7 @@
         </w:tc>
         <w:tc>
           <w:tcPr>
-            <w:tcW w:w="3149" w:type="dxa"/>
+            <w:tcW w:w="3150" w:type="dxa"/>
             <w:tcBorders>
               <w:top w:val="single" w:sz="4" w:space="0" w:color="000000"/>
               <w:start w:val="single" w:sz="4" w:space="0" w:color="000000"/>
@@ -10214,8 +10214,8 @@
       </w:tblPr>
       <w:tblGrid>
         <w:gridCol w:w="1908"/>
-        <w:gridCol w:w="1307"/>
-        <w:gridCol w:w="5811"/>
+        <w:gridCol w:w="1306"/>
+        <w:gridCol w:w="5812"/>
       </w:tblGrid>
       <w:tr>
         <w:trPr/>
@@ -10248,7 +10248,7 @@
         </w:tc>
         <w:tc>
           <w:tcPr>
-            <w:tcW w:w="1307" w:type="dxa"/>
+            <w:tcW w:w="1306" w:type="dxa"/>
             <w:tcBorders>
               <w:top w:val="single" w:sz="4" w:space="0" w:color="000000"/>
               <w:start w:val="single" w:sz="4" w:space="0" w:color="000000"/>
@@ -10275,7 +10275,7 @@
         </w:tc>
         <w:tc>
           <w:tcPr>
-            <w:tcW w:w="5811" w:type="dxa"/>
+            <w:tcW w:w="5812" w:type="dxa"/>
             <w:tcBorders>
               <w:top w:val="single" w:sz="4" w:space="0" w:color="000000"/>
               <w:start w:val="single" w:sz="4" w:space="0" w:color="000000"/>
@@ -10328,7 +10328,7 @@
         </w:tc>
         <w:tc>
           <w:tcPr>
-            <w:tcW w:w="1307" w:type="dxa"/>
+            <w:tcW w:w="1306" w:type="dxa"/>
             <w:tcBorders>
               <w:top w:val="single" w:sz="4" w:space="0" w:color="000000"/>
               <w:start w:val="single" w:sz="4" w:space="0" w:color="000000"/>
@@ -10351,7 +10351,7 @@
         </w:tc>
         <w:tc>
           <w:tcPr>
-            <w:tcW w:w="5811" w:type="dxa"/>
+            <w:tcW w:w="5812" w:type="dxa"/>
             <w:tcBorders>
               <w:top w:val="single" w:sz="4" w:space="0" w:color="000000"/>
               <w:start w:val="single" w:sz="4" w:space="0" w:color="000000"/>
@@ -10411,7 +10411,7 @@
         </w:tc>
         <w:tc>
           <w:tcPr>
-            <w:tcW w:w="1307" w:type="dxa"/>
+            <w:tcW w:w="1306" w:type="dxa"/>
             <w:tcBorders>
               <w:top w:val="single" w:sz="4" w:space="0" w:color="000000"/>
               <w:start w:val="single" w:sz="4" w:space="0" w:color="000000"/>
@@ -10434,7 +10434,7 @@
         </w:tc>
         <w:tc>
           <w:tcPr>
-            <w:tcW w:w="5811" w:type="dxa"/>
+            <w:tcW w:w="5812" w:type="dxa"/>
             <w:tcBorders>
               <w:top w:val="single" w:sz="4" w:space="0" w:color="000000"/>
               <w:start w:val="single" w:sz="4" w:space="0" w:color="000000"/>
@@ -10490,7 +10490,7 @@
         </w:tc>
         <w:tc>
           <w:tcPr>
-            <w:tcW w:w="1307" w:type="dxa"/>
+            <w:tcW w:w="1306" w:type="dxa"/>
             <w:tcBorders>
               <w:top w:val="single" w:sz="4" w:space="0" w:color="000000"/>
               <w:start w:val="single" w:sz="4" w:space="0" w:color="000000"/>
@@ -10513,7 +10513,7 @@
         </w:tc>
         <w:tc>
           <w:tcPr>
-            <w:tcW w:w="5811" w:type="dxa"/>
+            <w:tcW w:w="5812" w:type="dxa"/>
             <w:tcBorders>
               <w:top w:val="single" w:sz="4" w:space="0" w:color="000000"/>
               <w:start w:val="single" w:sz="4" w:space="0" w:color="000000"/>
@@ -10569,7 +10569,7 @@
         </w:tc>
         <w:tc>
           <w:tcPr>
-            <w:tcW w:w="1307" w:type="dxa"/>
+            <w:tcW w:w="1306" w:type="dxa"/>
             <w:tcBorders>
               <w:top w:val="single" w:sz="4" w:space="0" w:color="000000"/>
               <w:start w:val="single" w:sz="4" w:space="0" w:color="000000"/>
@@ -10592,7 +10592,7 @@
         </w:tc>
         <w:tc>
           <w:tcPr>
-            <w:tcW w:w="5811" w:type="dxa"/>
+            <w:tcW w:w="5812" w:type="dxa"/>
             <w:tcBorders>
               <w:top w:val="single" w:sz="4" w:space="0" w:color="000000"/>
               <w:start w:val="single" w:sz="4" w:space="0" w:color="000000"/>
@@ -10641,7 +10641,7 @@
         </w:tc>
         <w:tc>
           <w:tcPr>
-            <w:tcW w:w="1307" w:type="dxa"/>
+            <w:tcW w:w="1306" w:type="dxa"/>
             <w:tcBorders>
               <w:top w:val="single" w:sz="4" w:space="0" w:color="000000"/>
               <w:start w:val="single" w:sz="4" w:space="0" w:color="000000"/>
@@ -10664,7 +10664,7 @@
         </w:tc>
         <w:tc>
           <w:tcPr>
-            <w:tcW w:w="5811" w:type="dxa"/>
+            <w:tcW w:w="5812" w:type="dxa"/>
             <w:tcBorders>
               <w:top w:val="single" w:sz="4" w:space="0" w:color="000000"/>
               <w:start w:val="single" w:sz="4" w:space="0" w:color="000000"/>
@@ -10720,7 +10720,7 @@
         </w:tc>
         <w:tc>
           <w:tcPr>
-            <w:tcW w:w="1307" w:type="dxa"/>
+            <w:tcW w:w="1306" w:type="dxa"/>
             <w:tcBorders>
               <w:top w:val="single" w:sz="4" w:space="0" w:color="000000"/>
               <w:start w:val="single" w:sz="4" w:space="0" w:color="000000"/>
@@ -10743,7 +10743,7 @@
         </w:tc>
         <w:tc>
           <w:tcPr>
-            <w:tcW w:w="5811" w:type="dxa"/>
+            <w:tcW w:w="5812" w:type="dxa"/>
             <w:tcBorders>
               <w:top w:val="single" w:sz="4" w:space="0" w:color="000000"/>
               <w:start w:val="single" w:sz="4" w:space="0" w:color="000000"/>
@@ -10792,7 +10792,7 @@
         </w:tc>
         <w:tc>
           <w:tcPr>
-            <w:tcW w:w="1307" w:type="dxa"/>
+            <w:tcW w:w="1306" w:type="dxa"/>
             <w:tcBorders>
               <w:top w:val="single" w:sz="4" w:space="0" w:color="000000"/>
               <w:start w:val="single" w:sz="4" w:space="0" w:color="000000"/>
@@ -10815,7 +10815,7 @@
         </w:tc>
         <w:tc>
           <w:tcPr>
-            <w:tcW w:w="5811" w:type="dxa"/>
+            <w:tcW w:w="5812" w:type="dxa"/>
             <w:tcBorders>
               <w:top w:val="single" w:sz="4" w:space="0" w:color="000000"/>
               <w:start w:val="single" w:sz="4" w:space="0" w:color="000000"/>
@@ -12508,15 +12508,15 @@
         <w:tblLook w:val="0000" w:noHBand="0" w:noVBand="0" w:firstColumn="0" w:lastRow="0" w:lastColumn="0" w:firstRow="0"/>
       </w:tblPr>
       <w:tblGrid>
-        <w:gridCol w:w="3023"/>
-        <w:gridCol w:w="4361"/>
+        <w:gridCol w:w="3022"/>
+        <w:gridCol w:w="4362"/>
         <w:gridCol w:w="1642"/>
       </w:tblGrid>
       <w:tr>
         <w:trPr/>
         <w:tc>
           <w:tcPr>
-            <w:tcW w:w="3023" w:type="dxa"/>
+            <w:tcW w:w="3022" w:type="dxa"/>
             <w:tcBorders>
               <w:top w:val="single" w:sz="4" w:space="0" w:color="000000"/>
               <w:start w:val="single" w:sz="4" w:space="0" w:color="000000"/>
@@ -12543,7 +12543,7 @@
         </w:tc>
         <w:tc>
           <w:tcPr>
-            <w:tcW w:w="4361" w:type="dxa"/>
+            <w:tcW w:w="4362" w:type="dxa"/>
             <w:tcBorders>
               <w:top w:val="single" w:sz="4" w:space="0" w:color="000000"/>
               <w:start w:val="single" w:sz="4" w:space="0" w:color="000000"/>
@@ -12600,7 +12600,7 @@
         <w:trPr/>
         <w:tc>
           <w:tcPr>
-            <w:tcW w:w="3023" w:type="dxa"/>
+            <w:tcW w:w="3022" w:type="dxa"/>
             <w:tcBorders>
               <w:top w:val="single" w:sz="4" w:space="0" w:color="000000"/>
               <w:start w:val="single" w:sz="4" w:space="0" w:color="000000"/>
@@ -12623,7 +12623,7 @@
         </w:tc>
         <w:tc>
           <w:tcPr>
-            <w:tcW w:w="4361" w:type="dxa"/>
+            <w:tcW w:w="4362" w:type="dxa"/>
             <w:tcBorders>
               <w:top w:val="single" w:sz="4" w:space="0" w:color="000000"/>
               <w:start w:val="single" w:sz="4" w:space="0" w:color="000000"/>
@@ -12676,7 +12676,7 @@
         <w:trPr/>
         <w:tc>
           <w:tcPr>
-            <w:tcW w:w="3023" w:type="dxa"/>
+            <w:tcW w:w="3022" w:type="dxa"/>
             <w:tcBorders>
               <w:top w:val="single" w:sz="4" w:space="0" w:color="000000"/>
               <w:start w:val="single" w:sz="4" w:space="0" w:color="000000"/>
@@ -12699,7 +12699,7 @@
         </w:tc>
         <w:tc>
           <w:tcPr>
-            <w:tcW w:w="4361" w:type="dxa"/>
+            <w:tcW w:w="4362" w:type="dxa"/>
             <w:tcBorders>
               <w:top w:val="single" w:sz="4" w:space="0" w:color="000000"/>
               <w:start w:val="single" w:sz="4" w:space="0" w:color="000000"/>
@@ -12763,7 +12763,7 @@
         <w:trPr/>
         <w:tc>
           <w:tcPr>
-            <w:tcW w:w="3023" w:type="dxa"/>
+            <w:tcW w:w="3022" w:type="dxa"/>
             <w:tcBorders>
               <w:top w:val="single" w:sz="4" w:space="0" w:color="000000"/>
               <w:start w:val="single" w:sz="4" w:space="0" w:color="000000"/>
@@ -12786,7 +12786,7 @@
         </w:tc>
         <w:tc>
           <w:tcPr>
-            <w:tcW w:w="4361" w:type="dxa"/>
+            <w:tcW w:w="4362" w:type="dxa"/>
             <w:tcBorders>
               <w:top w:val="single" w:sz="4" w:space="0" w:color="000000"/>
               <w:start w:val="single" w:sz="4" w:space="0" w:color="000000"/>
@@ -12835,7 +12835,7 @@
         <w:trPr/>
         <w:tc>
           <w:tcPr>
-            <w:tcW w:w="3023" w:type="dxa"/>
+            <w:tcW w:w="3022" w:type="dxa"/>
             <w:tcBorders>
               <w:top w:val="single" w:sz="4" w:space="0" w:color="000000"/>
               <w:start w:val="single" w:sz="4" w:space="0" w:color="000000"/>
@@ -12858,7 +12858,7 @@
         </w:tc>
         <w:tc>
           <w:tcPr>
-            <w:tcW w:w="4361" w:type="dxa"/>
+            <w:tcW w:w="4362" w:type="dxa"/>
             <w:tcBorders>
               <w:top w:val="single" w:sz="4" w:space="0" w:color="000000"/>
               <w:start w:val="single" w:sz="4" w:space="0" w:color="000000"/>
@@ -12918,7 +12918,7 @@
         <w:trPr/>
         <w:tc>
           <w:tcPr>
-            <w:tcW w:w="3023" w:type="dxa"/>
+            <w:tcW w:w="3022" w:type="dxa"/>
             <w:tcBorders>
               <w:top w:val="single" w:sz="4" w:space="0" w:color="000000"/>
               <w:start w:val="single" w:sz="4" w:space="0" w:color="000000"/>
@@ -12941,7 +12941,7 @@
         </w:tc>
         <w:tc>
           <w:tcPr>
-            <w:tcW w:w="4361" w:type="dxa"/>
+            <w:tcW w:w="4362" w:type="dxa"/>
             <w:tcBorders>
               <w:top w:val="single" w:sz="4" w:space="0" w:color="000000"/>
               <w:start w:val="single" w:sz="4" w:space="0" w:color="000000"/>
@@ -12994,7 +12994,7 @@
         <w:trPr/>
         <w:tc>
           <w:tcPr>
-            <w:tcW w:w="3023" w:type="dxa"/>
+            <w:tcW w:w="3022" w:type="dxa"/>
             <w:tcBorders>
               <w:top w:val="single" w:sz="4" w:space="0" w:color="000000"/>
               <w:start w:val="single" w:sz="4" w:space="0" w:color="000000"/>
@@ -13024,7 +13024,7 @@
         </w:tc>
         <w:tc>
           <w:tcPr>
-            <w:tcW w:w="4361" w:type="dxa"/>
+            <w:tcW w:w="4362" w:type="dxa"/>
             <w:tcBorders>
               <w:top w:val="single" w:sz="4" w:space="0" w:color="000000"/>
               <w:start w:val="single" w:sz="4" w:space="0" w:color="000000"/>
@@ -13077,7 +13077,7 @@
         <w:trPr/>
         <w:tc>
           <w:tcPr>
-            <w:tcW w:w="3023" w:type="dxa"/>
+            <w:tcW w:w="3022" w:type="dxa"/>
             <w:tcBorders>
               <w:top w:val="single" w:sz="4" w:space="0" w:color="000000"/>
               <w:start w:val="single" w:sz="4" w:space="0" w:color="000000"/>
@@ -13107,7 +13107,7 @@
         </w:tc>
         <w:tc>
           <w:tcPr>
-            <w:tcW w:w="4361" w:type="dxa"/>
+            <w:tcW w:w="4362" w:type="dxa"/>
             <w:tcBorders>
               <w:top w:val="single" w:sz="4" w:space="0" w:color="000000"/>
               <w:start w:val="single" w:sz="4" w:space="0" w:color="000000"/>
@@ -13156,7 +13156,7 @@
         <w:trPr/>
         <w:tc>
           <w:tcPr>
-            <w:tcW w:w="3023" w:type="dxa"/>
+            <w:tcW w:w="3022" w:type="dxa"/>
             <w:tcBorders>
               <w:top w:val="single" w:sz="4" w:space="0" w:color="000000"/>
               <w:start w:val="single" w:sz="4" w:space="0" w:color="000000"/>
@@ -13179,7 +13179,7 @@
         </w:tc>
         <w:tc>
           <w:tcPr>
-            <w:tcW w:w="4361" w:type="dxa"/>
+            <w:tcW w:w="4362" w:type="dxa"/>
             <w:tcBorders>
               <w:top w:val="single" w:sz="4" w:space="0" w:color="000000"/>
               <w:start w:val="single" w:sz="4" w:space="0" w:color="000000"/>
@@ -13232,7 +13232,7 @@
         <w:trPr/>
         <w:tc>
           <w:tcPr>
-            <w:tcW w:w="3023" w:type="dxa"/>
+            <w:tcW w:w="3022" w:type="dxa"/>
             <w:tcBorders>
               <w:top w:val="single" w:sz="4" w:space="0" w:color="000000"/>
               <w:start w:val="single" w:sz="4" w:space="0" w:color="000000"/>
@@ -13255,7 +13255,7 @@
         </w:tc>
         <w:tc>
           <w:tcPr>
-            <w:tcW w:w="4361" w:type="dxa"/>
+            <w:tcW w:w="4362" w:type="dxa"/>
             <w:tcBorders>
               <w:top w:val="single" w:sz="4" w:space="0" w:color="000000"/>
               <w:start w:val="single" w:sz="4" w:space="0" w:color="000000"/>
@@ -14242,8 +14242,8 @@
       </w:tblPr>
       <w:tblGrid>
         <w:gridCol w:w="3076"/>
-        <w:gridCol w:w="3737"/>
-        <w:gridCol w:w="2213"/>
+        <w:gridCol w:w="3736"/>
+        <w:gridCol w:w="2214"/>
       </w:tblGrid>
       <w:tr>
         <w:trPr/>
@@ -14276,7 +14276,7 @@
         </w:tc>
         <w:tc>
           <w:tcPr>
-            <w:tcW w:w="3737" w:type="dxa"/>
+            <w:tcW w:w="3736" w:type="dxa"/>
             <w:tcBorders>
               <w:top w:val="single" w:sz="4" w:space="0" w:color="000000"/>
               <w:start w:val="single" w:sz="4" w:space="0" w:color="000000"/>
@@ -14305,7 +14305,7 @@
         </w:tc>
         <w:tc>
           <w:tcPr>
-            <w:tcW w:w="2213" w:type="dxa"/>
+            <w:tcW w:w="2214" w:type="dxa"/>
             <w:tcBorders>
               <w:top w:val="single" w:sz="4" w:space="0" w:color="000000"/>
               <w:start w:val="single" w:sz="4" w:space="0" w:color="000000"/>
@@ -14365,7 +14365,7 @@
         </w:tc>
         <w:tc>
           <w:tcPr>
-            <w:tcW w:w="3737" w:type="dxa"/>
+            <w:tcW w:w="3736" w:type="dxa"/>
             <w:tcBorders>
               <w:top w:val="single" w:sz="4" w:space="0" w:color="000000"/>
               <w:start w:val="single" w:sz="4" w:space="0" w:color="000000"/>
@@ -14392,7 +14392,7 @@
         </w:tc>
         <w:tc>
           <w:tcPr>
-            <w:tcW w:w="2213" w:type="dxa"/>
+            <w:tcW w:w="2214" w:type="dxa"/>
             <w:tcBorders>
               <w:top w:val="single" w:sz="4" w:space="0" w:color="000000"/>
               <w:start w:val="single" w:sz="4" w:space="0" w:color="000000"/>
@@ -14448,7 +14448,7 @@
         </w:tc>
         <w:tc>
           <w:tcPr>
-            <w:tcW w:w="3737" w:type="dxa"/>
+            <w:tcW w:w="3736" w:type="dxa"/>
             <w:tcBorders>
               <w:top w:val="single" w:sz="4" w:space="0" w:color="000000"/>
               <w:start w:val="single" w:sz="4" w:space="0" w:color="000000"/>
@@ -14475,7 +14475,7 @@
         </w:tc>
         <w:tc>
           <w:tcPr>
-            <w:tcW w:w="2213" w:type="dxa"/>
+            <w:tcW w:w="2214" w:type="dxa"/>
             <w:tcBorders>
               <w:top w:val="single" w:sz="4" w:space="0" w:color="000000"/>
               <w:start w:val="single" w:sz="4" w:space="0" w:color="000000"/>
@@ -14524,7 +14524,7 @@
         </w:tc>
         <w:tc>
           <w:tcPr>
-            <w:tcW w:w="3737" w:type="dxa"/>
+            <w:tcW w:w="3736" w:type="dxa"/>
             <w:tcBorders>
               <w:top w:val="single" w:sz="4" w:space="0" w:color="000000"/>
               <w:start w:val="single" w:sz="4" w:space="0" w:color="000000"/>
@@ -14551,7 +14551,7 @@
         </w:tc>
         <w:tc>
           <w:tcPr>
-            <w:tcW w:w="2213" w:type="dxa"/>
+            <w:tcW w:w="2214" w:type="dxa"/>
             <w:tcBorders>
               <w:top w:val="single" w:sz="4" w:space="0" w:color="000000"/>
               <w:start w:val="single" w:sz="4" w:space="0" w:color="000000"/>
@@ -14600,7 +14600,7 @@
         </w:tc>
         <w:tc>
           <w:tcPr>
-            <w:tcW w:w="3737" w:type="dxa"/>
+            <w:tcW w:w="3736" w:type="dxa"/>
             <w:tcBorders>
               <w:top w:val="single" w:sz="4" w:space="0" w:color="000000"/>
               <w:start w:val="single" w:sz="4" w:space="0" w:color="000000"/>
@@ -14627,7 +14627,7 @@
         </w:tc>
         <w:tc>
           <w:tcPr>
-            <w:tcW w:w="2213" w:type="dxa"/>
+            <w:tcW w:w="2214" w:type="dxa"/>
             <w:tcBorders>
               <w:top w:val="single" w:sz="4" w:space="0" w:color="000000"/>
               <w:start w:val="single" w:sz="4" w:space="0" w:color="000000"/>
@@ -17473,8 +17473,8 @@
         <w:tblLook w:val="0000" w:noHBand="0" w:noVBand="0" w:firstColumn="0" w:lastRow="0" w:lastColumn="0" w:firstRow="0"/>
       </w:tblPr>
       <w:tblGrid>
-        <w:gridCol w:w="1853"/>
-        <w:gridCol w:w="1917"/>
+        <w:gridCol w:w="1852"/>
+        <w:gridCol w:w="1918"/>
         <w:gridCol w:w="2437"/>
         <w:gridCol w:w="2819"/>
       </w:tblGrid>
@@ -17482,7 +17482,7 @@
         <w:trPr/>
         <w:tc>
           <w:tcPr>
-            <w:tcW w:w="1853" w:type="dxa"/>
+            <w:tcW w:w="1852" w:type="dxa"/>
             <w:tcBorders>
               <w:top w:val="single" w:sz="4" w:space="0" w:color="000000"/>
               <w:start w:val="single" w:sz="4" w:space="0" w:color="000000"/>
@@ -17509,7 +17509,7 @@
         </w:tc>
         <w:tc>
           <w:tcPr>
-            <w:tcW w:w="1917" w:type="dxa"/>
+            <w:tcW w:w="1918" w:type="dxa"/>
             <w:tcBorders>
               <w:top w:val="single" w:sz="4" w:space="0" w:color="000000"/>
               <w:start w:val="single" w:sz="4" w:space="0" w:color="000000"/>
@@ -17593,7 +17593,7 @@
         <w:trPr/>
         <w:tc>
           <w:tcPr>
-            <w:tcW w:w="1853" w:type="dxa"/>
+            <w:tcW w:w="1852" w:type="dxa"/>
             <w:tcBorders>
               <w:top w:val="single" w:sz="4" w:space="0" w:color="000000"/>
               <w:start w:val="single" w:sz="4" w:space="0" w:color="000000"/>
@@ -17616,7 +17616,7 @@
         </w:tc>
         <w:tc>
           <w:tcPr>
-            <w:tcW w:w="1917" w:type="dxa"/>
+            <w:tcW w:w="1918" w:type="dxa"/>
             <w:tcBorders>
               <w:top w:val="single" w:sz="4" w:space="0" w:color="000000"/>
               <w:start w:val="single" w:sz="4" w:space="0" w:color="000000"/>
@@ -17688,7 +17688,7 @@
         <w:trPr/>
         <w:tc>
           <w:tcPr>
-            <w:tcW w:w="1853" w:type="dxa"/>
+            <w:tcW w:w="1852" w:type="dxa"/>
             <w:tcBorders>
               <w:top w:val="single" w:sz="4" w:space="0" w:color="000000"/>
               <w:start w:val="single" w:sz="4" w:space="0" w:color="000000"/>
@@ -17711,7 +17711,7 @@
         </w:tc>
         <w:tc>
           <w:tcPr>
-            <w:tcW w:w="1917" w:type="dxa"/>
+            <w:tcW w:w="1918" w:type="dxa"/>
             <w:tcBorders>
               <w:top w:val="single" w:sz="4" w:space="0" w:color="000000"/>
               <w:start w:val="single" w:sz="4" w:space="0" w:color="000000"/>
@@ -19403,8 +19403,8 @@
       </w:tblPr>
       <w:tblGrid>
         <w:gridCol w:w="2732"/>
-        <w:gridCol w:w="3301"/>
-        <w:gridCol w:w="2993"/>
+        <w:gridCol w:w="3300"/>
+        <w:gridCol w:w="2994"/>
       </w:tblGrid>
       <w:tr>
         <w:trPr/>
@@ -19437,7 +19437,7 @@
         </w:tc>
         <w:tc>
           <w:tcPr>
-            <w:tcW w:w="3301" w:type="dxa"/>
+            <w:tcW w:w="3300" w:type="dxa"/>
             <w:tcBorders>
               <w:top w:val="single" w:sz="4" w:space="0" w:color="000000"/>
               <w:start w:val="single" w:sz="4" w:space="0" w:color="000000"/>
@@ -19464,7 +19464,7 @@
         </w:tc>
         <w:tc>
           <w:tcPr>
-            <w:tcW w:w="2993" w:type="dxa"/>
+            <w:tcW w:w="2994" w:type="dxa"/>
             <w:tcBorders>
               <w:top w:val="single" w:sz="4" w:space="0" w:color="000000"/>
               <w:start w:val="single" w:sz="4" w:space="0" w:color="000000"/>
@@ -19517,7 +19517,7 @@
         </w:tc>
         <w:tc>
           <w:tcPr>
-            <w:tcW w:w="3301" w:type="dxa"/>
+            <w:tcW w:w="3300" w:type="dxa"/>
             <w:tcBorders>
               <w:top w:val="single" w:sz="4" w:space="0" w:color="000000"/>
               <w:start w:val="single" w:sz="4" w:space="0" w:color="000000"/>
@@ -19540,7 +19540,7 @@
         </w:tc>
         <w:tc>
           <w:tcPr>
-            <w:tcW w:w="2993" w:type="dxa"/>
+            <w:tcW w:w="2994" w:type="dxa"/>
             <w:tcBorders>
               <w:top w:val="single" w:sz="4" w:space="0" w:color="000000"/>
               <w:start w:val="single" w:sz="4" w:space="0" w:color="000000"/>
@@ -19589,7 +19589,7 @@
         </w:tc>
         <w:tc>
           <w:tcPr>
-            <w:tcW w:w="3301" w:type="dxa"/>
+            <w:tcW w:w="3300" w:type="dxa"/>
             <w:tcBorders>
               <w:top w:val="single" w:sz="4" w:space="0" w:color="000000"/>
               <w:start w:val="single" w:sz="4" w:space="0" w:color="000000"/>
@@ -19612,7 +19612,7 @@
         </w:tc>
         <w:tc>
           <w:tcPr>
-            <w:tcW w:w="2993" w:type="dxa"/>
+            <w:tcW w:w="2994" w:type="dxa"/>
             <w:tcBorders>
               <w:top w:val="single" w:sz="4" w:space="0" w:color="000000"/>
               <w:start w:val="single" w:sz="4" w:space="0" w:color="000000"/>
@@ -19661,7 +19661,7 @@
         </w:tc>
         <w:tc>
           <w:tcPr>
-            <w:tcW w:w="3301" w:type="dxa"/>
+            <w:tcW w:w="3300" w:type="dxa"/>
             <w:tcBorders>
               <w:top w:val="single" w:sz="4" w:space="0" w:color="000000"/>
               <w:start w:val="single" w:sz="4" w:space="0" w:color="000000"/>
@@ -19684,7 +19684,7 @@
         </w:tc>
         <w:tc>
           <w:tcPr>
-            <w:tcW w:w="2993" w:type="dxa"/>
+            <w:tcW w:w="2994" w:type="dxa"/>
             <w:tcBorders>
               <w:top w:val="single" w:sz="4" w:space="0" w:color="000000"/>
               <w:start w:val="single" w:sz="4" w:space="0" w:color="000000"/>
@@ -19733,7 +19733,7 @@
         </w:tc>
         <w:tc>
           <w:tcPr>
-            <w:tcW w:w="3301" w:type="dxa"/>
+            <w:tcW w:w="3300" w:type="dxa"/>
             <w:tcBorders>
               <w:top w:val="single" w:sz="4" w:space="0" w:color="000000"/>
               <w:start w:val="single" w:sz="4" w:space="0" w:color="000000"/>
@@ -19756,7 +19756,7 @@
         </w:tc>
         <w:tc>
           <w:tcPr>
-            <w:tcW w:w="2993" w:type="dxa"/>
+            <w:tcW w:w="2994" w:type="dxa"/>
             <w:tcBorders>
               <w:top w:val="single" w:sz="4" w:space="0" w:color="000000"/>
               <w:start w:val="single" w:sz="4" w:space="0" w:color="000000"/>
@@ -19805,7 +19805,7 @@
         </w:tc>
         <w:tc>
           <w:tcPr>
-            <w:tcW w:w="3301" w:type="dxa"/>
+            <w:tcW w:w="3300" w:type="dxa"/>
             <w:tcBorders>
               <w:top w:val="single" w:sz="4" w:space="0" w:color="000000"/>
               <w:start w:val="single" w:sz="4" w:space="0" w:color="000000"/>
@@ -19828,7 +19828,7 @@
         </w:tc>
         <w:tc>
           <w:tcPr>
-            <w:tcW w:w="2993" w:type="dxa"/>
+            <w:tcW w:w="2994" w:type="dxa"/>
             <w:tcBorders>
               <w:top w:val="single" w:sz="4" w:space="0" w:color="000000"/>
               <w:start w:val="single" w:sz="4" w:space="0" w:color="000000"/>
@@ -19877,7 +19877,7 @@
         </w:tc>
         <w:tc>
           <w:tcPr>
-            <w:tcW w:w="3301" w:type="dxa"/>
+            <w:tcW w:w="3300" w:type="dxa"/>
             <w:tcBorders>
               <w:top w:val="single" w:sz="4" w:space="0" w:color="000000"/>
               <w:start w:val="single" w:sz="4" w:space="0" w:color="000000"/>
@@ -19900,7 +19900,7 @@
         </w:tc>
         <w:tc>
           <w:tcPr>
-            <w:tcW w:w="2993" w:type="dxa"/>
+            <w:tcW w:w="2994" w:type="dxa"/>
             <w:tcBorders>
               <w:top w:val="single" w:sz="4" w:space="0" w:color="000000"/>
               <w:start w:val="single" w:sz="4" w:space="0" w:color="000000"/>
@@ -20016,8 +20016,8 @@
       </w:tblPr>
       <w:tblGrid>
         <w:gridCol w:w="4437"/>
-        <w:gridCol w:w="2128"/>
-        <w:gridCol w:w="2461"/>
+        <w:gridCol w:w="2127"/>
+        <w:gridCol w:w="2462"/>
       </w:tblGrid>
       <w:tr>
         <w:trPr/>
@@ -20050,7 +20050,7 @@
         </w:tc>
         <w:tc>
           <w:tcPr>
-            <w:tcW w:w="2128" w:type="dxa"/>
+            <w:tcW w:w="2127" w:type="dxa"/>
             <w:tcBorders>
               <w:top w:val="single" w:sz="4" w:space="0" w:color="000000"/>
               <w:start w:val="single" w:sz="4" w:space="0" w:color="000000"/>
@@ -20077,7 +20077,7 @@
         </w:tc>
         <w:tc>
           <w:tcPr>
-            <w:tcW w:w="2461" w:type="dxa"/>
+            <w:tcW w:w="2462" w:type="dxa"/>
             <w:tcBorders>
               <w:top w:val="single" w:sz="4" w:space="0" w:color="000000"/>
               <w:start w:val="single" w:sz="4" w:space="0" w:color="000000"/>
@@ -20130,7 +20130,7 @@
         </w:tc>
         <w:tc>
           <w:tcPr>
-            <w:tcW w:w="2128" w:type="dxa"/>
+            <w:tcW w:w="2127" w:type="dxa"/>
             <w:tcBorders>
               <w:top w:val="single" w:sz="4" w:space="0" w:color="000000"/>
               <w:start w:val="single" w:sz="4" w:space="0" w:color="000000"/>
@@ -20153,7 +20153,7 @@
         </w:tc>
         <w:tc>
           <w:tcPr>
-            <w:tcW w:w="2461" w:type="dxa"/>
+            <w:tcW w:w="2462" w:type="dxa"/>
             <w:tcBorders>
               <w:top w:val="single" w:sz="4" w:space="0" w:color="000000"/>
               <w:start w:val="single" w:sz="4" w:space="0" w:color="000000"/>
@@ -20206,7 +20206,7 @@
         </w:tc>
         <w:tc>
           <w:tcPr>
-            <w:tcW w:w="2128" w:type="dxa"/>
+            <w:tcW w:w="2127" w:type="dxa"/>
             <w:tcBorders>
               <w:top w:val="single" w:sz="4" w:space="0" w:color="000000"/>
               <w:start w:val="single" w:sz="4" w:space="0" w:color="000000"/>
@@ -20229,7 +20229,7 @@
         </w:tc>
         <w:tc>
           <w:tcPr>
-            <w:tcW w:w="2461" w:type="dxa"/>
+            <w:tcW w:w="2462" w:type="dxa"/>
             <w:tcBorders>
               <w:top w:val="single" w:sz="4" w:space="0" w:color="000000"/>
               <w:start w:val="single" w:sz="4" w:space="0" w:color="000000"/>
@@ -20278,7 +20278,7 @@
         </w:tc>
         <w:tc>
           <w:tcPr>
-            <w:tcW w:w="2128" w:type="dxa"/>
+            <w:tcW w:w="2127" w:type="dxa"/>
             <w:tcBorders>
               <w:top w:val="single" w:sz="4" w:space="0" w:color="000000"/>
               <w:start w:val="single" w:sz="4" w:space="0" w:color="000000"/>
@@ -20301,7 +20301,7 @@
         </w:tc>
         <w:tc>
           <w:tcPr>
-            <w:tcW w:w="2461" w:type="dxa"/>
+            <w:tcW w:w="2462" w:type="dxa"/>
             <w:tcBorders>
               <w:top w:val="single" w:sz="4" w:space="0" w:color="000000"/>
               <w:start w:val="single" w:sz="4" w:space="0" w:color="000000"/>
@@ -20350,7 +20350,7 @@
         </w:tc>
         <w:tc>
           <w:tcPr>
-            <w:tcW w:w="2128" w:type="dxa"/>
+            <w:tcW w:w="2127" w:type="dxa"/>
             <w:tcBorders>
               <w:top w:val="single" w:sz="4" w:space="0" w:color="000000"/>
               <w:start w:val="single" w:sz="4" w:space="0" w:color="000000"/>
@@ -20373,7 +20373,7 @@
         </w:tc>
         <w:tc>
           <w:tcPr>
-            <w:tcW w:w="2461" w:type="dxa"/>
+            <w:tcW w:w="2462" w:type="dxa"/>
             <w:tcBorders>
               <w:top w:val="single" w:sz="4" w:space="0" w:color="000000"/>
               <w:start w:val="single" w:sz="4" w:space="0" w:color="000000"/>
@@ -20422,7 +20422,7 @@
         </w:tc>
         <w:tc>
           <w:tcPr>
-            <w:tcW w:w="2128" w:type="dxa"/>
+            <w:tcW w:w="2127" w:type="dxa"/>
             <w:tcBorders>
               <w:top w:val="single" w:sz="4" w:space="0" w:color="000000"/>
               <w:start w:val="single" w:sz="4" w:space="0" w:color="000000"/>
@@ -20445,7 +20445,7 @@
         </w:tc>
         <w:tc>
           <w:tcPr>
-            <w:tcW w:w="2461" w:type="dxa"/>
+            <w:tcW w:w="2462" w:type="dxa"/>
             <w:tcBorders>
               <w:top w:val="single" w:sz="4" w:space="0" w:color="000000"/>
               <w:start w:val="single" w:sz="4" w:space="0" w:color="000000"/>
@@ -20494,7 +20494,7 @@
         </w:tc>
         <w:tc>
           <w:tcPr>
-            <w:tcW w:w="2128" w:type="dxa"/>
+            <w:tcW w:w="2127" w:type="dxa"/>
             <w:tcBorders>
               <w:top w:val="single" w:sz="4" w:space="0" w:color="000000"/>
               <w:start w:val="single" w:sz="4" w:space="0" w:color="000000"/>
@@ -20517,7 +20517,7 @@
         </w:tc>
         <w:tc>
           <w:tcPr>
-            <w:tcW w:w="2461" w:type="dxa"/>
+            <w:tcW w:w="2462" w:type="dxa"/>
             <w:tcBorders>
               <w:top w:val="single" w:sz="4" w:space="0" w:color="000000"/>
               <w:start w:val="single" w:sz="4" w:space="0" w:color="000000"/>
@@ -20635,9 +20635,9 @@
         <w:tblLook w:val="0000" w:noHBand="0" w:noVBand="0" w:firstColumn="0" w:lastRow="0" w:lastColumn="0" w:firstRow="0"/>
       </w:tblPr>
       <w:tblGrid>
-        <w:gridCol w:w="1051"/>
+        <w:gridCol w:w="1050"/>
         <w:gridCol w:w="1538"/>
-        <w:gridCol w:w="1913"/>
+        <w:gridCol w:w="1914"/>
         <w:gridCol w:w="1530"/>
         <w:gridCol w:w="1693"/>
         <w:gridCol w:w="1301"/>
@@ -20646,7 +20646,7 @@
         <w:trPr/>
         <w:tc>
           <w:tcPr>
-            <w:tcW w:w="1051" w:type="dxa"/>
+            <w:tcW w:w="1050" w:type="dxa"/>
             <w:tcBorders>
               <w:top w:val="single" w:sz="4" w:space="0" w:color="000000"/>
               <w:start w:val="single" w:sz="4" w:space="0" w:color="000000"/>
@@ -20700,7 +20700,7 @@
         </w:tc>
         <w:tc>
           <w:tcPr>
-            <w:tcW w:w="1913" w:type="dxa"/>
+            <w:tcW w:w="1914" w:type="dxa"/>
             <w:tcBorders>
               <w:top w:val="single" w:sz="4" w:space="0" w:color="000000"/>
               <w:start w:val="single" w:sz="4" w:space="0" w:color="000000"/>
@@ -20811,7 +20811,7 @@
         <w:trPr/>
         <w:tc>
           <w:tcPr>
-            <w:tcW w:w="1051" w:type="dxa"/>
+            <w:tcW w:w="1050" w:type="dxa"/>
             <w:tcBorders>
               <w:top w:val="single" w:sz="4" w:space="0" w:color="000000"/>
               <w:start w:val="single" w:sz="4" w:space="0" w:color="000000"/>
@@ -20857,7 +20857,7 @@
         </w:tc>
         <w:tc>
           <w:tcPr>
-            <w:tcW w:w="1913" w:type="dxa"/>
+            <w:tcW w:w="1914" w:type="dxa"/>
             <w:tcBorders>
               <w:top w:val="single" w:sz="4" w:space="0" w:color="000000"/>
               <w:start w:val="single" w:sz="4" w:space="0" w:color="000000"/>
@@ -20952,7 +20952,7 @@
         <w:trPr/>
         <w:tc>
           <w:tcPr>
-            <w:tcW w:w="1051" w:type="dxa"/>
+            <w:tcW w:w="1050" w:type="dxa"/>
             <w:tcBorders>
               <w:top w:val="single" w:sz="4" w:space="0" w:color="000000"/>
               <w:start w:val="single" w:sz="4" w:space="0" w:color="000000"/>
@@ -20998,7 +20998,7 @@
         </w:tc>
         <w:tc>
           <w:tcPr>
-            <w:tcW w:w="1913" w:type="dxa"/>
+            <w:tcW w:w="1914" w:type="dxa"/>
             <w:tcBorders>
               <w:top w:val="single" w:sz="4" w:space="0" w:color="000000"/>
               <w:start w:val="single" w:sz="4" w:space="0" w:color="000000"/>
@@ -21245,8 +21245,8 @@
       </w:tblPr>
       <w:tblGrid>
         <w:gridCol w:w="1516"/>
-        <w:gridCol w:w="3943"/>
-        <w:gridCol w:w="3567"/>
+        <w:gridCol w:w="3942"/>
+        <w:gridCol w:w="3568"/>
       </w:tblGrid>
       <w:tr>
         <w:trPr/>
@@ -21279,7 +21279,7 @@
         </w:tc>
         <w:tc>
           <w:tcPr>
-            <w:tcW w:w="3943" w:type="dxa"/>
+            <w:tcW w:w="3942" w:type="dxa"/>
             <w:tcBorders>
               <w:top w:val="single" w:sz="4" w:space="0" w:color="000000"/>
               <w:start w:val="single" w:sz="4" w:space="0" w:color="000000"/>
@@ -21306,7 +21306,7 @@
         </w:tc>
         <w:tc>
           <w:tcPr>
-            <w:tcW w:w="3567" w:type="dxa"/>
+            <w:tcW w:w="3568" w:type="dxa"/>
             <w:tcBorders>
               <w:top w:val="single" w:sz="4" w:space="0" w:color="000000"/>
               <w:start w:val="single" w:sz="4" w:space="0" w:color="000000"/>
@@ -21359,7 +21359,7 @@
         </w:tc>
         <w:tc>
           <w:tcPr>
-            <w:tcW w:w="3943" w:type="dxa"/>
+            <w:tcW w:w="3942" w:type="dxa"/>
             <w:tcBorders>
               <w:top w:val="single" w:sz="4" w:space="0" w:color="000000"/>
               <w:start w:val="single" w:sz="4" w:space="0" w:color="000000"/>
@@ -21382,7 +21382,7 @@
         </w:tc>
         <w:tc>
           <w:tcPr>
-            <w:tcW w:w="3567" w:type="dxa"/>
+            <w:tcW w:w="3568" w:type="dxa"/>
             <w:tcBorders>
               <w:top w:val="single" w:sz="4" w:space="0" w:color="000000"/>
               <w:start w:val="single" w:sz="4" w:space="0" w:color="000000"/>
@@ -21431,7 +21431,7 @@
         </w:tc>
         <w:tc>
           <w:tcPr>
-            <w:tcW w:w="3943" w:type="dxa"/>
+            <w:tcW w:w="3942" w:type="dxa"/>
             <w:tcBorders>
               <w:top w:val="single" w:sz="4" w:space="0" w:color="000000"/>
               <w:start w:val="single" w:sz="4" w:space="0" w:color="000000"/>
@@ -21454,7 +21454,7 @@
         </w:tc>
         <w:tc>
           <w:tcPr>
-            <w:tcW w:w="3567" w:type="dxa"/>
+            <w:tcW w:w="3568" w:type="dxa"/>
             <w:tcBorders>
               <w:top w:val="single" w:sz="4" w:space="0" w:color="000000"/>
               <w:start w:val="single" w:sz="4" w:space="0" w:color="000000"/>
@@ -22423,16 +22423,16 @@
         <w:tblLook w:val="0000" w:noHBand="0" w:noVBand="0" w:firstColumn="0" w:lastRow="0" w:lastColumn="0" w:firstRow="0"/>
       </w:tblPr>
       <w:tblGrid>
-        <w:gridCol w:w="1272"/>
+        <w:gridCol w:w="1271"/>
         <w:gridCol w:w="2399"/>
         <w:gridCol w:w="2273"/>
-        <w:gridCol w:w="3082"/>
+        <w:gridCol w:w="3083"/>
       </w:tblGrid>
       <w:tr>
         <w:trPr/>
         <w:tc>
           <w:tcPr>
-            <w:tcW w:w="1272" w:type="dxa"/>
+            <w:tcW w:w="1271" w:type="dxa"/>
             <w:tcBorders>
               <w:top w:val="single" w:sz="4" w:space="0" w:color="000000"/>
               <w:start w:val="single" w:sz="4" w:space="0" w:color="000000"/>
@@ -22513,7 +22513,7 @@
         </w:tc>
         <w:tc>
           <w:tcPr>
-            <w:tcW w:w="3082" w:type="dxa"/>
+            <w:tcW w:w="3083" w:type="dxa"/>
             <w:tcBorders>
               <w:top w:val="single" w:sz="4" w:space="0" w:color="000000"/>
               <w:start w:val="single" w:sz="4" w:space="0" w:color="000000"/>
@@ -22543,7 +22543,7 @@
         <w:trPr/>
         <w:tc>
           <w:tcPr>
-            <w:tcW w:w="1272" w:type="dxa"/>
+            <w:tcW w:w="1271" w:type="dxa"/>
             <w:tcBorders>
               <w:top w:val="single" w:sz="4" w:space="0" w:color="000000"/>
               <w:start w:val="single" w:sz="4" w:space="0" w:color="000000"/>
@@ -22612,7 +22612,7 @@
         </w:tc>
         <w:tc>
           <w:tcPr>
-            <w:tcW w:w="3082" w:type="dxa"/>
+            <w:tcW w:w="3083" w:type="dxa"/>
             <w:tcBorders>
               <w:top w:val="single" w:sz="4" w:space="0" w:color="000000"/>
               <w:start w:val="single" w:sz="4" w:space="0" w:color="000000"/>
@@ -22638,7 +22638,7 @@
         <w:trPr/>
         <w:tc>
           <w:tcPr>
-            <w:tcW w:w="1272" w:type="dxa"/>
+            <w:tcW w:w="1271" w:type="dxa"/>
             <w:tcBorders>
               <w:top w:val="single" w:sz="4" w:space="0" w:color="000000"/>
               <w:start w:val="single" w:sz="4" w:space="0" w:color="000000"/>
@@ -22707,7 +22707,7 @@
         </w:tc>
         <w:tc>
           <w:tcPr>
-            <w:tcW w:w="3082" w:type="dxa"/>
+            <w:tcW w:w="3083" w:type="dxa"/>
             <w:tcBorders>
               <w:top w:val="single" w:sz="4" w:space="0" w:color="000000"/>
               <w:start w:val="single" w:sz="4" w:space="0" w:color="000000"/>
@@ -22824,17 +22824,17 @@
         <w:tblLook w:val="0000" w:noHBand="0" w:noVBand="0" w:firstColumn="0" w:lastRow="0" w:lastColumn="0" w:firstRow="0"/>
       </w:tblPr>
       <w:tblGrid>
-        <w:gridCol w:w="1133"/>
+        <w:gridCol w:w="1132"/>
         <w:gridCol w:w="1028"/>
-        <w:gridCol w:w="1479"/>
-        <w:gridCol w:w="1395"/>
-        <w:gridCol w:w="3991"/>
+        <w:gridCol w:w="1480"/>
+        <w:gridCol w:w="1394"/>
+        <w:gridCol w:w="3992"/>
       </w:tblGrid>
       <w:tr>
         <w:trPr/>
         <w:tc>
           <w:tcPr>
-            <w:tcW w:w="1133" w:type="dxa"/>
+            <w:tcW w:w="1132" w:type="dxa"/>
             <w:tcBorders>
               <w:top w:val="single" w:sz="4" w:space="0" w:color="000000"/>
               <w:start w:val="single" w:sz="4" w:space="0" w:color="000000"/>
@@ -22888,7 +22888,7 @@
         </w:tc>
         <w:tc>
           <w:tcPr>
-            <w:tcW w:w="1479" w:type="dxa"/>
+            <w:tcW w:w="1480" w:type="dxa"/>
             <w:tcBorders>
               <w:top w:val="single" w:sz="4" w:space="0" w:color="000000"/>
               <w:start w:val="single" w:sz="4" w:space="0" w:color="000000"/>
@@ -22915,7 +22915,7 @@
         </w:tc>
         <w:tc>
           <w:tcPr>
-            <w:tcW w:w="1395" w:type="dxa"/>
+            <w:tcW w:w="1394" w:type="dxa"/>
             <w:tcBorders>
               <w:top w:val="single" w:sz="4" w:space="0" w:color="000000"/>
               <w:start w:val="single" w:sz="4" w:space="0" w:color="000000"/>
@@ -22942,7 +22942,7 @@
         </w:tc>
         <w:tc>
           <w:tcPr>
-            <w:tcW w:w="3991" w:type="dxa"/>
+            <w:tcW w:w="3992" w:type="dxa"/>
             <w:tcBorders>
               <w:top w:val="single" w:sz="4" w:space="0" w:color="000000"/>
               <w:start w:val="single" w:sz="4" w:space="0" w:color="000000"/>
@@ -22972,7 +22972,7 @@
         <w:trPr/>
         <w:tc>
           <w:tcPr>
-            <w:tcW w:w="1133" w:type="dxa"/>
+            <w:tcW w:w="1132" w:type="dxa"/>
             <w:tcBorders>
               <w:top w:val="single" w:sz="4" w:space="0" w:color="000000"/>
               <w:start w:val="single" w:sz="4" w:space="0" w:color="000000"/>
@@ -23018,7 +23018,7 @@
         </w:tc>
         <w:tc>
           <w:tcPr>
-            <w:tcW w:w="1479" w:type="dxa"/>
+            <w:tcW w:w="1480" w:type="dxa"/>
             <w:tcBorders>
               <w:top w:val="single" w:sz="4" w:space="0" w:color="000000"/>
               <w:start w:val="single" w:sz="4" w:space="0" w:color="000000"/>
@@ -23041,7 +23041,7 @@
         </w:tc>
         <w:tc>
           <w:tcPr>
-            <w:tcW w:w="1395" w:type="dxa"/>
+            <w:tcW w:w="1394" w:type="dxa"/>
             <w:tcBorders>
               <w:top w:val="single" w:sz="4" w:space="0" w:color="000000"/>
               <w:start w:val="single" w:sz="4" w:space="0" w:color="000000"/>
@@ -23064,7 +23064,7 @@
         </w:tc>
         <w:tc>
           <w:tcPr>
-            <w:tcW w:w="3991" w:type="dxa"/>
+            <w:tcW w:w="3992" w:type="dxa"/>
             <w:tcBorders>
               <w:top w:val="single" w:sz="4" w:space="0" w:color="000000"/>
               <w:start w:val="single" w:sz="4" w:space="0" w:color="000000"/>
@@ -23090,7 +23090,7 @@
         <w:trPr/>
         <w:tc>
           <w:tcPr>
-            <w:tcW w:w="1133" w:type="dxa"/>
+            <w:tcW w:w="1132" w:type="dxa"/>
             <w:tcBorders>
               <w:top w:val="single" w:sz="4" w:space="0" w:color="000000"/>
               <w:start w:val="single" w:sz="4" w:space="0" w:color="000000"/>
@@ -23136,7 +23136,7 @@
         </w:tc>
         <w:tc>
           <w:tcPr>
-            <w:tcW w:w="1479" w:type="dxa"/>
+            <w:tcW w:w="1480" w:type="dxa"/>
             <w:tcBorders>
               <w:top w:val="single" w:sz="4" w:space="0" w:color="000000"/>
               <w:start w:val="single" w:sz="4" w:space="0" w:color="000000"/>
@@ -23159,7 +23159,7 @@
         </w:tc>
         <w:tc>
           <w:tcPr>
-            <w:tcW w:w="1395" w:type="dxa"/>
+            <w:tcW w:w="1394" w:type="dxa"/>
             <w:tcBorders>
               <w:top w:val="single" w:sz="4" w:space="0" w:color="000000"/>
               <w:start w:val="single" w:sz="4" w:space="0" w:color="000000"/>
@@ -23182,7 +23182,7 @@
         </w:tc>
         <w:tc>
           <w:tcPr>
-            <w:tcW w:w="3991" w:type="dxa"/>
+            <w:tcW w:w="3992" w:type="dxa"/>
             <w:tcBorders>
               <w:top w:val="single" w:sz="4" w:space="0" w:color="000000"/>
               <w:start w:val="single" w:sz="4" w:space="0" w:color="000000"/>
@@ -23208,7 +23208,7 @@
         <w:trPr/>
         <w:tc>
           <w:tcPr>
-            <w:tcW w:w="1133" w:type="dxa"/>
+            <w:tcW w:w="1132" w:type="dxa"/>
             <w:tcBorders>
               <w:top w:val="single" w:sz="4" w:space="0" w:color="000000"/>
               <w:start w:val="single" w:sz="4" w:space="0" w:color="000000"/>
@@ -23254,7 +23254,7 @@
         </w:tc>
         <w:tc>
           <w:tcPr>
-            <w:tcW w:w="1479" w:type="dxa"/>
+            <w:tcW w:w="1480" w:type="dxa"/>
             <w:tcBorders>
               <w:top w:val="single" w:sz="4" w:space="0" w:color="000000"/>
               <w:start w:val="single" w:sz="4" w:space="0" w:color="000000"/>
@@ -23277,7 +23277,7 @@
         </w:tc>
         <w:tc>
           <w:tcPr>
-            <w:tcW w:w="1395" w:type="dxa"/>
+            <w:tcW w:w="1394" w:type="dxa"/>
             <w:tcBorders>
               <w:top w:val="single" w:sz="4" w:space="0" w:color="000000"/>
               <w:start w:val="single" w:sz="4" w:space="0" w:color="000000"/>
@@ -23300,7 +23300,7 @@
         </w:tc>
         <w:tc>
           <w:tcPr>
-            <w:tcW w:w="3991" w:type="dxa"/>
+            <w:tcW w:w="3992" w:type="dxa"/>
             <w:tcBorders>
               <w:top w:val="single" w:sz="4" w:space="0" w:color="000000"/>
               <w:start w:val="single" w:sz="4" w:space="0" w:color="000000"/>
@@ -23326,7 +23326,7 @@
         <w:trPr/>
         <w:tc>
           <w:tcPr>
-            <w:tcW w:w="1133" w:type="dxa"/>
+            <w:tcW w:w="1132" w:type="dxa"/>
             <w:tcBorders>
               <w:top w:val="single" w:sz="4" w:space="0" w:color="000000"/>
               <w:start w:val="single" w:sz="4" w:space="0" w:color="000000"/>
@@ -23372,7 +23372,7 @@
         </w:tc>
         <w:tc>
           <w:tcPr>
-            <w:tcW w:w="1479" w:type="dxa"/>
+            <w:tcW w:w="1480" w:type="dxa"/>
             <w:tcBorders>
               <w:top w:val="single" w:sz="4" w:space="0" w:color="000000"/>
               <w:start w:val="single" w:sz="4" w:space="0" w:color="000000"/>
@@ -23395,7 +23395,7 @@
         </w:tc>
         <w:tc>
           <w:tcPr>
-            <w:tcW w:w="1395" w:type="dxa"/>
+            <w:tcW w:w="1394" w:type="dxa"/>
             <w:tcBorders>
               <w:top w:val="single" w:sz="4" w:space="0" w:color="000000"/>
               <w:start w:val="single" w:sz="4" w:space="0" w:color="000000"/>
@@ -23418,7 +23418,7 @@
         </w:tc>
         <w:tc>
           <w:tcPr>
-            <w:tcW w:w="3991" w:type="dxa"/>
+            <w:tcW w:w="3992" w:type="dxa"/>
             <w:tcBorders>
               <w:top w:val="single" w:sz="4" w:space="0" w:color="000000"/>
               <w:start w:val="single" w:sz="4" w:space="0" w:color="000000"/>
@@ -23562,9 +23562,9 @@
       </w:tblPr>
       <w:tblGrid>
         <w:gridCol w:w="1100"/>
-        <w:gridCol w:w="2385"/>
+        <w:gridCol w:w="2384"/>
         <w:gridCol w:w="3252"/>
-        <w:gridCol w:w="2289"/>
+        <w:gridCol w:w="2290"/>
       </w:tblGrid>
       <w:tr>
         <w:trPr/>
@@ -23597,7 +23597,7 @@
         </w:tc>
         <w:tc>
           <w:tcPr>
-            <w:tcW w:w="2385" w:type="dxa"/>
+            <w:tcW w:w="2384" w:type="dxa"/>
             <w:tcBorders>
               <w:top w:val="single" w:sz="4" w:space="0" w:color="000000"/>
               <w:start w:val="single" w:sz="4" w:space="0" w:color="000000"/>
@@ -23651,7 +23651,7 @@
         </w:tc>
         <w:tc>
           <w:tcPr>
-            <w:tcW w:w="2289" w:type="dxa"/>
+            <w:tcW w:w="2290" w:type="dxa"/>
             <w:tcBorders>
               <w:top w:val="single" w:sz="4" w:space="0" w:color="000000"/>
               <w:start w:val="single" w:sz="4" w:space="0" w:color="000000"/>
@@ -23704,7 +23704,7 @@
         </w:tc>
         <w:tc>
           <w:tcPr>
-            <w:tcW w:w="2385" w:type="dxa"/>
+            <w:tcW w:w="2384" w:type="dxa"/>
             <w:tcBorders>
               <w:top w:val="single" w:sz="4" w:space="0" w:color="000000"/>
               <w:start w:val="single" w:sz="4" w:space="0" w:color="000000"/>
@@ -23750,7 +23750,7 @@
         </w:tc>
         <w:tc>
           <w:tcPr>
-            <w:tcW w:w="2289" w:type="dxa"/>
+            <w:tcW w:w="2290" w:type="dxa"/>
             <w:tcBorders>
               <w:top w:val="single" w:sz="4" w:space="0" w:color="000000"/>
               <w:start w:val="single" w:sz="4" w:space="0" w:color="000000"/>
@@ -23799,7 +23799,7 @@
         </w:tc>
         <w:tc>
           <w:tcPr>
-            <w:tcW w:w="2385" w:type="dxa"/>
+            <w:tcW w:w="2384" w:type="dxa"/>
             <w:tcBorders>
               <w:top w:val="single" w:sz="4" w:space="0" w:color="000000"/>
               <w:start w:val="single" w:sz="4" w:space="0" w:color="000000"/>
@@ -23845,7 +23845,7 @@
         </w:tc>
         <w:tc>
           <w:tcPr>
-            <w:tcW w:w="2289" w:type="dxa"/>
+            <w:tcW w:w="2290" w:type="dxa"/>
             <w:tcBorders>
               <w:top w:val="single" w:sz="4" w:space="0" w:color="000000"/>
               <w:start w:val="single" w:sz="4" w:space="0" w:color="000000"/>
@@ -23960,17 +23960,17 @@
         <w:tblLook w:val="0000" w:noHBand="0" w:noVBand="0" w:firstColumn="0" w:lastRow="0" w:lastColumn="0" w:firstRow="0"/>
       </w:tblPr>
       <w:tblGrid>
-        <w:gridCol w:w="1060"/>
-        <w:gridCol w:w="3189"/>
-        <w:gridCol w:w="2034"/>
-        <w:gridCol w:w="1908"/>
+        <w:gridCol w:w="1059"/>
+        <w:gridCol w:w="3190"/>
+        <w:gridCol w:w="2033"/>
+        <w:gridCol w:w="1909"/>
         <w:gridCol w:w="835"/>
       </w:tblGrid>
       <w:tr>
         <w:trPr/>
         <w:tc>
           <w:tcPr>
-            <w:tcW w:w="1060" w:type="dxa"/>
+            <w:tcW w:w="1059" w:type="dxa"/>
             <w:tcBorders>
               <w:top w:val="single" w:sz="4" w:space="0" w:color="000000"/>
               <w:start w:val="single" w:sz="4" w:space="0" w:color="000000"/>
@@ -23997,7 +23997,7 @@
         </w:tc>
         <w:tc>
           <w:tcPr>
-            <w:tcW w:w="3189" w:type="dxa"/>
+            <w:tcW w:w="3190" w:type="dxa"/>
             <w:tcBorders>
               <w:top w:val="single" w:sz="4" w:space="0" w:color="000000"/>
               <w:start w:val="single" w:sz="4" w:space="0" w:color="000000"/>
@@ -24024,7 +24024,7 @@
         </w:tc>
         <w:tc>
           <w:tcPr>
-            <w:tcW w:w="2034" w:type="dxa"/>
+            <w:tcW w:w="2033" w:type="dxa"/>
             <w:tcBorders>
               <w:top w:val="single" w:sz="4" w:space="0" w:color="000000"/>
               <w:start w:val="single" w:sz="4" w:space="0" w:color="000000"/>
@@ -24051,7 +24051,7 @@
         </w:tc>
         <w:tc>
           <w:tcPr>
-            <w:tcW w:w="1908" w:type="dxa"/>
+            <w:tcW w:w="1909" w:type="dxa"/>
             <w:tcBorders>
               <w:top w:val="single" w:sz="4" w:space="0" w:color="000000"/>
               <w:start w:val="single" w:sz="4" w:space="0" w:color="000000"/>
@@ -24108,7 +24108,7 @@
         <w:trPr/>
         <w:tc>
           <w:tcPr>
-            <w:tcW w:w="1060" w:type="dxa"/>
+            <w:tcW w:w="1059" w:type="dxa"/>
             <w:tcBorders>
               <w:top w:val="single" w:sz="4" w:space="0" w:color="000000"/>
               <w:start w:val="single" w:sz="4" w:space="0" w:color="000000"/>
@@ -24131,7 +24131,7 @@
         </w:tc>
         <w:tc>
           <w:tcPr>
-            <w:tcW w:w="3189" w:type="dxa"/>
+            <w:tcW w:w="3190" w:type="dxa"/>
             <w:tcBorders>
               <w:top w:val="single" w:sz="4" w:space="0" w:color="000000"/>
               <w:start w:val="single" w:sz="4" w:space="0" w:color="000000"/>
@@ -24154,7 +24154,7 @@
         </w:tc>
         <w:tc>
           <w:tcPr>
-            <w:tcW w:w="2034" w:type="dxa"/>
+            <w:tcW w:w="2033" w:type="dxa"/>
             <w:tcBorders>
               <w:top w:val="single" w:sz="4" w:space="0" w:color="000000"/>
               <w:start w:val="single" w:sz="4" w:space="0" w:color="000000"/>
@@ -24177,7 +24177,7 @@
         </w:tc>
         <w:tc>
           <w:tcPr>
-            <w:tcW w:w="1908" w:type="dxa"/>
+            <w:tcW w:w="1909" w:type="dxa"/>
             <w:tcBorders>
               <w:top w:val="single" w:sz="4" w:space="0" w:color="000000"/>
               <w:start w:val="single" w:sz="4" w:space="0" w:color="000000"/>
@@ -24226,7 +24226,7 @@
         <w:trPr/>
         <w:tc>
           <w:tcPr>
-            <w:tcW w:w="1060" w:type="dxa"/>
+            <w:tcW w:w="1059" w:type="dxa"/>
             <w:tcBorders>
               <w:top w:val="single" w:sz="4" w:space="0" w:color="000000"/>
               <w:start w:val="single" w:sz="4" w:space="0" w:color="000000"/>
@@ -24249,7 +24249,7 @@
         </w:tc>
         <w:tc>
           <w:tcPr>
-            <w:tcW w:w="3189" w:type="dxa"/>
+            <w:tcW w:w="3190" w:type="dxa"/>
             <w:tcBorders>
               <w:top w:val="single" w:sz="4" w:space="0" w:color="000000"/>
               <w:start w:val="single" w:sz="4" w:space="0" w:color="000000"/>
@@ -24272,7 +24272,7 @@
         </w:tc>
         <w:tc>
           <w:tcPr>
-            <w:tcW w:w="2034" w:type="dxa"/>
+            <w:tcW w:w="2033" w:type="dxa"/>
             <w:tcBorders>
               <w:top w:val="single" w:sz="4" w:space="0" w:color="000000"/>
               <w:start w:val="single" w:sz="4" w:space="0" w:color="000000"/>
@@ -24295,7 +24295,7 @@
         </w:tc>
         <w:tc>
           <w:tcPr>
-            <w:tcW w:w="1908" w:type="dxa"/>
+            <w:tcW w:w="1909" w:type="dxa"/>
             <w:tcBorders>
               <w:top w:val="single" w:sz="4" w:space="0" w:color="000000"/>
               <w:start w:val="single" w:sz="4" w:space="0" w:color="000000"/>
@@ -24344,7 +24344,7 @@
         <w:trPr/>
         <w:tc>
           <w:tcPr>
-            <w:tcW w:w="1060" w:type="dxa"/>
+            <w:tcW w:w="1059" w:type="dxa"/>
             <w:tcBorders>
               <w:top w:val="single" w:sz="4" w:space="0" w:color="000000"/>
               <w:start w:val="single" w:sz="4" w:space="0" w:color="000000"/>
@@ -24370,7 +24370,7 @@
         </w:tc>
         <w:tc>
           <w:tcPr>
-            <w:tcW w:w="3189" w:type="dxa"/>
+            <w:tcW w:w="3190" w:type="dxa"/>
             <w:tcBorders>
               <w:top w:val="single" w:sz="4" w:space="0" w:color="000000"/>
               <w:start w:val="single" w:sz="4" w:space="0" w:color="000000"/>
@@ -24396,7 +24396,7 @@
         </w:tc>
         <w:tc>
           <w:tcPr>
-            <w:tcW w:w="2034" w:type="dxa"/>
+            <w:tcW w:w="2033" w:type="dxa"/>
             <w:tcBorders>
               <w:top w:val="single" w:sz="4" w:space="0" w:color="000000"/>
               <w:start w:val="single" w:sz="4" w:space="0" w:color="000000"/>
@@ -24422,7 +24422,7 @@
         </w:tc>
         <w:tc>
           <w:tcPr>
-            <w:tcW w:w="1908" w:type="dxa"/>
+            <w:tcW w:w="1909" w:type="dxa"/>
             <w:tcBorders>
               <w:top w:val="single" w:sz="4" w:space="0" w:color="000000"/>
               <w:start w:val="single" w:sz="4" w:space="0" w:color="000000"/>
@@ -24557,8 +24557,8 @@
       </w:tblPr>
       <w:tblGrid>
         <w:gridCol w:w="4929"/>
-        <w:gridCol w:w="1050"/>
-        <w:gridCol w:w="3047"/>
+        <w:gridCol w:w="1049"/>
+        <w:gridCol w:w="3048"/>
       </w:tblGrid>
       <w:tr>
         <w:trPr/>
@@ -24591,7 +24591,7 @@
         </w:tc>
         <w:tc>
           <w:tcPr>
-            <w:tcW w:w="1050" w:type="dxa"/>
+            <w:tcW w:w="1049" w:type="dxa"/>
             <w:tcBorders>
               <w:top w:val="single" w:sz="4" w:space="0" w:color="000000"/>
               <w:start w:val="single" w:sz="4" w:space="0" w:color="000000"/>
@@ -24618,7 +24618,7 @@
         </w:tc>
         <w:tc>
           <w:tcPr>
-            <w:tcW w:w="3047" w:type="dxa"/>
+            <w:tcW w:w="3048" w:type="dxa"/>
             <w:tcBorders>
               <w:top w:val="single" w:sz="4" w:space="0" w:color="000000"/>
               <w:start w:val="single" w:sz="4" w:space="0" w:color="000000"/>
@@ -24671,7 +24671,7 @@
         </w:tc>
         <w:tc>
           <w:tcPr>
-            <w:tcW w:w="1050" w:type="dxa"/>
+            <w:tcW w:w="1049" w:type="dxa"/>
             <w:tcBorders>
               <w:top w:val="single" w:sz="4" w:space="0" w:color="000000"/>
               <w:start w:val="single" w:sz="4" w:space="0" w:color="000000"/>
@@ -24694,7 +24694,7 @@
         </w:tc>
         <w:tc>
           <w:tcPr>
-            <w:tcW w:w="3047" w:type="dxa"/>
+            <w:tcW w:w="3048" w:type="dxa"/>
             <w:tcBorders>
               <w:top w:val="single" w:sz="4" w:space="0" w:color="000000"/>
               <w:start w:val="single" w:sz="4" w:space="0" w:color="000000"/>
@@ -24743,7 +24743,7 @@
         </w:tc>
         <w:tc>
           <w:tcPr>
-            <w:tcW w:w="1050" w:type="dxa"/>
+            <w:tcW w:w="1049" w:type="dxa"/>
             <w:tcBorders>
               <w:top w:val="single" w:sz="4" w:space="0" w:color="000000"/>
               <w:start w:val="single" w:sz="4" w:space="0" w:color="000000"/>
@@ -24766,7 +24766,7 @@
         </w:tc>
         <w:tc>
           <w:tcPr>
-            <w:tcW w:w="3047" w:type="dxa"/>
+            <w:tcW w:w="3048" w:type="dxa"/>
             <w:tcBorders>
               <w:top w:val="single" w:sz="4" w:space="0" w:color="000000"/>
               <w:start w:val="single" w:sz="4" w:space="0" w:color="000000"/>
@@ -24815,7 +24815,7 @@
         </w:tc>
         <w:tc>
           <w:tcPr>
-            <w:tcW w:w="1050" w:type="dxa"/>
+            <w:tcW w:w="1049" w:type="dxa"/>
             <w:tcBorders>
               <w:top w:val="single" w:sz="4" w:space="0" w:color="000000"/>
               <w:start w:val="single" w:sz="4" w:space="0" w:color="000000"/>
@@ -24842,7 +24842,7 @@
         </w:tc>
         <w:tc>
           <w:tcPr>
-            <w:tcW w:w="3047" w:type="dxa"/>
+            <w:tcW w:w="3048" w:type="dxa"/>
             <w:tcBorders>
               <w:top w:val="single" w:sz="4" w:space="0" w:color="000000"/>
               <w:start w:val="single" w:sz="4" w:space="0" w:color="000000"/>
@@ -25021,16 +25021,16 @@
         <w:tblLook w:val="0000" w:noHBand="0" w:noVBand="0" w:firstColumn="0" w:lastRow="0" w:lastColumn="0" w:firstRow="0"/>
       </w:tblPr>
       <w:tblGrid>
-        <w:gridCol w:w="1363"/>
+        <w:gridCol w:w="1362"/>
         <w:gridCol w:w="4049"/>
-        <w:gridCol w:w="1108"/>
+        <w:gridCol w:w="1109"/>
         <w:gridCol w:w="2506"/>
       </w:tblGrid>
       <w:tr>
         <w:trPr/>
         <w:tc>
           <w:tcPr>
-            <w:tcW w:w="1363" w:type="dxa"/>
+            <w:tcW w:w="1362" w:type="dxa"/>
             <w:tcBorders>
               <w:top w:val="single" w:sz="4" w:space="0" w:color="000000"/>
               <w:start w:val="single" w:sz="4" w:space="0" w:color="000000"/>
@@ -25084,7 +25084,7 @@
         </w:tc>
         <w:tc>
           <w:tcPr>
-            <w:tcW w:w="1108" w:type="dxa"/>
+            <w:tcW w:w="1109" w:type="dxa"/>
             <w:tcBorders>
               <w:top w:val="single" w:sz="4" w:space="0" w:color="000000"/>
               <w:start w:val="single" w:sz="4" w:space="0" w:color="000000"/>
@@ -25141,7 +25141,7 @@
         <w:trPr/>
         <w:tc>
           <w:tcPr>
-            <w:tcW w:w="1363" w:type="dxa"/>
+            <w:tcW w:w="1362" w:type="dxa"/>
             <w:tcBorders>
               <w:top w:val="single" w:sz="4" w:space="0" w:color="000000"/>
               <w:start w:val="single" w:sz="4" w:space="0" w:color="000000"/>
@@ -25187,7 +25187,7 @@
         </w:tc>
         <w:tc>
           <w:tcPr>
-            <w:tcW w:w="1108" w:type="dxa"/>
+            <w:tcW w:w="1109" w:type="dxa"/>
             <w:tcBorders>
               <w:top w:val="single" w:sz="4" w:space="0" w:color="000000"/>
               <w:start w:val="single" w:sz="4" w:space="0" w:color="000000"/>
@@ -25236,7 +25236,7 @@
         <w:trPr/>
         <w:tc>
           <w:tcPr>
-            <w:tcW w:w="1363" w:type="dxa"/>
+            <w:tcW w:w="1362" w:type="dxa"/>
             <w:tcBorders>
               <w:top w:val="single" w:sz="4" w:space="0" w:color="000000"/>
               <w:start w:val="single" w:sz="4" w:space="0" w:color="000000"/>
@@ -25282,7 +25282,7 @@
         </w:tc>
         <w:tc>
           <w:tcPr>
-            <w:tcW w:w="1108" w:type="dxa"/>
+            <w:tcW w:w="1109" w:type="dxa"/>
             <w:tcBorders>
               <w:top w:val="single" w:sz="4" w:space="0" w:color="000000"/>
               <w:start w:val="single" w:sz="4" w:space="0" w:color="000000"/>
@@ -25331,7 +25331,7 @@
         <w:trPr/>
         <w:tc>
           <w:tcPr>
-            <w:tcW w:w="1363" w:type="dxa"/>
+            <w:tcW w:w="1362" w:type="dxa"/>
             <w:tcBorders>
               <w:top w:val="single" w:sz="4" w:space="0" w:color="000000"/>
               <w:start w:val="single" w:sz="4" w:space="0" w:color="000000"/>
@@ -25377,7 +25377,7 @@
         </w:tc>
         <w:tc>
           <w:tcPr>
-            <w:tcW w:w="1108" w:type="dxa"/>
+            <w:tcW w:w="1109" w:type="dxa"/>
             <w:tcBorders>
               <w:top w:val="single" w:sz="4" w:space="0" w:color="000000"/>
               <w:start w:val="single" w:sz="4" w:space="0" w:color="000000"/>
@@ -25480,8 +25480,8 @@
       <w:tblGrid>
         <w:gridCol w:w="1824"/>
         <w:gridCol w:w="1213"/>
-        <w:gridCol w:w="3417"/>
-        <w:gridCol w:w="2572"/>
+        <w:gridCol w:w="3416"/>
+        <w:gridCol w:w="2573"/>
       </w:tblGrid>
       <w:tr>
         <w:trPr/>
@@ -25541,7 +25541,7 @@
         </w:tc>
         <w:tc>
           <w:tcPr>
-            <w:tcW w:w="3417" w:type="dxa"/>
+            <w:tcW w:w="3416" w:type="dxa"/>
             <w:tcBorders>
               <w:top w:val="single" w:sz="4" w:space="0" w:color="000000"/>
               <w:start w:val="single" w:sz="4" w:space="0" w:color="000000"/>
@@ -25568,7 +25568,7 @@
         </w:tc>
         <w:tc>
           <w:tcPr>
-            <w:tcW w:w="2572" w:type="dxa"/>
+            <w:tcW w:w="2573" w:type="dxa"/>
             <w:tcBorders>
               <w:top w:val="single" w:sz="4" w:space="0" w:color="000000"/>
               <w:start w:val="single" w:sz="4" w:space="0" w:color="000000"/>
@@ -25644,7 +25644,7 @@
         </w:tc>
         <w:tc>
           <w:tcPr>
-            <w:tcW w:w="3417" w:type="dxa"/>
+            <w:tcW w:w="3416" w:type="dxa"/>
             <w:tcBorders>
               <w:top w:val="single" w:sz="4" w:space="0" w:color="000000"/>
               <w:start w:val="single" w:sz="4" w:space="0" w:color="000000"/>
@@ -25667,7 +25667,7 @@
         </w:tc>
         <w:tc>
           <w:tcPr>
-            <w:tcW w:w="2572" w:type="dxa"/>
+            <w:tcW w:w="2573" w:type="dxa"/>
             <w:tcBorders>
               <w:top w:val="single" w:sz="4" w:space="0" w:color="000000"/>
               <w:start w:val="single" w:sz="4" w:space="0" w:color="000000"/>
@@ -25739,7 +25739,7 @@
         </w:tc>
         <w:tc>
           <w:tcPr>
-            <w:tcW w:w="3417" w:type="dxa"/>
+            <w:tcW w:w="3416" w:type="dxa"/>
             <w:tcBorders>
               <w:top w:val="single" w:sz="4" w:space="0" w:color="000000"/>
               <w:start w:val="single" w:sz="4" w:space="0" w:color="000000"/>
@@ -25762,7 +25762,7 @@
         </w:tc>
         <w:tc>
           <w:tcPr>
-            <w:tcW w:w="2572" w:type="dxa"/>
+            <w:tcW w:w="2573" w:type="dxa"/>
             <w:tcBorders>
               <w:top w:val="single" w:sz="4" w:space="0" w:color="000000"/>
               <w:start w:val="single" w:sz="4" w:space="0" w:color="000000"/>
@@ -25834,7 +25834,7 @@
         </w:tc>
         <w:tc>
           <w:tcPr>
-            <w:tcW w:w="3417" w:type="dxa"/>
+            <w:tcW w:w="3416" w:type="dxa"/>
             <w:tcBorders>
               <w:top w:val="single" w:sz="4" w:space="0" w:color="000000"/>
               <w:start w:val="single" w:sz="4" w:space="0" w:color="000000"/>
@@ -25857,7 +25857,7 @@
         </w:tc>
         <w:tc>
           <w:tcPr>
-            <w:tcW w:w="2572" w:type="dxa"/>
+            <w:tcW w:w="2573" w:type="dxa"/>
             <w:tcBorders>
               <w:top w:val="single" w:sz="4" w:space="0" w:color="000000"/>
               <w:start w:val="single" w:sz="4" w:space="0" w:color="000000"/>
@@ -25929,7 +25929,7 @@
         </w:tc>
         <w:tc>
           <w:tcPr>
-            <w:tcW w:w="3417" w:type="dxa"/>
+            <w:tcW w:w="3416" w:type="dxa"/>
             <w:tcBorders>
               <w:top w:val="single" w:sz="4" w:space="0" w:color="000000"/>
               <w:start w:val="single" w:sz="4" w:space="0" w:color="000000"/>
@@ -25952,7 +25952,7 @@
         </w:tc>
         <w:tc>
           <w:tcPr>
-            <w:tcW w:w="2572" w:type="dxa"/>
+            <w:tcW w:w="2573" w:type="dxa"/>
             <w:tcBorders>
               <w:top w:val="single" w:sz="4" w:space="0" w:color="000000"/>
               <w:start w:val="single" w:sz="4" w:space="0" w:color="000000"/>
@@ -27680,15 +27680,15 @@
         <w:tblLook w:val="0000" w:noHBand="0" w:noVBand="0" w:firstColumn="0" w:lastRow="0" w:lastColumn="0" w:firstRow="0"/>
       </w:tblPr>
       <w:tblGrid>
-        <w:gridCol w:w="2858"/>
-        <w:gridCol w:w="2781"/>
+        <w:gridCol w:w="2857"/>
+        <w:gridCol w:w="2782"/>
         <w:gridCol w:w="3387"/>
       </w:tblGrid>
       <w:tr>
         <w:trPr/>
         <w:tc>
           <w:tcPr>
-            <w:tcW w:w="2858" w:type="dxa"/>
+            <w:tcW w:w="2857" w:type="dxa"/>
             <w:tcBorders>
               <w:top w:val="single" w:sz="4" w:space="0" w:color="000000"/>
               <w:start w:val="single" w:sz="4" w:space="0" w:color="000000"/>
@@ -27715,7 +27715,7 @@
         </w:tc>
         <w:tc>
           <w:tcPr>
-            <w:tcW w:w="2781" w:type="dxa"/>
+            <w:tcW w:w="2782" w:type="dxa"/>
             <w:tcBorders>
               <w:top w:val="single" w:sz="4" w:space="0" w:color="000000"/>
               <w:start w:val="single" w:sz="4" w:space="0" w:color="000000"/>
@@ -27772,7 +27772,7 @@
         <w:trPr/>
         <w:tc>
           <w:tcPr>
-            <w:tcW w:w="2858" w:type="dxa"/>
+            <w:tcW w:w="2857" w:type="dxa"/>
             <w:tcBorders>
               <w:top w:val="single" w:sz="4" w:space="0" w:color="000000"/>
               <w:start w:val="single" w:sz="4" w:space="0" w:color="000000"/>
@@ -27795,7 +27795,7 @@
         </w:tc>
         <w:tc>
           <w:tcPr>
-            <w:tcW w:w="2781" w:type="dxa"/>
+            <w:tcW w:w="2782" w:type="dxa"/>
             <w:tcBorders>
               <w:top w:val="single" w:sz="4" w:space="0" w:color="000000"/>
               <w:start w:val="single" w:sz="4" w:space="0" w:color="000000"/>
@@ -27844,7 +27844,7 @@
         <w:trPr/>
         <w:tc>
           <w:tcPr>
-            <w:tcW w:w="2858" w:type="dxa"/>
+            <w:tcW w:w="2857" w:type="dxa"/>
             <w:tcBorders>
               <w:top w:val="single" w:sz="4" w:space="0" w:color="000000"/>
               <w:start w:val="single" w:sz="4" w:space="0" w:color="000000"/>
@@ -27867,7 +27867,7 @@
         </w:tc>
         <w:tc>
           <w:tcPr>
-            <w:tcW w:w="2781" w:type="dxa"/>
+            <w:tcW w:w="2782" w:type="dxa"/>
             <w:tcBorders>
               <w:top w:val="single" w:sz="4" w:space="0" w:color="000000"/>
               <w:start w:val="single" w:sz="4" w:space="0" w:color="000000"/>
@@ -27916,7 +27916,7 @@
         <w:trPr/>
         <w:tc>
           <w:tcPr>
-            <w:tcW w:w="2858" w:type="dxa"/>
+            <w:tcW w:w="2857" w:type="dxa"/>
             <w:tcBorders>
               <w:top w:val="single" w:sz="4" w:space="0" w:color="000000"/>
               <w:start w:val="single" w:sz="4" w:space="0" w:color="000000"/>
@@ -27939,7 +27939,7 @@
         </w:tc>
         <w:tc>
           <w:tcPr>
-            <w:tcW w:w="2781" w:type="dxa"/>
+            <w:tcW w:w="2782" w:type="dxa"/>
             <w:tcBorders>
               <w:top w:val="single" w:sz="4" w:space="0" w:color="000000"/>
               <w:start w:val="single" w:sz="4" w:space="0" w:color="000000"/>
@@ -27988,7 +27988,7 @@
         <w:trPr/>
         <w:tc>
           <w:tcPr>
-            <w:tcW w:w="2858" w:type="dxa"/>
+            <w:tcW w:w="2857" w:type="dxa"/>
             <w:tcBorders>
               <w:top w:val="single" w:sz="4" w:space="0" w:color="000000"/>
               <w:start w:val="single" w:sz="4" w:space="0" w:color="000000"/>
@@ -28011,7 +28011,7 @@
         </w:tc>
         <w:tc>
           <w:tcPr>
-            <w:tcW w:w="2781" w:type="dxa"/>
+            <w:tcW w:w="2782" w:type="dxa"/>
             <w:tcBorders>
               <w:top w:val="single" w:sz="4" w:space="0" w:color="000000"/>
               <w:start w:val="single" w:sz="4" w:space="0" w:color="000000"/>
@@ -28060,7 +28060,7 @@
         <w:trPr/>
         <w:tc>
           <w:tcPr>
-            <w:tcW w:w="2858" w:type="dxa"/>
+            <w:tcW w:w="2857" w:type="dxa"/>
             <w:tcBorders>
               <w:top w:val="single" w:sz="4" w:space="0" w:color="000000"/>
               <w:start w:val="single" w:sz="4" w:space="0" w:color="000000"/>
@@ -28083,7 +28083,7 @@
         </w:tc>
         <w:tc>
           <w:tcPr>
-            <w:tcW w:w="2781" w:type="dxa"/>
+            <w:tcW w:w="2782" w:type="dxa"/>
             <w:tcBorders>
               <w:top w:val="single" w:sz="4" w:space="0" w:color="000000"/>
               <w:start w:val="single" w:sz="4" w:space="0" w:color="000000"/>
@@ -28132,7 +28132,7 @@
         <w:trPr/>
         <w:tc>
           <w:tcPr>
-            <w:tcW w:w="2858" w:type="dxa"/>
+            <w:tcW w:w="2857" w:type="dxa"/>
             <w:tcBorders>
               <w:top w:val="single" w:sz="4" w:space="0" w:color="000000"/>
               <w:start w:val="single" w:sz="4" w:space="0" w:color="000000"/>
@@ -28155,7 +28155,7 @@
         </w:tc>
         <w:tc>
           <w:tcPr>
-            <w:tcW w:w="2781" w:type="dxa"/>
+            <w:tcW w:w="2782" w:type="dxa"/>
             <w:tcBorders>
               <w:top w:val="single" w:sz="4" w:space="0" w:color="000000"/>
               <w:start w:val="single" w:sz="4" w:space="0" w:color="000000"/>
@@ -28204,7 +28204,7 @@
         <w:trPr/>
         <w:tc>
           <w:tcPr>
-            <w:tcW w:w="2858" w:type="dxa"/>
+            <w:tcW w:w="2857" w:type="dxa"/>
             <w:tcBorders>
               <w:top w:val="single" w:sz="4" w:space="0" w:color="000000"/>
               <w:start w:val="single" w:sz="4" w:space="0" w:color="000000"/>
@@ -28227,7 +28227,7 @@
         </w:tc>
         <w:tc>
           <w:tcPr>
-            <w:tcW w:w="2781" w:type="dxa"/>
+            <w:tcW w:w="2782" w:type="dxa"/>
             <w:tcBorders>
               <w:top w:val="single" w:sz="4" w:space="0" w:color="000000"/>
               <w:start w:val="single" w:sz="4" w:space="0" w:color="000000"/>
@@ -28276,7 +28276,7 @@
         <w:trPr/>
         <w:tc>
           <w:tcPr>
-            <w:tcW w:w="2858" w:type="dxa"/>
+            <w:tcW w:w="2857" w:type="dxa"/>
             <w:tcBorders>
               <w:top w:val="single" w:sz="4" w:space="0" w:color="000000"/>
               <w:start w:val="single" w:sz="4" w:space="0" w:color="000000"/>
@@ -28299,7 +28299,7 @@
         </w:tc>
         <w:tc>
           <w:tcPr>
-            <w:tcW w:w="2781" w:type="dxa"/>
+            <w:tcW w:w="2782" w:type="dxa"/>
             <w:tcBorders>
               <w:top w:val="single" w:sz="4" w:space="0" w:color="000000"/>
               <w:start w:val="single" w:sz="4" w:space="0" w:color="000000"/>
@@ -28348,7 +28348,7 @@
         <w:trPr/>
         <w:tc>
           <w:tcPr>
-            <w:tcW w:w="2858" w:type="dxa"/>
+            <w:tcW w:w="2857" w:type="dxa"/>
             <w:tcBorders>
               <w:top w:val="single" w:sz="4" w:space="0" w:color="000000"/>
               <w:start w:val="single" w:sz="4" w:space="0" w:color="000000"/>
@@ -28371,7 +28371,7 @@
         </w:tc>
         <w:tc>
           <w:tcPr>
-            <w:tcW w:w="2781" w:type="dxa"/>
+            <w:tcW w:w="2782" w:type="dxa"/>
             <w:tcBorders>
               <w:top w:val="single" w:sz="4" w:space="0" w:color="000000"/>
               <w:start w:val="single" w:sz="4" w:space="0" w:color="000000"/>
@@ -28420,7 +28420,7 @@
         <w:trPr/>
         <w:tc>
           <w:tcPr>
-            <w:tcW w:w="2858" w:type="dxa"/>
+            <w:tcW w:w="2857" w:type="dxa"/>
             <w:tcBorders>
               <w:top w:val="single" w:sz="4" w:space="0" w:color="000000"/>
               <w:start w:val="single" w:sz="4" w:space="0" w:color="000000"/>
@@ -28443,7 +28443,7 @@
         </w:tc>
         <w:tc>
           <w:tcPr>
-            <w:tcW w:w="2781" w:type="dxa"/>
+            <w:tcW w:w="2782" w:type="dxa"/>
             <w:tcBorders>
               <w:top w:val="single" w:sz="4" w:space="0" w:color="000000"/>
               <w:start w:val="single" w:sz="4" w:space="0" w:color="000000"/>
@@ -28492,7 +28492,7 @@
         <w:trPr/>
         <w:tc>
           <w:tcPr>
-            <w:tcW w:w="2858" w:type="dxa"/>
+            <w:tcW w:w="2857" w:type="dxa"/>
             <w:tcBorders>
               <w:top w:val="single" w:sz="4" w:space="0" w:color="000000"/>
               <w:start w:val="single" w:sz="4" w:space="0" w:color="000000"/>
@@ -28515,7 +28515,7 @@
         </w:tc>
         <w:tc>
           <w:tcPr>
-            <w:tcW w:w="2781" w:type="dxa"/>
+            <w:tcW w:w="2782" w:type="dxa"/>
             <w:tcBorders>
               <w:top w:val="single" w:sz="4" w:space="0" w:color="000000"/>
               <w:start w:val="single" w:sz="4" w:space="0" w:color="000000"/>
@@ -28632,8 +28632,8 @@
       </w:tblPr>
       <w:tblGrid>
         <w:gridCol w:w="537"/>
-        <w:gridCol w:w="2561"/>
-        <w:gridCol w:w="1654"/>
+        <w:gridCol w:w="2560"/>
+        <w:gridCol w:w="1655"/>
         <w:gridCol w:w="3439"/>
         <w:gridCol w:w="835"/>
       </w:tblGrid>
@@ -28668,7 +28668,7 @@
         </w:tc>
         <w:tc>
           <w:tcPr>
-            <w:tcW w:w="2561" w:type="dxa"/>
+            <w:tcW w:w="2560" w:type="dxa"/>
             <w:tcBorders>
               <w:top w:val="single" w:sz="4" w:space="0" w:color="000000"/>
               <w:start w:val="single" w:sz="4" w:space="0" w:color="000000"/>
@@ -28695,7 +28695,7 @@
         </w:tc>
         <w:tc>
           <w:tcPr>
-            <w:tcW w:w="1654" w:type="dxa"/>
+            <w:tcW w:w="1655" w:type="dxa"/>
             <w:tcBorders>
               <w:top w:val="single" w:sz="4" w:space="0" w:color="000000"/>
               <w:start w:val="single" w:sz="4" w:space="0" w:color="000000"/>
@@ -28802,7 +28802,7 @@
         </w:tc>
         <w:tc>
           <w:tcPr>
-            <w:tcW w:w="2561" w:type="dxa"/>
+            <w:tcW w:w="2560" w:type="dxa"/>
             <w:tcBorders>
               <w:top w:val="single" w:sz="4" w:space="0" w:color="000000"/>
               <w:start w:val="single" w:sz="4" w:space="0" w:color="000000"/>
@@ -28825,7 +28825,7 @@
         </w:tc>
         <w:tc>
           <w:tcPr>
-            <w:tcW w:w="1654" w:type="dxa"/>
+            <w:tcW w:w="1655" w:type="dxa"/>
             <w:tcBorders>
               <w:top w:val="single" w:sz="4" w:space="0" w:color="000000"/>
               <w:start w:val="single" w:sz="4" w:space="0" w:color="000000"/>
@@ -28924,7 +28924,7 @@
         </w:tc>
         <w:tc>
           <w:tcPr>
-            <w:tcW w:w="2561" w:type="dxa"/>
+            <w:tcW w:w="2560" w:type="dxa"/>
             <w:tcBorders>
               <w:top w:val="single" w:sz="4" w:space="0" w:color="000000"/>
               <w:start w:val="single" w:sz="4" w:space="0" w:color="000000"/>
@@ -28947,7 +28947,7 @@
         </w:tc>
         <w:tc>
           <w:tcPr>
-            <w:tcW w:w="1654" w:type="dxa"/>
+            <w:tcW w:w="1655" w:type="dxa"/>
             <w:tcBorders>
               <w:top w:val="single" w:sz="4" w:space="0" w:color="000000"/>
               <w:start w:val="single" w:sz="4" w:space="0" w:color="000000"/>
@@ -29050,7 +29050,7 @@
         </w:tc>
         <w:tc>
           <w:tcPr>
-            <w:tcW w:w="2561" w:type="dxa"/>
+            <w:tcW w:w="2560" w:type="dxa"/>
             <w:tcBorders>
               <w:top w:val="single" w:sz="4" w:space="0" w:color="000000"/>
               <w:start w:val="single" w:sz="4" w:space="0" w:color="000000"/>
@@ -29073,7 +29073,7 @@
         </w:tc>
         <w:tc>
           <w:tcPr>
-            <w:tcW w:w="1654" w:type="dxa"/>
+            <w:tcW w:w="1655" w:type="dxa"/>
             <w:tcBorders>
               <w:top w:val="single" w:sz="4" w:space="0" w:color="000000"/>
               <w:start w:val="single" w:sz="4" w:space="0" w:color="000000"/>
@@ -29168,7 +29168,7 @@
         </w:tc>
         <w:tc>
           <w:tcPr>
-            <w:tcW w:w="2561" w:type="dxa"/>
+            <w:tcW w:w="2560" w:type="dxa"/>
             <w:tcBorders>
               <w:top w:val="single" w:sz="4" w:space="0" w:color="000000"/>
               <w:start w:val="single" w:sz="4" w:space="0" w:color="000000"/>
@@ -29191,7 +29191,7 @@
         </w:tc>
         <w:tc>
           <w:tcPr>
-            <w:tcW w:w="1654" w:type="dxa"/>
+            <w:tcW w:w="1655" w:type="dxa"/>
             <w:tcBorders>
               <w:top w:val="single" w:sz="4" w:space="0" w:color="000000"/>
               <w:start w:val="single" w:sz="4" w:space="0" w:color="000000"/>
@@ -29290,7 +29290,7 @@
         </w:tc>
         <w:tc>
           <w:tcPr>
-            <w:tcW w:w="2561" w:type="dxa"/>
+            <w:tcW w:w="2560" w:type="dxa"/>
             <w:tcBorders>
               <w:top w:val="single" w:sz="4" w:space="0" w:color="000000"/>
               <w:start w:val="single" w:sz="4" w:space="0" w:color="000000"/>
@@ -29313,7 +29313,7 @@
         </w:tc>
         <w:tc>
           <w:tcPr>
-            <w:tcW w:w="1654" w:type="dxa"/>
+            <w:tcW w:w="1655" w:type="dxa"/>
             <w:tcBorders>
               <w:top w:val="single" w:sz="4" w:space="0" w:color="000000"/>
               <w:start w:val="single" w:sz="4" w:space="0" w:color="000000"/>
@@ -29412,7 +29412,7 @@
         </w:tc>
         <w:tc>
           <w:tcPr>
-            <w:tcW w:w="2561" w:type="dxa"/>
+            <w:tcW w:w="2560" w:type="dxa"/>
             <w:tcBorders>
               <w:top w:val="single" w:sz="4" w:space="0" w:color="000000"/>
               <w:start w:val="single" w:sz="4" w:space="0" w:color="000000"/>
@@ -29435,7 +29435,7 @@
         </w:tc>
         <w:tc>
           <w:tcPr>
-            <w:tcW w:w="1654" w:type="dxa"/>
+            <w:tcW w:w="1655" w:type="dxa"/>
             <w:tcBorders>
               <w:top w:val="single" w:sz="4" w:space="0" w:color="000000"/>
               <w:start w:val="single" w:sz="4" w:space="0" w:color="000000"/>
@@ -29534,7 +29534,7 @@
         </w:tc>
         <w:tc>
           <w:tcPr>
-            <w:tcW w:w="2561" w:type="dxa"/>
+            <w:tcW w:w="2560" w:type="dxa"/>
             <w:tcBorders>
               <w:top w:val="single" w:sz="4" w:space="0" w:color="000000"/>
               <w:start w:val="single" w:sz="4" w:space="0" w:color="000000"/>
@@ -29557,7 +29557,7 @@
         </w:tc>
         <w:tc>
           <w:tcPr>
-            <w:tcW w:w="1654" w:type="dxa"/>
+            <w:tcW w:w="1655" w:type="dxa"/>
             <w:tcBorders>
               <w:top w:val="single" w:sz="4" w:space="0" w:color="000000"/>
               <w:start w:val="single" w:sz="4" w:space="0" w:color="000000"/>
@@ -29652,7 +29652,7 @@
         </w:tc>
         <w:tc>
           <w:tcPr>
-            <w:tcW w:w="2561" w:type="dxa"/>
+            <w:tcW w:w="2560" w:type="dxa"/>
             <w:tcBorders>
               <w:top w:val="single" w:sz="4" w:space="0" w:color="000000"/>
               <w:start w:val="single" w:sz="4" w:space="0" w:color="000000"/>
@@ -29675,7 +29675,7 @@
         </w:tc>
         <w:tc>
           <w:tcPr>
-            <w:tcW w:w="1654" w:type="dxa"/>
+            <w:tcW w:w="1655" w:type="dxa"/>
             <w:tcBorders>
               <w:top w:val="single" w:sz="4" w:space="0" w:color="000000"/>
               <w:start w:val="single" w:sz="4" w:space="0" w:color="000000"/>
@@ -29774,7 +29774,7 @@
         </w:tc>
         <w:tc>
           <w:tcPr>
-            <w:tcW w:w="2561" w:type="dxa"/>
+            <w:tcW w:w="2560" w:type="dxa"/>
             <w:tcBorders>
               <w:top w:val="single" w:sz="4" w:space="0" w:color="000000"/>
               <w:start w:val="single" w:sz="4" w:space="0" w:color="000000"/>
@@ -29797,7 +29797,7 @@
         </w:tc>
         <w:tc>
           <w:tcPr>
-            <w:tcW w:w="1654" w:type="dxa"/>
+            <w:tcW w:w="1655" w:type="dxa"/>
             <w:tcBorders>
               <w:top w:val="single" w:sz="4" w:space="0" w:color="000000"/>
               <w:start w:val="single" w:sz="4" w:space="0" w:color="000000"/>
@@ -31253,6 +31253,18 @@
       <w:r>
         <w:rPr/>
         <w:t>. Organización Mundial de la Salud, Ginebra.</w:t>
+      </w:r>
+    </w:p>
+    <w:p>
+      <w:pPr>
+        <w:pStyle w:val="Normal"/>
+        <w:spacing w:before="0" w:after="200"/>
+        <w:jc w:val="both"/>
+        <w:rPr/>
+      </w:pPr>
+      <w:r>
+        <w:rPr/>
+        <w:t>Ramírez-Faz, J., Fernández-Ahumada, L. M., Fernández-Ahumada, E., &amp; López-Luque, R. (2020). Monitoring of temperature in retail refrigerated cabinets applying IoT over open-source hardware and software. Sensors, 20(3), 846. https://doi.org/10.3390/s20030846</w:t>
       </w:r>
     </w:p>
     <w:p>
@@ -32175,15 +32187,15 @@
         <w:tblLook w:val="0000" w:noHBand="0" w:noVBand="0" w:firstColumn="0" w:lastRow="0" w:lastColumn="0" w:firstRow="0"/>
       </w:tblPr>
       <w:tblGrid>
-        <w:gridCol w:w="2024"/>
+        <w:gridCol w:w="2023"/>
         <w:gridCol w:w="2203"/>
-        <w:gridCol w:w="4799"/>
+        <w:gridCol w:w="4800"/>
       </w:tblGrid>
       <w:tr>
         <w:trPr/>
         <w:tc>
           <w:tcPr>
-            <w:tcW w:w="2024" w:type="dxa"/>
+            <w:tcW w:w="2023" w:type="dxa"/>
             <w:tcBorders>
               <w:top w:val="single" w:sz="4" w:space="0" w:color="000000"/>
               <w:start w:val="single" w:sz="4" w:space="0" w:color="000000"/>
@@ -32237,7 +32249,7 @@
         </w:tc>
         <w:tc>
           <w:tcPr>
-            <w:tcW w:w="4799" w:type="dxa"/>
+            <w:tcW w:w="4800" w:type="dxa"/>
             <w:tcBorders>
               <w:top w:val="single" w:sz="4" w:space="0" w:color="000000"/>
               <w:start w:val="single" w:sz="4" w:space="0" w:color="000000"/>
@@ -32267,7 +32279,7 @@
         <w:trPr/>
         <w:tc>
           <w:tcPr>
-            <w:tcW w:w="2024" w:type="dxa"/>
+            <w:tcW w:w="2023" w:type="dxa"/>
             <w:tcBorders>
               <w:top w:val="single" w:sz="4" w:space="0" w:color="000000"/>
               <w:start w:val="single" w:sz="4" w:space="0" w:color="000000"/>
@@ -32313,7 +32325,7 @@
         </w:tc>
         <w:tc>
           <w:tcPr>
-            <w:tcW w:w="4799" w:type="dxa"/>
+            <w:tcW w:w="4800" w:type="dxa"/>
             <w:tcBorders>
               <w:top w:val="single" w:sz="4" w:space="0" w:color="000000"/>
               <w:start w:val="single" w:sz="4" w:space="0" w:color="000000"/>
@@ -32339,7 +32351,7 @@
         <w:trPr/>
         <w:tc>
           <w:tcPr>
-            <w:tcW w:w="2024" w:type="dxa"/>
+            <w:tcW w:w="2023" w:type="dxa"/>
             <w:tcBorders>
               <w:top w:val="single" w:sz="4" w:space="0" w:color="000000"/>
               <w:start w:val="single" w:sz="4" w:space="0" w:color="000000"/>
@@ -32385,7 +32397,7 @@
         </w:tc>
         <w:tc>
           <w:tcPr>
-            <w:tcW w:w="4799" w:type="dxa"/>
+            <w:tcW w:w="4800" w:type="dxa"/>
             <w:tcBorders>
               <w:top w:val="single" w:sz="4" w:space="0" w:color="000000"/>
               <w:start w:val="single" w:sz="4" w:space="0" w:color="000000"/>
@@ -32411,7 +32423,7 @@
         <w:trPr/>
         <w:tc>
           <w:tcPr>
-            <w:tcW w:w="2024" w:type="dxa"/>
+            <w:tcW w:w="2023" w:type="dxa"/>
             <w:tcBorders>
               <w:top w:val="single" w:sz="4" w:space="0" w:color="000000"/>
               <w:start w:val="single" w:sz="4" w:space="0" w:color="000000"/>
@@ -32457,7 +32469,7 @@
         </w:tc>
         <w:tc>
           <w:tcPr>
-            <w:tcW w:w="4799" w:type="dxa"/>
+            <w:tcW w:w="4800" w:type="dxa"/>
             <w:tcBorders>
               <w:top w:val="single" w:sz="4" w:space="0" w:color="000000"/>
               <w:start w:val="single" w:sz="4" w:space="0" w:color="000000"/>
@@ -32483,7 +32495,7 @@
         <w:trPr/>
         <w:tc>
           <w:tcPr>
-            <w:tcW w:w="2024" w:type="dxa"/>
+            <w:tcW w:w="2023" w:type="dxa"/>
             <w:tcBorders>
               <w:top w:val="single" w:sz="4" w:space="0" w:color="000000"/>
               <w:start w:val="single" w:sz="4" w:space="0" w:color="000000"/>
@@ -32529,7 +32541,7 @@
         </w:tc>
         <w:tc>
           <w:tcPr>
-            <w:tcW w:w="4799" w:type="dxa"/>
+            <w:tcW w:w="4800" w:type="dxa"/>
             <w:tcBorders>
               <w:top w:val="single" w:sz="4" w:space="0" w:color="000000"/>
               <w:start w:val="single" w:sz="4" w:space="0" w:color="000000"/>
@@ -32866,15 +32878,15 @@
         <w:tblLook w:val="0000" w:noHBand="0" w:noVBand="0" w:firstColumn="0" w:lastRow="0" w:lastColumn="0" w:firstRow="0"/>
       </w:tblPr>
       <w:tblGrid>
-        <w:gridCol w:w="1578"/>
+        <w:gridCol w:w="1577"/>
         <w:gridCol w:w="2713"/>
-        <w:gridCol w:w="4735"/>
+        <w:gridCol w:w="4736"/>
       </w:tblGrid>
       <w:tr>
         <w:trPr/>
         <w:tc>
           <w:tcPr>
-            <w:tcW w:w="1578" w:type="dxa"/>
+            <w:tcW w:w="1577" w:type="dxa"/>
             <w:tcBorders>
               <w:top w:val="single" w:sz="4" w:space="0" w:color="000000"/>
               <w:start w:val="single" w:sz="4" w:space="0" w:color="000000"/>
@@ -32928,7 +32940,7 @@
         </w:tc>
         <w:tc>
           <w:tcPr>
-            <w:tcW w:w="4735" w:type="dxa"/>
+            <w:tcW w:w="4736" w:type="dxa"/>
             <w:tcBorders>
               <w:top w:val="single" w:sz="4" w:space="0" w:color="000000"/>
               <w:start w:val="single" w:sz="4" w:space="0" w:color="000000"/>
@@ -32958,7 +32970,7 @@
         <w:trPr/>
         <w:tc>
           <w:tcPr>
-            <w:tcW w:w="1578" w:type="dxa"/>
+            <w:tcW w:w="1577" w:type="dxa"/>
             <w:tcBorders>
               <w:top w:val="single" w:sz="4" w:space="0" w:color="000000"/>
               <w:start w:val="single" w:sz="4" w:space="0" w:color="000000"/>
@@ -33004,7 +33016,7 @@
         </w:tc>
         <w:tc>
           <w:tcPr>
-            <w:tcW w:w="4735" w:type="dxa"/>
+            <w:tcW w:w="4736" w:type="dxa"/>
             <w:tcBorders>
               <w:top w:val="single" w:sz="4" w:space="0" w:color="000000"/>
               <w:start w:val="single" w:sz="4" w:space="0" w:color="000000"/>
@@ -33030,7 +33042,7 @@
         <w:trPr/>
         <w:tc>
           <w:tcPr>
-            <w:tcW w:w="1578" w:type="dxa"/>
+            <w:tcW w:w="1577" w:type="dxa"/>
             <w:tcBorders>
               <w:top w:val="single" w:sz="4" w:space="0" w:color="000000"/>
               <w:start w:val="single" w:sz="4" w:space="0" w:color="000000"/>
@@ -33076,7 +33088,7 @@
         </w:tc>
         <w:tc>
           <w:tcPr>
-            <w:tcW w:w="4735" w:type="dxa"/>
+            <w:tcW w:w="4736" w:type="dxa"/>
             <w:tcBorders>
               <w:top w:val="single" w:sz="4" w:space="0" w:color="000000"/>
               <w:start w:val="single" w:sz="4" w:space="0" w:color="000000"/>
@@ -33102,7 +33114,7 @@
         <w:trPr/>
         <w:tc>
           <w:tcPr>
-            <w:tcW w:w="1578" w:type="dxa"/>
+            <w:tcW w:w="1577" w:type="dxa"/>
             <w:tcBorders>
               <w:top w:val="single" w:sz="4" w:space="0" w:color="000000"/>
               <w:start w:val="single" w:sz="4" w:space="0" w:color="000000"/>
@@ -33148,7 +33160,7 @@
         </w:tc>
         <w:tc>
           <w:tcPr>
-            <w:tcW w:w="4735" w:type="dxa"/>
+            <w:tcW w:w="4736" w:type="dxa"/>
             <w:tcBorders>
               <w:top w:val="single" w:sz="4" w:space="0" w:color="000000"/>
               <w:start w:val="single" w:sz="4" w:space="0" w:color="000000"/>
@@ -33174,7 +33186,7 @@
         <w:trPr/>
         <w:tc>
           <w:tcPr>
-            <w:tcW w:w="1578" w:type="dxa"/>
+            <w:tcW w:w="1577" w:type="dxa"/>
             <w:tcBorders>
               <w:top w:val="single" w:sz="4" w:space="0" w:color="000000"/>
               <w:start w:val="single" w:sz="4" w:space="0" w:color="000000"/>
@@ -33220,7 +33232,7 @@
         </w:tc>
         <w:tc>
           <w:tcPr>
-            <w:tcW w:w="4735" w:type="dxa"/>
+            <w:tcW w:w="4736" w:type="dxa"/>
             <w:tcBorders>
               <w:top w:val="single" w:sz="4" w:space="0" w:color="000000"/>
               <w:start w:val="single" w:sz="4" w:space="0" w:color="000000"/>
@@ -33246,7 +33258,7 @@
         <w:trPr/>
         <w:tc>
           <w:tcPr>
-            <w:tcW w:w="1578" w:type="dxa"/>
+            <w:tcW w:w="1577" w:type="dxa"/>
             <w:tcBorders>
               <w:top w:val="single" w:sz="4" w:space="0" w:color="000000"/>
               <w:start w:val="single" w:sz="4" w:space="0" w:color="000000"/>
@@ -33292,7 +33304,7 @@
         </w:tc>
         <w:tc>
           <w:tcPr>
-            <w:tcW w:w="4735" w:type="dxa"/>
+            <w:tcW w:w="4736" w:type="dxa"/>
             <w:tcBorders>
               <w:top w:val="single" w:sz="4" w:space="0" w:color="000000"/>
               <w:start w:val="single" w:sz="4" w:space="0" w:color="000000"/>
@@ -33318,7 +33330,7 @@
         <w:trPr/>
         <w:tc>
           <w:tcPr>
-            <w:tcW w:w="1578" w:type="dxa"/>
+            <w:tcW w:w="1577" w:type="dxa"/>
             <w:tcBorders>
               <w:top w:val="single" w:sz="4" w:space="0" w:color="000000"/>
               <w:start w:val="single" w:sz="4" w:space="0" w:color="000000"/>
@@ -33364,7 +33376,7 @@
         </w:tc>
         <w:tc>
           <w:tcPr>
-            <w:tcW w:w="4735" w:type="dxa"/>
+            <w:tcW w:w="4736" w:type="dxa"/>
             <w:tcBorders>
               <w:top w:val="single" w:sz="4" w:space="0" w:color="000000"/>
               <w:start w:val="single" w:sz="4" w:space="0" w:color="000000"/>
@@ -33604,8 +33616,8 @@
       </w:tblPr>
       <w:tblGrid>
         <w:gridCol w:w="1821"/>
-        <w:gridCol w:w="2944"/>
-        <w:gridCol w:w="4261"/>
+        <w:gridCol w:w="2943"/>
+        <w:gridCol w:w="4262"/>
       </w:tblGrid>
       <w:tr>
         <w:trPr/>
@@ -33638,7 +33650,7 @@
         </w:tc>
         <w:tc>
           <w:tcPr>
-            <w:tcW w:w="2944" w:type="dxa"/>
+            <w:tcW w:w="2943" w:type="dxa"/>
             <w:tcBorders>
               <w:top w:val="single" w:sz="4" w:space="0" w:color="000000"/>
               <w:start w:val="single" w:sz="4" w:space="0" w:color="000000"/>
@@ -33665,7 +33677,7 @@
         </w:tc>
         <w:tc>
           <w:tcPr>
-            <w:tcW w:w="4261" w:type="dxa"/>
+            <w:tcW w:w="4262" w:type="dxa"/>
             <w:tcBorders>
               <w:top w:val="single" w:sz="4" w:space="0" w:color="000000"/>
               <w:start w:val="single" w:sz="4" w:space="0" w:color="000000"/>
@@ -33718,7 +33730,7 @@
         </w:tc>
         <w:tc>
           <w:tcPr>
-            <w:tcW w:w="2944" w:type="dxa"/>
+            <w:tcW w:w="2943" w:type="dxa"/>
             <w:tcBorders>
               <w:top w:val="single" w:sz="4" w:space="0" w:color="000000"/>
               <w:start w:val="single" w:sz="4" w:space="0" w:color="000000"/>
@@ -33741,7 +33753,7 @@
         </w:tc>
         <w:tc>
           <w:tcPr>
-            <w:tcW w:w="4261" w:type="dxa"/>
+            <w:tcW w:w="4262" w:type="dxa"/>
             <w:tcBorders>
               <w:top w:val="single" w:sz="4" w:space="0" w:color="000000"/>
               <w:start w:val="single" w:sz="4" w:space="0" w:color="000000"/>
@@ -33790,7 +33802,7 @@
         </w:tc>
         <w:tc>
           <w:tcPr>
-            <w:tcW w:w="2944" w:type="dxa"/>
+            <w:tcW w:w="2943" w:type="dxa"/>
             <w:tcBorders>
               <w:top w:val="single" w:sz="4" w:space="0" w:color="000000"/>
               <w:start w:val="single" w:sz="4" w:space="0" w:color="000000"/>
@@ -33813,7 +33825,7 @@
         </w:tc>
         <w:tc>
           <w:tcPr>
-            <w:tcW w:w="4261" w:type="dxa"/>
+            <w:tcW w:w="4262" w:type="dxa"/>
             <w:tcBorders>
               <w:top w:val="single" w:sz="4" w:space="0" w:color="000000"/>
               <w:start w:val="single" w:sz="4" w:space="0" w:color="000000"/>
@@ -33862,7 +33874,7 @@
         </w:tc>
         <w:tc>
           <w:tcPr>
-            <w:tcW w:w="2944" w:type="dxa"/>
+            <w:tcW w:w="2943" w:type="dxa"/>
             <w:tcBorders>
               <w:top w:val="single" w:sz="4" w:space="0" w:color="000000"/>
               <w:start w:val="single" w:sz="4" w:space="0" w:color="000000"/>
@@ -33885,7 +33897,7 @@
         </w:tc>
         <w:tc>
           <w:tcPr>
-            <w:tcW w:w="4261" w:type="dxa"/>
+            <w:tcW w:w="4262" w:type="dxa"/>
             <w:tcBorders>
               <w:top w:val="single" w:sz="4" w:space="0" w:color="000000"/>
               <w:start w:val="single" w:sz="4" w:space="0" w:color="000000"/>
@@ -33934,7 +33946,7 @@
         </w:tc>
         <w:tc>
           <w:tcPr>
-            <w:tcW w:w="2944" w:type="dxa"/>
+            <w:tcW w:w="2943" w:type="dxa"/>
             <w:tcBorders>
               <w:top w:val="single" w:sz="4" w:space="0" w:color="000000"/>
               <w:start w:val="single" w:sz="4" w:space="0" w:color="000000"/>
@@ -33957,7 +33969,7 @@
         </w:tc>
         <w:tc>
           <w:tcPr>
-            <w:tcW w:w="4261" w:type="dxa"/>
+            <w:tcW w:w="4262" w:type="dxa"/>
             <w:tcBorders>
               <w:top w:val="single" w:sz="4" w:space="0" w:color="000000"/>
               <w:start w:val="single" w:sz="4" w:space="0" w:color="000000"/>
@@ -34005,7 +34017,7 @@
         </w:tc>
         <w:tc>
           <w:tcPr>
-            <w:tcW w:w="2944" w:type="dxa"/>
+            <w:tcW w:w="2943" w:type="dxa"/>
             <w:tcBorders>
               <w:top w:val="single" w:sz="4" w:space="0" w:color="000000"/>
               <w:start w:val="single" w:sz="4" w:space="0" w:color="000000"/>
@@ -34028,7 +34040,7 @@
         </w:tc>
         <w:tc>
           <w:tcPr>
-            <w:tcW w:w="4261" w:type="dxa"/>
+            <w:tcW w:w="4262" w:type="dxa"/>
             <w:tcBorders>
               <w:top w:val="single" w:sz="4" w:space="0" w:color="000000"/>
               <w:start w:val="single" w:sz="4" w:space="0" w:color="000000"/>
@@ -34077,7 +34089,7 @@
         </w:tc>
         <w:tc>
           <w:tcPr>
-            <w:tcW w:w="2944" w:type="dxa"/>
+            <w:tcW w:w="2943" w:type="dxa"/>
             <w:tcBorders>
               <w:top w:val="single" w:sz="4" w:space="0" w:color="000000"/>
               <w:start w:val="single" w:sz="4" w:space="0" w:color="000000"/>
@@ -34100,7 +34112,7 @@
         </w:tc>
         <w:tc>
           <w:tcPr>
-            <w:tcW w:w="4261" w:type="dxa"/>
+            <w:tcW w:w="4262" w:type="dxa"/>
             <w:tcBorders>
               <w:top w:val="single" w:sz="4" w:space="0" w:color="000000"/>
               <w:start w:val="single" w:sz="4" w:space="0" w:color="000000"/>
@@ -35443,15 +35455,15 @@
         <w:tblLook w:val="0000" w:noHBand="0" w:noVBand="0" w:firstColumn="0" w:lastRow="0" w:lastColumn="0" w:firstRow="0"/>
       </w:tblPr>
       <w:tblGrid>
-        <w:gridCol w:w="3827"/>
+        <w:gridCol w:w="3826"/>
         <w:gridCol w:w="3801"/>
-        <w:gridCol w:w="1398"/>
+        <w:gridCol w:w="1399"/>
       </w:tblGrid>
       <w:tr>
         <w:trPr/>
         <w:tc>
           <w:tcPr>
-            <w:tcW w:w="3827" w:type="dxa"/>
+            <w:tcW w:w="3826" w:type="dxa"/>
             <w:tcBorders>
               <w:top w:val="single" w:sz="4" w:space="0" w:color="000000"/>
               <w:start w:val="single" w:sz="4" w:space="0" w:color="000000"/>
@@ -35505,7 +35517,7 @@
         </w:tc>
         <w:tc>
           <w:tcPr>
-            <w:tcW w:w="1398" w:type="dxa"/>
+            <w:tcW w:w="1399" w:type="dxa"/>
             <w:tcBorders>
               <w:top w:val="single" w:sz="4" w:space="0" w:color="000000"/>
               <w:start w:val="single" w:sz="4" w:space="0" w:color="000000"/>
@@ -35535,7 +35547,7 @@
         <w:trPr/>
         <w:tc>
           <w:tcPr>
-            <w:tcW w:w="3827" w:type="dxa"/>
+            <w:tcW w:w="3826" w:type="dxa"/>
             <w:tcBorders>
               <w:top w:val="single" w:sz="4" w:space="0" w:color="000000"/>
               <w:start w:val="single" w:sz="4" w:space="0" w:color="000000"/>
@@ -35581,7 +35593,7 @@
         </w:tc>
         <w:tc>
           <w:tcPr>
-            <w:tcW w:w="1398" w:type="dxa"/>
+            <w:tcW w:w="1399" w:type="dxa"/>
             <w:tcBorders>
               <w:top w:val="single" w:sz="4" w:space="0" w:color="000000"/>
               <w:start w:val="single" w:sz="4" w:space="0" w:color="000000"/>
@@ -35607,7 +35619,7 @@
         <w:trPr/>
         <w:tc>
           <w:tcPr>
-            <w:tcW w:w="3827" w:type="dxa"/>
+            <w:tcW w:w="3826" w:type="dxa"/>
             <w:tcBorders>
               <w:top w:val="single" w:sz="4" w:space="0" w:color="000000"/>
               <w:start w:val="single" w:sz="4" w:space="0" w:color="000000"/>
@@ -35653,7 +35665,7 @@
         </w:tc>
         <w:tc>
           <w:tcPr>
-            <w:tcW w:w="1398" w:type="dxa"/>
+            <w:tcW w:w="1399" w:type="dxa"/>
             <w:tcBorders>
               <w:top w:val="single" w:sz="4" w:space="0" w:color="000000"/>
               <w:start w:val="single" w:sz="4" w:space="0" w:color="000000"/>
@@ -35679,7 +35691,7 @@
         <w:trPr/>
         <w:tc>
           <w:tcPr>
-            <w:tcW w:w="3827" w:type="dxa"/>
+            <w:tcW w:w="3826" w:type="dxa"/>
             <w:tcBorders>
               <w:top w:val="single" w:sz="4" w:space="0" w:color="000000"/>
               <w:start w:val="single" w:sz="4" w:space="0" w:color="000000"/>
@@ -35725,7 +35737,7 @@
         </w:tc>
         <w:tc>
           <w:tcPr>
-            <w:tcW w:w="1398" w:type="dxa"/>
+            <w:tcW w:w="1399" w:type="dxa"/>
             <w:tcBorders>
               <w:top w:val="single" w:sz="4" w:space="0" w:color="000000"/>
               <w:start w:val="single" w:sz="4" w:space="0" w:color="000000"/>
@@ -35751,7 +35763,7 @@
         <w:trPr/>
         <w:tc>
           <w:tcPr>
-            <w:tcW w:w="3827" w:type="dxa"/>
+            <w:tcW w:w="3826" w:type="dxa"/>
             <w:tcBorders>
               <w:top w:val="single" w:sz="4" w:space="0" w:color="000000"/>
               <w:start w:val="single" w:sz="4" w:space="0" w:color="000000"/>
@@ -35797,7 +35809,7 @@
         </w:tc>
         <w:tc>
           <w:tcPr>
-            <w:tcW w:w="1398" w:type="dxa"/>
+            <w:tcW w:w="1399" w:type="dxa"/>
             <w:tcBorders>
               <w:top w:val="single" w:sz="4" w:space="0" w:color="000000"/>
               <w:start w:val="single" w:sz="4" w:space="0" w:color="000000"/>
@@ -35823,7 +35835,7 @@
         <w:trPr/>
         <w:tc>
           <w:tcPr>
-            <w:tcW w:w="3827" w:type="dxa"/>
+            <w:tcW w:w="3826" w:type="dxa"/>
             <w:tcBorders>
               <w:top w:val="single" w:sz="4" w:space="0" w:color="000000"/>
               <w:start w:val="single" w:sz="4" w:space="0" w:color="000000"/>
@@ -35869,7 +35881,7 @@
         </w:tc>
         <w:tc>
           <w:tcPr>
-            <w:tcW w:w="1398" w:type="dxa"/>
+            <w:tcW w:w="1399" w:type="dxa"/>
             <w:tcBorders>
               <w:top w:val="single" w:sz="4" w:space="0" w:color="000000"/>
               <w:start w:val="single" w:sz="4" w:space="0" w:color="000000"/>
@@ -35895,7 +35907,7 @@
         <w:trPr/>
         <w:tc>
           <w:tcPr>
-            <w:tcW w:w="3827" w:type="dxa"/>
+            <w:tcW w:w="3826" w:type="dxa"/>
             <w:tcBorders>
               <w:top w:val="single" w:sz="4" w:space="0" w:color="000000"/>
               <w:start w:val="single" w:sz="4" w:space="0" w:color="000000"/>
@@ -35943,7 +35955,7 @@
         </w:tc>
         <w:tc>
           <w:tcPr>
-            <w:tcW w:w="1398" w:type="dxa"/>
+            <w:tcW w:w="1399" w:type="dxa"/>
             <w:tcBorders>
               <w:top w:val="single" w:sz="4" w:space="0" w:color="000000"/>
               <w:start w:val="single" w:sz="4" w:space="0" w:color="000000"/>
@@ -36447,16 +36459,16 @@
         <w:tblLook w:val="0000" w:noHBand="0" w:noVBand="0" w:firstColumn="0" w:lastRow="0" w:lastColumn="0" w:firstRow="0"/>
       </w:tblPr>
       <w:tblGrid>
-        <w:gridCol w:w="2599"/>
+        <w:gridCol w:w="2598"/>
         <w:gridCol w:w="1778"/>
-        <w:gridCol w:w="1578"/>
+        <w:gridCol w:w="1579"/>
         <w:gridCol w:w="3071"/>
       </w:tblGrid>
       <w:tr>
         <w:trPr/>
         <w:tc>
           <w:tcPr>
-            <w:tcW w:w="2599" w:type="dxa"/>
+            <w:tcW w:w="2598" w:type="dxa"/>
             <w:tcBorders>
               <w:top w:val="single" w:sz="4" w:space="0" w:color="000000"/>
               <w:start w:val="single" w:sz="4" w:space="0" w:color="000000"/>
@@ -36510,7 +36522,7 @@
         </w:tc>
         <w:tc>
           <w:tcPr>
-            <w:tcW w:w="1578" w:type="dxa"/>
+            <w:tcW w:w="1579" w:type="dxa"/>
             <w:tcBorders>
               <w:top w:val="single" w:sz="4" w:space="0" w:color="000000"/>
               <w:start w:val="single" w:sz="4" w:space="0" w:color="000000"/>
@@ -36567,7 +36579,7 @@
         <w:trPr/>
         <w:tc>
           <w:tcPr>
-            <w:tcW w:w="2599" w:type="dxa"/>
+            <w:tcW w:w="2598" w:type="dxa"/>
             <w:tcBorders>
               <w:top w:val="single" w:sz="4" w:space="0" w:color="000000"/>
               <w:start w:val="single" w:sz="4" w:space="0" w:color="000000"/>
@@ -36616,7 +36628,7 @@
         </w:tc>
         <w:tc>
           <w:tcPr>
-            <w:tcW w:w="1578" w:type="dxa"/>
+            <w:tcW w:w="1579" w:type="dxa"/>
             <w:tcBorders>
               <w:top w:val="single" w:sz="4" w:space="0" w:color="000000"/>
               <w:start w:val="single" w:sz="4" w:space="0" w:color="000000"/>
@@ -36665,7 +36677,7 @@
         <w:trPr/>
         <w:tc>
           <w:tcPr>
-            <w:tcW w:w="2599" w:type="dxa"/>
+            <w:tcW w:w="2598" w:type="dxa"/>
             <w:tcBorders>
               <w:top w:val="single" w:sz="4" w:space="0" w:color="000000"/>
               <w:start w:val="single" w:sz="4" w:space="0" w:color="000000"/>
@@ -36711,7 +36723,7 @@
         </w:tc>
         <w:tc>
           <w:tcPr>
-            <w:tcW w:w="1578" w:type="dxa"/>
+            <w:tcW w:w="1579" w:type="dxa"/>
             <w:tcBorders>
               <w:top w:val="single" w:sz="4" w:space="0" w:color="000000"/>
               <w:start w:val="single" w:sz="4" w:space="0" w:color="000000"/>
@@ -36760,7 +36772,7 @@
         <w:trPr/>
         <w:tc>
           <w:tcPr>
-            <w:tcW w:w="2599" w:type="dxa"/>
+            <w:tcW w:w="2598" w:type="dxa"/>
             <w:tcBorders>
               <w:top w:val="single" w:sz="4" w:space="0" w:color="000000"/>
               <w:start w:val="single" w:sz="4" w:space="0" w:color="000000"/>
@@ -36806,7 +36818,7 @@
         </w:tc>
         <w:tc>
           <w:tcPr>
-            <w:tcW w:w="1578" w:type="dxa"/>
+            <w:tcW w:w="1579" w:type="dxa"/>
             <w:tcBorders>
               <w:top w:val="single" w:sz="4" w:space="0" w:color="000000"/>
               <w:start w:val="single" w:sz="4" w:space="0" w:color="000000"/>
@@ -39039,6 +39051,7 @@
     <w:qFormat/>
     <w:pPr>
       <w:widowControl/>
+      <w:suppressAutoHyphens w:val="true"/>
       <w:bidi w:val="0"/>
       <w:spacing w:lineRule="auto" w:line="360" w:before="0" w:after="0"/>
       <w:jc w:val="start"/>
@@ -39058,6 +39071,7 @@
     <w:qFormat/>
     <w:pPr>
       <w:widowControl/>
+      <w:suppressAutoHyphens w:val="true"/>
       <w:bidi w:val="0"/>
       <w:spacing w:lineRule="auto" w:line="360" w:before="360" w:after="240"/>
       <w:jc w:val="start"/>
@@ -39081,6 +39095,7 @@
     <w:qFormat/>
     <w:pPr>
       <w:widowControl/>
+      <w:suppressAutoHyphens w:val="true"/>
       <w:bidi w:val="0"/>
       <w:spacing w:lineRule="auto" w:line="360" w:before="280" w:after="200"/>
       <w:jc w:val="start"/>
@@ -39104,6 +39119,7 @@
     <w:qFormat/>
     <w:pPr>
       <w:widowControl/>
+      <w:suppressAutoHyphens w:val="true"/>
       <w:bidi w:val="0"/>
       <w:spacing w:lineRule="auto" w:line="360" w:before="240" w:after="160"/>
       <w:jc w:val="start"/>
@@ -39127,6 +39143,7 @@
     <w:qFormat/>
     <w:pPr>
       <w:widowControl/>
+      <w:suppressAutoHyphens w:val="true"/>
       <w:bidi w:val="0"/>
       <w:spacing w:lineRule="auto" w:line="360" w:before="200" w:after="120"/>
       <w:jc w:val="start"/>
@@ -39153,6 +39170,7 @@
     <w:qFormat/>
     <w:pPr>
       <w:widowControl/>
+      <w:suppressAutoHyphens w:val="true"/>
       <w:bidi w:val="0"/>
       <w:spacing w:lineRule="auto" w:line="360" w:before="0" w:after="0"/>
       <w:jc w:val="start"/>
@@ -39175,6 +39193,7 @@
     <w:qFormat/>
     <w:pPr>
       <w:widowControl/>
+      <w:suppressAutoHyphens w:val="true"/>
       <w:bidi w:val="0"/>
       <w:spacing w:lineRule="auto" w:line="360" w:before="0" w:after="0"/>
       <w:jc w:val="start"/>
@@ -39206,11 +39225,18 @@
       <w:u w:val="single"/>
     </w:rPr>
   </w:style>
-  <w:style w:type="character" w:styleId="FootnoteCharacters">
-    <w:name w:val="Footnote Characters"/>
+  <w:style w:type="character" w:styleId="FootnoteCharactersuser">
+    <w:name w:val="Footnote Characters (user)"/>
     <w:uiPriority w:val="99"/>
     <w:semiHidden/>
     <w:unhideWhenUsed/>
+    <w:qFormat/>
+    <w:rPr>
+      <w:vertAlign w:val="superscript"/>
+    </w:rPr>
+  </w:style>
+  <w:style w:type="character" w:styleId="FootnoteCharacters">
+    <w:name w:val="Footnote Characters"/>
     <w:qFormat/>
     <w:rPr>
       <w:vertAlign w:val="superscript"/>
@@ -39234,11 +39260,18 @@
       <w:szCs w:val="20"/>
     </w:rPr>
   </w:style>
-  <w:style w:type="character" w:styleId="EndnoteCharacters">
-    <w:name w:val="Endnote Characters"/>
+  <w:style w:type="character" w:styleId="EndnoteCharactersuser">
+    <w:name w:val="Endnote Characters (user)"/>
     <w:uiPriority w:val="99"/>
     <w:semiHidden/>
     <w:unhideWhenUsed/>
+    <w:qFormat/>
+    <w:rPr>
+      <w:vertAlign w:val="superscript"/>
+    </w:rPr>
+  </w:style>
+  <w:style w:type="character" w:styleId="EndnoteCharacters">
+    <w:name w:val="Endnote Characters"/>
     <w:qFormat/>
     <w:rPr>
       <w:vertAlign w:val="superscript"/>
@@ -39362,6 +39395,7 @@
     <w:qFormat/>
     <w:pPr>
       <w:widowControl/>
+      <w:suppressAutoHyphens w:val="true"/>
       <w:bidi w:val="0"/>
       <w:spacing w:lineRule="auto" w:line="360" w:before="0" w:after="0"/>
       <w:jc w:val="start"/>
@@ -39380,6 +39414,7 @@
     <w:qFormat/>
     <w:pPr>
       <w:widowControl/>
+      <w:suppressAutoHyphens w:val="true"/>
       <w:bidi w:val="0"/>
       <w:spacing w:lineRule="auto" w:line="360" w:before="0" w:after="0"/>
       <w:jc w:val="start"/>
@@ -39400,6 +39435,7 @@
     <w:qFormat/>
     <w:pPr>
       <w:widowControl/>
+      <w:suppressAutoHyphens w:val="true"/>
       <w:bidi w:val="0"/>
       <w:spacing w:lineRule="auto" w:line="360" w:before="0" w:after="0"/>
       <w:jc w:val="start"/>
@@ -39421,6 +39457,7 @@
     <w:unhideWhenUsed/>
     <w:pPr>
       <w:widowControl/>
+      <w:suppressAutoHyphens w:val="true"/>
       <w:bidi w:val="0"/>
       <w:spacing w:lineRule="auto" w:line="240" w:before="0" w:after="0"/>
       <w:jc w:val="start"/>
@@ -39442,6 +39479,7 @@
     <w:unhideWhenUsed/>
     <w:pPr>
       <w:widowControl/>
+      <w:suppressAutoHyphens w:val="true"/>
       <w:bidi w:val="0"/>
       <w:spacing w:lineRule="auto" w:line="240" w:before="0" w:after="0"/>
       <w:jc w:val="start"/>

</xml_diff>